<commit_message>
Mini ciclo 1,2,3,4: Implementación Wheel, symbols, makeVisible() para todos, inicio implementación add Wheel()
</commit_message>
<xml_diff>
--- a/Primer Ciclo/Primer Ciclo.docx
+++ b/Primer Ciclo/Primer Ciclo.docx
@@ -304,11 +304,15 @@
     <w:p>
       <w:pPr>
         <w:rPr>
-          <w:lang w:val="es-CO"/>
-        </w:rPr>
-      </w:pPr>
-      <w:r>
-        <w:rPr>
+          <w:b/>
+          <w:bCs/>
+          <w:lang w:val="es-CO"/>
+        </w:rPr>
+      </w:pPr>
+      <w:r>
+        <w:rPr>
+          <w:b/>
+          <w:bCs/>
           <w:lang w:val="es-CO"/>
         </w:rPr>
         <w:lastRenderedPageBreak/>
@@ -316,18 +320,24 @@
       </w:r>
       <w:r>
         <w:rPr>
+          <w:b/>
+          <w:bCs/>
           <w:lang w:val="es-CO"/>
         </w:rPr>
         <w:t xml:space="preserve"> Creación e implementación</w:t>
       </w:r>
       <w:r>
         <w:rPr>
+          <w:b/>
+          <w:bCs/>
           <w:lang w:val="es-CO"/>
         </w:rPr>
         <w:t xml:space="preserve"> de </w:t>
       </w:r>
       <w:r>
         <w:rPr>
+          <w:b/>
+          <w:bCs/>
           <w:lang w:val="es-CO"/>
         </w:rPr>
         <w:t>Symbol:</w:t>
@@ -373,6 +383,7 @@
       </w:pPr>
       <w:r>
         <w:rPr>
+          <w:noProof/>
           <w:lang w:val="es-CO"/>
         </w:rPr>
         <w:drawing>
@@ -422,6 +433,159 @@
         <w:rPr>
           <w:lang w:val="es-CO"/>
         </w:rPr>
+        <w:t>Además sus atributos son:</w:t>
+      </w:r>
+    </w:p>
+    <w:p>
+      <w:pPr>
+        <w:rPr>
+          <w:lang w:val="es-CO"/>
+        </w:rPr>
+      </w:pPr>
+      <w:r>
+        <w:rPr>
+          <w:lang w:val="es-CO"/>
+        </w:rPr>
+        <w:drawing>
+          <wp:inline distT="0" distB="0" distL="0" distR="0" wp14:anchorId="1131AEC6" wp14:editId="3A0A9BED">
+            <wp:extent cx="3258005" cy="419158"/>
+            <wp:effectExtent l="0" t="0" r="0" b="0"/>
+            <wp:docPr id="764897681" name="Imagen 1"/>
+            <wp:cNvGraphicFramePr>
+              <a:graphicFrameLocks xmlns:a="http://schemas.openxmlformats.org/drawingml/2006/main" noChangeAspect="1"/>
+            </wp:cNvGraphicFramePr>
+            <a:graphic xmlns:a="http://schemas.openxmlformats.org/drawingml/2006/main">
+              <a:graphicData uri="http://schemas.openxmlformats.org/drawingml/2006/picture">
+                <pic:pic xmlns:pic="http://schemas.openxmlformats.org/drawingml/2006/picture">
+                  <pic:nvPicPr>
+                    <pic:cNvPr id="764897681" name=""/>
+                    <pic:cNvPicPr/>
+                  </pic:nvPicPr>
+                  <pic:blipFill>
+                    <a:blip r:embed="rId7"/>
+                    <a:stretch>
+                      <a:fillRect/>
+                    </a:stretch>
+                  </pic:blipFill>
+                  <pic:spPr>
+                    <a:xfrm>
+                      <a:off x="0" y="0"/>
+                      <a:ext cx="3258005" cy="419158"/>
+                    </a:xfrm>
+                    <a:prstGeom prst="rect">
+                      <a:avLst/>
+                    </a:prstGeom>
+                  </pic:spPr>
+                </pic:pic>
+              </a:graphicData>
+            </a:graphic>
+          </wp:inline>
+        </w:drawing>
+      </w:r>
+    </w:p>
+    <w:p>
+      <w:pPr>
+        <w:rPr>
+          <w:lang w:val="es-CO"/>
+        </w:rPr>
+      </w:pPr>
+      <w:r>
+        <w:rPr>
+          <w:lang w:val="es-CO"/>
+        </w:rPr>
+        <w:t>La cual representa su interfaz grafica como Rectangle de shapes.</w:t>
+      </w:r>
+    </w:p>
+    <w:p>
+      <w:pPr>
+        <w:rPr>
+          <w:lang w:val="es-CO"/>
+        </w:rPr>
+      </w:pPr>
+    </w:p>
+    <w:p>
+      <w:pPr>
+        <w:rPr>
+          <w:lang w:val="es-CO"/>
+        </w:rPr>
+      </w:pPr>
+      <w:r>
+        <w:rPr>
+          <w:lang w:val="es-CO"/>
+        </w:rPr>
+        <w:t>A la clase Rectangle fue necesario agregarle ciertos métodos para encontrar su ubicación en la pantalla, su tamaño</w:t>
+      </w:r>
+      <w:r>
+        <w:rPr>
+          <w:lang w:val="es-CO"/>
+        </w:rPr>
+        <w:t>, su color y crearle un nuevo constructor que directamente le ponga un color:</w:t>
+      </w:r>
+    </w:p>
+    <w:p>
+      <w:pPr>
+        <w:rPr>
+          <w:lang w:val="es-CO"/>
+        </w:rPr>
+      </w:pPr>
+      <w:r>
+        <w:rPr>
+          <w:lang w:val="es-CO"/>
+        </w:rPr>
+        <w:drawing>
+          <wp:inline distT="0" distB="0" distL="0" distR="0" wp14:anchorId="478E0ABE" wp14:editId="2F3F08A5">
+            <wp:extent cx="1714739" cy="1247949"/>
+            <wp:effectExtent l="0" t="0" r="0" b="9525"/>
+            <wp:docPr id="2021345245" name="Imagen 1"/>
+            <wp:cNvGraphicFramePr>
+              <a:graphicFrameLocks xmlns:a="http://schemas.openxmlformats.org/drawingml/2006/main" noChangeAspect="1"/>
+            </wp:cNvGraphicFramePr>
+            <a:graphic xmlns:a="http://schemas.openxmlformats.org/drawingml/2006/main">
+              <a:graphicData uri="http://schemas.openxmlformats.org/drawingml/2006/picture">
+                <pic:pic xmlns:pic="http://schemas.openxmlformats.org/drawingml/2006/picture">
+                  <pic:nvPicPr>
+                    <pic:cNvPr id="2021345245" name=""/>
+                    <pic:cNvPicPr/>
+                  </pic:nvPicPr>
+                  <pic:blipFill>
+                    <a:blip r:embed="rId8"/>
+                    <a:stretch>
+                      <a:fillRect/>
+                    </a:stretch>
+                  </pic:blipFill>
+                  <pic:spPr>
+                    <a:xfrm>
+                      <a:off x="0" y="0"/>
+                      <a:ext cx="1714739" cy="1247949"/>
+                    </a:xfrm>
+                    <a:prstGeom prst="rect">
+                      <a:avLst/>
+                    </a:prstGeom>
+                  </pic:spPr>
+                </pic:pic>
+              </a:graphicData>
+            </a:graphic>
+          </wp:inline>
+        </w:drawing>
+      </w:r>
+    </w:p>
+    <w:p>
+      <w:pPr>
+        <w:rPr>
+          <w:lang w:val="es-CO"/>
+        </w:rPr>
+      </w:pPr>
+    </w:p>
+    <w:p>
+      <w:pPr>
+        <w:rPr>
+          <w:lang w:val="es-CO"/>
+        </w:rPr>
+      </w:pPr>
+      <w:r>
+        <w:rPr>
+          <w:lang w:val="es-CO"/>
+        </w:rPr>
         <w:t xml:space="preserve">Por tanto cada método debe cumplir determinada función. </w:t>
       </w:r>
     </w:p>
@@ -435,7 +599,385 @@
         <w:rPr>
           <w:lang w:val="es-CO"/>
         </w:rPr>
-        <w:t>El constructor: Este debe crear al símbolo, además de escoger alguna forma al azar y crear esa forma con el color que se le envia</w:t>
+        <w:t>El constructor: Este debe crear al símbolo,</w:t>
+      </w:r>
+      <w:r>
+        <w:rPr>
+          <w:lang w:val="es-CO"/>
+        </w:rPr>
+        <w:t xml:space="preserve"> el cuál será un rectángulo de un color determinado.</w:t>
+      </w:r>
+    </w:p>
+    <w:p>
+      <w:pPr>
+        <w:rPr>
+          <w:lang w:val="es-CO"/>
+        </w:rPr>
+      </w:pPr>
+      <w:r>
+        <w:rPr>
+          <w:lang w:val="es-CO"/>
+        </w:rPr>
+        <w:t>makeVisible(): Debe volver visible el símbolo.</w:t>
+      </w:r>
+    </w:p>
+    <w:p>
+      <w:pPr>
+        <w:rPr>
+          <w:lang w:val="es-CO"/>
+        </w:rPr>
+      </w:pPr>
+      <w:r>
+        <w:rPr>
+          <w:lang w:val="es-CO"/>
+        </w:rPr>
+        <w:lastRenderedPageBreak/>
+        <w:t>makeInvisible(): Debe volver invisible el símbolo.</w:t>
+      </w:r>
+    </w:p>
+    <w:p>
+      <w:pPr>
+        <w:rPr>
+          <w:lang w:val="es-CO"/>
+        </w:rPr>
+      </w:pPr>
+      <w:r>
+        <w:rPr>
+          <w:lang w:val="es-CO"/>
+        </w:rPr>
+        <w:t>placeSymbol()</w:t>
+      </w:r>
+      <w:r>
+        <w:rPr>
+          <w:lang w:val="es-CO"/>
+        </w:rPr>
+        <w:t>: Debe poner el símbolo en determinada posición.</w:t>
+      </w:r>
+    </w:p>
+    <w:p>
+      <w:pPr>
+        <w:rPr>
+          <w:lang w:val="es-CO"/>
+        </w:rPr>
+      </w:pPr>
+      <w:r>
+        <w:rPr>
+          <w:lang w:val="es-CO"/>
+        </w:rPr>
+        <w:t>getColor(): Para obtener el nombre del color que tiene symbol.</w:t>
+      </w:r>
+    </w:p>
+    <w:p>
+      <w:pPr>
+        <w:rPr>
+          <w:lang w:val="es-CO"/>
+        </w:rPr>
+      </w:pPr>
+      <w:r>
+        <w:rPr>
+          <w:lang w:val="es-CO"/>
+        </w:rPr>
+        <w:t>Un ejemplo de un Symbol sería:</w:t>
+      </w:r>
+    </w:p>
+    <w:p>
+      <w:pPr>
+        <w:rPr>
+          <w:lang w:val="es-CO"/>
+        </w:rPr>
+      </w:pPr>
+      <w:r>
+        <w:rPr>
+          <w:lang w:val="es-CO"/>
+        </w:rPr>
+        <w:drawing>
+          <wp:inline distT="0" distB="0" distL="0" distR="0" wp14:anchorId="426462FB" wp14:editId="2036112D">
+            <wp:extent cx="1476581" cy="1181265"/>
+            <wp:effectExtent l="0" t="0" r="9525" b="0"/>
+            <wp:docPr id="76506448" name="Imagen 1"/>
+            <wp:cNvGraphicFramePr>
+              <a:graphicFrameLocks xmlns:a="http://schemas.openxmlformats.org/drawingml/2006/main" noChangeAspect="1"/>
+            </wp:cNvGraphicFramePr>
+            <a:graphic xmlns:a="http://schemas.openxmlformats.org/drawingml/2006/main">
+              <a:graphicData uri="http://schemas.openxmlformats.org/drawingml/2006/picture">
+                <pic:pic xmlns:pic="http://schemas.openxmlformats.org/drawingml/2006/picture">
+                  <pic:nvPicPr>
+                    <pic:cNvPr id="76506448" name=""/>
+                    <pic:cNvPicPr/>
+                  </pic:nvPicPr>
+                  <pic:blipFill>
+                    <a:blip r:embed="rId9"/>
+                    <a:stretch>
+                      <a:fillRect/>
+                    </a:stretch>
+                  </pic:blipFill>
+                  <pic:spPr>
+                    <a:xfrm>
+                      <a:off x="0" y="0"/>
+                      <a:ext cx="1476581" cy="1181265"/>
+                    </a:xfrm>
+                    <a:prstGeom prst="rect">
+                      <a:avLst/>
+                    </a:prstGeom>
+                  </pic:spPr>
+                </pic:pic>
+              </a:graphicData>
+            </a:graphic>
+          </wp:inline>
+        </w:drawing>
+      </w:r>
+    </w:p>
+    <w:p>
+      <w:pPr>
+        <w:rPr>
+          <w:lang w:val="es-CO"/>
+        </w:rPr>
+      </w:pPr>
+    </w:p>
+    <w:p>
+      <w:pPr>
+        <w:rPr>
+          <w:b/>
+          <w:bCs/>
+          <w:lang w:val="es-CO"/>
+        </w:rPr>
+      </w:pPr>
+      <w:r>
+        <w:rPr>
+          <w:b/>
+          <w:bCs/>
+          <w:lang w:val="es-CO"/>
+        </w:rPr>
+        <w:t xml:space="preserve">MiniCiclo 2: Creación e implementación </w:t>
+      </w:r>
+      <w:r>
+        <w:rPr>
+          <w:b/>
+          <w:bCs/>
+          <w:lang w:val="es-CO"/>
+        </w:rPr>
+        <w:t>de Wheel.</w:t>
+      </w:r>
+    </w:p>
+    <w:p>
+      <w:pPr>
+        <w:rPr>
+          <w:lang w:val="es-CO"/>
+        </w:rPr>
+      </w:pPr>
+      <w:r>
+        <w:rPr>
+          <w:lang w:val="es-CO"/>
+        </w:rPr>
+        <w:t xml:space="preserve">Inicialmente se busca crear la clase </w:t>
+      </w:r>
+      <w:r>
+        <w:rPr>
+          <w:lang w:val="es-CO"/>
+        </w:rPr>
+        <w:t>Wheel que representará cada una de esas ruedas que tiene el slotMachine, este contendrá varios símbolos.</w:t>
+      </w:r>
+    </w:p>
+    <w:p>
+      <w:pPr>
+        <w:rPr>
+          <w:lang w:val="es-CO"/>
+        </w:rPr>
+      </w:pPr>
+      <w:r>
+        <w:rPr>
+          <w:lang w:val="es-CO"/>
+        </w:rPr>
+        <w:t>Además sus atributos son:</w:t>
+      </w:r>
+    </w:p>
+    <w:p>
+      <w:pPr>
+        <w:rPr>
+          <w:lang w:val="es-CO"/>
+        </w:rPr>
+      </w:pPr>
+      <w:r>
+        <w:rPr>
+          <w:lang w:val="es-CO"/>
+        </w:rPr>
+        <w:drawing>
+          <wp:inline distT="0" distB="0" distL="0" distR="0" wp14:anchorId="43556CD7" wp14:editId="3F3D4B3F">
+            <wp:extent cx="3258005" cy="419158"/>
+            <wp:effectExtent l="0" t="0" r="0" b="0"/>
+            <wp:docPr id="846618881" name="Imagen 1"/>
+            <wp:cNvGraphicFramePr>
+              <a:graphicFrameLocks xmlns:a="http://schemas.openxmlformats.org/drawingml/2006/main" noChangeAspect="1"/>
+            </wp:cNvGraphicFramePr>
+            <a:graphic xmlns:a="http://schemas.openxmlformats.org/drawingml/2006/main">
+              <a:graphicData uri="http://schemas.openxmlformats.org/drawingml/2006/picture">
+                <pic:pic xmlns:pic="http://schemas.openxmlformats.org/drawingml/2006/picture">
+                  <pic:nvPicPr>
+                    <pic:cNvPr id="764897681" name=""/>
+                    <pic:cNvPicPr/>
+                  </pic:nvPicPr>
+                  <pic:blipFill>
+                    <a:blip r:embed="rId7"/>
+                    <a:stretch>
+                      <a:fillRect/>
+                    </a:stretch>
+                  </pic:blipFill>
+                  <pic:spPr>
+                    <a:xfrm>
+                      <a:off x="0" y="0"/>
+                      <a:ext cx="3258005" cy="419158"/>
+                    </a:xfrm>
+                    <a:prstGeom prst="rect">
+                      <a:avLst/>
+                    </a:prstGeom>
+                  </pic:spPr>
+                </pic:pic>
+              </a:graphicData>
+            </a:graphic>
+          </wp:inline>
+        </w:drawing>
+      </w:r>
+    </w:p>
+    <w:p>
+      <w:pPr>
+        <w:rPr>
+          <w:lang w:val="es-CO"/>
+        </w:rPr>
+      </w:pPr>
+      <w:r>
+        <w:rPr>
+          <w:lang w:val="es-CO"/>
+        </w:rPr>
+        <w:t>La cual representa su interfaz grafica como Rectangle de shapes.</w:t>
+      </w:r>
+    </w:p>
+    <w:p>
+      <w:pPr>
+        <w:rPr>
+          <w:lang w:val="es-CO"/>
+        </w:rPr>
+      </w:pPr>
+      <w:r>
+        <w:rPr>
+          <w:lang w:val="es-CO"/>
+        </w:rPr>
+        <w:drawing>
+          <wp:inline distT="0" distB="0" distL="0" distR="0" wp14:anchorId="3F28C062" wp14:editId="19695342">
+            <wp:extent cx="3943900" cy="895475"/>
+            <wp:effectExtent l="0" t="0" r="0" b="0"/>
+            <wp:docPr id="742690186" name="Imagen 1"/>
+            <wp:cNvGraphicFramePr>
+              <a:graphicFrameLocks xmlns:a="http://schemas.openxmlformats.org/drawingml/2006/main" noChangeAspect="1"/>
+            </wp:cNvGraphicFramePr>
+            <a:graphic xmlns:a="http://schemas.openxmlformats.org/drawingml/2006/main">
+              <a:graphicData uri="http://schemas.openxmlformats.org/drawingml/2006/picture">
+                <pic:pic xmlns:pic="http://schemas.openxmlformats.org/drawingml/2006/picture">
+                  <pic:nvPicPr>
+                    <pic:cNvPr id="742690186" name=""/>
+                    <pic:cNvPicPr/>
+                  </pic:nvPicPr>
+                  <pic:blipFill>
+                    <a:blip r:embed="rId10"/>
+                    <a:stretch>
+                      <a:fillRect/>
+                    </a:stretch>
+                  </pic:blipFill>
+                  <pic:spPr>
+                    <a:xfrm>
+                      <a:off x="0" y="0"/>
+                      <a:ext cx="3943900" cy="895475"/>
+                    </a:xfrm>
+                    <a:prstGeom prst="rect">
+                      <a:avLst/>
+                    </a:prstGeom>
+                  </pic:spPr>
+                </pic:pic>
+              </a:graphicData>
+            </a:graphic>
+          </wp:inline>
+        </w:drawing>
+      </w:r>
+    </w:p>
+    <w:p>
+      <w:pPr>
+        <w:rPr>
+          <w:lang w:val="es-CO"/>
+        </w:rPr>
+      </w:pPr>
+      <w:r>
+        <w:rPr>
+          <w:lang w:val="es-CO"/>
+        </w:rPr>
+        <w:t>s</w:t>
+      </w:r>
+      <w:r>
+        <w:rPr>
+          <w:lang w:val="es-CO"/>
+        </w:rPr>
+        <w:t>ymbols son una lista de todos los símbolos que tiene</w:t>
+      </w:r>
+      <w:r>
+        <w:rPr>
+          <w:lang w:val="es-CO"/>
+        </w:rPr>
+        <w:t xml:space="preserve"> </w:t>
+      </w:r>
+      <w:r>
+        <w:rPr>
+          <w:lang w:val="es-CO"/>
+        </w:rPr>
+        <w:t>Wheel</w:t>
+      </w:r>
+      <w:r>
+        <w:rPr>
+          <w:lang w:val="es-CO"/>
+        </w:rPr>
+        <w:t xml:space="preserve"> como clase</w:t>
+      </w:r>
+      <w:r>
+        <w:rPr>
+          <w:lang w:val="es-CO"/>
+        </w:rPr>
+        <w:t>, por eso es static</w:t>
+      </w:r>
+    </w:p>
+    <w:p>
+      <w:pPr>
+        <w:rPr>
+          <w:lang w:val="es-CO"/>
+        </w:rPr>
+      </w:pPr>
+      <w:r>
+        <w:rPr>
+          <w:lang w:val="es-CO"/>
+        </w:rPr>
+        <w:t>rectangleBodyPart es su interfaz gráfica como Rectangle de shapes.</w:t>
+      </w:r>
+    </w:p>
+    <w:p>
+      <w:pPr>
+        <w:rPr>
+          <w:lang w:val="es-CO"/>
+        </w:rPr>
+      </w:pPr>
+      <w:r>
+        <w:rPr>
+          <w:lang w:val="es-CO"/>
+        </w:rPr>
+        <w:t>currentSymbol es el símbolo actual que tiene.</w:t>
+      </w:r>
+    </w:p>
+    <w:p>
+      <w:pPr>
+        <w:rPr>
+          <w:lang w:val="es-CO"/>
+        </w:rPr>
+      </w:pPr>
+      <w:r>
+        <w:rPr>
+          <w:lang w:val="es-CO"/>
+        </w:rPr>
+        <w:t>isVisible permite saber si está visible o no</w:t>
       </w:r>
       <w:r>
         <w:rPr>
@@ -454,91 +996,1299 @@
         <w:rPr>
           <w:lang w:val="es-CO"/>
         </w:rPr>
-        <w:t>makeVisible(): Debe volver visible el símbolo.</w:t>
-      </w:r>
-    </w:p>
-    <w:p>
-      <w:pPr>
-        <w:rPr>
-          <w:lang w:val="es-CO"/>
-        </w:rPr>
-      </w:pPr>
-      <w:r>
-        <w:rPr>
-          <w:lang w:val="es-CO"/>
-        </w:rPr>
-        <w:t>makeInvisible(): Debe volver invisible el símbolo.</w:t>
-      </w:r>
-    </w:p>
-    <w:p>
-      <w:pPr>
-        <w:rPr>
-          <w:lang w:val="es-CO"/>
-        </w:rPr>
-      </w:pPr>
-      <w:r>
-        <w:rPr>
-          <w:lang w:val="es-CO"/>
-        </w:rPr>
-        <w:t>placeSymbol()</w:t>
-      </w:r>
-      <w:r>
-        <w:rPr>
-          <w:lang w:val="es-CO"/>
-        </w:rPr>
-        <w:t>: Debe poner el símbolo en determinada posición.</w:t>
-      </w:r>
-    </w:p>
-    <w:p>
-      <w:pPr>
-        <w:rPr>
-          <w:lang w:val="es-CO"/>
-        </w:rPr>
-      </w:pPr>
-      <w:r>
-        <w:rPr>
-          <w:lang w:val="es-CO"/>
-        </w:rPr>
-        <w:t>getColor(): Para obtener el nombre del color que tiene symbol.</w:t>
-      </w:r>
-    </w:p>
-    <w:p>
-      <w:pPr>
-        <w:rPr>
-          <w:lang w:val="es-CO"/>
-        </w:rPr>
-      </w:pPr>
-      <w:r>
-        <w:rPr>
-          <w:lang w:val="es-CO"/>
-        </w:rPr>
-        <w:t xml:space="preserve">MiniCiclo 2: Creación e implementación </w:t>
-      </w:r>
-      <w:r>
-        <w:rPr>
-          <w:lang w:val="es-CO"/>
-        </w:rPr>
-        <w:t>de Wheel.</w:t>
-      </w:r>
-    </w:p>
-    <w:p>
-      <w:pPr>
-        <w:rPr>
-          <w:lang w:val="es-CO"/>
-        </w:rPr>
-      </w:pPr>
-      <w:r>
-        <w:rPr>
-          <w:lang w:val="es-CO"/>
-        </w:rPr>
-        <w:t xml:space="preserve">Inicialmente se busca crear la clase </w:t>
-      </w:r>
-      <w:r>
-        <w:rPr>
-          <w:lang w:val="es-CO"/>
-        </w:rPr>
-        <w:t>Wheel que representará cada una de esas ruedas que tiene el slotMachine, este contendrá varios símbolos.</w:t>
-      </w:r>
+        <w:t>Inicialmente se modela así en astah:</w:t>
+      </w:r>
+    </w:p>
+    <w:p>
+      <w:pPr>
+        <w:rPr>
+          <w:lang w:val="es-CO"/>
+        </w:rPr>
+      </w:pPr>
+      <w:r>
+        <w:rPr>
+          <w:lang w:val="es-CO"/>
+        </w:rPr>
+        <w:lastRenderedPageBreak/>
+        <w:drawing>
+          <wp:inline distT="0" distB="0" distL="0" distR="0" wp14:anchorId="38F0C526" wp14:editId="07C82065">
+            <wp:extent cx="3219899" cy="2743583"/>
+            <wp:effectExtent l="0" t="0" r="0" b="0"/>
+            <wp:docPr id="2003374044" name="Imagen 1"/>
+            <wp:cNvGraphicFramePr>
+              <a:graphicFrameLocks xmlns:a="http://schemas.openxmlformats.org/drawingml/2006/main" noChangeAspect="1"/>
+            </wp:cNvGraphicFramePr>
+            <a:graphic xmlns:a="http://schemas.openxmlformats.org/drawingml/2006/main">
+              <a:graphicData uri="http://schemas.openxmlformats.org/drawingml/2006/picture">
+                <pic:pic xmlns:pic="http://schemas.openxmlformats.org/drawingml/2006/picture">
+                  <pic:nvPicPr>
+                    <pic:cNvPr id="2003374044" name=""/>
+                    <pic:cNvPicPr/>
+                  </pic:nvPicPr>
+                  <pic:blipFill>
+                    <a:blip r:embed="rId11"/>
+                    <a:stretch>
+                      <a:fillRect/>
+                    </a:stretch>
+                  </pic:blipFill>
+                  <pic:spPr>
+                    <a:xfrm>
+                      <a:off x="0" y="0"/>
+                      <a:ext cx="3219899" cy="2743583"/>
+                    </a:xfrm>
+                    <a:prstGeom prst="rect">
+                      <a:avLst/>
+                    </a:prstGeom>
+                  </pic:spPr>
+                </pic:pic>
+              </a:graphicData>
+            </a:graphic>
+          </wp:inline>
+        </w:drawing>
+      </w:r>
+    </w:p>
+    <w:p>
+      <w:pPr>
+        <w:rPr>
+          <w:lang w:val="es-CO"/>
+        </w:rPr>
+      </w:pPr>
+      <w:r>
+        <w:rPr>
+          <w:lang w:val="es-CO"/>
+        </w:rPr>
+        <w:t>Por tanto cada método debe cumplir una determinada función:</w:t>
+      </w:r>
+    </w:p>
+    <w:p>
+      <w:pPr>
+        <w:rPr>
+          <w:lang w:val="es-CO"/>
+        </w:rPr>
+      </w:pPr>
+      <w:r>
+        <w:rPr>
+          <w:lang w:val="es-CO"/>
+        </w:rPr>
+        <w:t>El constructor: Se encarga de instancia la clase Wheel, creando la figura de Wheel que será un rectángulo de tamaño gris con un tamaño fijo.</w:t>
+      </w:r>
+    </w:p>
+    <w:p>
+      <w:pPr>
+        <w:rPr>
+          <w:lang w:val="es-CO"/>
+        </w:rPr>
+      </w:pPr>
+      <w:r>
+        <w:rPr>
+          <w:lang w:val="es-CO"/>
+        </w:rPr>
+        <w:t>makeVisible(): Se encarga de volver visible a</w:t>
+      </w:r>
+      <w:r>
+        <w:rPr>
+          <w:lang w:val="es-CO"/>
+        </w:rPr>
+        <w:t xml:space="preserve"> Wheel y al símbolo que tenga actualmente.</w:t>
+      </w:r>
+    </w:p>
+    <w:p>
+      <w:pPr>
+        <w:rPr>
+          <w:lang w:val="es-CO"/>
+        </w:rPr>
+      </w:pPr>
+      <w:r>
+        <w:rPr>
+          <w:lang w:val="es-CO"/>
+        </w:rPr>
+        <w:t>makeInvisible(): Se encarga de volver invisible a Wheel y al símbolo que tenga actualmente.</w:t>
+      </w:r>
+    </w:p>
+    <w:p>
+      <w:pPr>
+        <w:rPr>
+          <w:lang w:val="es-CO"/>
+        </w:rPr>
+      </w:pPr>
+      <w:r>
+        <w:rPr>
+          <w:lang w:val="es-CO"/>
+        </w:rPr>
+        <w:t>Place(): Se encarga de poner a la rueda en una posición específica.</w:t>
+      </w:r>
+    </w:p>
+    <w:p>
+      <w:pPr>
+        <w:rPr>
+          <w:lang w:val="es-CO"/>
+        </w:rPr>
+      </w:pPr>
+      <w:r>
+        <w:rPr>
+          <w:lang w:val="es-CO"/>
+        </w:rPr>
+        <w:t>addSymbol</w:t>
+      </w:r>
+      <w:r>
+        <w:rPr>
+          <w:lang w:val="es-CO"/>
+        </w:rPr>
+        <w:t>()</w:t>
+      </w:r>
+      <w:r>
+        <w:rPr>
+          <w:lang w:val="es-CO"/>
+        </w:rPr>
+        <w:t>:</w:t>
+      </w:r>
+      <w:r>
+        <w:rPr>
+          <w:lang w:val="es-CO"/>
+        </w:rPr>
+        <w:t xml:space="preserve"> Se encarga de añadir un símbolo a la rueda.</w:t>
+      </w:r>
+    </w:p>
+    <w:p>
+      <w:pPr>
+        <w:rPr>
+          <w:lang w:val="es-CO"/>
+        </w:rPr>
+      </w:pPr>
+      <w:r>
+        <w:rPr>
+          <w:lang w:val="es-CO"/>
+        </w:rPr>
+        <w:t>deleteSymbol(): Se encarga de borrar un símbolo de la rueda</w:t>
+      </w:r>
+      <w:r>
+        <w:rPr>
+          <w:lang w:val="es-CO"/>
+        </w:rPr>
+        <w:t>.</w:t>
+      </w:r>
+    </w:p>
+    <w:p>
+      <w:pPr>
+        <w:rPr>
+          <w:lang w:val="es-CO"/>
+        </w:rPr>
+      </w:pPr>
+      <w:r>
+        <w:rPr>
+          <w:lang w:val="es-CO"/>
+        </w:rPr>
+        <w:t>Adicionalmente en Canvas fue necesario añadir otro color nuevo, el color gris (“gray”):</w:t>
+      </w:r>
+    </w:p>
+    <w:p>
+      <w:pPr>
+        <w:rPr>
+          <w:lang w:val="es-CO"/>
+        </w:rPr>
+      </w:pPr>
+      <w:r>
+        <w:rPr>
+          <w:lang w:val="es-CO"/>
+        </w:rPr>
+        <w:drawing>
+          <wp:inline distT="0" distB="0" distL="0" distR="0" wp14:anchorId="7F36737F" wp14:editId="66F9DCD3">
+            <wp:extent cx="4067743" cy="504895"/>
+            <wp:effectExtent l="0" t="0" r="9525" b="0"/>
+            <wp:docPr id="1535759183" name="Imagen 1"/>
+            <wp:cNvGraphicFramePr>
+              <a:graphicFrameLocks xmlns:a="http://schemas.openxmlformats.org/drawingml/2006/main" noChangeAspect="1"/>
+            </wp:cNvGraphicFramePr>
+            <a:graphic xmlns:a="http://schemas.openxmlformats.org/drawingml/2006/main">
+              <a:graphicData uri="http://schemas.openxmlformats.org/drawingml/2006/picture">
+                <pic:pic xmlns:pic="http://schemas.openxmlformats.org/drawingml/2006/picture">
+                  <pic:nvPicPr>
+                    <pic:cNvPr id="1535759183" name=""/>
+                    <pic:cNvPicPr/>
+                  </pic:nvPicPr>
+                  <pic:blipFill>
+                    <a:blip r:embed="rId12"/>
+                    <a:stretch>
+                      <a:fillRect/>
+                    </a:stretch>
+                  </pic:blipFill>
+                  <pic:spPr>
+                    <a:xfrm>
+                      <a:off x="0" y="0"/>
+                      <a:ext cx="4067743" cy="504895"/>
+                    </a:xfrm>
+                    <a:prstGeom prst="rect">
+                      <a:avLst/>
+                    </a:prstGeom>
+                  </pic:spPr>
+                </pic:pic>
+              </a:graphicData>
+            </a:graphic>
+          </wp:inline>
+        </w:drawing>
+      </w:r>
+    </w:p>
+    <w:p>
+      <w:pPr>
+        <w:rPr>
+          <w:lang w:val="es-CO"/>
+        </w:rPr>
+      </w:pPr>
+      <w:r>
+        <w:rPr>
+          <w:lang w:val="es-CO"/>
+        </w:rPr>
+        <w:t>Esto se hizo, creando un nuevo color con el estándar RGB de los colores.</w:t>
+      </w:r>
+    </w:p>
+    <w:p>
+      <w:pPr>
+        <w:rPr>
+          <w:lang w:val="es-CO"/>
+        </w:rPr>
+      </w:pPr>
+    </w:p>
+    <w:p>
+      <w:pPr>
+        <w:rPr>
+          <w:lang w:val="es-CO"/>
+        </w:rPr>
+      </w:pPr>
+      <w:r>
+        <w:rPr>
+          <w:lang w:val="es-CO"/>
+        </w:rPr>
+        <w:t>Inicialmente Wheel vacio se ve como:</w:t>
+      </w:r>
+    </w:p>
+    <w:p>
+      <w:pPr>
+        <w:rPr>
+          <w:lang w:val="es-CO"/>
+        </w:rPr>
+      </w:pPr>
+      <w:r>
+        <w:rPr>
+          <w:lang w:val="es-CO"/>
+        </w:rPr>
+        <w:lastRenderedPageBreak/>
+        <w:drawing>
+          <wp:inline distT="0" distB="0" distL="0" distR="0" wp14:anchorId="25F04472" wp14:editId="0D7E9F2C">
+            <wp:extent cx="704948" cy="1086002"/>
+            <wp:effectExtent l="0" t="0" r="0" b="0"/>
+            <wp:docPr id="1209215431" name="Imagen 1"/>
+            <wp:cNvGraphicFramePr>
+              <a:graphicFrameLocks xmlns:a="http://schemas.openxmlformats.org/drawingml/2006/main" noChangeAspect="1"/>
+            </wp:cNvGraphicFramePr>
+            <a:graphic xmlns:a="http://schemas.openxmlformats.org/drawingml/2006/main">
+              <a:graphicData uri="http://schemas.openxmlformats.org/drawingml/2006/picture">
+                <pic:pic xmlns:pic="http://schemas.openxmlformats.org/drawingml/2006/picture">
+                  <pic:nvPicPr>
+                    <pic:cNvPr id="1209215431" name=""/>
+                    <pic:cNvPicPr/>
+                  </pic:nvPicPr>
+                  <pic:blipFill>
+                    <a:blip r:embed="rId13"/>
+                    <a:stretch>
+                      <a:fillRect/>
+                    </a:stretch>
+                  </pic:blipFill>
+                  <pic:spPr>
+                    <a:xfrm>
+                      <a:off x="0" y="0"/>
+                      <a:ext cx="704948" cy="1086002"/>
+                    </a:xfrm>
+                    <a:prstGeom prst="rect">
+                      <a:avLst/>
+                    </a:prstGeom>
+                  </pic:spPr>
+                </pic:pic>
+              </a:graphicData>
+            </a:graphic>
+          </wp:inline>
+        </w:drawing>
+      </w:r>
+    </w:p>
+    <w:p>
+      <w:pPr>
+        <w:rPr>
+          <w:lang w:val="es-CO"/>
+        </w:rPr>
+      </w:pPr>
+      <w:r>
+        <w:rPr>
+          <w:lang w:val="es-CO"/>
+        </w:rPr>
+        <w:t>Si tiene un símbolo se ve como:</w:t>
+      </w:r>
+    </w:p>
+    <w:p>
+      <w:pPr>
+        <w:rPr>
+          <w:lang w:val="es-CO"/>
+        </w:rPr>
+      </w:pPr>
+      <w:r>
+        <w:rPr>
+          <w:lang w:val="es-CO"/>
+        </w:rPr>
+        <w:drawing>
+          <wp:inline distT="0" distB="0" distL="0" distR="0" wp14:anchorId="0A680574" wp14:editId="53A5D947">
+            <wp:extent cx="666843" cy="1095528"/>
+            <wp:effectExtent l="0" t="0" r="0" b="9525"/>
+            <wp:docPr id="637928086" name="Imagen 1"/>
+            <wp:cNvGraphicFramePr>
+              <a:graphicFrameLocks xmlns:a="http://schemas.openxmlformats.org/drawingml/2006/main" noChangeAspect="1"/>
+            </wp:cNvGraphicFramePr>
+            <a:graphic xmlns:a="http://schemas.openxmlformats.org/drawingml/2006/main">
+              <a:graphicData uri="http://schemas.openxmlformats.org/drawingml/2006/picture">
+                <pic:pic xmlns:pic="http://schemas.openxmlformats.org/drawingml/2006/picture">
+                  <pic:nvPicPr>
+                    <pic:cNvPr id="637928086" name=""/>
+                    <pic:cNvPicPr/>
+                  </pic:nvPicPr>
+                  <pic:blipFill>
+                    <a:blip r:embed="rId14"/>
+                    <a:stretch>
+                      <a:fillRect/>
+                    </a:stretch>
+                  </pic:blipFill>
+                  <pic:spPr>
+                    <a:xfrm>
+                      <a:off x="0" y="0"/>
+                      <a:ext cx="666843" cy="1095528"/>
+                    </a:xfrm>
+                    <a:prstGeom prst="rect">
+                      <a:avLst/>
+                    </a:prstGeom>
+                  </pic:spPr>
+                </pic:pic>
+              </a:graphicData>
+            </a:graphic>
+          </wp:inline>
+        </w:drawing>
+      </w:r>
+    </w:p>
+    <w:p>
+      <w:pPr>
+        <w:rPr>
+          <w:lang w:val="es-CO"/>
+        </w:rPr>
+      </w:pPr>
+      <w:r>
+        <w:rPr>
+          <w:lang w:val="es-CO"/>
+        </w:rPr>
+        <w:t>(La parte gris es para mostrar como se ve ubicado</w:t>
+      </w:r>
+      <w:r>
+        <w:rPr>
+          <w:lang w:val="es-CO"/>
+        </w:rPr>
+        <w:t xml:space="preserve"> el cuadrado, normalmente será blanco)</w:t>
+      </w:r>
+    </w:p>
+    <w:p>
+      <w:pPr>
+        <w:rPr>
+          <w:lang w:val="es-CO"/>
+        </w:rPr>
+      </w:pPr>
+      <w:r>
+        <w:rPr>
+          <w:lang w:val="es-CO"/>
+        </w:rPr>
+        <w:t>Además sus atributos son:</w:t>
+      </w:r>
+    </w:p>
+    <w:p>
+      <w:pPr>
+        <w:rPr>
+          <w:lang w:val="es-CO"/>
+        </w:rPr>
+      </w:pPr>
+      <w:r>
+        <w:rPr>
+          <w:lang w:val="es-CO"/>
+        </w:rPr>
+        <w:drawing>
+          <wp:inline distT="0" distB="0" distL="0" distR="0" wp14:anchorId="730B8B58" wp14:editId="1CEDB2EC">
+            <wp:extent cx="3419952" cy="885949"/>
+            <wp:effectExtent l="0" t="0" r="0" b="9525"/>
+            <wp:docPr id="191963372" name="Imagen 1"/>
+            <wp:cNvGraphicFramePr>
+              <a:graphicFrameLocks xmlns:a="http://schemas.openxmlformats.org/drawingml/2006/main" noChangeAspect="1"/>
+            </wp:cNvGraphicFramePr>
+            <a:graphic xmlns:a="http://schemas.openxmlformats.org/drawingml/2006/main">
+              <a:graphicData uri="http://schemas.openxmlformats.org/drawingml/2006/picture">
+                <pic:pic xmlns:pic="http://schemas.openxmlformats.org/drawingml/2006/picture">
+                  <pic:nvPicPr>
+                    <pic:cNvPr id="191963372" name=""/>
+                    <pic:cNvPicPr/>
+                  </pic:nvPicPr>
+                  <pic:blipFill>
+                    <a:blip r:embed="rId15"/>
+                    <a:stretch>
+                      <a:fillRect/>
+                    </a:stretch>
+                  </pic:blipFill>
+                  <pic:spPr>
+                    <a:xfrm>
+                      <a:off x="0" y="0"/>
+                      <a:ext cx="3419952" cy="885949"/>
+                    </a:xfrm>
+                    <a:prstGeom prst="rect">
+                      <a:avLst/>
+                    </a:prstGeom>
+                  </pic:spPr>
+                </pic:pic>
+              </a:graphicData>
+            </a:graphic>
+          </wp:inline>
+        </w:drawing>
+      </w:r>
+    </w:p>
+    <w:p>
+      <w:pPr>
+        <w:rPr>
+          <w:b/>
+          <w:bCs/>
+          <w:lang w:val="es-CO"/>
+        </w:rPr>
+      </w:pPr>
+      <w:r>
+        <w:rPr>
+          <w:b/>
+          <w:bCs/>
+          <w:lang w:val="es-CO"/>
+        </w:rPr>
+        <w:t>MiniCiclo3:</w:t>
+      </w:r>
+      <w:r>
+        <w:rPr>
+          <w:b/>
+          <w:bCs/>
+          <w:lang w:val="es-CO"/>
+        </w:rPr>
+        <w:t xml:space="preserve"> Crear un estado inicial </w:t>
+      </w:r>
+      <w:r>
+        <w:rPr>
+          <w:b/>
+          <w:bCs/>
+          <w:lang w:val="es-CO"/>
+        </w:rPr>
+        <w:t>de la slotMachine:</w:t>
+      </w:r>
+    </w:p>
+    <w:p>
+      <w:pPr>
+        <w:rPr>
+          <w:lang w:val="es-CO"/>
+        </w:rPr>
+      </w:pPr>
+      <w:r>
+        <w:rPr>
+          <w:lang w:val="es-CO"/>
+        </w:rPr>
+        <w:t>Se busca que la slotMachine inicié con un estado inicial</w:t>
+      </w:r>
+      <w:r>
+        <w:rPr>
+          <w:lang w:val="es-CO"/>
+        </w:rPr>
+        <w:t>, donde aparezca la pantalla y al menos 3 ruedas, cada rueda con 3 símbolos al azar.</w:t>
+      </w:r>
+    </w:p>
+    <w:p>
+      <w:pPr>
+        <w:rPr>
+          <w:lang w:val="es-CO"/>
+        </w:rPr>
+      </w:pPr>
+      <w:r>
+        <w:rPr>
+          <w:lang w:val="es-CO"/>
+        </w:rPr>
+        <w:t>Tiene los siguientes atributos:</w:t>
+      </w:r>
+    </w:p>
+    <w:p>
+      <w:pPr>
+        <w:rPr>
+          <w:lang w:val="es-CO"/>
+        </w:rPr>
+      </w:pPr>
+    </w:p>
+    <w:p>
+      <w:pPr>
+        <w:rPr>
+          <w:lang w:val="es-CO"/>
+        </w:rPr>
+      </w:pPr>
+      <w:r>
+        <w:rPr>
+          <w:lang w:val="es-CO"/>
+        </w:rPr>
+        <w:t>Por tanto es necesario hacer los siguientes métodos:</w:t>
+      </w:r>
+    </w:p>
+    <w:p>
+      <w:pPr>
+        <w:rPr>
+          <w:lang w:val="es-CO"/>
+        </w:rPr>
+      </w:pPr>
+      <w:r>
+        <w:rPr>
+          <w:lang w:val="es-CO"/>
+        </w:rPr>
+        <w:t xml:space="preserve">Constructor: </w:t>
+      </w:r>
+      <w:r>
+        <w:rPr>
+          <w:lang w:val="es-CO"/>
+        </w:rPr>
+        <w:t xml:space="preserve">Donde se inicializan diversos objetos den entorno y se llaman a otros métodos para que se prepare, </w:t>
+      </w:r>
+      <w:r>
+        <w:rPr>
+          <w:lang w:val="es-CO"/>
+        </w:rPr>
+        <w:t>la interfaz de la maquina, se preparen los símbolos y las ruedas iniciales.</w:t>
+      </w:r>
+    </w:p>
+    <w:p>
+      <w:pPr>
+        <w:rPr>
+          <w:lang w:val="es-CO"/>
+        </w:rPr>
+      </w:pPr>
+      <w:r>
+        <w:rPr>
+          <w:lang w:val="es-CO"/>
+        </w:rPr>
+        <w:t>prepareMachine(): Se encarga de poner en un estado inicial al tablero</w:t>
+      </w:r>
+      <w:r>
+        <w:rPr>
+          <w:lang w:val="es-CO"/>
+        </w:rPr>
+        <w:t>, dándole color y forma.</w:t>
+      </w:r>
+    </w:p>
+    <w:p>
+      <w:pPr>
+        <w:rPr>
+          <w:lang w:val="es-CO"/>
+        </w:rPr>
+      </w:pPr>
+      <w:r>
+        <w:rPr>
+          <w:lang w:val="es-CO"/>
+        </w:rPr>
+        <w:lastRenderedPageBreak/>
+        <w:t xml:space="preserve">prepareSymbols(): Se encarga de crear unos símbolos predeterminados con el color </w:t>
+      </w:r>
+      <w:r>
+        <w:rPr>
+          <w:lang w:val="es-CO"/>
+        </w:rPr>
+        <w:t xml:space="preserve">verde, </w:t>
+      </w:r>
+      <w:r>
+        <w:rPr>
+          <w:lang w:val="es-CO"/>
+        </w:rPr>
+        <w:t>rojo</w:t>
+      </w:r>
+      <w:r>
+        <w:rPr>
+          <w:lang w:val="es-CO"/>
+        </w:rPr>
+        <w:t xml:space="preserve"> y</w:t>
+      </w:r>
+      <w:r>
+        <w:rPr>
+          <w:lang w:val="es-CO"/>
+        </w:rPr>
+        <w:t xml:space="preserve"> azul</w:t>
+      </w:r>
+      <w:r>
+        <w:rPr>
+          <w:lang w:val="es-CO"/>
+        </w:rPr>
+        <w:t>.</w:t>
+      </w:r>
+    </w:p>
+    <w:p>
+      <w:pPr>
+        <w:rPr>
+          <w:lang w:val="es-CO"/>
+        </w:rPr>
+      </w:pPr>
+      <w:r>
+        <w:rPr>
+          <w:lang w:val="es-CO"/>
+        </w:rPr>
+        <w:t xml:space="preserve">prepareWheels(): Se encarga de crear las ruedas, además de situar sus símbolos </w:t>
+      </w:r>
+      <w:r>
+        <w:rPr>
+          <w:lang w:val="es-CO"/>
+        </w:rPr>
+        <w:t>en uno al azar de los que tiene.</w:t>
+      </w:r>
+      <w:r>
+        <w:rPr>
+          <w:lang w:val="es-CO"/>
+        </w:rPr>
+        <w:t xml:space="preserve"> Esto hizo necesario crear un método en Wheel llamado randomizeSymbol().</w:t>
+      </w:r>
+    </w:p>
+    <w:p>
+      <w:pPr>
+        <w:rPr>
+          <w:lang w:val="es-CO"/>
+        </w:rPr>
+      </w:pPr>
+      <w:r>
+        <w:rPr>
+          <w:lang w:val="es-CO"/>
+        </w:rPr>
+        <w:t xml:space="preserve">randomNumGenerator(): </w:t>
+      </w:r>
+      <w:r>
+        <w:rPr>
+          <w:lang w:val="es-CO"/>
+        </w:rPr>
+        <w:t>Es un método estático, que se busca usar, para cualquier cálculo que dependa de generar números aleatorios, por tanto puede ser usado por cualquiera en cualquier momento.</w:t>
+      </w:r>
+    </w:p>
+    <w:p>
+      <w:pPr>
+        <w:rPr>
+          <w:lang w:val="es-CO"/>
+        </w:rPr>
+      </w:pPr>
+      <w:r>
+        <w:rPr>
+          <w:lang w:val="es-CO"/>
+        </w:rPr>
+        <w:t xml:space="preserve">makeVisible(): Se encarga de mostrar el tablero y reposicionar </w:t>
+      </w:r>
+      <w:r>
+        <w:rPr>
+          <w:lang w:val="es-CO"/>
+        </w:rPr>
+        <w:t xml:space="preserve">las Wheel teniendo en cuenta que: </w:t>
+      </w:r>
+      <w:r>
+        <w:rPr>
+          <w:lang w:val="es-CO"/>
+        </w:rPr>
+        <w:t xml:space="preserve"> </w:t>
+      </w:r>
+      <w:r>
+        <w:rPr>
+          <w:lang w:val="es-CO"/>
+        </w:rPr>
+        <w:t xml:space="preserve">La distancia entre cada </w:t>
+      </w:r>
+      <w:r>
+        <w:rPr>
+          <w:lang w:val="es-CO"/>
+        </w:rPr>
+        <w:t>Wheel</w:t>
+      </w:r>
+      <w:r>
+        <w:rPr>
+          <w:lang w:val="es-CO"/>
+        </w:rPr>
+        <w:t xml:space="preserve"> y la distancia entre las </w:t>
+      </w:r>
+      <w:r>
+        <w:rPr>
+          <w:lang w:val="es-CO"/>
+        </w:rPr>
+        <w:t>Wheel</w:t>
+      </w:r>
+      <w:r>
+        <w:rPr>
+          <w:lang w:val="es-CO"/>
+        </w:rPr>
+        <w:t xml:space="preserve"> y los bordes laterales d</w:t>
+      </w:r>
+      <w:r>
+        <w:rPr>
+          <w:lang w:val="es-CO"/>
+        </w:rPr>
+        <w:t xml:space="preserve">e la maquina debe </w:t>
+      </w:r>
+      <w:r>
+        <w:rPr>
+          <w:lang w:val="es-CO"/>
+        </w:rPr>
+        <w:t>ser la misma</w:t>
+      </w:r>
+      <w:r>
+        <w:rPr>
+          <w:lang w:val="es-CO"/>
+        </w:rPr>
+        <w:t>.</w:t>
+      </w:r>
+    </w:p>
+    <w:p>
+      <w:pPr>
+        <w:rPr>
+          <w:lang w:val="es-CO"/>
+        </w:rPr>
+      </w:pPr>
+      <w:r>
+        <w:rPr>
+          <w:lang w:val="es-CO"/>
+        </w:rPr>
+        <w:drawing>
+          <wp:inline distT="0" distB="0" distL="0" distR="0" wp14:anchorId="16BC14C5" wp14:editId="6A17137A">
+            <wp:extent cx="5943600" cy="3581400"/>
+            <wp:effectExtent l="0" t="0" r="0" b="0"/>
+            <wp:docPr id="1658921134" name="Imagen 1"/>
+            <wp:cNvGraphicFramePr>
+              <a:graphicFrameLocks xmlns:a="http://schemas.openxmlformats.org/drawingml/2006/main" noChangeAspect="1"/>
+            </wp:cNvGraphicFramePr>
+            <a:graphic xmlns:a="http://schemas.openxmlformats.org/drawingml/2006/main">
+              <a:graphicData uri="http://schemas.openxmlformats.org/drawingml/2006/picture">
+                <pic:pic xmlns:pic="http://schemas.openxmlformats.org/drawingml/2006/picture">
+                  <pic:nvPicPr>
+                    <pic:cNvPr id="1658921134" name=""/>
+                    <pic:cNvPicPr/>
+                  </pic:nvPicPr>
+                  <pic:blipFill>
+                    <a:blip r:embed="rId16"/>
+                    <a:stretch>
+                      <a:fillRect/>
+                    </a:stretch>
+                  </pic:blipFill>
+                  <pic:spPr>
+                    <a:xfrm>
+                      <a:off x="0" y="0"/>
+                      <a:ext cx="5943600" cy="3581400"/>
+                    </a:xfrm>
+                    <a:prstGeom prst="rect">
+                      <a:avLst/>
+                    </a:prstGeom>
+                  </pic:spPr>
+                </pic:pic>
+              </a:graphicData>
+            </a:graphic>
+          </wp:inline>
+        </w:drawing>
+      </w:r>
+    </w:p>
+    <w:p>
+      <w:pPr>
+        <w:rPr>
+          <w:lang w:val="es-CO"/>
+        </w:rPr>
+      </w:pPr>
+      <w:r>
+        <w:rPr>
+          <w:lang w:val="es-CO"/>
+        </w:rPr>
+        <w:t>Esto sería una representación gráfica de lo que se busca hacer. Para resumir, la base de la maquina tendrá un tamaño X, y esos espacios entre las ruedas</w:t>
+      </w:r>
+      <w:r>
+        <w:rPr>
+          <w:lang w:val="es-CO"/>
+        </w:rPr>
+        <w:t xml:space="preserve"> tendrán una distancia Y, además de que </w:t>
+      </w:r>
+      <w:r>
+        <w:rPr>
+          <w:lang w:val="es-CO"/>
+        </w:rPr>
+        <w:t>habrá</w:t>
+      </w:r>
+      <w:r>
+        <w:rPr>
+          <w:lang w:val="es-CO"/>
+        </w:rPr>
+        <w:t xml:space="preserve"> N </w:t>
+      </w:r>
+      <w:r>
+        <w:rPr>
+          <w:lang w:val="es-CO"/>
+        </w:rPr>
+        <w:t>Wheels</w:t>
+      </w:r>
+      <w:r>
+        <w:rPr>
+          <w:lang w:val="es-CO"/>
+        </w:rPr>
+        <w:t xml:space="preserve">. Por </w:t>
+      </w:r>
+      <w:r>
+        <w:rPr>
+          <w:lang w:val="es-CO"/>
+        </w:rPr>
+        <w:t>tanto,</w:t>
+      </w:r>
+      <w:r>
+        <w:rPr>
+          <w:lang w:val="es-CO"/>
+        </w:rPr>
+        <w:t xml:space="preserve"> se deben hacer determinados cálculos para ser capaces de saber que tanta distancia dejar entre ellas.</w:t>
+      </w:r>
+    </w:p>
+    <w:p>
+      <w:pPr>
+        <w:rPr>
+          <w:lang w:val="es-CO"/>
+        </w:rPr>
+      </w:pPr>
+      <w:r>
+        <w:rPr>
+          <w:lang w:val="es-CO"/>
+        </w:rPr>
+        <w:lastRenderedPageBreak/>
+        <w:t>Puesto que el número de espacio Y que hay está determinado por la cantidad de ruedas más 1</w:t>
+      </w:r>
+      <w:r>
+        <w:rPr>
+          <w:lang w:val="es-CO"/>
+        </w:rPr>
+        <w:t>:</w:t>
+      </w:r>
+    </w:p>
+    <w:p>
+      <w:pPr>
+        <w:rPr>
+          <w:lang w:val="es-CO"/>
+        </w:rPr>
+      </w:pPr>
+      <w:r>
+        <w:rPr>
+          <w:lang w:val="es-CO"/>
+        </w:rPr>
+        <w:t xml:space="preserve">X = </w:t>
+      </w:r>
+      <w:r>
+        <w:rPr>
+          <w:lang w:val="es-CO"/>
+        </w:rPr>
+        <w:t>Y</w:t>
+      </w:r>
+      <w:r>
+        <w:rPr>
+          <w:lang w:val="es-CO"/>
+        </w:rPr>
+        <w:t>*</w:t>
+      </w:r>
+      <w:r>
+        <w:rPr>
+          <w:lang w:val="es-CO"/>
+        </w:rPr>
+        <w:t>(n + 1)</w:t>
+      </w:r>
+      <w:r>
+        <w:rPr>
+          <w:lang w:val="es-CO"/>
+        </w:rPr>
+        <w:t>+</w:t>
+      </w:r>
+      <w:r>
+        <w:rPr>
+          <w:lang w:val="es-CO"/>
+        </w:rPr>
+        <w:t>50*n</w:t>
+      </w:r>
+    </w:p>
+    <w:p>
+      <w:pPr>
+        <w:rPr>
+          <w:lang w:val="es-CO"/>
+        </w:rPr>
+      </w:pPr>
+      <w:r>
+        <w:rPr>
+          <w:lang w:val="es-CO"/>
+        </w:rPr>
+        <w:t>Si se sabe que n será un valor fijo y X también será un valor fijo, que irá aumentando de acuerdo a las ruedas que se vayan poniendo</w:t>
+      </w:r>
+      <w:r>
+        <w:rPr>
+          <w:lang w:val="es-CO"/>
+        </w:rPr>
+        <w:t>.</w:t>
+      </w:r>
+    </w:p>
+    <w:p>
+      <w:pPr>
+        <w:rPr>
+          <w:lang w:val="es-CO"/>
+        </w:rPr>
+      </w:pPr>
+      <w:r>
+        <w:rPr>
+          <w:lang w:val="es-CO"/>
+        </w:rPr>
+        <w:t xml:space="preserve">Y= </w:t>
+      </w:r>
+      <w:r>
+        <w:rPr>
+          <w:lang w:val="es-CO"/>
+        </w:rPr>
+        <w:t>(</w:t>
+      </w:r>
+      <w:r>
+        <w:rPr>
+          <w:lang w:val="es-CO"/>
+        </w:rPr>
+        <w:t>X</w:t>
+      </w:r>
+      <w:r>
+        <w:rPr>
+          <w:lang w:val="es-CO"/>
+        </w:rPr>
+        <w:t xml:space="preserve"> – 50*n)/</w:t>
+      </w:r>
+      <w:r>
+        <w:rPr>
+          <w:lang w:val="es-CO"/>
+        </w:rPr>
+        <w:t>(n+1)</w:t>
+      </w:r>
+    </w:p>
+    <w:p>
+      <w:pPr>
+        <w:rPr>
+          <w:lang w:val="es-CO"/>
+        </w:rPr>
+      </w:pPr>
+      <w:r>
+        <w:rPr>
+          <w:lang w:val="es-CO"/>
+        </w:rPr>
+        <w:drawing>
+          <wp:inline distT="0" distB="0" distL="0" distR="0" wp14:anchorId="40E59D09" wp14:editId="43C637FD">
+            <wp:extent cx="4001058" cy="2257740"/>
+            <wp:effectExtent l="0" t="0" r="0" b="9525"/>
+            <wp:docPr id="1975319967" name="Imagen 1"/>
+            <wp:cNvGraphicFramePr>
+              <a:graphicFrameLocks xmlns:a="http://schemas.openxmlformats.org/drawingml/2006/main" noChangeAspect="1"/>
+            </wp:cNvGraphicFramePr>
+            <a:graphic xmlns:a="http://schemas.openxmlformats.org/drawingml/2006/main">
+              <a:graphicData uri="http://schemas.openxmlformats.org/drawingml/2006/picture">
+                <pic:pic xmlns:pic="http://schemas.openxmlformats.org/drawingml/2006/picture">
+                  <pic:nvPicPr>
+                    <pic:cNvPr id="1975319967" name=""/>
+                    <pic:cNvPicPr/>
+                  </pic:nvPicPr>
+                  <pic:blipFill>
+                    <a:blip r:embed="rId17"/>
+                    <a:stretch>
+                      <a:fillRect/>
+                    </a:stretch>
+                  </pic:blipFill>
+                  <pic:spPr>
+                    <a:xfrm>
+                      <a:off x="0" y="0"/>
+                      <a:ext cx="4001058" cy="2257740"/>
+                    </a:xfrm>
+                    <a:prstGeom prst="rect">
+                      <a:avLst/>
+                    </a:prstGeom>
+                  </pic:spPr>
+                </pic:pic>
+              </a:graphicData>
+            </a:graphic>
+          </wp:inline>
+        </w:drawing>
+      </w:r>
+    </w:p>
+    <w:p>
+      <w:pPr>
+        <w:rPr>
+          <w:lang w:val="es-CO"/>
+        </w:rPr>
+      </w:pPr>
+      <w:r>
+        <w:rPr>
+          <w:lang w:val="es-CO"/>
+        </w:rPr>
+        <w:t>Este es un boceto actual de como se ve la maquina</w:t>
+      </w:r>
+      <w:r>
+        <w:rPr>
+          <w:lang w:val="es-CO"/>
+        </w:rPr>
+        <w:t xml:space="preserve"> en un estado actual</w:t>
+      </w:r>
+      <w:r>
+        <w:rPr>
+          <w:lang w:val="es-CO"/>
+        </w:rPr>
+        <w:t>, donde se crea y se ven las ruedas con sus símbolos.</w:t>
+      </w:r>
+    </w:p>
+    <w:p>
+      <w:pPr>
+        <w:rPr>
+          <w:lang w:val="es-CO"/>
+        </w:rPr>
+      </w:pPr>
+    </w:p>
+    <w:p>
+      <w:pPr>
+        <w:rPr>
+          <w:lang w:val="es-CO"/>
+        </w:rPr>
+      </w:pPr>
+      <w:r>
+        <w:rPr>
+          <w:lang w:val="es-CO"/>
+        </w:rPr>
+        <w:t xml:space="preserve">makeInvisible(): </w:t>
+      </w:r>
+      <w:r>
+        <w:rPr>
+          <w:lang w:val="es-CO"/>
+        </w:rPr>
+        <w:t>Se encarga de volver todo invisible.</w:t>
+      </w:r>
+    </w:p>
+    <w:p>
+      <w:pPr>
+        <w:rPr>
+          <w:lang w:val="es-CO"/>
+        </w:rPr>
+      </w:pPr>
+      <w:r>
+        <w:rPr>
+          <w:lang w:val="es-CO"/>
+        </w:rPr>
+        <w:lastRenderedPageBreak/>
+        <w:drawing>
+          <wp:inline distT="0" distB="0" distL="0" distR="0" wp14:anchorId="37821223" wp14:editId="4CB96237">
+            <wp:extent cx="5943600" cy="4065905"/>
+            <wp:effectExtent l="0" t="0" r="0" b="0"/>
+            <wp:docPr id="2086843071" name="Imagen 1"/>
+            <wp:cNvGraphicFramePr>
+              <a:graphicFrameLocks xmlns:a="http://schemas.openxmlformats.org/drawingml/2006/main" noChangeAspect="1"/>
+            </wp:cNvGraphicFramePr>
+            <a:graphic xmlns:a="http://schemas.openxmlformats.org/drawingml/2006/main">
+              <a:graphicData uri="http://schemas.openxmlformats.org/drawingml/2006/picture">
+                <pic:pic xmlns:pic="http://schemas.openxmlformats.org/drawingml/2006/picture">
+                  <pic:nvPicPr>
+                    <pic:cNvPr id="2086843071" name=""/>
+                    <pic:cNvPicPr/>
+                  </pic:nvPicPr>
+                  <pic:blipFill>
+                    <a:blip r:embed="rId18"/>
+                    <a:stretch>
+                      <a:fillRect/>
+                    </a:stretch>
+                  </pic:blipFill>
+                  <pic:spPr>
+                    <a:xfrm>
+                      <a:off x="0" y="0"/>
+                      <a:ext cx="5943600" cy="4065905"/>
+                    </a:xfrm>
+                    <a:prstGeom prst="rect">
+                      <a:avLst/>
+                    </a:prstGeom>
+                  </pic:spPr>
+                </pic:pic>
+              </a:graphicData>
+            </a:graphic>
+          </wp:inline>
+        </w:drawing>
+      </w:r>
+    </w:p>
+    <w:p>
+      <w:pPr>
+        <w:rPr>
+          <w:lang w:val="es-CO"/>
+        </w:rPr>
+      </w:pPr>
+      <w:r>
+        <w:rPr>
+          <w:lang w:val="es-CO"/>
+        </w:rPr>
+        <w:t>En esta se ve como quedó completamente vacía</w:t>
+      </w:r>
+    </w:p>
+    <w:p>
+      <w:pPr>
+        <w:rPr>
+          <w:lang w:val="es-CO"/>
+        </w:rPr>
+      </w:pPr>
+      <w:r>
+        <w:rPr>
+          <w:lang w:val="es-CO"/>
+        </w:rPr>
+        <w:t xml:space="preserve">Adicionalmente se le añadió un método a </w:t>
+      </w:r>
+      <w:r>
+        <w:rPr>
+          <w:lang w:val="es-CO"/>
+        </w:rPr>
+        <w:t>Wheel:</w:t>
+      </w:r>
+    </w:p>
+    <w:p>
+      <w:pPr>
+        <w:rPr>
+          <w:lang w:val="es-CO"/>
+        </w:rPr>
+      </w:pPr>
+      <w:r>
+        <w:rPr>
+          <w:lang w:val="es-CO"/>
+        </w:rPr>
+        <w:t xml:space="preserve">randomizeSymbol(): Se encarga de poner un símbolo aleatorio </w:t>
+      </w:r>
+      <w:r>
+        <w:rPr>
+          <w:lang w:val="es-CO"/>
+        </w:rPr>
+        <w:t>de su repertorio de símbolos.</w:t>
+      </w:r>
+    </w:p>
+    <w:p>
+      <w:pPr>
+        <w:rPr>
+          <w:lang w:val="es-CO"/>
+        </w:rPr>
+      </w:pPr>
+    </w:p>
+    <w:p>
+      <w:r>
+        <w:t>MiniCiclo 4:</w:t>
+      </w:r>
+      <w:r>
+        <w:t xml:space="preserve"> </w:t>
+      </w:r>
+      <w:r>
+        <w:t>Add</w:t>
+      </w:r>
+      <w:r>
+        <w:t xml:space="preserve">/Delete </w:t>
+      </w:r>
+      <w:r>
+        <w:t>Wheel</w:t>
+      </w:r>
+    </w:p>
+    <w:p>
+      <w:pPr>
+        <w:rPr>
+          <w:lang w:val="es-CO"/>
+        </w:rPr>
+      </w:pPr>
+      <w:r>
+        <w:rPr>
+          <w:lang w:val="es-CO"/>
+        </w:rPr>
+        <w:t>En este ciclo nos e</w:t>
+      </w:r>
+      <w:r>
+        <w:rPr>
+          <w:lang w:val="es-CO"/>
+        </w:rPr>
+        <w:t>ncargaremos de añadir una nueva Wheel en la maquina, probando de paso que nuestro algoritmo matemático para calcular el espacio y que quedé simétrico al ejecutar makeVisible() funcione.</w:t>
+      </w:r>
+    </w:p>
+    <w:p>
+      <w:pPr>
+        <w:rPr>
+          <w:lang w:val="es-CO"/>
+        </w:rPr>
+      </w:pPr>
+      <w:r>
+        <w:rPr>
+          <w:lang w:val="es-CO"/>
+        </w:rPr>
+        <w:t>Necesitaremos crear los siguiente métodos:</w:t>
+      </w:r>
+    </w:p>
+    <w:p>
+      <w:pPr>
+        <w:rPr>
+          <w:lang w:val="es-CO"/>
+        </w:rPr>
+      </w:pPr>
+      <w:r>
+        <w:rPr>
+          <w:lang w:val="es-CO"/>
+        </w:rPr>
+        <w:t xml:space="preserve">Symbols(): Para obtener todos los símbolos que se tienen actualmente, además de </w:t>
+      </w:r>
+      <w:r>
+        <w:rPr>
+          <w:lang w:val="es-CO"/>
+        </w:rPr>
+        <w:t>que estos estén en orden.</w:t>
+      </w:r>
+      <w:r>
+        <w:rPr>
+          <w:lang w:val="es-CO"/>
+        </w:rPr>
+        <w:t xml:space="preserve"> Esto también permite refactorizar parte del código para que quede un poco más limpio.</w:t>
+      </w:r>
+    </w:p>
+    <w:p>
+      <w:pPr>
+        <w:rPr>
+          <w:lang w:val="es-CO"/>
+        </w:rPr>
+      </w:pPr>
+      <w:r>
+        <w:rPr>
+          <w:lang w:val="es-CO"/>
+        </w:rPr>
+        <w:lastRenderedPageBreak/>
+        <w:t>Add</w:t>
+      </w:r>
+      <w:r>
+        <w:rPr>
+          <w:lang w:val="es-CO"/>
+        </w:rPr>
+        <w:t>Wheel(): Tiene el objetivo de agregar una nueva rueda, en una posición específica.</w:t>
+      </w:r>
+      <w:r>
+        <w:rPr>
+          <w:lang w:val="es-CO"/>
+        </w:rPr>
+        <w:t xml:space="preserve"> </w:t>
+      </w:r>
+      <w:r>
+        <w:rPr>
+          <w:lang w:val="es-CO"/>
+        </w:rPr>
+        <w:t>Teniendo en cuenta que las posiciones empiezan desde 1, si se pone un número menor a 1, se sigue tomando la primera, si es mayor al máximo, se toma como ese máximo.</w:t>
+      </w:r>
+    </w:p>
+    <w:p>
+      <w:pPr>
+        <w:rPr>
+          <w:lang w:val="es-CO"/>
+        </w:rPr>
+      </w:pPr>
+    </w:p>
+    <w:p>
+      <w:pPr>
+        <w:rPr>
+          <w:lang w:val="es-CO"/>
+        </w:rPr>
+      </w:pPr>
+    </w:p>
+    <w:p>
+      <w:pPr>
+        <w:rPr>
+          <w:lang w:val="es-CO"/>
+        </w:rPr>
+      </w:pPr>
     </w:p>
     <w:p>
       <w:pPr>
@@ -548,7 +2298,7 @@
       </w:pPr>
     </w:p>
     <w:sectPr>
-      <w:headerReference w:type="default" r:id="rId7"/>
+      <w:headerReference w:type="default" r:id="rId19"/>
       <w:pgSz w:w="12240" w:h="15840"/>
       <w:pgMar w:top="1440" w:right="1440" w:bottom="1440" w:left="1440" w:header="720" w:footer="720" w:gutter="0"/>
       <w:cols w:space="720"/>

</xml_diff>

<commit_message>
Added MiniCiclo 4: Add/Del Wheel
</commit_message>
<xml_diff>
--- a/Primer Ciclo/Primer Ciclo.docx
+++ b/Primer Ciclo/Primer Ciclo.docx
@@ -618,6 +618,54 @@
         <w:rPr>
           <w:lang w:val="es-CO"/>
         </w:rPr>
+        <w:lastRenderedPageBreak/>
+        <w:drawing>
+          <wp:inline distT="0" distB="0" distL="0" distR="0" wp14:anchorId="4DFBCD0B" wp14:editId="7F05CCF8">
+            <wp:extent cx="5943600" cy="1268095"/>
+            <wp:effectExtent l="0" t="0" r="0" b="8255"/>
+            <wp:docPr id="778857925" name="Imagen 1"/>
+            <wp:cNvGraphicFramePr>
+              <a:graphicFrameLocks xmlns:a="http://schemas.openxmlformats.org/drawingml/2006/main" noChangeAspect="1"/>
+            </wp:cNvGraphicFramePr>
+            <a:graphic xmlns:a="http://schemas.openxmlformats.org/drawingml/2006/main">
+              <a:graphicData uri="http://schemas.openxmlformats.org/drawingml/2006/picture">
+                <pic:pic xmlns:pic="http://schemas.openxmlformats.org/drawingml/2006/picture">
+                  <pic:nvPicPr>
+                    <pic:cNvPr id="778857925" name=""/>
+                    <pic:cNvPicPr/>
+                  </pic:nvPicPr>
+                  <pic:blipFill>
+                    <a:blip r:embed="rId9"/>
+                    <a:stretch>
+                      <a:fillRect/>
+                    </a:stretch>
+                  </pic:blipFill>
+                  <pic:spPr>
+                    <a:xfrm>
+                      <a:off x="0" y="0"/>
+                      <a:ext cx="5943600" cy="1268095"/>
+                    </a:xfrm>
+                    <a:prstGeom prst="rect">
+                      <a:avLst/>
+                    </a:prstGeom>
+                  </pic:spPr>
+                </pic:pic>
+              </a:graphicData>
+            </a:graphic>
+          </wp:inline>
+        </w:drawing>
+      </w:r>
+    </w:p>
+    <w:p>
+      <w:pPr>
+        <w:rPr>
+          <w:lang w:val="es-CO"/>
+        </w:rPr>
+      </w:pPr>
+      <w:r>
+        <w:rPr>
+          <w:lang w:val="es-CO"/>
+        </w:rPr>
         <w:t>makeVisible(): Debe volver visible el símbolo.</w:t>
       </w:r>
     </w:p>
@@ -631,40 +679,228 @@
         <w:rPr>
           <w:lang w:val="es-CO"/>
         </w:rPr>
+        <w:drawing>
+          <wp:inline distT="0" distB="0" distL="0" distR="0" wp14:anchorId="55FD177C" wp14:editId="697ADCEA">
+            <wp:extent cx="3134162" cy="1343212"/>
+            <wp:effectExtent l="0" t="0" r="9525" b="9525"/>
+            <wp:docPr id="296057985" name="Imagen 1"/>
+            <wp:cNvGraphicFramePr>
+              <a:graphicFrameLocks xmlns:a="http://schemas.openxmlformats.org/drawingml/2006/main" noChangeAspect="1"/>
+            </wp:cNvGraphicFramePr>
+            <a:graphic xmlns:a="http://schemas.openxmlformats.org/drawingml/2006/main">
+              <a:graphicData uri="http://schemas.openxmlformats.org/drawingml/2006/picture">
+                <pic:pic xmlns:pic="http://schemas.openxmlformats.org/drawingml/2006/picture">
+                  <pic:nvPicPr>
+                    <pic:cNvPr id="296057985" name=""/>
+                    <pic:cNvPicPr/>
+                  </pic:nvPicPr>
+                  <pic:blipFill>
+                    <a:blip r:embed="rId10"/>
+                    <a:stretch>
+                      <a:fillRect/>
+                    </a:stretch>
+                  </pic:blipFill>
+                  <pic:spPr>
+                    <a:xfrm>
+                      <a:off x="0" y="0"/>
+                      <a:ext cx="3134162" cy="1343212"/>
+                    </a:xfrm>
+                    <a:prstGeom prst="rect">
+                      <a:avLst/>
+                    </a:prstGeom>
+                  </pic:spPr>
+                </pic:pic>
+              </a:graphicData>
+            </a:graphic>
+          </wp:inline>
+        </w:drawing>
+      </w:r>
+    </w:p>
+    <w:p>
+      <w:pPr>
+        <w:rPr>
+          <w:lang w:val="es-CO"/>
+        </w:rPr>
+      </w:pPr>
+      <w:r>
+        <w:rPr>
+          <w:lang w:val="es-CO"/>
+        </w:rPr>
+        <w:t>makeInvisible(): Debe volver invisible el símbolo.</w:t>
+      </w:r>
+    </w:p>
+    <w:p>
+      <w:pPr>
+        <w:rPr>
+          <w:lang w:val="es-CO"/>
+        </w:rPr>
+      </w:pPr>
+      <w:r>
+        <w:rPr>
+          <w:lang w:val="es-CO"/>
+        </w:rPr>
+        <w:drawing>
+          <wp:inline distT="0" distB="0" distL="0" distR="0" wp14:anchorId="7C88D581" wp14:editId="28739FE3">
+            <wp:extent cx="3924848" cy="1486107"/>
+            <wp:effectExtent l="0" t="0" r="0" b="0"/>
+            <wp:docPr id="1890848180" name="Imagen 1"/>
+            <wp:cNvGraphicFramePr>
+              <a:graphicFrameLocks xmlns:a="http://schemas.openxmlformats.org/drawingml/2006/main" noChangeAspect="1"/>
+            </wp:cNvGraphicFramePr>
+            <a:graphic xmlns:a="http://schemas.openxmlformats.org/drawingml/2006/main">
+              <a:graphicData uri="http://schemas.openxmlformats.org/drawingml/2006/picture">
+                <pic:pic xmlns:pic="http://schemas.openxmlformats.org/drawingml/2006/picture">
+                  <pic:nvPicPr>
+                    <pic:cNvPr id="1890848180" name=""/>
+                    <pic:cNvPicPr/>
+                  </pic:nvPicPr>
+                  <pic:blipFill>
+                    <a:blip r:embed="rId11"/>
+                    <a:stretch>
+                      <a:fillRect/>
+                    </a:stretch>
+                  </pic:blipFill>
+                  <pic:spPr>
+                    <a:xfrm>
+                      <a:off x="0" y="0"/>
+                      <a:ext cx="3924848" cy="1486107"/>
+                    </a:xfrm>
+                    <a:prstGeom prst="rect">
+                      <a:avLst/>
+                    </a:prstGeom>
+                  </pic:spPr>
+                </pic:pic>
+              </a:graphicData>
+            </a:graphic>
+          </wp:inline>
+        </w:drawing>
+      </w:r>
+    </w:p>
+    <w:p>
+      <w:pPr>
+        <w:rPr>
+          <w:lang w:val="es-CO"/>
+        </w:rPr>
+      </w:pPr>
+      <w:r>
+        <w:rPr>
+          <w:lang w:val="es-CO"/>
+        </w:rPr>
+        <w:t>place()</w:t>
+      </w:r>
+      <w:r>
+        <w:rPr>
+          <w:lang w:val="es-CO"/>
+        </w:rPr>
+        <w:t>: Debe poner el símbolo en determinada posición.</w:t>
+      </w:r>
+    </w:p>
+    <w:p>
+      <w:pPr>
+        <w:rPr>
+          <w:lang w:val="es-CO"/>
+        </w:rPr>
+      </w:pPr>
+      <w:r>
+        <w:rPr>
+          <w:lang w:val="es-CO"/>
+        </w:rPr>
+        <w:drawing>
+          <wp:inline distT="0" distB="0" distL="0" distR="0" wp14:anchorId="7F348B8C" wp14:editId="7F6EB06B">
+            <wp:extent cx="5943600" cy="1841500"/>
+            <wp:effectExtent l="0" t="0" r="0" b="6350"/>
+            <wp:docPr id="307164237" name="Imagen 1"/>
+            <wp:cNvGraphicFramePr>
+              <a:graphicFrameLocks xmlns:a="http://schemas.openxmlformats.org/drawingml/2006/main" noChangeAspect="1"/>
+            </wp:cNvGraphicFramePr>
+            <a:graphic xmlns:a="http://schemas.openxmlformats.org/drawingml/2006/main">
+              <a:graphicData uri="http://schemas.openxmlformats.org/drawingml/2006/picture">
+                <pic:pic xmlns:pic="http://schemas.openxmlformats.org/drawingml/2006/picture">
+                  <pic:nvPicPr>
+                    <pic:cNvPr id="307164237" name=""/>
+                    <pic:cNvPicPr/>
+                  </pic:nvPicPr>
+                  <pic:blipFill>
+                    <a:blip r:embed="rId12"/>
+                    <a:stretch>
+                      <a:fillRect/>
+                    </a:stretch>
+                  </pic:blipFill>
+                  <pic:spPr>
+                    <a:xfrm>
+                      <a:off x="0" y="0"/>
+                      <a:ext cx="5943600" cy="1841500"/>
+                    </a:xfrm>
+                    <a:prstGeom prst="rect">
+                      <a:avLst/>
+                    </a:prstGeom>
+                  </pic:spPr>
+                </pic:pic>
+              </a:graphicData>
+            </a:graphic>
+          </wp:inline>
+        </w:drawing>
+      </w:r>
+    </w:p>
+    <w:p>
+      <w:pPr>
+        <w:rPr>
+          <w:lang w:val="es-CO"/>
+        </w:rPr>
+      </w:pPr>
+      <w:r>
+        <w:rPr>
+          <w:lang w:val="es-CO"/>
+        </w:rPr>
+        <w:t>getColor(): Para obtener el nombre del color que tiene symbol.</w:t>
+      </w:r>
+    </w:p>
+    <w:p>
+      <w:pPr>
+        <w:rPr>
+          <w:lang w:val="es-CO"/>
+        </w:rPr>
+      </w:pPr>
+      <w:r>
+        <w:rPr>
+          <w:lang w:val="es-CO"/>
+        </w:rPr>
         <w:lastRenderedPageBreak/>
-        <w:t>makeInvisible(): Debe volver invisible el símbolo.</w:t>
-      </w:r>
-    </w:p>
-    <w:p>
-      <w:pPr>
-        <w:rPr>
-          <w:lang w:val="es-CO"/>
-        </w:rPr>
-      </w:pPr>
-      <w:r>
-        <w:rPr>
-          <w:lang w:val="es-CO"/>
-        </w:rPr>
-        <w:t>placeSymbol()</w:t>
-      </w:r>
-      <w:r>
-        <w:rPr>
-          <w:lang w:val="es-CO"/>
-        </w:rPr>
-        <w:t>: Debe poner el símbolo en determinada posición.</w:t>
-      </w:r>
-    </w:p>
-    <w:p>
-      <w:pPr>
-        <w:rPr>
-          <w:lang w:val="es-CO"/>
-        </w:rPr>
-      </w:pPr>
-      <w:r>
-        <w:rPr>
-          <w:lang w:val="es-CO"/>
-        </w:rPr>
-        <w:t>getColor(): Para obtener el nombre del color que tiene symbol.</w:t>
+        <w:drawing>
+          <wp:inline distT="0" distB="0" distL="0" distR="0" wp14:anchorId="139B6065" wp14:editId="4ACDC9A6">
+            <wp:extent cx="3839111" cy="1505160"/>
+            <wp:effectExtent l="0" t="0" r="9525" b="0"/>
+            <wp:docPr id="380179971" name="Imagen 1"/>
+            <wp:cNvGraphicFramePr>
+              <a:graphicFrameLocks xmlns:a="http://schemas.openxmlformats.org/drawingml/2006/main" noChangeAspect="1"/>
+            </wp:cNvGraphicFramePr>
+            <a:graphic xmlns:a="http://schemas.openxmlformats.org/drawingml/2006/main">
+              <a:graphicData uri="http://schemas.openxmlformats.org/drawingml/2006/picture">
+                <pic:pic xmlns:pic="http://schemas.openxmlformats.org/drawingml/2006/picture">
+                  <pic:nvPicPr>
+                    <pic:cNvPr id="380179971" name=""/>
+                    <pic:cNvPicPr/>
+                  </pic:nvPicPr>
+                  <pic:blipFill>
+                    <a:blip r:embed="rId13"/>
+                    <a:stretch>
+                      <a:fillRect/>
+                    </a:stretch>
+                  </pic:blipFill>
+                  <pic:spPr>
+                    <a:xfrm>
+                      <a:off x="0" y="0"/>
+                      <a:ext cx="3839111" cy="1505160"/>
+                    </a:xfrm>
+                    <a:prstGeom prst="rect">
+                      <a:avLst/>
+                    </a:prstGeom>
+                  </pic:spPr>
+                </pic:pic>
+              </a:graphicData>
+            </a:graphic>
+          </wp:inline>
+        </w:drawing>
       </w:r>
     </w:p>
     <w:p>
@@ -706,7 +942,7 @@
                     <pic:cNvPicPr/>
                   </pic:nvPicPr>
                   <pic:blipFill>
-                    <a:blip r:embed="rId9"/>
+                    <a:blip r:embed="rId14"/>
                     <a:stretch>
                       <a:fillRect/>
                     </a:stretch>
@@ -877,7 +1113,7 @@
                     <pic:cNvPicPr/>
                   </pic:nvPicPr>
                   <pic:blipFill>
-                    <a:blip r:embed="rId10"/>
+                    <a:blip r:embed="rId15"/>
                     <a:stretch>
                       <a:fillRect/>
                     </a:stretch>
@@ -977,6 +1213,7 @@
         <w:rPr>
           <w:lang w:val="es-CO"/>
         </w:rPr>
+        <w:lastRenderedPageBreak/>
         <w:t>isVisible permite saber si está visible o no</w:t>
       </w:r>
       <w:r>
@@ -1009,7 +1246,6 @@
         <w:rPr>
           <w:lang w:val="es-CO"/>
         </w:rPr>
-        <w:lastRenderedPageBreak/>
         <w:drawing>
           <wp:inline distT="0" distB="0" distL="0" distR="0" wp14:anchorId="38F0C526" wp14:editId="07C82065">
             <wp:extent cx="3219899" cy="2743583"/>
@@ -1026,7 +1262,7 @@
                     <pic:cNvPicPr/>
                   </pic:nvPicPr>
                   <pic:blipFill>
-                    <a:blip r:embed="rId11"/>
+                    <a:blip r:embed="rId16"/>
                     <a:stretch>
                       <a:fillRect/>
                     </a:stretch>
@@ -1083,6 +1319,53 @@
         <w:rPr>
           <w:lang w:val="es-CO"/>
         </w:rPr>
+        <w:drawing>
+          <wp:inline distT="0" distB="0" distL="0" distR="0" wp14:anchorId="4260D5EE" wp14:editId="17FBF078">
+            <wp:extent cx="5334744" cy="1810003"/>
+            <wp:effectExtent l="0" t="0" r="0" b="0"/>
+            <wp:docPr id="2097418769" name="Imagen 1"/>
+            <wp:cNvGraphicFramePr>
+              <a:graphicFrameLocks xmlns:a="http://schemas.openxmlformats.org/drawingml/2006/main" noChangeAspect="1"/>
+            </wp:cNvGraphicFramePr>
+            <a:graphic xmlns:a="http://schemas.openxmlformats.org/drawingml/2006/main">
+              <a:graphicData uri="http://schemas.openxmlformats.org/drawingml/2006/picture">
+                <pic:pic xmlns:pic="http://schemas.openxmlformats.org/drawingml/2006/picture">
+                  <pic:nvPicPr>
+                    <pic:cNvPr id="2097418769" name=""/>
+                    <pic:cNvPicPr/>
+                  </pic:nvPicPr>
+                  <pic:blipFill>
+                    <a:blip r:embed="rId17"/>
+                    <a:stretch>
+                      <a:fillRect/>
+                    </a:stretch>
+                  </pic:blipFill>
+                  <pic:spPr>
+                    <a:xfrm>
+                      <a:off x="0" y="0"/>
+                      <a:ext cx="5334744" cy="1810003"/>
+                    </a:xfrm>
+                    <a:prstGeom prst="rect">
+                      <a:avLst/>
+                    </a:prstGeom>
+                  </pic:spPr>
+                </pic:pic>
+              </a:graphicData>
+            </a:graphic>
+          </wp:inline>
+        </w:drawing>
+      </w:r>
+    </w:p>
+    <w:p>
+      <w:pPr>
+        <w:rPr>
+          <w:lang w:val="es-CO"/>
+        </w:rPr>
+      </w:pPr>
+      <w:r>
+        <w:rPr>
+          <w:lang w:val="es-CO"/>
+        </w:rPr>
         <w:t>makeVisible(): Se encarga de volver visible a</w:t>
       </w:r>
       <w:r>
@@ -1102,6 +1385,54 @@
         <w:rPr>
           <w:lang w:val="es-CO"/>
         </w:rPr>
+        <w:drawing>
+          <wp:inline distT="0" distB="0" distL="0" distR="0" wp14:anchorId="7F8D4D29" wp14:editId="1A0303C3">
+            <wp:extent cx="5943600" cy="657860"/>
+            <wp:effectExtent l="0" t="0" r="0" b="8890"/>
+            <wp:docPr id="1563931222" name="Imagen 1"/>
+            <wp:cNvGraphicFramePr>
+              <a:graphicFrameLocks xmlns:a="http://schemas.openxmlformats.org/drawingml/2006/main" noChangeAspect="1"/>
+            </wp:cNvGraphicFramePr>
+            <a:graphic xmlns:a="http://schemas.openxmlformats.org/drawingml/2006/main">
+              <a:graphicData uri="http://schemas.openxmlformats.org/drawingml/2006/picture">
+                <pic:pic xmlns:pic="http://schemas.openxmlformats.org/drawingml/2006/picture">
+                  <pic:nvPicPr>
+                    <pic:cNvPr id="1563931222" name=""/>
+                    <pic:cNvPicPr/>
+                  </pic:nvPicPr>
+                  <pic:blipFill>
+                    <a:blip r:embed="rId18"/>
+                    <a:stretch>
+                      <a:fillRect/>
+                    </a:stretch>
+                  </pic:blipFill>
+                  <pic:spPr>
+                    <a:xfrm>
+                      <a:off x="0" y="0"/>
+                      <a:ext cx="5943600" cy="657860"/>
+                    </a:xfrm>
+                    <a:prstGeom prst="rect">
+                      <a:avLst/>
+                    </a:prstGeom>
+                  </pic:spPr>
+                </pic:pic>
+              </a:graphicData>
+            </a:graphic>
+          </wp:inline>
+        </w:drawing>
+      </w:r>
+    </w:p>
+    <w:p>
+      <w:pPr>
+        <w:rPr>
+          <w:lang w:val="es-CO"/>
+        </w:rPr>
+      </w:pPr>
+      <w:r>
+        <w:rPr>
+          <w:lang w:val="es-CO"/>
+        </w:rPr>
+        <w:lastRenderedPageBreak/>
         <w:t>makeInvisible(): Se encarga de volver invisible a Wheel y al símbolo que tenga actualmente.</w:t>
       </w:r>
     </w:p>
@@ -1115,6 +1446,53 @@
         <w:rPr>
           <w:lang w:val="es-CO"/>
         </w:rPr>
+        <w:drawing>
+          <wp:inline distT="0" distB="0" distL="0" distR="0" wp14:anchorId="5D78B5A8" wp14:editId="7ADDE2FE">
+            <wp:extent cx="4648849" cy="1648055"/>
+            <wp:effectExtent l="0" t="0" r="0" b="9525"/>
+            <wp:docPr id="2065929255" name="Imagen 1"/>
+            <wp:cNvGraphicFramePr>
+              <a:graphicFrameLocks xmlns:a="http://schemas.openxmlformats.org/drawingml/2006/main" noChangeAspect="1"/>
+            </wp:cNvGraphicFramePr>
+            <a:graphic xmlns:a="http://schemas.openxmlformats.org/drawingml/2006/main">
+              <a:graphicData uri="http://schemas.openxmlformats.org/drawingml/2006/picture">
+                <pic:pic xmlns:pic="http://schemas.openxmlformats.org/drawingml/2006/picture">
+                  <pic:nvPicPr>
+                    <pic:cNvPr id="2065929255" name=""/>
+                    <pic:cNvPicPr/>
+                  </pic:nvPicPr>
+                  <pic:blipFill>
+                    <a:blip r:embed="rId19"/>
+                    <a:stretch>
+                      <a:fillRect/>
+                    </a:stretch>
+                  </pic:blipFill>
+                  <pic:spPr>
+                    <a:xfrm>
+                      <a:off x="0" y="0"/>
+                      <a:ext cx="4648849" cy="1648055"/>
+                    </a:xfrm>
+                    <a:prstGeom prst="rect">
+                      <a:avLst/>
+                    </a:prstGeom>
+                  </pic:spPr>
+                </pic:pic>
+              </a:graphicData>
+            </a:graphic>
+          </wp:inline>
+        </w:drawing>
+      </w:r>
+    </w:p>
+    <w:p>
+      <w:pPr>
+        <w:rPr>
+          <w:lang w:val="es-CO"/>
+        </w:rPr>
+      </w:pPr>
+      <w:r>
+        <w:rPr>
+          <w:lang w:val="es-CO"/>
+        </w:rPr>
         <w:t>Place(): Se encarga de poner a la rueda en una posición específica.</w:t>
       </w:r>
     </w:p>
@@ -1128,6 +1506,53 @@
         <w:rPr>
           <w:lang w:val="es-CO"/>
         </w:rPr>
+        <w:drawing>
+          <wp:inline distT="0" distB="0" distL="0" distR="0" wp14:anchorId="08CBD3ED" wp14:editId="6853BC22">
+            <wp:extent cx="5943600" cy="1873250"/>
+            <wp:effectExtent l="0" t="0" r="0" b="0"/>
+            <wp:docPr id="1333899185" name="Imagen 1"/>
+            <wp:cNvGraphicFramePr>
+              <a:graphicFrameLocks xmlns:a="http://schemas.openxmlformats.org/drawingml/2006/main" noChangeAspect="1"/>
+            </wp:cNvGraphicFramePr>
+            <a:graphic xmlns:a="http://schemas.openxmlformats.org/drawingml/2006/main">
+              <a:graphicData uri="http://schemas.openxmlformats.org/drawingml/2006/picture">
+                <pic:pic xmlns:pic="http://schemas.openxmlformats.org/drawingml/2006/picture">
+                  <pic:nvPicPr>
+                    <pic:cNvPr id="1333899185" name=""/>
+                    <pic:cNvPicPr/>
+                  </pic:nvPicPr>
+                  <pic:blipFill>
+                    <a:blip r:embed="rId20"/>
+                    <a:stretch>
+                      <a:fillRect/>
+                    </a:stretch>
+                  </pic:blipFill>
+                  <pic:spPr>
+                    <a:xfrm>
+                      <a:off x="0" y="0"/>
+                      <a:ext cx="5943600" cy="1873250"/>
+                    </a:xfrm>
+                    <a:prstGeom prst="rect">
+                      <a:avLst/>
+                    </a:prstGeom>
+                  </pic:spPr>
+                </pic:pic>
+              </a:graphicData>
+            </a:graphic>
+          </wp:inline>
+        </w:drawing>
+      </w:r>
+    </w:p>
+    <w:p>
+      <w:pPr>
+        <w:rPr>
+          <w:lang w:val="es-CO"/>
+        </w:rPr>
+      </w:pPr>
+      <w:r>
+        <w:rPr>
+          <w:lang w:val="es-CO"/>
+        </w:rPr>
         <w:t>addSymbol</w:t>
       </w:r>
       <w:r>
@@ -1159,6 +1584,53 @@
         <w:rPr>
           <w:lang w:val="es-CO"/>
         </w:rPr>
+        <w:drawing>
+          <wp:inline distT="0" distB="0" distL="0" distR="0" wp14:anchorId="6E8A92BD" wp14:editId="552C4E40">
+            <wp:extent cx="3096057" cy="1333686"/>
+            <wp:effectExtent l="0" t="0" r="9525" b="0"/>
+            <wp:docPr id="372217502" name="Imagen 1"/>
+            <wp:cNvGraphicFramePr>
+              <a:graphicFrameLocks xmlns:a="http://schemas.openxmlformats.org/drawingml/2006/main" noChangeAspect="1"/>
+            </wp:cNvGraphicFramePr>
+            <a:graphic xmlns:a="http://schemas.openxmlformats.org/drawingml/2006/main">
+              <a:graphicData uri="http://schemas.openxmlformats.org/drawingml/2006/picture">
+                <pic:pic xmlns:pic="http://schemas.openxmlformats.org/drawingml/2006/picture">
+                  <pic:nvPicPr>
+                    <pic:cNvPr id="372217502" name=""/>
+                    <pic:cNvPicPr/>
+                  </pic:nvPicPr>
+                  <pic:blipFill>
+                    <a:blip r:embed="rId21"/>
+                    <a:stretch>
+                      <a:fillRect/>
+                    </a:stretch>
+                  </pic:blipFill>
+                  <pic:spPr>
+                    <a:xfrm>
+                      <a:off x="0" y="0"/>
+                      <a:ext cx="3096057" cy="1333686"/>
+                    </a:xfrm>
+                    <a:prstGeom prst="rect">
+                      <a:avLst/>
+                    </a:prstGeom>
+                  </pic:spPr>
+                </pic:pic>
+              </a:graphicData>
+            </a:graphic>
+          </wp:inline>
+        </w:drawing>
+      </w:r>
+    </w:p>
+    <w:p>
+      <w:pPr>
+        <w:rPr>
+          <w:lang w:val="es-CO"/>
+        </w:rPr>
+      </w:pPr>
+      <w:r>
+        <w:rPr>
+          <w:lang w:val="es-CO"/>
+        </w:rPr>
         <w:t>deleteSymbol(): Se encarga de borrar un símbolo de la rueda</w:t>
       </w:r>
       <w:r>
@@ -1166,6 +1638,54 @@
           <w:lang w:val="es-CO"/>
         </w:rPr>
         <w:t>.</w:t>
+      </w:r>
+    </w:p>
+    <w:p>
+      <w:pPr>
+        <w:rPr>
+          <w:lang w:val="es-CO"/>
+        </w:rPr>
+      </w:pPr>
+      <w:r>
+        <w:rPr>
+          <w:lang w:val="es-CO"/>
+        </w:rPr>
+        <w:lastRenderedPageBreak/>
+        <w:drawing>
+          <wp:inline distT="0" distB="0" distL="0" distR="0" wp14:anchorId="36DF256D" wp14:editId="29AB9653">
+            <wp:extent cx="4267796" cy="1991003"/>
+            <wp:effectExtent l="0" t="0" r="0" b="9525"/>
+            <wp:docPr id="636008894" name="Imagen 1"/>
+            <wp:cNvGraphicFramePr>
+              <a:graphicFrameLocks xmlns:a="http://schemas.openxmlformats.org/drawingml/2006/main" noChangeAspect="1"/>
+            </wp:cNvGraphicFramePr>
+            <a:graphic xmlns:a="http://schemas.openxmlformats.org/drawingml/2006/main">
+              <a:graphicData uri="http://schemas.openxmlformats.org/drawingml/2006/picture">
+                <pic:pic xmlns:pic="http://schemas.openxmlformats.org/drawingml/2006/picture">
+                  <pic:nvPicPr>
+                    <pic:cNvPr id="636008894" name=""/>
+                    <pic:cNvPicPr/>
+                  </pic:nvPicPr>
+                  <pic:blipFill>
+                    <a:blip r:embed="rId22"/>
+                    <a:stretch>
+                      <a:fillRect/>
+                    </a:stretch>
+                  </pic:blipFill>
+                  <pic:spPr>
+                    <a:xfrm>
+                      <a:off x="0" y="0"/>
+                      <a:ext cx="4267796" cy="1991003"/>
+                    </a:xfrm>
+                    <a:prstGeom prst="rect">
+                      <a:avLst/>
+                    </a:prstGeom>
+                  </pic:spPr>
+                </pic:pic>
+              </a:graphicData>
+            </a:graphic>
+          </wp:inline>
+        </w:drawing>
       </w:r>
     </w:p>
     <w:p>
@@ -1207,7 +1727,7 @@
                     <pic:cNvPicPr/>
                   </pic:nvPicPr>
                   <pic:blipFill>
-                    <a:blip r:embed="rId12"/>
+                    <a:blip r:embed="rId23"/>
                     <a:stretch>
                       <a:fillRect/>
                     </a:stretch>
@@ -1271,7 +1791,6 @@
         <w:rPr>
           <w:lang w:val="es-CO"/>
         </w:rPr>
-        <w:lastRenderedPageBreak/>
         <w:drawing>
           <wp:inline distT="0" distB="0" distL="0" distR="0" wp14:anchorId="25F04472" wp14:editId="0D7E9F2C">
             <wp:extent cx="704948" cy="1086002"/>
@@ -1288,7 +1807,7 @@
                     <pic:cNvPicPr/>
                   </pic:nvPicPr>
                   <pic:blipFill>
-                    <a:blip r:embed="rId13"/>
+                    <a:blip r:embed="rId24"/>
                     <a:stretch>
                       <a:fillRect/>
                     </a:stretch>
@@ -1348,7 +1867,7 @@
                     <pic:cNvPicPr/>
                   </pic:nvPicPr>
                   <pic:blipFill>
-                    <a:blip r:embed="rId14"/>
+                    <a:blip r:embed="rId25"/>
                     <a:stretch>
                       <a:fillRect/>
                     </a:stretch>
@@ -1411,6 +1930,7 @@
         <w:rPr>
           <w:lang w:val="es-CO"/>
         </w:rPr>
+        <w:lastRenderedPageBreak/>
         <w:drawing>
           <wp:inline distT="0" distB="0" distL="0" distR="0" wp14:anchorId="730B8B58" wp14:editId="1CEDB2EC">
             <wp:extent cx="3419952" cy="885949"/>
@@ -1427,7 +1947,7 @@
                     <pic:cNvPicPr/>
                   </pic:nvPicPr>
                   <pic:blipFill>
-                    <a:blip r:embed="rId15"/>
+                    <a:blip r:embed="rId26"/>
                     <a:stretch>
                       <a:fillRect/>
                     </a:stretch>
@@ -1519,6 +2039,46 @@
           <w:lang w:val="es-CO"/>
         </w:rPr>
       </w:pPr>
+      <w:r>
+        <w:rPr>
+          <w:lang w:val="es-CO"/>
+        </w:rPr>
+        <w:drawing>
+          <wp:inline distT="0" distB="0" distL="0" distR="0" wp14:anchorId="529DFCDE" wp14:editId="11FABBB9">
+            <wp:extent cx="3810532" cy="647790"/>
+            <wp:effectExtent l="0" t="0" r="0" b="0"/>
+            <wp:docPr id="1984519304" name="Imagen 1"/>
+            <wp:cNvGraphicFramePr>
+              <a:graphicFrameLocks xmlns:a="http://schemas.openxmlformats.org/drawingml/2006/main" noChangeAspect="1"/>
+            </wp:cNvGraphicFramePr>
+            <a:graphic xmlns:a="http://schemas.openxmlformats.org/drawingml/2006/main">
+              <a:graphicData uri="http://schemas.openxmlformats.org/drawingml/2006/picture">
+                <pic:pic xmlns:pic="http://schemas.openxmlformats.org/drawingml/2006/picture">
+                  <pic:nvPicPr>
+                    <pic:cNvPr id="1984519304" name=""/>
+                    <pic:cNvPicPr/>
+                  </pic:nvPicPr>
+                  <pic:blipFill>
+                    <a:blip r:embed="rId27"/>
+                    <a:stretch>
+                      <a:fillRect/>
+                    </a:stretch>
+                  </pic:blipFill>
+                  <pic:spPr>
+                    <a:xfrm>
+                      <a:off x="0" y="0"/>
+                      <a:ext cx="3810532" cy="647790"/>
+                    </a:xfrm>
+                    <a:prstGeom prst="rect">
+                      <a:avLst/>
+                    </a:prstGeom>
+                  </pic:spPr>
+                </pic:pic>
+              </a:graphicData>
+            </a:graphic>
+          </wp:inline>
+        </w:drawing>
+      </w:r>
     </w:p>
     <w:p>
       <w:pPr>
@@ -1568,6 +2128,54 @@
         <w:rPr>
           <w:lang w:val="es-CO"/>
         </w:rPr>
+        <w:drawing>
+          <wp:inline distT="0" distB="0" distL="0" distR="0" wp14:anchorId="7EEF9A8F" wp14:editId="49095D9B">
+            <wp:extent cx="5430008" cy="3620005"/>
+            <wp:effectExtent l="0" t="0" r="0" b="0"/>
+            <wp:docPr id="811646256" name="Imagen 1"/>
+            <wp:cNvGraphicFramePr>
+              <a:graphicFrameLocks xmlns:a="http://schemas.openxmlformats.org/drawingml/2006/main" noChangeAspect="1"/>
+            </wp:cNvGraphicFramePr>
+            <a:graphic xmlns:a="http://schemas.openxmlformats.org/drawingml/2006/main">
+              <a:graphicData uri="http://schemas.openxmlformats.org/drawingml/2006/picture">
+                <pic:pic xmlns:pic="http://schemas.openxmlformats.org/drawingml/2006/picture">
+                  <pic:nvPicPr>
+                    <pic:cNvPr id="811646256" name=""/>
+                    <pic:cNvPicPr/>
+                  </pic:nvPicPr>
+                  <pic:blipFill>
+                    <a:blip r:embed="rId28"/>
+                    <a:stretch>
+                      <a:fillRect/>
+                    </a:stretch>
+                  </pic:blipFill>
+                  <pic:spPr>
+                    <a:xfrm>
+                      <a:off x="0" y="0"/>
+                      <a:ext cx="5430008" cy="3620005"/>
+                    </a:xfrm>
+                    <a:prstGeom prst="rect">
+                      <a:avLst/>
+                    </a:prstGeom>
+                  </pic:spPr>
+                </pic:pic>
+              </a:graphicData>
+            </a:graphic>
+          </wp:inline>
+        </w:drawing>
+      </w:r>
+    </w:p>
+    <w:p>
+      <w:pPr>
+        <w:rPr>
+          <w:lang w:val="es-CO"/>
+        </w:rPr>
+      </w:pPr>
+      <w:r>
+        <w:rPr>
+          <w:lang w:val="es-CO"/>
+        </w:rPr>
+        <w:lastRenderedPageBreak/>
         <w:t>prepareMachine(): Se encarga de poner en un estado inicial al tablero</w:t>
       </w:r>
       <w:r>
@@ -1587,32 +2195,337 @@
         <w:rPr>
           <w:lang w:val="es-CO"/>
         </w:rPr>
+        <w:drawing>
+          <wp:inline distT="0" distB="0" distL="0" distR="0" wp14:anchorId="3788328C" wp14:editId="412C8C69">
+            <wp:extent cx="5943600" cy="1344930"/>
+            <wp:effectExtent l="0" t="0" r="0" b="7620"/>
+            <wp:docPr id="1692553323" name="Imagen 1"/>
+            <wp:cNvGraphicFramePr>
+              <a:graphicFrameLocks xmlns:a="http://schemas.openxmlformats.org/drawingml/2006/main" noChangeAspect="1"/>
+            </wp:cNvGraphicFramePr>
+            <a:graphic xmlns:a="http://schemas.openxmlformats.org/drawingml/2006/main">
+              <a:graphicData uri="http://schemas.openxmlformats.org/drawingml/2006/picture">
+                <pic:pic xmlns:pic="http://schemas.openxmlformats.org/drawingml/2006/picture">
+                  <pic:nvPicPr>
+                    <pic:cNvPr id="1692553323" name=""/>
+                    <pic:cNvPicPr/>
+                  </pic:nvPicPr>
+                  <pic:blipFill>
+                    <a:blip r:embed="rId29"/>
+                    <a:stretch>
+                      <a:fillRect/>
+                    </a:stretch>
+                  </pic:blipFill>
+                  <pic:spPr>
+                    <a:xfrm>
+                      <a:off x="0" y="0"/>
+                      <a:ext cx="5943600" cy="1344930"/>
+                    </a:xfrm>
+                    <a:prstGeom prst="rect">
+                      <a:avLst/>
+                    </a:prstGeom>
+                  </pic:spPr>
+                </pic:pic>
+              </a:graphicData>
+            </a:graphic>
+          </wp:inline>
+        </w:drawing>
+      </w:r>
+    </w:p>
+    <w:p>
+      <w:pPr>
+        <w:rPr>
+          <w:lang w:val="es-CO"/>
+        </w:rPr>
+      </w:pPr>
+      <w:r>
+        <w:rPr>
+          <w:lang w:val="es-CO"/>
+        </w:rPr>
+        <w:t xml:space="preserve">prepareSymbols(): Se encarga de crear unos símbolos predeterminados con el color </w:t>
+      </w:r>
+      <w:r>
+        <w:rPr>
+          <w:lang w:val="es-CO"/>
+        </w:rPr>
+        <w:t xml:space="preserve">verde, </w:t>
+      </w:r>
+      <w:r>
+        <w:rPr>
+          <w:lang w:val="es-CO"/>
+        </w:rPr>
+        <w:t>rojo</w:t>
+      </w:r>
+      <w:r>
+        <w:rPr>
+          <w:lang w:val="es-CO"/>
+        </w:rPr>
+        <w:t xml:space="preserve"> y</w:t>
+      </w:r>
+      <w:r>
+        <w:rPr>
+          <w:lang w:val="es-CO"/>
+        </w:rPr>
+        <w:t xml:space="preserve"> azul</w:t>
+      </w:r>
+      <w:r>
+        <w:rPr>
+          <w:lang w:val="es-CO"/>
+        </w:rPr>
+        <w:t>.</w:t>
+      </w:r>
+    </w:p>
+    <w:p>
+      <w:pPr>
+        <w:rPr>
+          <w:lang w:val="es-CO"/>
+        </w:rPr>
+      </w:pPr>
+      <w:r>
+        <w:rPr>
+          <w:lang w:val="es-CO"/>
+        </w:rPr>
+        <w:drawing>
+          <wp:inline distT="0" distB="0" distL="0" distR="0" wp14:anchorId="624082ED" wp14:editId="0C9B90AD">
+            <wp:extent cx="5943600" cy="1827530"/>
+            <wp:effectExtent l="0" t="0" r="0" b="1270"/>
+            <wp:docPr id="1152489133" name="Imagen 1"/>
+            <wp:cNvGraphicFramePr>
+              <a:graphicFrameLocks xmlns:a="http://schemas.openxmlformats.org/drawingml/2006/main" noChangeAspect="1"/>
+            </wp:cNvGraphicFramePr>
+            <a:graphic xmlns:a="http://schemas.openxmlformats.org/drawingml/2006/main">
+              <a:graphicData uri="http://schemas.openxmlformats.org/drawingml/2006/picture">
+                <pic:pic xmlns:pic="http://schemas.openxmlformats.org/drawingml/2006/picture">
+                  <pic:nvPicPr>
+                    <pic:cNvPr id="1152489133" name=""/>
+                    <pic:cNvPicPr/>
+                  </pic:nvPicPr>
+                  <pic:blipFill>
+                    <a:blip r:embed="rId30"/>
+                    <a:stretch>
+                      <a:fillRect/>
+                    </a:stretch>
+                  </pic:blipFill>
+                  <pic:spPr>
+                    <a:xfrm>
+                      <a:off x="0" y="0"/>
+                      <a:ext cx="5943600" cy="1827530"/>
+                    </a:xfrm>
+                    <a:prstGeom prst="rect">
+                      <a:avLst/>
+                    </a:prstGeom>
+                  </pic:spPr>
+                </pic:pic>
+              </a:graphicData>
+            </a:graphic>
+          </wp:inline>
+        </w:drawing>
+      </w:r>
+    </w:p>
+    <w:p>
+      <w:pPr>
+        <w:rPr>
+          <w:lang w:val="es-CO"/>
+        </w:rPr>
+      </w:pPr>
+      <w:r>
+        <w:rPr>
+          <w:lang w:val="es-CO"/>
+        </w:rPr>
+        <w:t xml:space="preserve">prepareWheels(): Se encarga de crear las ruedas, además de situar sus símbolos </w:t>
+      </w:r>
+      <w:r>
+        <w:rPr>
+          <w:lang w:val="es-CO"/>
+        </w:rPr>
+        <w:t>en uno al azar de los que tiene.</w:t>
+      </w:r>
+      <w:r>
+        <w:rPr>
+          <w:lang w:val="es-CO"/>
+        </w:rPr>
+        <w:t xml:space="preserve"> Esto hizo necesario crear un método en Wheel llamado randomizeSymbol().</w:t>
+      </w:r>
+    </w:p>
+    <w:p>
+      <w:pPr>
+        <w:rPr>
+          <w:lang w:val="es-CO"/>
+        </w:rPr>
+      </w:pPr>
+      <w:r>
+        <w:rPr>
+          <w:lang w:val="es-CO"/>
+        </w:rPr>
         <w:lastRenderedPageBreak/>
-        <w:t xml:space="preserve">prepareSymbols(): Se encarga de crear unos símbolos predeterminados con el color </w:t>
-      </w:r>
-      <w:r>
-        <w:rPr>
-          <w:lang w:val="es-CO"/>
-        </w:rPr>
-        <w:t xml:space="preserve">verde, </w:t>
-      </w:r>
-      <w:r>
-        <w:rPr>
-          <w:lang w:val="es-CO"/>
-        </w:rPr>
-        <w:t>rojo</w:t>
-      </w:r>
-      <w:r>
-        <w:rPr>
-          <w:lang w:val="es-CO"/>
-        </w:rPr>
-        <w:t xml:space="preserve"> y</w:t>
-      </w:r>
-      <w:r>
-        <w:rPr>
-          <w:lang w:val="es-CO"/>
-        </w:rPr>
-        <w:t xml:space="preserve"> azul</w:t>
+        <w:drawing>
+          <wp:inline distT="0" distB="0" distL="0" distR="0" wp14:anchorId="2EB86DEE" wp14:editId="74601CA3">
+            <wp:extent cx="5943600" cy="4057015"/>
+            <wp:effectExtent l="0" t="0" r="0" b="635"/>
+            <wp:docPr id="270032048" name="Imagen 1"/>
+            <wp:cNvGraphicFramePr>
+              <a:graphicFrameLocks xmlns:a="http://schemas.openxmlformats.org/drawingml/2006/main" noChangeAspect="1"/>
+            </wp:cNvGraphicFramePr>
+            <a:graphic xmlns:a="http://schemas.openxmlformats.org/drawingml/2006/main">
+              <a:graphicData uri="http://schemas.openxmlformats.org/drawingml/2006/picture">
+                <pic:pic xmlns:pic="http://schemas.openxmlformats.org/drawingml/2006/picture">
+                  <pic:nvPicPr>
+                    <pic:cNvPr id="270032048" name=""/>
+                    <pic:cNvPicPr/>
+                  </pic:nvPicPr>
+                  <pic:blipFill>
+                    <a:blip r:embed="rId31"/>
+                    <a:stretch>
+                      <a:fillRect/>
+                    </a:stretch>
+                  </pic:blipFill>
+                  <pic:spPr>
+                    <a:xfrm>
+                      <a:off x="0" y="0"/>
+                      <a:ext cx="5943600" cy="4057015"/>
+                    </a:xfrm>
+                    <a:prstGeom prst="rect">
+                      <a:avLst/>
+                    </a:prstGeom>
+                  </pic:spPr>
+                </pic:pic>
+              </a:graphicData>
+            </a:graphic>
+          </wp:inline>
+        </w:drawing>
+      </w:r>
+    </w:p>
+    <w:p>
+      <w:pPr>
+        <w:rPr>
+          <w:lang w:val="es-CO"/>
+        </w:rPr>
+      </w:pPr>
+      <w:r>
+        <w:rPr>
+          <w:lang w:val="es-CO"/>
+        </w:rPr>
+        <w:t xml:space="preserve">randomNumGenerator(): </w:t>
+      </w:r>
+      <w:r>
+        <w:rPr>
+          <w:lang w:val="es-CO"/>
+        </w:rPr>
+        <w:t>Es un método estático, que se busca usar, para cualquier cálculo que dependa de generar números aleatorios, por tanto puede ser usado por cualquiera en cualquier momento.</w:t>
+      </w:r>
+    </w:p>
+    <w:p>
+      <w:pPr>
+        <w:rPr>
+          <w:lang w:val="es-CO"/>
+        </w:rPr>
+      </w:pPr>
+      <w:r>
+        <w:rPr>
+          <w:lang w:val="es-CO"/>
+        </w:rPr>
+        <w:drawing>
+          <wp:inline distT="0" distB="0" distL="0" distR="0" wp14:anchorId="6EE6C572" wp14:editId="327D09F8">
+            <wp:extent cx="5943600" cy="1965960"/>
+            <wp:effectExtent l="0" t="0" r="0" b="0"/>
+            <wp:docPr id="1574610198" name="Imagen 1"/>
+            <wp:cNvGraphicFramePr>
+              <a:graphicFrameLocks xmlns:a="http://schemas.openxmlformats.org/drawingml/2006/main" noChangeAspect="1"/>
+            </wp:cNvGraphicFramePr>
+            <a:graphic xmlns:a="http://schemas.openxmlformats.org/drawingml/2006/main">
+              <a:graphicData uri="http://schemas.openxmlformats.org/drawingml/2006/picture">
+                <pic:pic xmlns:pic="http://schemas.openxmlformats.org/drawingml/2006/picture">
+                  <pic:nvPicPr>
+                    <pic:cNvPr id="1574610198" name=""/>
+                    <pic:cNvPicPr/>
+                  </pic:nvPicPr>
+                  <pic:blipFill>
+                    <a:blip r:embed="rId32"/>
+                    <a:stretch>
+                      <a:fillRect/>
+                    </a:stretch>
+                  </pic:blipFill>
+                  <pic:spPr>
+                    <a:xfrm>
+                      <a:off x="0" y="0"/>
+                      <a:ext cx="5943600" cy="1965960"/>
+                    </a:xfrm>
+                    <a:prstGeom prst="rect">
+                      <a:avLst/>
+                    </a:prstGeom>
+                  </pic:spPr>
+                </pic:pic>
+              </a:graphicData>
+            </a:graphic>
+          </wp:inline>
+        </w:drawing>
+      </w:r>
+    </w:p>
+    <w:p>
+      <w:pPr>
+        <w:rPr>
+          <w:lang w:val="es-CO"/>
+        </w:rPr>
+      </w:pPr>
+      <w:r>
+        <w:rPr>
+          <w:lang w:val="es-CO"/>
+        </w:rPr>
+        <w:t xml:space="preserve">makeVisible(): Se encarga de mostrar el tablero y reposicionar </w:t>
+      </w:r>
+      <w:r>
+        <w:rPr>
+          <w:lang w:val="es-CO"/>
+        </w:rPr>
+        <w:t xml:space="preserve">las Wheel teniendo en cuenta que: </w:t>
+      </w:r>
+      <w:r>
+        <w:rPr>
+          <w:lang w:val="es-CO"/>
+        </w:rPr>
+        <w:t xml:space="preserve"> </w:t>
+      </w:r>
+      <w:r>
+        <w:rPr>
+          <w:lang w:val="es-CO"/>
+        </w:rPr>
+        <w:t xml:space="preserve">La distancia entre cada </w:t>
+      </w:r>
+      <w:r>
+        <w:rPr>
+          <w:lang w:val="es-CO"/>
+        </w:rPr>
+        <w:t>Wheel</w:t>
+      </w:r>
+      <w:r>
+        <w:rPr>
+          <w:lang w:val="es-CO"/>
+        </w:rPr>
+        <w:t xml:space="preserve"> y la distancia entre las </w:t>
+      </w:r>
+      <w:r>
+        <w:rPr>
+          <w:lang w:val="es-CO"/>
+        </w:rPr>
+        <w:t>Wheel</w:t>
+      </w:r>
+      <w:r>
+        <w:rPr>
+          <w:lang w:val="es-CO"/>
+        </w:rPr>
+        <w:t xml:space="preserve"> y los bordes laterales d</w:t>
+      </w:r>
+      <w:r>
+        <w:rPr>
+          <w:lang w:val="es-CO"/>
+        </w:rPr>
+        <w:t xml:space="preserve">e la maquina debe </w:t>
+      </w:r>
+      <w:r>
+        <w:rPr>
+          <w:lang w:val="es-CO"/>
+        </w:rPr>
+        <w:t>ser la misma</w:t>
       </w:r>
       <w:r>
         <w:rPr>
@@ -1631,111 +2544,42 @@
         <w:rPr>
           <w:lang w:val="es-CO"/>
         </w:rPr>
-        <w:t xml:space="preserve">prepareWheels(): Se encarga de crear las ruedas, además de situar sus símbolos </w:t>
-      </w:r>
-      <w:r>
-        <w:rPr>
-          <w:lang w:val="es-CO"/>
-        </w:rPr>
-        <w:t>en uno al azar de los que tiene.</w:t>
-      </w:r>
-      <w:r>
-        <w:rPr>
-          <w:lang w:val="es-CO"/>
-        </w:rPr>
-        <w:t xml:space="preserve"> Esto hizo necesario crear un método en Wheel llamado randomizeSymbol().</w:t>
-      </w:r>
-    </w:p>
-    <w:p>
-      <w:pPr>
-        <w:rPr>
-          <w:lang w:val="es-CO"/>
-        </w:rPr>
-      </w:pPr>
-      <w:r>
-        <w:rPr>
-          <w:lang w:val="es-CO"/>
-        </w:rPr>
-        <w:t xml:space="preserve">randomNumGenerator(): </w:t>
-      </w:r>
-      <w:r>
-        <w:rPr>
-          <w:lang w:val="es-CO"/>
-        </w:rPr>
-        <w:t>Es un método estático, que se busca usar, para cualquier cálculo que dependa de generar números aleatorios, por tanto puede ser usado por cualquiera en cualquier momento.</w:t>
-      </w:r>
-    </w:p>
-    <w:p>
-      <w:pPr>
-        <w:rPr>
-          <w:lang w:val="es-CO"/>
-        </w:rPr>
-      </w:pPr>
-      <w:r>
-        <w:rPr>
-          <w:lang w:val="es-CO"/>
-        </w:rPr>
-        <w:t xml:space="preserve">makeVisible(): Se encarga de mostrar el tablero y reposicionar </w:t>
-      </w:r>
-      <w:r>
-        <w:rPr>
-          <w:lang w:val="es-CO"/>
-        </w:rPr>
-        <w:t xml:space="preserve">las Wheel teniendo en cuenta que: </w:t>
-      </w:r>
-      <w:r>
-        <w:rPr>
-          <w:lang w:val="es-CO"/>
-        </w:rPr>
-        <w:t xml:space="preserve"> </w:t>
-      </w:r>
-      <w:r>
-        <w:rPr>
-          <w:lang w:val="es-CO"/>
-        </w:rPr>
-        <w:t xml:space="preserve">La distancia entre cada </w:t>
-      </w:r>
-      <w:r>
-        <w:rPr>
-          <w:lang w:val="es-CO"/>
-        </w:rPr>
-        <w:t>Wheel</w:t>
-      </w:r>
-      <w:r>
-        <w:rPr>
-          <w:lang w:val="es-CO"/>
-        </w:rPr>
-        <w:t xml:space="preserve"> y la distancia entre las </w:t>
-      </w:r>
-      <w:r>
-        <w:rPr>
-          <w:lang w:val="es-CO"/>
-        </w:rPr>
-        <w:t>Wheel</w:t>
-      </w:r>
-      <w:r>
-        <w:rPr>
-          <w:lang w:val="es-CO"/>
-        </w:rPr>
-        <w:t xml:space="preserve"> y los bordes laterales d</w:t>
-      </w:r>
-      <w:r>
-        <w:rPr>
-          <w:lang w:val="es-CO"/>
-        </w:rPr>
-        <w:t xml:space="preserve">e la maquina debe </w:t>
-      </w:r>
-      <w:r>
-        <w:rPr>
-          <w:lang w:val="es-CO"/>
-        </w:rPr>
-        <w:t>ser la misma</w:t>
-      </w:r>
-      <w:r>
-        <w:rPr>
-          <w:lang w:val="es-CO"/>
-        </w:rPr>
-        <w:t>.</w:t>
+        <w:lastRenderedPageBreak/>
+        <w:drawing>
+          <wp:inline distT="0" distB="0" distL="0" distR="0" wp14:anchorId="17B81619" wp14:editId="5E0F2B5B">
+            <wp:extent cx="5943600" cy="1461135"/>
+            <wp:effectExtent l="0" t="0" r="0" b="5715"/>
+            <wp:docPr id="1303291662" name="Imagen 1"/>
+            <wp:cNvGraphicFramePr>
+              <a:graphicFrameLocks xmlns:a="http://schemas.openxmlformats.org/drawingml/2006/main" noChangeAspect="1"/>
+            </wp:cNvGraphicFramePr>
+            <a:graphic xmlns:a="http://schemas.openxmlformats.org/drawingml/2006/main">
+              <a:graphicData uri="http://schemas.openxmlformats.org/drawingml/2006/picture">
+                <pic:pic xmlns:pic="http://schemas.openxmlformats.org/drawingml/2006/picture">
+                  <pic:nvPicPr>
+                    <pic:cNvPr id="1303291662" name=""/>
+                    <pic:cNvPicPr/>
+                  </pic:nvPicPr>
+                  <pic:blipFill>
+                    <a:blip r:embed="rId33"/>
+                    <a:stretch>
+                      <a:fillRect/>
+                    </a:stretch>
+                  </pic:blipFill>
+                  <pic:spPr>
+                    <a:xfrm>
+                      <a:off x="0" y="0"/>
+                      <a:ext cx="5943600" cy="1461135"/>
+                    </a:xfrm>
+                    <a:prstGeom prst="rect">
+                      <a:avLst/>
+                    </a:prstGeom>
+                  </pic:spPr>
+                </pic:pic>
+              </a:graphicData>
+            </a:graphic>
+          </wp:inline>
+        </w:drawing>
       </w:r>
     </w:p>
     <w:p>
@@ -1764,7 +2608,7 @@
                     <pic:cNvPicPr/>
                   </pic:nvPicPr>
                   <pic:blipFill>
-                    <a:blip r:embed="rId16"/>
+                    <a:blip r:embed="rId34"/>
                     <a:stretch>
                       <a:fillRect/>
                     </a:stretch>
@@ -1850,88 +2694,88 @@
         <w:rPr>
           <w:lang w:val="es-CO"/>
         </w:rPr>
+        <w:t>Puesto que el número de espacio Y que hay está determinado por la cantidad de ruedas más 1</w:t>
+      </w:r>
+      <w:r>
+        <w:rPr>
+          <w:lang w:val="es-CO"/>
+        </w:rPr>
+        <w:t>:</w:t>
+      </w:r>
+    </w:p>
+    <w:p>
+      <w:pPr>
+        <w:rPr>
+          <w:lang w:val="es-CO"/>
+        </w:rPr>
+      </w:pPr>
+      <w:r>
+        <w:rPr>
+          <w:lang w:val="es-CO"/>
+        </w:rPr>
+        <w:t xml:space="preserve">X = </w:t>
+      </w:r>
+      <w:r>
+        <w:rPr>
+          <w:lang w:val="es-CO"/>
+        </w:rPr>
+        <w:t>Y</w:t>
+      </w:r>
+      <w:r>
+        <w:rPr>
+          <w:lang w:val="es-CO"/>
+        </w:rPr>
+        <w:t>*</w:t>
+      </w:r>
+      <w:r>
+        <w:rPr>
+          <w:lang w:val="es-CO"/>
+        </w:rPr>
+        <w:t>(n + 1)</w:t>
+      </w:r>
+      <w:r>
+        <w:rPr>
+          <w:lang w:val="es-CO"/>
+        </w:rPr>
+        <w:t>+</w:t>
+      </w:r>
+      <w:r>
+        <w:rPr>
+          <w:lang w:val="es-CO"/>
+        </w:rPr>
+        <w:t>50*n</w:t>
+      </w:r>
+    </w:p>
+    <w:p>
+      <w:pPr>
+        <w:rPr>
+          <w:lang w:val="es-CO"/>
+        </w:rPr>
+      </w:pPr>
+      <w:r>
+        <w:rPr>
+          <w:lang w:val="es-CO"/>
+        </w:rPr>
+        <w:t>Si se sabe que n será un valor fijo y X también será un valor fijo, que irá aumentando de acuerdo a las ruedas que se vayan poniendo</w:t>
+      </w:r>
+      <w:r>
+        <w:rPr>
+          <w:lang w:val="es-CO"/>
+        </w:rPr>
+        <w:t>.</w:t>
+      </w:r>
+    </w:p>
+    <w:p>
+      <w:pPr>
+        <w:rPr>
+          <w:lang w:val="es-CO"/>
+        </w:rPr>
+      </w:pPr>
+      <w:r>
+        <w:rPr>
+          <w:lang w:val="es-CO"/>
+        </w:rPr>
         <w:lastRenderedPageBreak/>
-        <w:t>Puesto que el número de espacio Y que hay está determinado por la cantidad de ruedas más 1</w:t>
-      </w:r>
-      <w:r>
-        <w:rPr>
-          <w:lang w:val="es-CO"/>
-        </w:rPr>
-        <w:t>:</w:t>
-      </w:r>
-    </w:p>
-    <w:p>
-      <w:pPr>
-        <w:rPr>
-          <w:lang w:val="es-CO"/>
-        </w:rPr>
-      </w:pPr>
-      <w:r>
-        <w:rPr>
-          <w:lang w:val="es-CO"/>
-        </w:rPr>
-        <w:t xml:space="preserve">X = </w:t>
-      </w:r>
-      <w:r>
-        <w:rPr>
-          <w:lang w:val="es-CO"/>
-        </w:rPr>
-        <w:t>Y</w:t>
-      </w:r>
-      <w:r>
-        <w:rPr>
-          <w:lang w:val="es-CO"/>
-        </w:rPr>
-        <w:t>*</w:t>
-      </w:r>
-      <w:r>
-        <w:rPr>
-          <w:lang w:val="es-CO"/>
-        </w:rPr>
-        <w:t>(n + 1)</w:t>
-      </w:r>
-      <w:r>
-        <w:rPr>
-          <w:lang w:val="es-CO"/>
-        </w:rPr>
-        <w:t>+</w:t>
-      </w:r>
-      <w:r>
-        <w:rPr>
-          <w:lang w:val="es-CO"/>
-        </w:rPr>
-        <w:t>50*n</w:t>
-      </w:r>
-    </w:p>
-    <w:p>
-      <w:pPr>
-        <w:rPr>
-          <w:lang w:val="es-CO"/>
-        </w:rPr>
-      </w:pPr>
-      <w:r>
-        <w:rPr>
-          <w:lang w:val="es-CO"/>
-        </w:rPr>
-        <w:t>Si se sabe que n será un valor fijo y X también será un valor fijo, que irá aumentando de acuerdo a las ruedas que se vayan poniendo</w:t>
-      </w:r>
-      <w:r>
-        <w:rPr>
-          <w:lang w:val="es-CO"/>
-        </w:rPr>
-        <w:t>.</w:t>
-      </w:r>
-    </w:p>
-    <w:p>
-      <w:pPr>
-        <w:rPr>
-          <w:lang w:val="es-CO"/>
-        </w:rPr>
-      </w:pPr>
-      <w:r>
-        <w:rPr>
-          <w:lang w:val="es-CO"/>
-        </w:rPr>
         <w:t xml:space="preserve">Y= </w:t>
       </w:r>
       <w:r>
@@ -1985,7 +2829,7 @@
                     <pic:cNvPicPr/>
                   </pic:nvPicPr>
                   <pic:blipFill>
-                    <a:blip r:embed="rId17"/>
+                    <a:blip r:embed="rId35"/>
                     <a:stretch>
                       <a:fillRect/>
                     </a:stretch>
@@ -2067,6 +2911,53 @@
         <w:rPr>
           <w:lang w:val="es-CO"/>
         </w:rPr>
+        <w:drawing>
+          <wp:inline distT="0" distB="0" distL="0" distR="0" wp14:anchorId="6B23CAC7" wp14:editId="572737CB">
+            <wp:extent cx="5277587" cy="2657846"/>
+            <wp:effectExtent l="0" t="0" r="0" b="9525"/>
+            <wp:docPr id="525613826" name="Imagen 1"/>
+            <wp:cNvGraphicFramePr>
+              <a:graphicFrameLocks xmlns:a="http://schemas.openxmlformats.org/drawingml/2006/main" noChangeAspect="1"/>
+            </wp:cNvGraphicFramePr>
+            <a:graphic xmlns:a="http://schemas.openxmlformats.org/drawingml/2006/main">
+              <a:graphicData uri="http://schemas.openxmlformats.org/drawingml/2006/picture">
+                <pic:pic xmlns:pic="http://schemas.openxmlformats.org/drawingml/2006/picture">
+                  <pic:nvPicPr>
+                    <pic:cNvPr id="525613826" name=""/>
+                    <pic:cNvPicPr/>
+                  </pic:nvPicPr>
+                  <pic:blipFill>
+                    <a:blip r:embed="rId36"/>
+                    <a:stretch>
+                      <a:fillRect/>
+                    </a:stretch>
+                  </pic:blipFill>
+                  <pic:spPr>
+                    <a:xfrm>
+                      <a:off x="0" y="0"/>
+                      <a:ext cx="5277587" cy="2657846"/>
+                    </a:xfrm>
+                    <a:prstGeom prst="rect">
+                      <a:avLst/>
+                    </a:prstGeom>
+                  </pic:spPr>
+                </pic:pic>
+              </a:graphicData>
+            </a:graphic>
+          </wp:inline>
+        </w:drawing>
+      </w:r>
+    </w:p>
+    <w:p>
+      <w:pPr>
+        <w:rPr>
+          <w:lang w:val="es-CO"/>
+        </w:rPr>
+      </w:pPr>
+      <w:r>
+        <w:rPr>
+          <w:lang w:val="es-CO"/>
+        </w:rPr>
         <w:lastRenderedPageBreak/>
         <w:drawing>
           <wp:inline distT="0" distB="0" distL="0" distR="0" wp14:anchorId="37821223" wp14:editId="4CB96237">
@@ -2084,7 +2975,7 @@
                     <pic:cNvPicPr/>
                   </pic:nvPicPr>
                   <pic:blipFill>
-                    <a:blip r:embed="rId18"/>
+                    <a:blip r:embed="rId37"/>
                     <a:stretch>
                       <a:fillRect/>
                     </a:stretch>
@@ -2162,21 +3053,94 @@
           <w:lang w:val="es-CO"/>
         </w:rPr>
       </w:pPr>
-    </w:p>
-    <w:p>
-      <w:r>
+      <w:r>
+        <w:rPr>
+          <w:lang w:val="es-CO"/>
+        </w:rPr>
+        <w:drawing>
+          <wp:inline distT="0" distB="0" distL="0" distR="0" wp14:anchorId="0AD123D3" wp14:editId="50FEFA6C">
+            <wp:extent cx="5943600" cy="1704975"/>
+            <wp:effectExtent l="0" t="0" r="0" b="9525"/>
+            <wp:docPr id="520277285" name="Imagen 1"/>
+            <wp:cNvGraphicFramePr>
+              <a:graphicFrameLocks xmlns:a="http://schemas.openxmlformats.org/drawingml/2006/main" noChangeAspect="1"/>
+            </wp:cNvGraphicFramePr>
+            <a:graphic xmlns:a="http://schemas.openxmlformats.org/drawingml/2006/main">
+              <a:graphicData uri="http://schemas.openxmlformats.org/drawingml/2006/picture">
+                <pic:pic xmlns:pic="http://schemas.openxmlformats.org/drawingml/2006/picture">
+                  <pic:nvPicPr>
+                    <pic:cNvPr id="520277285" name=""/>
+                    <pic:cNvPicPr/>
+                  </pic:nvPicPr>
+                  <pic:blipFill>
+                    <a:blip r:embed="rId38"/>
+                    <a:stretch>
+                      <a:fillRect/>
+                    </a:stretch>
+                  </pic:blipFill>
+                  <pic:spPr>
+                    <a:xfrm>
+                      <a:off x="0" y="0"/>
+                      <a:ext cx="5943600" cy="1704975"/>
+                    </a:xfrm>
+                    <a:prstGeom prst="rect">
+                      <a:avLst/>
+                    </a:prstGeom>
+                  </pic:spPr>
+                </pic:pic>
+              </a:graphicData>
+            </a:graphic>
+          </wp:inline>
+        </w:drawing>
+      </w:r>
+    </w:p>
+    <w:p>
+      <w:pPr>
+        <w:rPr>
+          <w:b/>
+          <w:bCs/>
+        </w:rPr>
+      </w:pPr>
+      <w:r>
+        <w:rPr>
+          <w:b/>
+          <w:bCs/>
+        </w:rPr>
         <w:t>MiniCiclo 4:</w:t>
       </w:r>
       <w:r>
+        <w:rPr>
+          <w:b/>
+          <w:bCs/>
+        </w:rPr>
         <w:t xml:space="preserve"> </w:t>
       </w:r>
       <w:r>
+        <w:rPr>
+          <w:b/>
+          <w:bCs/>
+        </w:rPr>
         <w:t>Add</w:t>
       </w:r>
       <w:r>
-        <w:t xml:space="preserve">/Delete </w:t>
-      </w:r>
-      <w:r>
+        <w:rPr>
+          <w:b/>
+          <w:bCs/>
+        </w:rPr>
+        <w:t>/Del</w:t>
+      </w:r>
+      <w:r>
+        <w:rPr>
+          <w:b/>
+          <w:bCs/>
+        </w:rPr>
+        <w:t xml:space="preserve"> </w:t>
+      </w:r>
+      <w:r>
+        <w:rPr>
+          <w:b/>
+          <w:bCs/>
+        </w:rPr>
         <w:t>Wheel</w:t>
       </w:r>
     </w:p>
@@ -2190,6 +3154,7 @@
         <w:rPr>
           <w:lang w:val="es-CO"/>
         </w:rPr>
+        <w:lastRenderedPageBreak/>
         <w:t>En este ciclo nos e</w:t>
       </w:r>
       <w:r>
@@ -2234,7 +3199,85 @@
         <w:rPr>
           <w:lang w:val="es-CO"/>
         </w:rPr>
-        <w:t xml:space="preserve"> Esto también permite refactorizar parte del código para que quede un poco más limpio.</w:t>
+        <w:t xml:space="preserve"> </w:t>
+      </w:r>
+    </w:p>
+    <w:p>
+      <w:pPr>
+        <w:rPr>
+          <w:lang w:val="es-CO"/>
+        </w:rPr>
+      </w:pPr>
+      <w:r>
+        <w:rPr>
+          <w:lang w:val="es-CO"/>
+        </w:rPr>
+        <w:drawing>
+          <wp:inline distT="0" distB="0" distL="0" distR="0" wp14:anchorId="671C3BD3" wp14:editId="41300AC8">
+            <wp:extent cx="5277587" cy="2457793"/>
+            <wp:effectExtent l="0" t="0" r="0" b="0"/>
+            <wp:docPr id="790801852" name="Imagen 1"/>
+            <wp:cNvGraphicFramePr>
+              <a:graphicFrameLocks xmlns:a="http://schemas.openxmlformats.org/drawingml/2006/main" noChangeAspect="1"/>
+            </wp:cNvGraphicFramePr>
+            <a:graphic xmlns:a="http://schemas.openxmlformats.org/drawingml/2006/main">
+              <a:graphicData uri="http://schemas.openxmlformats.org/drawingml/2006/picture">
+                <pic:pic xmlns:pic="http://schemas.openxmlformats.org/drawingml/2006/picture">
+                  <pic:nvPicPr>
+                    <pic:cNvPr id="790801852" name=""/>
+                    <pic:cNvPicPr/>
+                  </pic:nvPicPr>
+                  <pic:blipFill>
+                    <a:blip r:embed="rId39"/>
+                    <a:stretch>
+                      <a:fillRect/>
+                    </a:stretch>
+                  </pic:blipFill>
+                  <pic:spPr>
+                    <a:xfrm>
+                      <a:off x="0" y="0"/>
+                      <a:ext cx="5277587" cy="2457793"/>
+                    </a:xfrm>
+                    <a:prstGeom prst="rect">
+                      <a:avLst/>
+                    </a:prstGeom>
+                  </pic:spPr>
+                </pic:pic>
+              </a:graphicData>
+            </a:graphic>
+          </wp:inline>
+        </w:drawing>
+      </w:r>
+    </w:p>
+    <w:p>
+      <w:pPr>
+        <w:rPr>
+          <w:lang w:val="es-CO"/>
+        </w:rPr>
+      </w:pPr>
+      <w:r>
+        <w:rPr>
+          <w:lang w:val="es-CO"/>
+        </w:rPr>
+        <w:t>Add</w:t>
+      </w:r>
+      <w:r>
+        <w:rPr>
+          <w:lang w:val="es-CO"/>
+        </w:rPr>
+        <w:t>Wheel(): Tiene el objetivo de agregar una nueva rueda, en una posición específica.</w:t>
+      </w:r>
+      <w:r>
+        <w:rPr>
+          <w:lang w:val="es-CO"/>
+        </w:rPr>
+        <w:t xml:space="preserve"> </w:t>
+      </w:r>
+      <w:r>
+        <w:rPr>
+          <w:lang w:val="es-CO"/>
+        </w:rPr>
+        <w:t>Teniendo en cuenta que las posiciones empiezan desde 1, si se pone un número menor a 1, se sigue tomando la primera, si es mayor al máximo, se toma como ese máximo.</w:t>
       </w:r>
     </w:p>
     <w:p>
@@ -2248,57 +3291,1004 @@
           <w:lang w:val="es-CO"/>
         </w:rPr>
         <w:lastRenderedPageBreak/>
-        <w:t>Add</w:t>
-      </w:r>
-      <w:r>
-        <w:rPr>
-          <w:lang w:val="es-CO"/>
-        </w:rPr>
-        <w:t>Wheel(): Tiene el objetivo de agregar una nueva rueda, en una posición específica.</w:t>
-      </w:r>
-      <w:r>
-        <w:rPr>
-          <w:lang w:val="es-CO"/>
-        </w:rPr>
-        <w:t xml:space="preserve"> </w:t>
-      </w:r>
-      <w:r>
-        <w:rPr>
-          <w:lang w:val="es-CO"/>
-        </w:rPr>
-        <w:t>Teniendo en cuenta que las posiciones empiezan desde 1, si se pone un número menor a 1, se sigue tomando la primera, si es mayor al máximo, se toma como ese máximo.</w:t>
-      </w:r>
-    </w:p>
-    <w:p>
-      <w:pPr>
-        <w:rPr>
-          <w:lang w:val="es-CO"/>
-        </w:rPr>
-      </w:pPr>
-    </w:p>
-    <w:p>
-      <w:pPr>
-        <w:rPr>
-          <w:lang w:val="es-CO"/>
-        </w:rPr>
-      </w:pPr>
-    </w:p>
-    <w:p>
-      <w:pPr>
-        <w:rPr>
-          <w:lang w:val="es-CO"/>
-        </w:rPr>
-      </w:pPr>
-    </w:p>
-    <w:p>
-      <w:pPr>
-        <w:rPr>
-          <w:lang w:val="es-CO"/>
-        </w:rPr>
-      </w:pPr>
+        <w:drawing>
+          <wp:inline distT="0" distB="0" distL="0" distR="0" wp14:anchorId="4A1DB036" wp14:editId="6ADFA02C">
+            <wp:extent cx="5943600" cy="3410585"/>
+            <wp:effectExtent l="0" t="0" r="0" b="0"/>
+            <wp:docPr id="2036166773" name="Imagen 1"/>
+            <wp:cNvGraphicFramePr>
+              <a:graphicFrameLocks xmlns:a="http://schemas.openxmlformats.org/drawingml/2006/main" noChangeAspect="1"/>
+            </wp:cNvGraphicFramePr>
+            <a:graphic xmlns:a="http://schemas.openxmlformats.org/drawingml/2006/main">
+              <a:graphicData uri="http://schemas.openxmlformats.org/drawingml/2006/picture">
+                <pic:pic xmlns:pic="http://schemas.openxmlformats.org/drawingml/2006/picture">
+                  <pic:nvPicPr>
+                    <pic:cNvPr id="2036166773" name=""/>
+                    <pic:cNvPicPr/>
+                  </pic:nvPicPr>
+                  <pic:blipFill>
+                    <a:blip r:embed="rId40"/>
+                    <a:stretch>
+                      <a:fillRect/>
+                    </a:stretch>
+                  </pic:blipFill>
+                  <pic:spPr>
+                    <a:xfrm>
+                      <a:off x="0" y="0"/>
+                      <a:ext cx="5943600" cy="3410585"/>
+                    </a:xfrm>
+                    <a:prstGeom prst="rect">
+                      <a:avLst/>
+                    </a:prstGeom>
+                  </pic:spPr>
+                </pic:pic>
+              </a:graphicData>
+            </a:graphic>
+          </wp:inline>
+        </w:drawing>
+      </w:r>
+    </w:p>
+    <w:p>
+      <w:pPr>
+        <w:rPr>
+          <w:lang w:val="es-CO"/>
+        </w:rPr>
+      </w:pPr>
+      <w:r>
+        <w:rPr>
+          <w:lang w:val="es-CO"/>
+        </w:rPr>
+        <w:t>Si este es el estado inicial:</w:t>
+      </w:r>
+    </w:p>
+    <w:p>
+      <w:pPr>
+        <w:rPr>
+          <w:lang w:val="es-CO"/>
+        </w:rPr>
+      </w:pPr>
+      <w:r>
+        <w:rPr>
+          <w:lang w:val="es-CO"/>
+        </w:rPr>
+        <w:drawing>
+          <wp:inline distT="0" distB="0" distL="0" distR="0" wp14:anchorId="66A44B99" wp14:editId="47F51841">
+            <wp:extent cx="4324954" cy="2276793"/>
+            <wp:effectExtent l="0" t="0" r="0" b="9525"/>
+            <wp:docPr id="688208019" name="Imagen 1"/>
+            <wp:cNvGraphicFramePr>
+              <a:graphicFrameLocks xmlns:a="http://schemas.openxmlformats.org/drawingml/2006/main" noChangeAspect="1"/>
+            </wp:cNvGraphicFramePr>
+            <a:graphic xmlns:a="http://schemas.openxmlformats.org/drawingml/2006/main">
+              <a:graphicData uri="http://schemas.openxmlformats.org/drawingml/2006/picture">
+                <pic:pic xmlns:pic="http://schemas.openxmlformats.org/drawingml/2006/picture">
+                  <pic:nvPicPr>
+                    <pic:cNvPr id="688208019" name=""/>
+                    <pic:cNvPicPr/>
+                  </pic:nvPicPr>
+                  <pic:blipFill>
+                    <a:blip r:embed="rId41"/>
+                    <a:stretch>
+                      <a:fillRect/>
+                    </a:stretch>
+                  </pic:blipFill>
+                  <pic:spPr>
+                    <a:xfrm>
+                      <a:off x="0" y="0"/>
+                      <a:ext cx="4324954" cy="2276793"/>
+                    </a:xfrm>
+                    <a:prstGeom prst="rect">
+                      <a:avLst/>
+                    </a:prstGeom>
+                  </pic:spPr>
+                </pic:pic>
+              </a:graphicData>
+            </a:graphic>
+          </wp:inline>
+        </w:drawing>
+      </w:r>
+    </w:p>
+    <w:p>
+      <w:pPr>
+        <w:rPr>
+          <w:lang w:val="es-CO"/>
+        </w:rPr>
+      </w:pPr>
+      <w:r>
+        <w:rPr>
+          <w:lang w:val="es-CO"/>
+        </w:rPr>
+        <w:t>Al añadir un nuevo símbolo en una posición negativa, se debe añadir al inicio:</w:t>
+      </w:r>
+    </w:p>
+    <w:p>
+      <w:pPr>
+        <w:rPr>
+          <w:lang w:val="es-CO"/>
+        </w:rPr>
+      </w:pPr>
+      <w:r>
+        <w:rPr>
+          <w:lang w:val="es-CO"/>
+        </w:rPr>
+        <w:lastRenderedPageBreak/>
+        <w:drawing>
+          <wp:inline distT="0" distB="0" distL="0" distR="0" wp14:anchorId="5008C24A" wp14:editId="7B12731C">
+            <wp:extent cx="3458058" cy="2076740"/>
+            <wp:effectExtent l="0" t="0" r="9525" b="0"/>
+            <wp:docPr id="618713854" name="Imagen 1"/>
+            <wp:cNvGraphicFramePr>
+              <a:graphicFrameLocks xmlns:a="http://schemas.openxmlformats.org/drawingml/2006/main" noChangeAspect="1"/>
+            </wp:cNvGraphicFramePr>
+            <a:graphic xmlns:a="http://schemas.openxmlformats.org/drawingml/2006/main">
+              <a:graphicData uri="http://schemas.openxmlformats.org/drawingml/2006/picture">
+                <pic:pic xmlns:pic="http://schemas.openxmlformats.org/drawingml/2006/picture">
+                  <pic:nvPicPr>
+                    <pic:cNvPr id="618713854" name=""/>
+                    <pic:cNvPicPr/>
+                  </pic:nvPicPr>
+                  <pic:blipFill>
+                    <a:blip r:embed="rId42"/>
+                    <a:stretch>
+                      <a:fillRect/>
+                    </a:stretch>
+                  </pic:blipFill>
+                  <pic:spPr>
+                    <a:xfrm>
+                      <a:off x="0" y="0"/>
+                      <a:ext cx="3458058" cy="2076740"/>
+                    </a:xfrm>
+                    <a:prstGeom prst="rect">
+                      <a:avLst/>
+                    </a:prstGeom>
+                  </pic:spPr>
+                </pic:pic>
+              </a:graphicData>
+            </a:graphic>
+          </wp:inline>
+        </w:drawing>
+      </w:r>
+    </w:p>
+    <w:p>
+      <w:pPr>
+        <w:rPr>
+          <w:lang w:val="es-CO"/>
+        </w:rPr>
+      </w:pPr>
+      <w:r>
+        <w:rPr>
+          <w:lang w:val="es-CO"/>
+        </w:rPr>
+        <w:t>Como se ve posteriormente, se añade una rueda al inicio:</w:t>
+      </w:r>
+    </w:p>
+    <w:p>
+      <w:pPr>
+        <w:rPr>
+          <w:lang w:val="es-CO"/>
+        </w:rPr>
+      </w:pPr>
+      <w:r>
+        <w:rPr>
+          <w:lang w:val="es-CO"/>
+        </w:rPr>
+        <w:drawing>
+          <wp:inline distT="0" distB="0" distL="0" distR="0" wp14:anchorId="0C86608D" wp14:editId="1A32AF02">
+            <wp:extent cx="4601217" cy="2076740"/>
+            <wp:effectExtent l="0" t="0" r="0" b="0"/>
+            <wp:docPr id="1796481570" name="Imagen 1"/>
+            <wp:cNvGraphicFramePr>
+              <a:graphicFrameLocks xmlns:a="http://schemas.openxmlformats.org/drawingml/2006/main" noChangeAspect="1"/>
+            </wp:cNvGraphicFramePr>
+            <a:graphic xmlns:a="http://schemas.openxmlformats.org/drawingml/2006/main">
+              <a:graphicData uri="http://schemas.openxmlformats.org/drawingml/2006/picture">
+                <pic:pic xmlns:pic="http://schemas.openxmlformats.org/drawingml/2006/picture">
+                  <pic:nvPicPr>
+                    <pic:cNvPr id="1796481570" name=""/>
+                    <pic:cNvPicPr/>
+                  </pic:nvPicPr>
+                  <pic:blipFill>
+                    <a:blip r:embed="rId43"/>
+                    <a:stretch>
+                      <a:fillRect/>
+                    </a:stretch>
+                  </pic:blipFill>
+                  <pic:spPr>
+                    <a:xfrm>
+                      <a:off x="0" y="0"/>
+                      <a:ext cx="4601217" cy="2076740"/>
+                    </a:xfrm>
+                    <a:prstGeom prst="rect">
+                      <a:avLst/>
+                    </a:prstGeom>
+                  </pic:spPr>
+                </pic:pic>
+              </a:graphicData>
+            </a:graphic>
+          </wp:inline>
+        </w:drawing>
+      </w:r>
+    </w:p>
+    <w:p>
+      <w:pPr>
+        <w:rPr>
+          <w:lang w:val="es-CO"/>
+        </w:rPr>
+      </w:pPr>
+      <w:r>
+        <w:rPr>
+          <w:lang w:val="es-CO"/>
+        </w:rPr>
+        <w:t>Al poner una, en una posición máxima:</w:t>
+      </w:r>
+    </w:p>
+    <w:p>
+      <w:pPr>
+        <w:rPr>
+          <w:lang w:val="es-CO"/>
+        </w:rPr>
+      </w:pPr>
+      <w:r>
+        <w:rPr>
+          <w:lang w:val="es-CO"/>
+        </w:rPr>
+        <w:drawing>
+          <wp:inline distT="0" distB="0" distL="0" distR="0" wp14:anchorId="1F6AA988" wp14:editId="59F683C5">
+            <wp:extent cx="3391373" cy="2276793"/>
+            <wp:effectExtent l="0" t="0" r="0" b="9525"/>
+            <wp:docPr id="394869038" name="Imagen 1"/>
+            <wp:cNvGraphicFramePr>
+              <a:graphicFrameLocks xmlns:a="http://schemas.openxmlformats.org/drawingml/2006/main" noChangeAspect="1"/>
+            </wp:cNvGraphicFramePr>
+            <a:graphic xmlns:a="http://schemas.openxmlformats.org/drawingml/2006/main">
+              <a:graphicData uri="http://schemas.openxmlformats.org/drawingml/2006/picture">
+                <pic:pic xmlns:pic="http://schemas.openxmlformats.org/drawingml/2006/picture">
+                  <pic:nvPicPr>
+                    <pic:cNvPr id="394869038" name=""/>
+                    <pic:cNvPicPr/>
+                  </pic:nvPicPr>
+                  <pic:blipFill>
+                    <a:blip r:embed="rId44"/>
+                    <a:stretch>
+                      <a:fillRect/>
+                    </a:stretch>
+                  </pic:blipFill>
+                  <pic:spPr>
+                    <a:xfrm>
+                      <a:off x="0" y="0"/>
+                      <a:ext cx="3391373" cy="2276793"/>
+                    </a:xfrm>
+                    <a:prstGeom prst="rect">
+                      <a:avLst/>
+                    </a:prstGeom>
+                  </pic:spPr>
+                </pic:pic>
+              </a:graphicData>
+            </a:graphic>
+          </wp:inline>
+        </w:drawing>
+      </w:r>
+    </w:p>
+    <w:p>
+      <w:pPr>
+        <w:rPr>
+          <w:lang w:val="es-CO"/>
+        </w:rPr>
+      </w:pPr>
+      <w:r>
+        <w:rPr>
+          <w:lang w:val="es-CO"/>
+        </w:rPr>
+        <w:t>Queda el siguiente resultado:</w:t>
+      </w:r>
+    </w:p>
+    <w:p>
+      <w:pPr>
+        <w:rPr>
+          <w:lang w:val="es-CO"/>
+        </w:rPr>
+      </w:pPr>
+    </w:p>
+    <w:p>
+      <w:pPr>
+        <w:rPr>
+          <w:lang w:val="es-CO"/>
+        </w:rPr>
+      </w:pPr>
+      <w:r>
+        <w:rPr>
+          <w:lang w:val="es-CO"/>
+        </w:rPr>
+        <w:drawing>
+          <wp:inline distT="0" distB="0" distL="0" distR="0" wp14:anchorId="45A1A5DA" wp14:editId="65646DCA">
+            <wp:extent cx="4934639" cy="2048161"/>
+            <wp:effectExtent l="0" t="0" r="0" b="9525"/>
+            <wp:docPr id="495353474" name="Imagen 1"/>
+            <wp:cNvGraphicFramePr>
+              <a:graphicFrameLocks xmlns:a="http://schemas.openxmlformats.org/drawingml/2006/main" noChangeAspect="1"/>
+            </wp:cNvGraphicFramePr>
+            <a:graphic xmlns:a="http://schemas.openxmlformats.org/drawingml/2006/main">
+              <a:graphicData uri="http://schemas.openxmlformats.org/drawingml/2006/picture">
+                <pic:pic xmlns:pic="http://schemas.openxmlformats.org/drawingml/2006/picture">
+                  <pic:nvPicPr>
+                    <pic:cNvPr id="495353474" name=""/>
+                    <pic:cNvPicPr/>
+                  </pic:nvPicPr>
+                  <pic:blipFill>
+                    <a:blip r:embed="rId45"/>
+                    <a:stretch>
+                      <a:fillRect/>
+                    </a:stretch>
+                  </pic:blipFill>
+                  <pic:spPr>
+                    <a:xfrm>
+                      <a:off x="0" y="0"/>
+                      <a:ext cx="4934639" cy="2048161"/>
+                    </a:xfrm>
+                    <a:prstGeom prst="rect">
+                      <a:avLst/>
+                    </a:prstGeom>
+                  </pic:spPr>
+                </pic:pic>
+              </a:graphicData>
+            </a:graphic>
+          </wp:inline>
+        </w:drawing>
+      </w:r>
+    </w:p>
+    <w:p>
+      <w:pPr>
+        <w:rPr>
+          <w:lang w:val="es-CO"/>
+        </w:rPr>
+      </w:pPr>
+      <w:r>
+        <w:rPr>
+          <w:lang w:val="es-CO"/>
+        </w:rPr>
+        <w:t>Y se pone al final</w:t>
+      </w:r>
+    </w:p>
+    <w:p>
+      <w:pPr>
+        <w:rPr>
+          <w:lang w:val="es-CO"/>
+        </w:rPr>
+      </w:pPr>
+      <w:r>
+        <w:rPr>
+          <w:lang w:val="es-CO"/>
+        </w:rPr>
+        <w:t>Finalmente, si quiero que una nueva quede en la casilla 3:</w:t>
+      </w:r>
+    </w:p>
+    <w:p>
+      <w:pPr>
+        <w:rPr>
+          <w:lang w:val="es-CO"/>
+        </w:rPr>
+      </w:pPr>
+      <w:r>
+        <w:rPr>
+          <w:lang w:val="es-CO"/>
+        </w:rPr>
+        <w:drawing>
+          <wp:inline distT="0" distB="0" distL="0" distR="0" wp14:anchorId="5AE37CDE" wp14:editId="643A30B4">
+            <wp:extent cx="3334215" cy="2095792"/>
+            <wp:effectExtent l="0" t="0" r="0" b="0"/>
+            <wp:docPr id="1071138506" name="Imagen 1"/>
+            <wp:cNvGraphicFramePr>
+              <a:graphicFrameLocks xmlns:a="http://schemas.openxmlformats.org/drawingml/2006/main" noChangeAspect="1"/>
+            </wp:cNvGraphicFramePr>
+            <a:graphic xmlns:a="http://schemas.openxmlformats.org/drawingml/2006/main">
+              <a:graphicData uri="http://schemas.openxmlformats.org/drawingml/2006/picture">
+                <pic:pic xmlns:pic="http://schemas.openxmlformats.org/drawingml/2006/picture">
+                  <pic:nvPicPr>
+                    <pic:cNvPr id="1071138506" name=""/>
+                    <pic:cNvPicPr/>
+                  </pic:nvPicPr>
+                  <pic:blipFill>
+                    <a:blip r:embed="rId46"/>
+                    <a:stretch>
+                      <a:fillRect/>
+                    </a:stretch>
+                  </pic:blipFill>
+                  <pic:spPr>
+                    <a:xfrm>
+                      <a:off x="0" y="0"/>
+                      <a:ext cx="3334215" cy="2095792"/>
+                    </a:xfrm>
+                    <a:prstGeom prst="rect">
+                      <a:avLst/>
+                    </a:prstGeom>
+                  </pic:spPr>
+                </pic:pic>
+              </a:graphicData>
+            </a:graphic>
+          </wp:inline>
+        </w:drawing>
+      </w:r>
+    </w:p>
+    <w:p>
+      <w:pPr>
+        <w:rPr>
+          <w:lang w:val="es-CO"/>
+        </w:rPr>
+      </w:pPr>
+      <w:r>
+        <w:rPr>
+          <w:lang w:val="es-CO"/>
+        </w:rPr>
+        <w:t>Queda así:</w:t>
+      </w:r>
+    </w:p>
+    <w:p>
+      <w:pPr>
+        <w:rPr>
+          <w:lang w:val="es-CO"/>
+        </w:rPr>
+      </w:pPr>
+      <w:r>
+        <w:rPr>
+          <w:lang w:val="es-CO"/>
+        </w:rPr>
+        <w:drawing>
+          <wp:inline distT="0" distB="0" distL="0" distR="0" wp14:anchorId="7558FE91" wp14:editId="722AF004">
+            <wp:extent cx="5382376" cy="2010056"/>
+            <wp:effectExtent l="0" t="0" r="0" b="9525"/>
+            <wp:docPr id="1232875254" name="Imagen 1"/>
+            <wp:cNvGraphicFramePr>
+              <a:graphicFrameLocks xmlns:a="http://schemas.openxmlformats.org/drawingml/2006/main" noChangeAspect="1"/>
+            </wp:cNvGraphicFramePr>
+            <a:graphic xmlns:a="http://schemas.openxmlformats.org/drawingml/2006/main">
+              <a:graphicData uri="http://schemas.openxmlformats.org/drawingml/2006/picture">
+                <pic:pic xmlns:pic="http://schemas.openxmlformats.org/drawingml/2006/picture">
+                  <pic:nvPicPr>
+                    <pic:cNvPr id="1232875254" name=""/>
+                    <pic:cNvPicPr/>
+                  </pic:nvPicPr>
+                  <pic:blipFill>
+                    <a:blip r:embed="rId47"/>
+                    <a:stretch>
+                      <a:fillRect/>
+                    </a:stretch>
+                  </pic:blipFill>
+                  <pic:spPr>
+                    <a:xfrm>
+                      <a:off x="0" y="0"/>
+                      <a:ext cx="5382376" cy="2010056"/>
+                    </a:xfrm>
+                    <a:prstGeom prst="rect">
+                      <a:avLst/>
+                    </a:prstGeom>
+                  </pic:spPr>
+                </pic:pic>
+              </a:graphicData>
+            </a:graphic>
+          </wp:inline>
+        </w:drawing>
+      </w:r>
+    </w:p>
+    <w:p>
+      <w:pPr>
+        <w:rPr>
+          <w:lang w:val="es-CO"/>
+        </w:rPr>
+      </w:pPr>
+      <w:r>
+        <w:rPr>
+          <w:lang w:val="es-CO"/>
+        </w:rPr>
+        <w:lastRenderedPageBreak/>
+        <w:t>Si intento poner una en la posición 4:</w:t>
+      </w:r>
+    </w:p>
+    <w:p>
+      <w:pPr>
+        <w:rPr>
+          <w:lang w:val="es-CO"/>
+        </w:rPr>
+      </w:pPr>
+      <w:r>
+        <w:rPr>
+          <w:lang w:val="es-CO"/>
+        </w:rPr>
+        <w:drawing>
+          <wp:inline distT="0" distB="0" distL="0" distR="0" wp14:anchorId="0B1FBF45" wp14:editId="5BF98345">
+            <wp:extent cx="3362794" cy="2143424"/>
+            <wp:effectExtent l="0" t="0" r="9525" b="9525"/>
+            <wp:docPr id="500976375" name="Imagen 1"/>
+            <wp:cNvGraphicFramePr>
+              <a:graphicFrameLocks xmlns:a="http://schemas.openxmlformats.org/drawingml/2006/main" noChangeAspect="1"/>
+            </wp:cNvGraphicFramePr>
+            <a:graphic xmlns:a="http://schemas.openxmlformats.org/drawingml/2006/main">
+              <a:graphicData uri="http://schemas.openxmlformats.org/drawingml/2006/picture">
+                <pic:pic xmlns:pic="http://schemas.openxmlformats.org/drawingml/2006/picture">
+                  <pic:nvPicPr>
+                    <pic:cNvPr id="500976375" name=""/>
+                    <pic:cNvPicPr/>
+                  </pic:nvPicPr>
+                  <pic:blipFill>
+                    <a:blip r:embed="rId48"/>
+                    <a:stretch>
+                      <a:fillRect/>
+                    </a:stretch>
+                  </pic:blipFill>
+                  <pic:spPr>
+                    <a:xfrm>
+                      <a:off x="0" y="0"/>
+                      <a:ext cx="3362794" cy="2143424"/>
+                    </a:xfrm>
+                    <a:prstGeom prst="rect">
+                      <a:avLst/>
+                    </a:prstGeom>
+                  </pic:spPr>
+                </pic:pic>
+              </a:graphicData>
+            </a:graphic>
+          </wp:inline>
+        </w:drawing>
+      </w:r>
+    </w:p>
+    <w:p>
+      <w:pPr>
+        <w:rPr>
+          <w:lang w:val="es-CO"/>
+        </w:rPr>
+      </w:pPr>
+      <w:r>
+        <w:rPr>
+          <w:lang w:val="es-CO"/>
+        </w:rPr>
+        <w:drawing>
+          <wp:inline distT="0" distB="0" distL="0" distR="0" wp14:anchorId="5A5FFD88" wp14:editId="2F8E22E6">
+            <wp:extent cx="5887272" cy="2105319"/>
+            <wp:effectExtent l="0" t="0" r="0" b="9525"/>
+            <wp:docPr id="1700265998" name="Imagen 1"/>
+            <wp:cNvGraphicFramePr>
+              <a:graphicFrameLocks xmlns:a="http://schemas.openxmlformats.org/drawingml/2006/main" noChangeAspect="1"/>
+            </wp:cNvGraphicFramePr>
+            <a:graphic xmlns:a="http://schemas.openxmlformats.org/drawingml/2006/main">
+              <a:graphicData uri="http://schemas.openxmlformats.org/drawingml/2006/picture">
+                <pic:pic xmlns:pic="http://schemas.openxmlformats.org/drawingml/2006/picture">
+                  <pic:nvPicPr>
+                    <pic:cNvPr id="1700265998" name=""/>
+                    <pic:cNvPicPr/>
+                  </pic:nvPicPr>
+                  <pic:blipFill>
+                    <a:blip r:embed="rId49"/>
+                    <a:stretch>
+                      <a:fillRect/>
+                    </a:stretch>
+                  </pic:blipFill>
+                  <pic:spPr>
+                    <a:xfrm>
+                      <a:off x="0" y="0"/>
+                      <a:ext cx="5887272" cy="2105319"/>
+                    </a:xfrm>
+                    <a:prstGeom prst="rect">
+                      <a:avLst/>
+                    </a:prstGeom>
+                  </pic:spPr>
+                </pic:pic>
+              </a:graphicData>
+            </a:graphic>
+          </wp:inline>
+        </w:drawing>
+      </w:r>
+    </w:p>
+    <w:p>
+      <w:pPr>
+        <w:rPr>
+          <w:lang w:val="es-CO"/>
+        </w:rPr>
+      </w:pPr>
+    </w:p>
+    <w:p>
+      <w:pPr>
+        <w:rPr>
+          <w:lang w:val="es-CO"/>
+        </w:rPr>
+      </w:pPr>
+      <w:r>
+        <w:rPr>
+          <w:lang w:val="es-CO"/>
+        </w:rPr>
+        <w:t>delWheel(): Se debe encargar de borrar una rueda en una posición específica</w:t>
+      </w:r>
+      <w:r>
+        <w:rPr>
+          <w:lang w:val="es-CO"/>
+        </w:rPr>
+        <w:t>:</w:t>
+      </w:r>
+    </w:p>
+    <w:p>
+      <w:pPr>
+        <w:rPr>
+          <w:lang w:val="es-CO"/>
+        </w:rPr>
+      </w:pPr>
+      <w:r>
+        <w:rPr>
+          <w:lang w:val="es-CO"/>
+        </w:rPr>
+        <w:lastRenderedPageBreak/>
+        <w:drawing>
+          <wp:inline distT="0" distB="0" distL="0" distR="0" wp14:anchorId="4E671F01" wp14:editId="301D13EB">
+            <wp:extent cx="5943600" cy="3639820"/>
+            <wp:effectExtent l="0" t="0" r="0" b="0"/>
+            <wp:docPr id="1864213536" name="Imagen 1"/>
+            <wp:cNvGraphicFramePr>
+              <a:graphicFrameLocks xmlns:a="http://schemas.openxmlformats.org/drawingml/2006/main" noChangeAspect="1"/>
+            </wp:cNvGraphicFramePr>
+            <a:graphic xmlns:a="http://schemas.openxmlformats.org/drawingml/2006/main">
+              <a:graphicData uri="http://schemas.openxmlformats.org/drawingml/2006/picture">
+                <pic:pic xmlns:pic="http://schemas.openxmlformats.org/drawingml/2006/picture">
+                  <pic:nvPicPr>
+                    <pic:cNvPr id="1864213536" name=""/>
+                    <pic:cNvPicPr/>
+                  </pic:nvPicPr>
+                  <pic:blipFill>
+                    <a:blip r:embed="rId50"/>
+                    <a:stretch>
+                      <a:fillRect/>
+                    </a:stretch>
+                  </pic:blipFill>
+                  <pic:spPr>
+                    <a:xfrm>
+                      <a:off x="0" y="0"/>
+                      <a:ext cx="5943600" cy="3639820"/>
+                    </a:xfrm>
+                    <a:prstGeom prst="rect">
+                      <a:avLst/>
+                    </a:prstGeom>
+                  </pic:spPr>
+                </pic:pic>
+              </a:graphicData>
+            </a:graphic>
+          </wp:inline>
+        </w:drawing>
+      </w:r>
+    </w:p>
+    <w:p>
+      <w:pPr>
+        <w:rPr>
+          <w:lang w:val="es-CO"/>
+        </w:rPr>
+      </w:pPr>
+      <w:r>
+        <w:rPr>
+          <w:lang w:val="es-CO"/>
+        </w:rPr>
+        <w:t>Si se tiene este inicio:</w:t>
+      </w:r>
+    </w:p>
+    <w:p>
+      <w:pPr>
+        <w:rPr>
+          <w:lang w:val="es-CO"/>
+        </w:rPr>
+      </w:pPr>
+      <w:r>
+        <w:rPr>
+          <w:lang w:val="es-CO"/>
+        </w:rPr>
+        <w:drawing>
+          <wp:inline distT="0" distB="0" distL="0" distR="0" wp14:anchorId="7F9AB760" wp14:editId="6D79D10A">
+            <wp:extent cx="4115374" cy="2229161"/>
+            <wp:effectExtent l="0" t="0" r="0" b="0"/>
+            <wp:docPr id="1748595994" name="Imagen 1"/>
+            <wp:cNvGraphicFramePr>
+              <a:graphicFrameLocks xmlns:a="http://schemas.openxmlformats.org/drawingml/2006/main" noChangeAspect="1"/>
+            </wp:cNvGraphicFramePr>
+            <a:graphic xmlns:a="http://schemas.openxmlformats.org/drawingml/2006/main">
+              <a:graphicData uri="http://schemas.openxmlformats.org/drawingml/2006/picture">
+                <pic:pic xmlns:pic="http://schemas.openxmlformats.org/drawingml/2006/picture">
+                  <pic:nvPicPr>
+                    <pic:cNvPr id="1748595994" name=""/>
+                    <pic:cNvPicPr/>
+                  </pic:nvPicPr>
+                  <pic:blipFill>
+                    <a:blip r:embed="rId51"/>
+                    <a:stretch>
+                      <a:fillRect/>
+                    </a:stretch>
+                  </pic:blipFill>
+                  <pic:spPr>
+                    <a:xfrm>
+                      <a:off x="0" y="0"/>
+                      <a:ext cx="4115374" cy="2229161"/>
+                    </a:xfrm>
+                    <a:prstGeom prst="rect">
+                      <a:avLst/>
+                    </a:prstGeom>
+                  </pic:spPr>
+                </pic:pic>
+              </a:graphicData>
+            </a:graphic>
+          </wp:inline>
+        </w:drawing>
+      </w:r>
+    </w:p>
+    <w:p>
+      <w:pPr>
+        <w:rPr>
+          <w:lang w:val="es-CO"/>
+        </w:rPr>
+      </w:pPr>
+      <w:r>
+        <w:rPr>
+          <w:lang w:val="es-CO"/>
+        </w:rPr>
+        <w:t>Y se quiere borrar la última:</w:t>
+      </w:r>
+    </w:p>
+    <w:p>
+      <w:pPr>
+        <w:rPr>
+          <w:lang w:val="es-CO"/>
+        </w:rPr>
+      </w:pPr>
+      <w:r>
+        <w:rPr>
+          <w:lang w:val="es-CO"/>
+        </w:rPr>
+        <w:lastRenderedPageBreak/>
+        <w:drawing>
+          <wp:inline distT="0" distB="0" distL="0" distR="0" wp14:anchorId="1113ABBB" wp14:editId="3AAFD6FD">
+            <wp:extent cx="3515216" cy="2172003"/>
+            <wp:effectExtent l="0" t="0" r="9525" b="0"/>
+            <wp:docPr id="336465850" name="Imagen 1"/>
+            <wp:cNvGraphicFramePr>
+              <a:graphicFrameLocks xmlns:a="http://schemas.openxmlformats.org/drawingml/2006/main" noChangeAspect="1"/>
+            </wp:cNvGraphicFramePr>
+            <a:graphic xmlns:a="http://schemas.openxmlformats.org/drawingml/2006/main">
+              <a:graphicData uri="http://schemas.openxmlformats.org/drawingml/2006/picture">
+                <pic:pic xmlns:pic="http://schemas.openxmlformats.org/drawingml/2006/picture">
+                  <pic:nvPicPr>
+                    <pic:cNvPr id="336465850" name=""/>
+                    <pic:cNvPicPr/>
+                  </pic:nvPicPr>
+                  <pic:blipFill>
+                    <a:blip r:embed="rId52"/>
+                    <a:stretch>
+                      <a:fillRect/>
+                    </a:stretch>
+                  </pic:blipFill>
+                  <pic:spPr>
+                    <a:xfrm>
+                      <a:off x="0" y="0"/>
+                      <a:ext cx="3515216" cy="2172003"/>
+                    </a:xfrm>
+                    <a:prstGeom prst="rect">
+                      <a:avLst/>
+                    </a:prstGeom>
+                  </pic:spPr>
+                </pic:pic>
+              </a:graphicData>
+            </a:graphic>
+          </wp:inline>
+        </w:drawing>
+      </w:r>
+    </w:p>
+    <w:p>
+      <w:pPr>
+        <w:rPr>
+          <w:lang w:val="es-CO"/>
+        </w:rPr>
+      </w:pPr>
+      <w:r>
+        <w:rPr>
+          <w:lang w:val="es-CO"/>
+        </w:rPr>
+        <w:drawing>
+          <wp:inline distT="0" distB="0" distL="0" distR="0" wp14:anchorId="74FE8C7F" wp14:editId="6460D44D">
+            <wp:extent cx="3915321" cy="2067213"/>
+            <wp:effectExtent l="0" t="0" r="9525" b="9525"/>
+            <wp:docPr id="1590423233" name="Imagen 1"/>
+            <wp:cNvGraphicFramePr>
+              <a:graphicFrameLocks xmlns:a="http://schemas.openxmlformats.org/drawingml/2006/main" noChangeAspect="1"/>
+            </wp:cNvGraphicFramePr>
+            <a:graphic xmlns:a="http://schemas.openxmlformats.org/drawingml/2006/main">
+              <a:graphicData uri="http://schemas.openxmlformats.org/drawingml/2006/picture">
+                <pic:pic xmlns:pic="http://schemas.openxmlformats.org/drawingml/2006/picture">
+                  <pic:nvPicPr>
+                    <pic:cNvPr id="1590423233" name=""/>
+                    <pic:cNvPicPr/>
+                  </pic:nvPicPr>
+                  <pic:blipFill>
+                    <a:blip r:embed="rId53"/>
+                    <a:stretch>
+                      <a:fillRect/>
+                    </a:stretch>
+                  </pic:blipFill>
+                  <pic:spPr>
+                    <a:xfrm>
+                      <a:off x="0" y="0"/>
+                      <a:ext cx="3915321" cy="2067213"/>
+                    </a:xfrm>
+                    <a:prstGeom prst="rect">
+                      <a:avLst/>
+                    </a:prstGeom>
+                  </pic:spPr>
+                </pic:pic>
+              </a:graphicData>
+            </a:graphic>
+          </wp:inline>
+        </w:drawing>
+      </w:r>
+    </w:p>
+    <w:p>
+      <w:pPr>
+        <w:rPr>
+          <w:lang w:val="es-CO"/>
+        </w:rPr>
+      </w:pPr>
+      <w:r>
+        <w:rPr>
+          <w:lang w:val="es-CO"/>
+        </w:rPr>
+        <w:t>Si se añaden otras dos:</w:t>
+      </w:r>
+    </w:p>
+    <w:p>
+      <w:pPr>
+        <w:rPr>
+          <w:lang w:val="es-CO"/>
+        </w:rPr>
+      </w:pPr>
+      <w:r>
+        <w:rPr>
+          <w:lang w:val="es-CO"/>
+        </w:rPr>
+        <w:drawing>
+          <wp:inline distT="0" distB="0" distL="0" distR="0" wp14:anchorId="791DF431" wp14:editId="0D2E02AD">
+            <wp:extent cx="4887007" cy="2010056"/>
+            <wp:effectExtent l="0" t="0" r="0" b="9525"/>
+            <wp:docPr id="1902194880" name="Imagen 1"/>
+            <wp:cNvGraphicFramePr>
+              <a:graphicFrameLocks xmlns:a="http://schemas.openxmlformats.org/drawingml/2006/main" noChangeAspect="1"/>
+            </wp:cNvGraphicFramePr>
+            <a:graphic xmlns:a="http://schemas.openxmlformats.org/drawingml/2006/main">
+              <a:graphicData uri="http://schemas.openxmlformats.org/drawingml/2006/picture">
+                <pic:pic xmlns:pic="http://schemas.openxmlformats.org/drawingml/2006/picture">
+                  <pic:nvPicPr>
+                    <pic:cNvPr id="1902194880" name=""/>
+                    <pic:cNvPicPr/>
+                  </pic:nvPicPr>
+                  <pic:blipFill>
+                    <a:blip r:embed="rId54"/>
+                    <a:stretch>
+                      <a:fillRect/>
+                    </a:stretch>
+                  </pic:blipFill>
+                  <pic:spPr>
+                    <a:xfrm>
+                      <a:off x="0" y="0"/>
+                      <a:ext cx="4887007" cy="2010056"/>
+                    </a:xfrm>
+                    <a:prstGeom prst="rect">
+                      <a:avLst/>
+                    </a:prstGeom>
+                  </pic:spPr>
+                </pic:pic>
+              </a:graphicData>
+            </a:graphic>
+          </wp:inline>
+        </w:drawing>
+      </w:r>
+    </w:p>
+    <w:p>
+      <w:pPr>
+        <w:rPr>
+          <w:lang w:val="es-CO"/>
+        </w:rPr>
+      </w:pPr>
+      <w:r>
+        <w:rPr>
+          <w:lang w:val="es-CO"/>
+        </w:rPr>
+        <w:t>Y quiero borrar con un número negativo, lo va a tomar como si hubiera señalado la primera rueda:</w:t>
+      </w:r>
+    </w:p>
+    <w:p>
+      <w:pPr>
+        <w:rPr>
+          <w:lang w:val="es-CO"/>
+        </w:rPr>
+      </w:pPr>
+      <w:r>
+        <w:rPr>
+          <w:lang w:val="es-CO"/>
+        </w:rPr>
+        <w:lastRenderedPageBreak/>
+        <w:drawing>
+          <wp:inline distT="0" distB="0" distL="0" distR="0" wp14:anchorId="11419C3C" wp14:editId="1D13552F">
+            <wp:extent cx="3305636" cy="2191056"/>
+            <wp:effectExtent l="0" t="0" r="0" b="0"/>
+            <wp:docPr id="14423145" name="Imagen 1"/>
+            <wp:cNvGraphicFramePr>
+              <a:graphicFrameLocks xmlns:a="http://schemas.openxmlformats.org/drawingml/2006/main" noChangeAspect="1"/>
+            </wp:cNvGraphicFramePr>
+            <a:graphic xmlns:a="http://schemas.openxmlformats.org/drawingml/2006/main">
+              <a:graphicData uri="http://schemas.openxmlformats.org/drawingml/2006/picture">
+                <pic:pic xmlns:pic="http://schemas.openxmlformats.org/drawingml/2006/picture">
+                  <pic:nvPicPr>
+                    <pic:cNvPr id="14423145" name=""/>
+                    <pic:cNvPicPr/>
+                  </pic:nvPicPr>
+                  <pic:blipFill>
+                    <a:blip r:embed="rId55"/>
+                    <a:stretch>
+                      <a:fillRect/>
+                    </a:stretch>
+                  </pic:blipFill>
+                  <pic:spPr>
+                    <a:xfrm>
+                      <a:off x="0" y="0"/>
+                      <a:ext cx="3305636" cy="2191056"/>
+                    </a:xfrm>
+                    <a:prstGeom prst="rect">
+                      <a:avLst/>
+                    </a:prstGeom>
+                  </pic:spPr>
+                </pic:pic>
+              </a:graphicData>
+            </a:graphic>
+          </wp:inline>
+        </w:drawing>
+      </w:r>
+    </w:p>
+    <w:p>
+      <w:pPr>
+        <w:rPr>
+          <w:lang w:val="es-CO"/>
+        </w:rPr>
+      </w:pPr>
+      <w:r>
+        <w:rPr>
+          <w:lang w:val="es-CO"/>
+        </w:rPr>
+        <w:drawing>
+          <wp:inline distT="0" distB="0" distL="0" distR="0" wp14:anchorId="7E91D233" wp14:editId="3B39EC55">
+            <wp:extent cx="4906060" cy="2048161"/>
+            <wp:effectExtent l="0" t="0" r="8890" b="9525"/>
+            <wp:docPr id="434704890" name="Imagen 1"/>
+            <wp:cNvGraphicFramePr>
+              <a:graphicFrameLocks xmlns:a="http://schemas.openxmlformats.org/drawingml/2006/main" noChangeAspect="1"/>
+            </wp:cNvGraphicFramePr>
+            <a:graphic xmlns:a="http://schemas.openxmlformats.org/drawingml/2006/main">
+              <a:graphicData uri="http://schemas.openxmlformats.org/drawingml/2006/picture">
+                <pic:pic xmlns:pic="http://schemas.openxmlformats.org/drawingml/2006/picture">
+                  <pic:nvPicPr>
+                    <pic:cNvPr id="434704890" name=""/>
+                    <pic:cNvPicPr/>
+                  </pic:nvPicPr>
+                  <pic:blipFill>
+                    <a:blip r:embed="rId56"/>
+                    <a:stretch>
+                      <a:fillRect/>
+                    </a:stretch>
+                  </pic:blipFill>
+                  <pic:spPr>
+                    <a:xfrm>
+                      <a:off x="0" y="0"/>
+                      <a:ext cx="4906060" cy="2048161"/>
+                    </a:xfrm>
+                    <a:prstGeom prst="rect">
+                      <a:avLst/>
+                    </a:prstGeom>
+                  </pic:spPr>
+                </pic:pic>
+              </a:graphicData>
+            </a:graphic>
+          </wp:inline>
+        </w:drawing>
+      </w:r>
     </w:p>
     <w:sectPr>
-      <w:headerReference w:type="default" r:id="rId19"/>
+      <w:headerReference w:type="default" r:id="rId57"/>
       <w:pgSz w:w="12240" w:h="15840"/>
       <w:pgMar w:top="1440" w:right="1440" w:bottom="1440" w:left="1440" w:header="720" w:footer="720" w:gutter="0"/>
       <w:cols w:space="720"/>

</xml_diff>

<commit_message>
miniCiclo 6: add / delete symbol
</commit_message>
<xml_diff>
--- a/Primer Ciclo/Primer Ciclo.docx
+++ b/Primer Ciclo/Primer Ciclo.docx
@@ -1247,8 +1247,8 @@
           <w:lang w:val="es-CO"/>
         </w:rPr>
         <w:drawing>
-          <wp:inline distT="0" distB="0" distL="0" distR="0" wp14:anchorId="38F0C526" wp14:editId="07C82065">
-            <wp:extent cx="3219899" cy="2743583"/>
+          <wp:inline distT="0" distB="0" distL="0" distR="0" wp14:anchorId="38F0C526" wp14:editId="7B2C6760">
+            <wp:extent cx="3219450" cy="1581150"/>
             <wp:effectExtent l="0" t="0" r="0" b="0"/>
             <wp:docPr id="2003374044" name="Imagen 1"/>
             <wp:cNvGraphicFramePr>
@@ -1261,20 +1261,29 @@
                     <pic:cNvPr id="2003374044" name=""/>
                     <pic:cNvPicPr/>
                   </pic:nvPicPr>
-                  <pic:blipFill>
+                  <pic:blipFill rotWithShape="1">
                     <a:blip r:embed="rId16"/>
-                    <a:stretch>
-                      <a:fillRect/>
-                    </a:stretch>
-                  </pic:blipFill>
-                  <pic:spPr>
-                    <a:xfrm>
-                      <a:off x="0" y="0"/>
-                      <a:ext cx="3219899" cy="2743583"/>
-                    </a:xfrm>
-                    <a:prstGeom prst="rect">
-                      <a:avLst/>
-                    </a:prstGeom>
+                    <a:srcRect t="31945" b="10416"/>
+                    <a:stretch>
+                      <a:fillRect/>
+                    </a:stretch>
+                  </pic:blipFill>
+                  <pic:spPr bwMode="auto">
+                    <a:xfrm>
+                      <a:off x="0" y="0"/>
+                      <a:ext cx="3219899" cy="1581371"/>
+                    </a:xfrm>
+                    <a:prstGeom prst="rect">
+                      <a:avLst/>
+                    </a:prstGeom>
+                    <a:ln>
+                      <a:noFill/>
+                    </a:ln>
+                    <a:extLst>
+                      <a:ext uri="{53640926-AAD7-44D8-BBD7-CCE9431645EC}">
+                        <a14:shadowObscured xmlns:a14="http://schemas.microsoft.com/office/drawing/2010/main"/>
+                      </a:ext>
+                    </a:extLst>
                   </pic:spPr>
                 </pic:pic>
               </a:graphicData>
@@ -1432,20 +1441,20 @@
         <w:rPr>
           <w:lang w:val="es-CO"/>
         </w:rPr>
+        <w:t>makeInvisible(): Se encarga de volver invisible a Wheel y al símbolo que tenga actualmente.</w:t>
+      </w:r>
+    </w:p>
+    <w:p>
+      <w:pPr>
+        <w:rPr>
+          <w:lang w:val="es-CO"/>
+        </w:rPr>
+      </w:pPr>
+      <w:r>
+        <w:rPr>
+          <w:lang w:val="es-CO"/>
+        </w:rPr>
         <w:lastRenderedPageBreak/>
-        <w:t>makeInvisible(): Se encarga de volver invisible a Wheel y al símbolo que tenga actualmente.</w:t>
-      </w:r>
-    </w:p>
-    <w:p>
-      <w:pPr>
-        <w:rPr>
-          <w:lang w:val="es-CO"/>
-        </w:rPr>
-      </w:pPr>
-      <w:r>
-        <w:rPr>
-          <w:lang w:val="es-CO"/>
-        </w:rPr>
         <w:drawing>
           <wp:inline distT="0" distB="0" distL="0" distR="0" wp14:anchorId="5D78B5A8" wp14:editId="7ADDE2FE">
             <wp:extent cx="4648849" cy="1648055"/>
@@ -1627,66 +1636,6 @@
           <w:lang w:val="es-CO"/>
         </w:rPr>
       </w:pPr>
-      <w:r>
-        <w:rPr>
-          <w:lang w:val="es-CO"/>
-        </w:rPr>
-        <w:t>deleteSymbol(): Se encarga de borrar un símbolo de la rueda</w:t>
-      </w:r>
-      <w:r>
-        <w:rPr>
-          <w:lang w:val="es-CO"/>
-        </w:rPr>
-        <w:t>.</w:t>
-      </w:r>
-    </w:p>
-    <w:p>
-      <w:pPr>
-        <w:rPr>
-          <w:lang w:val="es-CO"/>
-        </w:rPr>
-      </w:pPr>
-      <w:r>
-        <w:rPr>
-          <w:lang w:val="es-CO"/>
-        </w:rPr>
-        <w:lastRenderedPageBreak/>
-        <w:drawing>
-          <wp:inline distT="0" distB="0" distL="0" distR="0" wp14:anchorId="36DF256D" wp14:editId="29AB9653">
-            <wp:extent cx="4267796" cy="1991003"/>
-            <wp:effectExtent l="0" t="0" r="0" b="9525"/>
-            <wp:docPr id="636008894" name="Imagen 1"/>
-            <wp:cNvGraphicFramePr>
-              <a:graphicFrameLocks xmlns:a="http://schemas.openxmlformats.org/drawingml/2006/main" noChangeAspect="1"/>
-            </wp:cNvGraphicFramePr>
-            <a:graphic xmlns:a="http://schemas.openxmlformats.org/drawingml/2006/main">
-              <a:graphicData uri="http://schemas.openxmlformats.org/drawingml/2006/picture">
-                <pic:pic xmlns:pic="http://schemas.openxmlformats.org/drawingml/2006/picture">
-                  <pic:nvPicPr>
-                    <pic:cNvPr id="636008894" name=""/>
-                    <pic:cNvPicPr/>
-                  </pic:nvPicPr>
-                  <pic:blipFill>
-                    <a:blip r:embed="rId22"/>
-                    <a:stretch>
-                      <a:fillRect/>
-                    </a:stretch>
-                  </pic:blipFill>
-                  <pic:spPr>
-                    <a:xfrm>
-                      <a:off x="0" y="0"/>
-                      <a:ext cx="4267796" cy="1991003"/>
-                    </a:xfrm>
-                    <a:prstGeom prst="rect">
-                      <a:avLst/>
-                    </a:prstGeom>
-                  </pic:spPr>
-                </pic:pic>
-              </a:graphicData>
-            </a:graphic>
-          </wp:inline>
-        </w:drawing>
-      </w:r>
     </w:p>
     <w:p>
       <w:pPr>
@@ -1727,7 +1676,7 @@
                     <pic:cNvPicPr/>
                   </pic:nvPicPr>
                   <pic:blipFill>
-                    <a:blip r:embed="rId23"/>
+                    <a:blip r:embed="rId22"/>
                     <a:stretch>
                       <a:fillRect/>
                     </a:stretch>
@@ -1778,6 +1727,7 @@
         <w:rPr>
           <w:lang w:val="es-CO"/>
         </w:rPr>
+        <w:lastRenderedPageBreak/>
         <w:t>Inicialmente Wheel vacio se ve como:</w:t>
       </w:r>
     </w:p>
@@ -1807,7 +1757,7 @@
                     <pic:cNvPicPr/>
                   </pic:nvPicPr>
                   <pic:blipFill>
-                    <a:blip r:embed="rId24"/>
+                    <a:blip r:embed="rId23"/>
                     <a:stretch>
                       <a:fillRect/>
                     </a:stretch>
@@ -1867,7 +1817,7 @@
                     <pic:cNvPicPr/>
                   </pic:nvPicPr>
                   <pic:blipFill>
-                    <a:blip r:embed="rId25"/>
+                    <a:blip r:embed="rId24"/>
                     <a:stretch>
                       <a:fillRect/>
                     </a:stretch>
@@ -1930,7 +1880,6 @@
         <w:rPr>
           <w:lang w:val="es-CO"/>
         </w:rPr>
-        <w:lastRenderedPageBreak/>
         <w:drawing>
           <wp:inline distT="0" distB="0" distL="0" distR="0" wp14:anchorId="730B8B58" wp14:editId="1CEDB2EC">
             <wp:extent cx="3419952" cy="885949"/>
@@ -1947,7 +1896,7 @@
                     <pic:cNvPicPr/>
                   </pic:nvPicPr>
                   <pic:blipFill>
-                    <a:blip r:embed="rId26"/>
+                    <a:blip r:embed="rId25"/>
                     <a:stretch>
                       <a:fillRect/>
                     </a:stretch>
@@ -2044,30 +1993,30 @@
           <w:lang w:val="es-CO"/>
         </w:rPr>
         <w:drawing>
-          <wp:inline distT="0" distB="0" distL="0" distR="0" wp14:anchorId="529DFCDE" wp14:editId="11FABBB9">
-            <wp:extent cx="3810532" cy="647790"/>
-            <wp:effectExtent l="0" t="0" r="0" b="0"/>
-            <wp:docPr id="1984519304" name="Imagen 1"/>
-            <wp:cNvGraphicFramePr>
-              <a:graphicFrameLocks xmlns:a="http://schemas.openxmlformats.org/drawingml/2006/main" noChangeAspect="1"/>
-            </wp:cNvGraphicFramePr>
-            <a:graphic xmlns:a="http://schemas.openxmlformats.org/drawingml/2006/main">
-              <a:graphicData uri="http://schemas.openxmlformats.org/drawingml/2006/picture">
-                <pic:pic xmlns:pic="http://schemas.openxmlformats.org/drawingml/2006/picture">
-                  <pic:nvPicPr>
-                    <pic:cNvPr id="1984519304" name=""/>
-                    <pic:cNvPicPr/>
-                  </pic:nvPicPr>
-                  <pic:blipFill>
-                    <a:blip r:embed="rId27"/>
-                    <a:stretch>
-                      <a:fillRect/>
-                    </a:stretch>
-                  </pic:blipFill>
-                  <pic:spPr>
-                    <a:xfrm>
-                      <a:off x="0" y="0"/>
-                      <a:ext cx="3810532" cy="647790"/>
+          <wp:inline distT="0" distB="0" distL="0" distR="0" wp14:anchorId="50C9C4B2" wp14:editId="678BBB8D">
+            <wp:extent cx="4010585" cy="762106"/>
+            <wp:effectExtent l="0" t="0" r="9525" b="0"/>
+            <wp:docPr id="2114480453" name="Imagen 1"/>
+            <wp:cNvGraphicFramePr>
+              <a:graphicFrameLocks xmlns:a="http://schemas.openxmlformats.org/drawingml/2006/main" noChangeAspect="1"/>
+            </wp:cNvGraphicFramePr>
+            <a:graphic xmlns:a="http://schemas.openxmlformats.org/drawingml/2006/main">
+              <a:graphicData uri="http://schemas.openxmlformats.org/drawingml/2006/picture">
+                <pic:pic xmlns:pic="http://schemas.openxmlformats.org/drawingml/2006/picture">
+                  <pic:nvPicPr>
+                    <pic:cNvPr id="2114480453" name=""/>
+                    <pic:cNvPicPr/>
+                  </pic:nvPicPr>
+                  <pic:blipFill>
+                    <a:blip r:embed="rId26"/>
+                    <a:stretch>
+                      <a:fillRect/>
+                    </a:stretch>
+                  </pic:blipFill>
+                  <pic:spPr>
+                    <a:xfrm>
+                      <a:off x="0" y="0"/>
+                      <a:ext cx="4010585" cy="762106"/>
                     </a:xfrm>
                     <a:prstGeom prst="rect">
                       <a:avLst/>
@@ -2128,6 +2077,7 @@
         <w:rPr>
           <w:lang w:val="es-CO"/>
         </w:rPr>
+        <w:lastRenderedPageBreak/>
         <w:drawing>
           <wp:inline distT="0" distB="0" distL="0" distR="0" wp14:anchorId="7EEF9A8F" wp14:editId="49095D9B">
             <wp:extent cx="5430008" cy="3620005"/>
@@ -2144,7 +2094,7 @@
                     <pic:cNvPicPr/>
                   </pic:nvPicPr>
                   <pic:blipFill>
-                    <a:blip r:embed="rId28"/>
+                    <a:blip r:embed="rId27"/>
                     <a:stretch>
                       <a:fillRect/>
                     </a:stretch>
@@ -2175,7 +2125,6 @@
         <w:rPr>
           <w:lang w:val="es-CO"/>
         </w:rPr>
-        <w:lastRenderedPageBreak/>
         <w:t>prepareMachine(): Se encarga de poner en un estado inicial al tablero</w:t>
       </w:r>
       <w:r>
@@ -2211,6 +2160,97 @@
                     <pic:cNvPicPr/>
                   </pic:nvPicPr>
                   <pic:blipFill>
+                    <a:blip r:embed="rId28"/>
+                    <a:stretch>
+                      <a:fillRect/>
+                    </a:stretch>
+                  </pic:blipFill>
+                  <pic:spPr>
+                    <a:xfrm>
+                      <a:off x="0" y="0"/>
+                      <a:ext cx="5943600" cy="1344930"/>
+                    </a:xfrm>
+                    <a:prstGeom prst="rect">
+                      <a:avLst/>
+                    </a:prstGeom>
+                  </pic:spPr>
+                </pic:pic>
+              </a:graphicData>
+            </a:graphic>
+          </wp:inline>
+        </w:drawing>
+      </w:r>
+    </w:p>
+    <w:p>
+      <w:pPr>
+        <w:rPr>
+          <w:lang w:val="es-CO"/>
+        </w:rPr>
+      </w:pPr>
+      <w:r>
+        <w:rPr>
+          <w:lang w:val="es-CO"/>
+        </w:rPr>
+        <w:t xml:space="preserve">prepareSymbols(): Se encarga de crear unos símbolos predeterminados con el color </w:t>
+      </w:r>
+      <w:r>
+        <w:rPr>
+          <w:lang w:val="es-CO"/>
+        </w:rPr>
+        <w:t xml:space="preserve">verde, </w:t>
+      </w:r>
+      <w:r>
+        <w:rPr>
+          <w:lang w:val="es-CO"/>
+        </w:rPr>
+        <w:t>rojo</w:t>
+      </w:r>
+      <w:r>
+        <w:rPr>
+          <w:lang w:val="es-CO"/>
+        </w:rPr>
+        <w:t xml:space="preserve"> y</w:t>
+      </w:r>
+      <w:r>
+        <w:rPr>
+          <w:lang w:val="es-CO"/>
+        </w:rPr>
+        <w:t xml:space="preserve"> azul</w:t>
+      </w:r>
+      <w:r>
+        <w:rPr>
+          <w:lang w:val="es-CO"/>
+        </w:rPr>
+        <w:t>.</w:t>
+      </w:r>
+    </w:p>
+    <w:p>
+      <w:pPr>
+        <w:rPr>
+          <w:lang w:val="es-CO"/>
+        </w:rPr>
+      </w:pPr>
+      <w:r>
+        <w:rPr>
+          <w:lang w:val="es-CO"/>
+        </w:rPr>
+        <w:lastRenderedPageBreak/>
+        <w:drawing>
+          <wp:inline distT="0" distB="0" distL="0" distR="0" wp14:anchorId="147E854A" wp14:editId="54CC2134">
+            <wp:extent cx="5725324" cy="1886213"/>
+            <wp:effectExtent l="0" t="0" r="8890" b="0"/>
+            <wp:docPr id="289844680" name="Imagen 1"/>
+            <wp:cNvGraphicFramePr>
+              <a:graphicFrameLocks xmlns:a="http://schemas.openxmlformats.org/drawingml/2006/main" noChangeAspect="1"/>
+            </wp:cNvGraphicFramePr>
+            <a:graphic xmlns:a="http://schemas.openxmlformats.org/drawingml/2006/main">
+              <a:graphicData uri="http://schemas.openxmlformats.org/drawingml/2006/picture">
+                <pic:pic xmlns:pic="http://schemas.openxmlformats.org/drawingml/2006/picture">
+                  <pic:nvPicPr>
+                    <pic:cNvPr id="289844680" name=""/>
+                    <pic:cNvPicPr/>
+                  </pic:nvPicPr>
+                  <pic:blipFill>
                     <a:blip r:embed="rId29"/>
                     <a:stretch>
                       <a:fillRect/>
@@ -2219,85 +2259,67 @@
                   <pic:spPr>
                     <a:xfrm>
                       <a:off x="0" y="0"/>
-                      <a:ext cx="5943600" cy="1344930"/>
-                    </a:xfrm>
-                    <a:prstGeom prst="rect">
-                      <a:avLst/>
-                    </a:prstGeom>
-                  </pic:spPr>
-                </pic:pic>
-              </a:graphicData>
-            </a:graphic>
-          </wp:inline>
-        </w:drawing>
-      </w:r>
-    </w:p>
-    <w:p>
-      <w:pPr>
-        <w:rPr>
-          <w:lang w:val="es-CO"/>
-        </w:rPr>
-      </w:pPr>
-      <w:r>
-        <w:rPr>
-          <w:lang w:val="es-CO"/>
-        </w:rPr>
-        <w:t xml:space="preserve">prepareSymbols(): Se encarga de crear unos símbolos predeterminados con el color </w:t>
-      </w:r>
-      <w:r>
-        <w:rPr>
-          <w:lang w:val="es-CO"/>
-        </w:rPr>
-        <w:t xml:space="preserve">verde, </w:t>
-      </w:r>
-      <w:r>
-        <w:rPr>
-          <w:lang w:val="es-CO"/>
-        </w:rPr>
-        <w:t>rojo</w:t>
-      </w:r>
-      <w:r>
-        <w:rPr>
-          <w:lang w:val="es-CO"/>
-        </w:rPr>
-        <w:t xml:space="preserve"> y</w:t>
-      </w:r>
-      <w:r>
-        <w:rPr>
-          <w:lang w:val="es-CO"/>
-        </w:rPr>
-        <w:t xml:space="preserve"> azul</w:t>
-      </w:r>
-      <w:r>
-        <w:rPr>
-          <w:lang w:val="es-CO"/>
-        </w:rPr>
-        <w:t>.</w:t>
-      </w:r>
-    </w:p>
-    <w:p>
-      <w:pPr>
-        <w:rPr>
-          <w:lang w:val="es-CO"/>
-        </w:rPr>
-      </w:pPr>
-      <w:r>
-        <w:rPr>
-          <w:lang w:val="es-CO"/>
-        </w:rPr>
-        <w:drawing>
-          <wp:inline distT="0" distB="0" distL="0" distR="0" wp14:anchorId="624082ED" wp14:editId="0C9B90AD">
-            <wp:extent cx="5943600" cy="1827530"/>
-            <wp:effectExtent l="0" t="0" r="0" b="1270"/>
-            <wp:docPr id="1152489133" name="Imagen 1"/>
-            <wp:cNvGraphicFramePr>
-              <a:graphicFrameLocks xmlns:a="http://schemas.openxmlformats.org/drawingml/2006/main" noChangeAspect="1"/>
-            </wp:cNvGraphicFramePr>
-            <a:graphic xmlns:a="http://schemas.openxmlformats.org/drawingml/2006/main">
-              <a:graphicData uri="http://schemas.openxmlformats.org/drawingml/2006/picture">
-                <pic:pic xmlns:pic="http://schemas.openxmlformats.org/drawingml/2006/picture">
-                  <pic:nvPicPr>
-                    <pic:cNvPr id="1152489133" name=""/>
+                      <a:ext cx="5725324" cy="1886213"/>
+                    </a:xfrm>
+                    <a:prstGeom prst="rect">
+                      <a:avLst/>
+                    </a:prstGeom>
+                  </pic:spPr>
+                </pic:pic>
+              </a:graphicData>
+            </a:graphic>
+          </wp:inline>
+        </w:drawing>
+      </w:r>
+    </w:p>
+    <w:p>
+      <w:pPr>
+        <w:rPr>
+          <w:lang w:val="es-CO"/>
+        </w:rPr>
+      </w:pPr>
+      <w:r>
+        <w:rPr>
+          <w:lang w:val="es-CO"/>
+        </w:rPr>
+        <w:t xml:space="preserve">prepareWheels(): Se encarga de crear las ruedas, además de situar sus símbolos </w:t>
+      </w:r>
+      <w:r>
+        <w:rPr>
+          <w:lang w:val="es-CO"/>
+        </w:rPr>
+        <w:t>en uno al azar de los que tiene.</w:t>
+      </w:r>
+      <w:r>
+        <w:rPr>
+          <w:lang w:val="es-CO"/>
+        </w:rPr>
+        <w:t xml:space="preserve"> Esto hizo necesario crear un método en Wheel llamado randomizeSymbol().</w:t>
+      </w:r>
+    </w:p>
+    <w:p>
+      <w:pPr>
+        <w:rPr>
+          <w:lang w:val="es-CO"/>
+        </w:rPr>
+      </w:pPr>
+      <w:r>
+        <w:rPr>
+          <w:lang w:val="es-CO"/>
+        </w:rPr>
+        <w:drawing>
+          <wp:inline distT="0" distB="0" distL="0" distR="0" wp14:anchorId="02107AD3" wp14:editId="4D44A16E">
+            <wp:extent cx="5725324" cy="3905795"/>
+            <wp:effectExtent l="0" t="0" r="8890" b="0"/>
+            <wp:docPr id="1017242837" name="Imagen 1"/>
+            <wp:cNvGraphicFramePr>
+              <a:graphicFrameLocks xmlns:a="http://schemas.openxmlformats.org/drawingml/2006/main" noChangeAspect="1"/>
+            </wp:cNvGraphicFramePr>
+            <a:graphic xmlns:a="http://schemas.openxmlformats.org/drawingml/2006/main">
+              <a:graphicData uri="http://schemas.openxmlformats.org/drawingml/2006/picture">
+                <pic:pic xmlns:pic="http://schemas.openxmlformats.org/drawingml/2006/picture">
+                  <pic:nvPicPr>
+                    <pic:cNvPr id="1017242837" name=""/>
                     <pic:cNvPicPr/>
                   </pic:nvPicPr>
                   <pic:blipFill>
@@ -2309,42 +2331,36 @@
                   <pic:spPr>
                     <a:xfrm>
                       <a:off x="0" y="0"/>
-                      <a:ext cx="5943600" cy="1827530"/>
-                    </a:xfrm>
-                    <a:prstGeom prst="rect">
-                      <a:avLst/>
-                    </a:prstGeom>
-                  </pic:spPr>
-                </pic:pic>
-              </a:graphicData>
-            </a:graphic>
-          </wp:inline>
-        </w:drawing>
-      </w:r>
-    </w:p>
-    <w:p>
-      <w:pPr>
-        <w:rPr>
-          <w:lang w:val="es-CO"/>
-        </w:rPr>
-      </w:pPr>
-      <w:r>
-        <w:rPr>
-          <w:lang w:val="es-CO"/>
-        </w:rPr>
-        <w:t xml:space="preserve">prepareWheels(): Se encarga de crear las ruedas, además de situar sus símbolos </w:t>
-      </w:r>
-      <w:r>
-        <w:rPr>
-          <w:lang w:val="es-CO"/>
-        </w:rPr>
-        <w:t>en uno al azar de los que tiene.</w:t>
-      </w:r>
-      <w:r>
-        <w:rPr>
-          <w:lang w:val="es-CO"/>
-        </w:rPr>
-        <w:t xml:space="preserve"> Esto hizo necesario crear un método en Wheel llamado randomizeSymbol().</w:t>
+                      <a:ext cx="5725324" cy="3905795"/>
+                    </a:xfrm>
+                    <a:prstGeom prst="rect">
+                      <a:avLst/>
+                    </a:prstGeom>
+                  </pic:spPr>
+                </pic:pic>
+              </a:graphicData>
+            </a:graphic>
+          </wp:inline>
+        </w:drawing>
+      </w:r>
+    </w:p>
+    <w:p>
+      <w:pPr>
+        <w:rPr>
+          <w:lang w:val="es-CO"/>
+        </w:rPr>
+      </w:pPr>
+      <w:r>
+        <w:rPr>
+          <w:lang w:val="es-CO"/>
+        </w:rPr>
+        <w:t xml:space="preserve">randomNumGenerator(): </w:t>
+      </w:r>
+      <w:r>
+        <w:rPr>
+          <w:lang w:val="es-CO"/>
+        </w:rPr>
+        <w:t>Es un método estático, que se busca usar, para cualquier cálculo que dependa de generar números aleatorios, por tanto puede ser usado por cualquiera en cualquier momento.</w:t>
       </w:r>
     </w:p>
     <w:p>
@@ -2358,72 +2374,6 @@
           <w:lang w:val="es-CO"/>
         </w:rPr>
         <w:lastRenderedPageBreak/>
-        <w:drawing>
-          <wp:inline distT="0" distB="0" distL="0" distR="0" wp14:anchorId="2EB86DEE" wp14:editId="74601CA3">
-            <wp:extent cx="5943600" cy="4057015"/>
-            <wp:effectExtent l="0" t="0" r="0" b="635"/>
-            <wp:docPr id="270032048" name="Imagen 1"/>
-            <wp:cNvGraphicFramePr>
-              <a:graphicFrameLocks xmlns:a="http://schemas.openxmlformats.org/drawingml/2006/main" noChangeAspect="1"/>
-            </wp:cNvGraphicFramePr>
-            <a:graphic xmlns:a="http://schemas.openxmlformats.org/drawingml/2006/main">
-              <a:graphicData uri="http://schemas.openxmlformats.org/drawingml/2006/picture">
-                <pic:pic xmlns:pic="http://schemas.openxmlformats.org/drawingml/2006/picture">
-                  <pic:nvPicPr>
-                    <pic:cNvPr id="270032048" name=""/>
-                    <pic:cNvPicPr/>
-                  </pic:nvPicPr>
-                  <pic:blipFill>
-                    <a:blip r:embed="rId31"/>
-                    <a:stretch>
-                      <a:fillRect/>
-                    </a:stretch>
-                  </pic:blipFill>
-                  <pic:spPr>
-                    <a:xfrm>
-                      <a:off x="0" y="0"/>
-                      <a:ext cx="5943600" cy="4057015"/>
-                    </a:xfrm>
-                    <a:prstGeom prst="rect">
-                      <a:avLst/>
-                    </a:prstGeom>
-                  </pic:spPr>
-                </pic:pic>
-              </a:graphicData>
-            </a:graphic>
-          </wp:inline>
-        </w:drawing>
-      </w:r>
-    </w:p>
-    <w:p>
-      <w:pPr>
-        <w:rPr>
-          <w:lang w:val="es-CO"/>
-        </w:rPr>
-      </w:pPr>
-      <w:r>
-        <w:rPr>
-          <w:lang w:val="es-CO"/>
-        </w:rPr>
-        <w:t xml:space="preserve">randomNumGenerator(): </w:t>
-      </w:r>
-      <w:r>
-        <w:rPr>
-          <w:lang w:val="es-CO"/>
-        </w:rPr>
-        <w:t>Es un método estático, que se busca usar, para cualquier cálculo que dependa de generar números aleatorios, por tanto puede ser usado por cualquiera en cualquier momento.</w:t>
-      </w:r>
-    </w:p>
-    <w:p>
-      <w:pPr>
-        <w:rPr>
-          <w:lang w:val="es-CO"/>
-        </w:rPr>
-      </w:pPr>
-      <w:r>
-        <w:rPr>
-          <w:lang w:val="es-CO"/>
-        </w:rPr>
         <w:drawing>
           <wp:inline distT="0" distB="0" distL="0" distR="0" wp14:anchorId="6EE6C572" wp14:editId="327D09F8">
             <wp:extent cx="5943600" cy="1965960"/>
@@ -2440,7 +2390,7 @@
                     <pic:cNvPicPr/>
                   </pic:nvPicPr>
                   <pic:blipFill>
-                    <a:blip r:embed="rId32"/>
+                    <a:blip r:embed="rId31"/>
                     <a:stretch>
                       <a:fillRect/>
                     </a:stretch>
@@ -2544,7 +2494,6 @@
         <w:rPr>
           <w:lang w:val="es-CO"/>
         </w:rPr>
-        <w:lastRenderedPageBreak/>
         <w:drawing>
           <wp:inline distT="0" distB="0" distL="0" distR="0" wp14:anchorId="17B81619" wp14:editId="5E0F2B5B">
             <wp:extent cx="5943600" cy="1461135"/>
@@ -2561,7 +2510,7 @@
                     <pic:cNvPicPr/>
                   </pic:nvPicPr>
                   <pic:blipFill>
-                    <a:blip r:embed="rId33"/>
+                    <a:blip r:embed="rId32"/>
                     <a:stretch>
                       <a:fillRect/>
                     </a:stretch>
@@ -2592,6 +2541,7 @@
         <w:rPr>
           <w:lang w:val="es-CO"/>
         </w:rPr>
+        <w:lastRenderedPageBreak/>
         <w:drawing>
           <wp:inline distT="0" distB="0" distL="0" distR="0" wp14:anchorId="16BC14C5" wp14:editId="6A17137A">
             <wp:extent cx="5943600" cy="3581400"/>
@@ -2608,7 +2558,7 @@
                     <pic:cNvPicPr/>
                   </pic:nvPicPr>
                   <pic:blipFill>
-                    <a:blip r:embed="rId34"/>
+                    <a:blip r:embed="rId33"/>
                     <a:stretch>
                       <a:fillRect/>
                     </a:stretch>
@@ -2775,44 +2725,44 @@
         <w:rPr>
           <w:lang w:val="es-CO"/>
         </w:rPr>
+        <w:t xml:space="preserve">Y= </w:t>
+      </w:r>
+      <w:r>
+        <w:rPr>
+          <w:lang w:val="es-CO"/>
+        </w:rPr>
+        <w:t>(</w:t>
+      </w:r>
+      <w:r>
+        <w:rPr>
+          <w:lang w:val="es-CO"/>
+        </w:rPr>
+        <w:t>X</w:t>
+      </w:r>
+      <w:r>
+        <w:rPr>
+          <w:lang w:val="es-CO"/>
+        </w:rPr>
+        <w:t xml:space="preserve"> – 50*n)/</w:t>
+      </w:r>
+      <w:r>
+        <w:rPr>
+          <w:lang w:val="es-CO"/>
+        </w:rPr>
+        <w:t>(n+1)</w:t>
+      </w:r>
+    </w:p>
+    <w:p>
+      <w:pPr>
+        <w:rPr>
+          <w:lang w:val="es-CO"/>
+        </w:rPr>
+      </w:pPr>
+      <w:r>
+        <w:rPr>
+          <w:lang w:val="es-CO"/>
+        </w:rPr>
         <w:lastRenderedPageBreak/>
-        <w:t xml:space="preserve">Y= </w:t>
-      </w:r>
-      <w:r>
-        <w:rPr>
-          <w:lang w:val="es-CO"/>
-        </w:rPr>
-        <w:t>(</w:t>
-      </w:r>
-      <w:r>
-        <w:rPr>
-          <w:lang w:val="es-CO"/>
-        </w:rPr>
-        <w:t>X</w:t>
-      </w:r>
-      <w:r>
-        <w:rPr>
-          <w:lang w:val="es-CO"/>
-        </w:rPr>
-        <w:t xml:space="preserve"> – 50*n)/</w:t>
-      </w:r>
-      <w:r>
-        <w:rPr>
-          <w:lang w:val="es-CO"/>
-        </w:rPr>
-        <w:t>(n+1)</w:t>
-      </w:r>
-    </w:p>
-    <w:p>
-      <w:pPr>
-        <w:rPr>
-          <w:lang w:val="es-CO"/>
-        </w:rPr>
-      </w:pPr>
-      <w:r>
-        <w:rPr>
-          <w:lang w:val="es-CO"/>
-        </w:rPr>
         <w:drawing>
           <wp:inline distT="0" distB="0" distL="0" distR="0" wp14:anchorId="40E59D09" wp14:editId="43C637FD">
             <wp:extent cx="4001058" cy="2257740"/>
@@ -2829,7 +2779,7 @@
                     <pic:cNvPicPr/>
                   </pic:nvPicPr>
                   <pic:blipFill>
-                    <a:blip r:embed="rId35"/>
+                    <a:blip r:embed="rId34"/>
                     <a:stretch>
                       <a:fillRect/>
                     </a:stretch>
@@ -2927,7 +2877,7 @@
                     <pic:cNvPicPr/>
                   </pic:nvPicPr>
                   <pic:blipFill>
-                    <a:blip r:embed="rId36"/>
+                    <a:blip r:embed="rId35"/>
                     <a:stretch>
                       <a:fillRect/>
                     </a:stretch>
@@ -2975,7 +2925,7 @@
                     <pic:cNvPicPr/>
                   </pic:nvPicPr>
                   <pic:blipFill>
-                    <a:blip r:embed="rId37"/>
+                    <a:blip r:embed="rId36"/>
                     <a:stretch>
                       <a:fillRect/>
                     </a:stretch>
@@ -3073,7 +3023,7 @@
                     <pic:cNvPicPr/>
                   </pic:nvPicPr>
                   <pic:blipFill>
-                    <a:blip r:embed="rId38"/>
+                    <a:blip r:embed="rId37"/>
                     <a:stretch>
                       <a:fillRect/>
                     </a:stretch>
@@ -3213,30 +3163,30 @@
           <w:lang w:val="es-CO"/>
         </w:rPr>
         <w:drawing>
-          <wp:inline distT="0" distB="0" distL="0" distR="0" wp14:anchorId="671C3BD3" wp14:editId="41300AC8">
-            <wp:extent cx="5277587" cy="2457793"/>
+          <wp:inline distT="0" distB="0" distL="0" distR="0" wp14:anchorId="30B0880B" wp14:editId="7F5FDCBE">
+            <wp:extent cx="5706271" cy="2362530"/>
             <wp:effectExtent l="0" t="0" r="0" b="0"/>
-            <wp:docPr id="790801852" name="Imagen 1"/>
-            <wp:cNvGraphicFramePr>
-              <a:graphicFrameLocks xmlns:a="http://schemas.openxmlformats.org/drawingml/2006/main" noChangeAspect="1"/>
-            </wp:cNvGraphicFramePr>
-            <a:graphic xmlns:a="http://schemas.openxmlformats.org/drawingml/2006/main">
-              <a:graphicData uri="http://schemas.openxmlformats.org/drawingml/2006/picture">
-                <pic:pic xmlns:pic="http://schemas.openxmlformats.org/drawingml/2006/picture">
-                  <pic:nvPicPr>
-                    <pic:cNvPr id="790801852" name=""/>
-                    <pic:cNvPicPr/>
-                  </pic:nvPicPr>
-                  <pic:blipFill>
-                    <a:blip r:embed="rId39"/>
-                    <a:stretch>
-                      <a:fillRect/>
-                    </a:stretch>
-                  </pic:blipFill>
-                  <pic:spPr>
-                    <a:xfrm>
-                      <a:off x="0" y="0"/>
-                      <a:ext cx="5277587" cy="2457793"/>
+            <wp:docPr id="1380323753" name="Imagen 1"/>
+            <wp:cNvGraphicFramePr>
+              <a:graphicFrameLocks xmlns:a="http://schemas.openxmlformats.org/drawingml/2006/main" noChangeAspect="1"/>
+            </wp:cNvGraphicFramePr>
+            <a:graphic xmlns:a="http://schemas.openxmlformats.org/drawingml/2006/main">
+              <a:graphicData uri="http://schemas.openxmlformats.org/drawingml/2006/picture">
+                <pic:pic xmlns:pic="http://schemas.openxmlformats.org/drawingml/2006/picture">
+                  <pic:nvPicPr>
+                    <pic:cNvPr id="1380323753" name=""/>
+                    <pic:cNvPicPr/>
+                  </pic:nvPicPr>
+                  <pic:blipFill>
+                    <a:blip r:embed="rId38"/>
+                    <a:stretch>
+                      <a:fillRect/>
+                    </a:stretch>
+                  </pic:blipFill>
+                  <pic:spPr>
+                    <a:xfrm>
+                      <a:off x="0" y="0"/>
+                      <a:ext cx="5706271" cy="2362530"/>
                     </a:xfrm>
                     <a:prstGeom prst="rect">
                       <a:avLst/>
@@ -3307,7 +3257,7 @@
                     <pic:cNvPicPr/>
                   </pic:nvPicPr>
                   <pic:blipFill>
-                    <a:blip r:embed="rId40"/>
+                    <a:blip r:embed="rId39"/>
                     <a:stretch>
                       <a:fillRect/>
                     </a:stretch>
@@ -3367,7 +3317,7 @@
                     <pic:cNvPicPr/>
                   </pic:nvPicPr>
                   <pic:blipFill>
-                    <a:blip r:embed="rId41"/>
+                    <a:blip r:embed="rId40"/>
                     <a:stretch>
                       <a:fillRect/>
                     </a:stretch>
@@ -3428,7 +3378,7 @@
                     <pic:cNvPicPr/>
                   </pic:nvPicPr>
                   <pic:blipFill>
-                    <a:blip r:embed="rId42"/>
+                    <a:blip r:embed="rId41"/>
                     <a:stretch>
                       <a:fillRect/>
                     </a:stretch>
@@ -3488,7 +3438,7 @@
                     <pic:cNvPicPr/>
                   </pic:nvPicPr>
                   <pic:blipFill>
-                    <a:blip r:embed="rId43"/>
+                    <a:blip r:embed="rId42"/>
                     <a:stretch>
                       <a:fillRect/>
                     </a:stretch>
@@ -3548,7 +3498,7 @@
                     <pic:cNvPicPr/>
                   </pic:nvPicPr>
                   <pic:blipFill>
-                    <a:blip r:embed="rId44"/>
+                    <a:blip r:embed="rId43"/>
                     <a:stretch>
                       <a:fillRect/>
                     </a:stretch>
@@ -3615,7 +3565,7 @@
                     <pic:cNvPicPr/>
                   </pic:nvPicPr>
                   <pic:blipFill>
-                    <a:blip r:embed="rId45"/>
+                    <a:blip r:embed="rId44"/>
                     <a:stretch>
                       <a:fillRect/>
                     </a:stretch>
@@ -3688,7 +3638,7 @@
                     <pic:cNvPicPr/>
                   </pic:nvPicPr>
                   <pic:blipFill>
-                    <a:blip r:embed="rId46"/>
+                    <a:blip r:embed="rId45"/>
                     <a:stretch>
                       <a:fillRect/>
                     </a:stretch>
@@ -3748,7 +3698,7 @@
                     <pic:cNvPicPr/>
                   </pic:nvPicPr>
                   <pic:blipFill>
-                    <a:blip r:embed="rId47"/>
+                    <a:blip r:embed="rId46"/>
                     <a:stretch>
                       <a:fillRect/>
                     </a:stretch>
@@ -3809,7 +3759,7 @@
                     <pic:cNvPicPr/>
                   </pic:nvPicPr>
                   <pic:blipFill>
-                    <a:blip r:embed="rId48"/>
+                    <a:blip r:embed="rId47"/>
                     <a:stretch>
                       <a:fillRect/>
                     </a:stretch>
@@ -3856,7 +3806,7 @@
                     <pic:cNvPicPr/>
                   </pic:nvPicPr>
                   <pic:blipFill>
-                    <a:blip r:embed="rId49"/>
+                    <a:blip r:embed="rId48"/>
                     <a:stretch>
                       <a:fillRect/>
                     </a:stretch>
@@ -3930,7 +3880,7 @@
                     <pic:cNvPicPr/>
                   </pic:nvPicPr>
                   <pic:blipFill>
-                    <a:blip r:embed="rId50"/>
+                    <a:blip r:embed="rId49"/>
                     <a:stretch>
                       <a:fillRect/>
                     </a:stretch>
@@ -3990,7 +3940,7 @@
                     <pic:cNvPicPr/>
                   </pic:nvPicPr>
                   <pic:blipFill>
-                    <a:blip r:embed="rId51"/>
+                    <a:blip r:embed="rId50"/>
                     <a:stretch>
                       <a:fillRect/>
                     </a:stretch>
@@ -4051,7 +4001,7 @@
                     <pic:cNvPicPr/>
                   </pic:nvPicPr>
                   <pic:blipFill>
-                    <a:blip r:embed="rId52"/>
+                    <a:blip r:embed="rId51"/>
                     <a:stretch>
                       <a:fillRect/>
                     </a:stretch>
@@ -4098,7 +4048,7 @@
                     <pic:cNvPicPr/>
                   </pic:nvPicPr>
                   <pic:blipFill>
-                    <a:blip r:embed="rId53"/>
+                    <a:blip r:embed="rId52"/>
                     <a:stretch>
                       <a:fillRect/>
                     </a:stretch>
@@ -4158,7 +4108,7 @@
                     <pic:cNvPicPr/>
                   </pic:nvPicPr>
                   <pic:blipFill>
-                    <a:blip r:embed="rId54"/>
+                    <a:blip r:embed="rId53"/>
                     <a:stretch>
                       <a:fillRect/>
                     </a:stretch>
@@ -4219,7 +4169,7 @@
                     <pic:cNvPicPr/>
                   </pic:nvPicPr>
                   <pic:blipFill>
-                    <a:blip r:embed="rId55"/>
+                    <a:blip r:embed="rId54"/>
                     <a:stretch>
                       <a:fillRect/>
                     </a:stretch>
@@ -4266,7 +4216,7 @@
                     <pic:cNvPicPr/>
                   </pic:nvPicPr>
                   <pic:blipFill>
-                    <a:blip r:embed="rId56"/>
+                    <a:blip r:embed="rId55"/>
                     <a:stretch>
                       <a:fillRect/>
                     </a:stretch>
@@ -4290,11 +4240,15 @@
     <w:p>
       <w:pPr>
         <w:rPr>
-          <w:lang w:val="es-CO"/>
-        </w:rPr>
-      </w:pPr>
-      <w:r>
-        <w:rPr>
+          <w:b/>
+          <w:bCs/>
+          <w:lang w:val="es-CO"/>
+        </w:rPr>
+      </w:pPr>
+      <w:r>
+        <w:rPr>
+          <w:b/>
+          <w:bCs/>
           <w:lang w:val="es-CO"/>
         </w:rPr>
         <w:t>MiniCiclo 5: Spin</w:t>
@@ -4401,7 +4355,7 @@
                     <pic:cNvPicPr/>
                   </pic:nvPicPr>
                   <pic:blipFill>
-                    <a:blip r:embed="rId57"/>
+                    <a:blip r:embed="rId56"/>
                     <a:stretch>
                       <a:fillRect/>
                     </a:stretch>
@@ -4462,7 +4416,7 @@
                     <pic:cNvPicPr/>
                   </pic:nvPicPr>
                   <pic:blipFill>
-                    <a:blip r:embed="rId58"/>
+                    <a:blip r:embed="rId57"/>
                     <a:stretch>
                       <a:fillRect/>
                     </a:stretch>
@@ -4509,7 +4463,7 @@
                     <pic:cNvPicPr/>
                   </pic:nvPicPr>
                   <pic:blipFill>
-                    <a:blip r:embed="rId59"/>
+                    <a:blip r:embed="rId58"/>
                     <a:stretch>
                       <a:fillRect/>
                     </a:stretch>
@@ -4565,7 +4519,31 @@
         <w:rPr>
           <w:lang w:val="es-CO"/>
         </w:rPr>
-        <w:t>“green”, “red”, “blue”. Por tanto</w:t>
+        <w:t>“green”</w:t>
+      </w:r>
+      <w:r>
+        <w:rPr>
+          <w:lang w:val="es-CO"/>
+        </w:rPr>
+        <w:t xml:space="preserve"> -&gt;</w:t>
+      </w:r>
+      <w:r>
+        <w:rPr>
+          <w:lang w:val="es-CO"/>
+        </w:rPr>
+        <w:t xml:space="preserve"> “red”</w:t>
+      </w:r>
+      <w:r>
+        <w:rPr>
+          <w:lang w:val="es-CO"/>
+        </w:rPr>
+        <w:t xml:space="preserve"> -&gt;</w:t>
+      </w:r>
+      <w:r>
+        <w:rPr>
+          <w:lang w:val="es-CO"/>
+        </w:rPr>
+        <w:t xml:space="preserve"> “blue”. Por tanto</w:t>
       </w:r>
       <w:r>
         <w:rPr>
@@ -4619,6 +4597,99 @@
                     <pic:cNvPicPr/>
                   </pic:nvPicPr>
                   <pic:blipFill>
+                    <a:blip r:embed="rId59"/>
+                    <a:stretch>
+                      <a:fillRect/>
+                    </a:stretch>
+                  </pic:blipFill>
+                  <pic:spPr>
+                    <a:xfrm>
+                      <a:off x="0" y="0"/>
+                      <a:ext cx="3982006" cy="2133898"/>
+                    </a:xfrm>
+                    <a:prstGeom prst="rect">
+                      <a:avLst/>
+                    </a:prstGeom>
+                  </pic:spPr>
+                </pic:pic>
+              </a:graphicData>
+            </a:graphic>
+          </wp:inline>
+        </w:drawing>
+      </w:r>
+    </w:p>
+    <w:p>
+      <w:pPr>
+        <w:rPr>
+          <w:lang w:val="es-CO"/>
+        </w:rPr>
+      </w:pPr>
+    </w:p>
+    <w:p>
+      <w:pPr>
+        <w:rPr>
+          <w:lang w:val="es-CO"/>
+        </w:rPr>
+      </w:pPr>
+      <w:r>
+        <w:rPr>
+          <w:lang w:val="es-CO"/>
+        </w:rPr>
+        <w:t>Ahora, si se busca solo mover una rueda en específico:</w:t>
+      </w:r>
+    </w:p>
+    <w:p>
+      <w:pPr>
+        <w:rPr>
+          <w:lang w:val="es-CO"/>
+        </w:rPr>
+      </w:pPr>
+      <w:r>
+        <w:rPr>
+          <w:lang w:val="es-CO"/>
+        </w:rPr>
+        <w:t>Spin(int wheel): El cual al escoger una rueda en específico cambiará al siguiente símbolo.</w:t>
+      </w:r>
+    </w:p>
+    <w:p>
+      <w:pPr>
+        <w:rPr>
+          <w:lang w:val="es-CO"/>
+        </w:rPr>
+      </w:pPr>
+      <w:r>
+        <w:rPr>
+          <w:lang w:val="es-CO"/>
+        </w:rPr>
+        <w:t>Por ejemplo, iniciamos con:</w:t>
+      </w:r>
+    </w:p>
+    <w:p>
+      <w:pPr>
+        <w:rPr>
+          <w:lang w:val="es-CO"/>
+        </w:rPr>
+      </w:pPr>
+      <w:r>
+        <w:rPr>
+          <w:lang w:val="es-CO"/>
+        </w:rPr>
+        <w:drawing>
+          <wp:inline distT="0" distB="0" distL="0" distR="0" wp14:anchorId="01FBB918" wp14:editId="30F88338">
+            <wp:extent cx="3915321" cy="2133898"/>
+            <wp:effectExtent l="0" t="0" r="0" b="0"/>
+            <wp:docPr id="1420605219" name="Imagen 1"/>
+            <wp:cNvGraphicFramePr>
+              <a:graphicFrameLocks xmlns:a="http://schemas.openxmlformats.org/drawingml/2006/main" noChangeAspect="1"/>
+            </wp:cNvGraphicFramePr>
+            <a:graphic xmlns:a="http://schemas.openxmlformats.org/drawingml/2006/main">
+              <a:graphicData uri="http://schemas.openxmlformats.org/drawingml/2006/picture">
+                <pic:pic xmlns:pic="http://schemas.openxmlformats.org/drawingml/2006/picture">
+                  <pic:nvPicPr>
+                    <pic:cNvPr id="1420605219" name=""/>
+                    <pic:cNvPicPr/>
+                  </pic:nvPicPr>
+                  <pic:blipFill>
                     <a:blip r:embed="rId60"/>
                     <a:stretch>
                       <a:fillRect/>
@@ -4627,79 +4698,130 @@
                   <pic:spPr>
                     <a:xfrm>
                       <a:off x="0" y="0"/>
-                      <a:ext cx="3982006" cy="2133898"/>
-                    </a:xfrm>
-                    <a:prstGeom prst="rect">
-                      <a:avLst/>
-                    </a:prstGeom>
-                  </pic:spPr>
-                </pic:pic>
-              </a:graphicData>
-            </a:graphic>
-          </wp:inline>
-        </w:drawing>
-      </w:r>
-    </w:p>
-    <w:p>
-      <w:pPr>
-        <w:rPr>
-          <w:lang w:val="es-CO"/>
-        </w:rPr>
-      </w:pPr>
-    </w:p>
-    <w:p>
-      <w:pPr>
-        <w:rPr>
-          <w:lang w:val="es-CO"/>
-        </w:rPr>
-      </w:pPr>
-      <w:r>
-        <w:rPr>
-          <w:lang w:val="es-CO"/>
-        </w:rPr>
-        <w:t>Ahora, si se busca solo mover una rueda en específico:</w:t>
-      </w:r>
-    </w:p>
-    <w:p>
-      <w:pPr>
-        <w:rPr>
-          <w:lang w:val="es-CO"/>
-        </w:rPr>
-      </w:pPr>
-    </w:p>
-    <w:p>
-      <w:pPr>
-        <w:rPr>
-          <w:lang w:val="es-CO"/>
-        </w:rPr>
-      </w:pPr>
-    </w:p>
-    <w:p>
-      <w:pPr>
-        <w:rPr>
-          <w:lang w:val="es-CO"/>
-        </w:rPr>
-      </w:pPr>
-      <w:r>
-        <w:rPr>
+                      <a:ext cx="3915321" cy="2133898"/>
+                    </a:xfrm>
+                    <a:prstGeom prst="rect">
+                      <a:avLst/>
+                    </a:prstGeom>
+                  </pic:spPr>
+                </pic:pic>
+              </a:graphicData>
+            </a:graphic>
+          </wp:inline>
+        </w:drawing>
+      </w:r>
+    </w:p>
+    <w:p>
+      <w:pPr>
+        <w:rPr>
+          <w:lang w:val="es-CO"/>
+        </w:rPr>
+      </w:pPr>
+      <w:r>
+        <w:rPr>
+          <w:lang w:val="es-CO"/>
+        </w:rPr>
+        <w:t>Y por el punto anterior sabemos que el siguiente de azul es verde:</w:t>
+      </w:r>
+    </w:p>
+    <w:p>
+      <w:pPr>
+        <w:rPr>
+          <w:lang w:val="es-CO"/>
+        </w:rPr>
+      </w:pPr>
+      <w:r>
+        <w:rPr>
+          <w:lang w:val="es-CO"/>
+        </w:rPr>
+        <w:lastRenderedPageBreak/>
+        <w:drawing>
+          <wp:inline distT="0" distB="0" distL="0" distR="0" wp14:anchorId="005C4274" wp14:editId="6E6E1E3A">
+            <wp:extent cx="4001058" cy="2038635"/>
+            <wp:effectExtent l="0" t="0" r="0" b="0"/>
+            <wp:docPr id="1538802773" name="Imagen 1"/>
+            <wp:cNvGraphicFramePr>
+              <a:graphicFrameLocks xmlns:a="http://schemas.openxmlformats.org/drawingml/2006/main" noChangeAspect="1"/>
+            </wp:cNvGraphicFramePr>
+            <a:graphic xmlns:a="http://schemas.openxmlformats.org/drawingml/2006/main">
+              <a:graphicData uri="http://schemas.openxmlformats.org/drawingml/2006/picture">
+                <pic:pic xmlns:pic="http://schemas.openxmlformats.org/drawingml/2006/picture">
+                  <pic:nvPicPr>
+                    <pic:cNvPr id="1538802773" name=""/>
+                    <pic:cNvPicPr/>
+                  </pic:nvPicPr>
+                  <pic:blipFill>
+                    <a:blip r:embed="rId61"/>
+                    <a:stretch>
+                      <a:fillRect/>
+                    </a:stretch>
+                  </pic:blipFill>
+                  <pic:spPr>
+                    <a:xfrm>
+                      <a:off x="0" y="0"/>
+                      <a:ext cx="4001058" cy="2038635"/>
+                    </a:xfrm>
+                    <a:prstGeom prst="rect">
+                      <a:avLst/>
+                    </a:prstGeom>
+                  </pic:spPr>
+                </pic:pic>
+              </a:graphicData>
+            </a:graphic>
+          </wp:inline>
+        </w:drawing>
+      </w:r>
+    </w:p>
+    <w:p>
+      <w:pPr>
+        <w:rPr>
+          <w:lang w:val="es-CO"/>
+        </w:rPr>
+      </w:pPr>
+    </w:p>
+    <w:p>
+      <w:pPr>
+        <w:rPr>
+          <w:lang w:val="es-CO"/>
+        </w:rPr>
+      </w:pPr>
+    </w:p>
+    <w:p>
+      <w:pPr>
+        <w:rPr>
+          <w:b/>
+          <w:bCs/>
+          <w:lang w:val="es-CO"/>
+        </w:rPr>
+      </w:pPr>
+      <w:r>
+        <w:rPr>
+          <w:b/>
+          <w:bCs/>
           <w:lang w:val="es-CO"/>
         </w:rPr>
         <w:t xml:space="preserve">MiniCiclo </w:t>
       </w:r>
       <w:r>
         <w:rPr>
+          <w:b/>
+          <w:bCs/>
           <w:lang w:val="es-CO"/>
         </w:rPr>
         <w:t>6</w:t>
       </w:r>
       <w:r>
         <w:rPr>
+          <w:b/>
+          <w:bCs/>
           <w:lang w:val="es-CO"/>
         </w:rPr>
         <w:t>: Add/Del symbols</w:t>
       </w:r>
       <w:r>
         <w:rPr>
+          <w:b/>
+          <w:bCs/>
           <w:lang w:val="es-CO"/>
         </w:rPr>
         <w:t>:</w:t>
@@ -4746,7 +4868,19 @@
         <w:rPr>
           <w:lang w:val="es-CO"/>
         </w:rPr>
-        <w:t>Wheel haremos una sobrecarga, al crear otros métodos addSymbol y deleteSymbol:</w:t>
+        <w:t>Wheel haremos una sobrecarga, al crear otro</w:t>
+      </w:r>
+      <w:r>
+        <w:rPr>
+          <w:lang w:val="es-CO"/>
+        </w:rPr>
+        <w:t xml:space="preserve"> método addSymbol</w:t>
+      </w:r>
+      <w:r>
+        <w:rPr>
+          <w:lang w:val="es-CO"/>
+        </w:rPr>
+        <w:t>:</w:t>
       </w:r>
     </w:p>
     <w:p>
@@ -4778,7 +4912,6 @@
         <w:rPr>
           <w:lang w:val="es-CO"/>
         </w:rPr>
-        <w:lastRenderedPageBreak/>
         <w:drawing>
           <wp:inline distT="0" distB="0" distL="0" distR="0" wp14:anchorId="3B12C239" wp14:editId="59B1E5D0">
             <wp:extent cx="5553850" cy="2657846"/>
@@ -4795,7 +4928,7 @@
                     <pic:cNvPicPr/>
                   </pic:nvPicPr>
                   <pic:blipFill>
-                    <a:blip r:embed="rId61"/>
+                    <a:blip r:embed="rId62"/>
                     <a:stretch>
                       <a:fillRect/>
                     </a:stretch>
@@ -4823,8 +4956,1296 @@
         </w:rPr>
       </w:pPr>
     </w:p>
+    <w:p>
+      <w:pPr>
+        <w:rPr>
+          <w:lang w:val="es-CO"/>
+        </w:rPr>
+      </w:pPr>
+      <w:r>
+        <w:rPr>
+          <w:lang w:val="es-CO"/>
+        </w:rPr>
+        <w:lastRenderedPageBreak/>
+        <w:t xml:space="preserve">Se crea </w:t>
+      </w:r>
+      <w:r>
+        <w:rPr>
+          <w:lang w:val="es-CO"/>
+        </w:rPr>
+        <w:t>addSymbol() en SlotMachine</w:t>
+      </w:r>
+      <w:r>
+        <w:rPr>
+          <w:lang w:val="es-CO"/>
+        </w:rPr>
+        <w:t>:</w:t>
+      </w:r>
+    </w:p>
+    <w:p>
+      <w:pPr>
+        <w:rPr>
+          <w:lang w:val="es-CO"/>
+        </w:rPr>
+      </w:pPr>
+      <w:r>
+        <w:rPr>
+          <w:lang w:val="es-CO"/>
+        </w:rPr>
+        <w:drawing>
+          <wp:inline distT="0" distB="0" distL="0" distR="0" wp14:anchorId="3F842FFB" wp14:editId="1E494F7A">
+            <wp:extent cx="5943600" cy="2580005"/>
+            <wp:effectExtent l="0" t="0" r="0" b="0"/>
+            <wp:docPr id="1665184298" name="Imagen 1"/>
+            <wp:cNvGraphicFramePr>
+              <a:graphicFrameLocks xmlns:a="http://schemas.openxmlformats.org/drawingml/2006/main" noChangeAspect="1"/>
+            </wp:cNvGraphicFramePr>
+            <a:graphic xmlns:a="http://schemas.openxmlformats.org/drawingml/2006/main">
+              <a:graphicData uri="http://schemas.openxmlformats.org/drawingml/2006/picture">
+                <pic:pic xmlns:pic="http://schemas.openxmlformats.org/drawingml/2006/picture">
+                  <pic:nvPicPr>
+                    <pic:cNvPr id="1665184298" name=""/>
+                    <pic:cNvPicPr/>
+                  </pic:nvPicPr>
+                  <pic:blipFill>
+                    <a:blip r:embed="rId63"/>
+                    <a:stretch>
+                      <a:fillRect/>
+                    </a:stretch>
+                  </pic:blipFill>
+                  <pic:spPr>
+                    <a:xfrm>
+                      <a:off x="0" y="0"/>
+                      <a:ext cx="5943600" cy="2580005"/>
+                    </a:xfrm>
+                    <a:prstGeom prst="rect">
+                      <a:avLst/>
+                    </a:prstGeom>
+                  </pic:spPr>
+                </pic:pic>
+              </a:graphicData>
+            </a:graphic>
+          </wp:inline>
+        </w:drawing>
+      </w:r>
+    </w:p>
+    <w:p>
+      <w:pPr>
+        <w:rPr>
+          <w:lang w:val="es-CO"/>
+        </w:rPr>
+      </w:pPr>
+      <w:r>
+        <w:rPr>
+          <w:lang w:val="es-CO"/>
+        </w:rPr>
+        <w:t>Para demostrar su funcionamiento, si iniciamos con:</w:t>
+      </w:r>
+    </w:p>
+    <w:p>
+      <w:pPr>
+        <w:rPr>
+          <w:lang w:val="es-CO"/>
+        </w:rPr>
+      </w:pPr>
+      <w:r>
+        <w:rPr>
+          <w:lang w:val="es-CO"/>
+        </w:rPr>
+        <w:drawing>
+          <wp:inline distT="0" distB="0" distL="0" distR="0" wp14:anchorId="507FCAB5" wp14:editId="5190585F">
+            <wp:extent cx="4048690" cy="2114845"/>
+            <wp:effectExtent l="0" t="0" r="9525" b="0"/>
+            <wp:docPr id="1350676143" name="Imagen 1"/>
+            <wp:cNvGraphicFramePr>
+              <a:graphicFrameLocks xmlns:a="http://schemas.openxmlformats.org/drawingml/2006/main" noChangeAspect="1"/>
+            </wp:cNvGraphicFramePr>
+            <a:graphic xmlns:a="http://schemas.openxmlformats.org/drawingml/2006/main">
+              <a:graphicData uri="http://schemas.openxmlformats.org/drawingml/2006/picture">
+                <pic:pic xmlns:pic="http://schemas.openxmlformats.org/drawingml/2006/picture">
+                  <pic:nvPicPr>
+                    <pic:cNvPr id="1350676143" name=""/>
+                    <pic:cNvPicPr/>
+                  </pic:nvPicPr>
+                  <pic:blipFill>
+                    <a:blip r:embed="rId64"/>
+                    <a:stretch>
+                      <a:fillRect/>
+                    </a:stretch>
+                  </pic:blipFill>
+                  <pic:spPr>
+                    <a:xfrm>
+                      <a:off x="0" y="0"/>
+                      <a:ext cx="4048690" cy="2114845"/>
+                    </a:xfrm>
+                    <a:prstGeom prst="rect">
+                      <a:avLst/>
+                    </a:prstGeom>
+                  </pic:spPr>
+                </pic:pic>
+              </a:graphicData>
+            </a:graphic>
+          </wp:inline>
+        </w:drawing>
+      </w:r>
+    </w:p>
+    <w:p>
+      <w:pPr>
+        <w:rPr>
+          <w:lang w:val="es-CO"/>
+        </w:rPr>
+      </w:pPr>
+      <w:r>
+        <w:rPr>
+          <w:lang w:val="es-CO"/>
+        </w:rPr>
+        <w:t>Si ponemos un número muy grande aunque no hayan tantos símbolos se pondrá al final:</w:t>
+      </w:r>
+    </w:p>
+    <w:p>
+      <w:pPr>
+        <w:rPr>
+          <w:lang w:val="es-CO"/>
+        </w:rPr>
+      </w:pPr>
+      <w:r>
+        <w:rPr>
+          <w:lang w:val="es-CO"/>
+        </w:rPr>
+        <w:lastRenderedPageBreak/>
+        <w:drawing>
+          <wp:inline distT="0" distB="0" distL="0" distR="0" wp14:anchorId="37B267CD" wp14:editId="5244E688">
+            <wp:extent cx="4105848" cy="2314898"/>
+            <wp:effectExtent l="0" t="0" r="9525" b="9525"/>
+            <wp:docPr id="1916244594" name="Imagen 1"/>
+            <wp:cNvGraphicFramePr>
+              <a:graphicFrameLocks xmlns:a="http://schemas.openxmlformats.org/drawingml/2006/main" noChangeAspect="1"/>
+            </wp:cNvGraphicFramePr>
+            <a:graphic xmlns:a="http://schemas.openxmlformats.org/drawingml/2006/main">
+              <a:graphicData uri="http://schemas.openxmlformats.org/drawingml/2006/picture">
+                <pic:pic xmlns:pic="http://schemas.openxmlformats.org/drawingml/2006/picture">
+                  <pic:nvPicPr>
+                    <pic:cNvPr id="1916244594" name=""/>
+                    <pic:cNvPicPr/>
+                  </pic:nvPicPr>
+                  <pic:blipFill>
+                    <a:blip r:embed="rId65"/>
+                    <a:stretch>
+                      <a:fillRect/>
+                    </a:stretch>
+                  </pic:blipFill>
+                  <pic:spPr>
+                    <a:xfrm>
+                      <a:off x="0" y="0"/>
+                      <a:ext cx="4105848" cy="2314898"/>
+                    </a:xfrm>
+                    <a:prstGeom prst="rect">
+                      <a:avLst/>
+                    </a:prstGeom>
+                  </pic:spPr>
+                </pic:pic>
+              </a:graphicData>
+            </a:graphic>
+          </wp:inline>
+        </w:drawing>
+      </w:r>
+    </w:p>
+    <w:p>
+      <w:pPr>
+        <w:rPr>
+          <w:lang w:val="es-CO"/>
+        </w:rPr>
+      </w:pPr>
+      <w:r>
+        <w:rPr>
+          <w:lang w:val="es-CO"/>
+        </w:rPr>
+        <w:t>Por tanto, si el ciclo actual es</w:t>
+      </w:r>
+      <w:r>
+        <w:rPr>
+          <w:lang w:val="es-CO"/>
+        </w:rPr>
+        <w:t>:</w:t>
+      </w:r>
+    </w:p>
+    <w:p>
+      <w:pPr>
+        <w:rPr>
+          <w:lang w:val="es-CO"/>
+        </w:rPr>
+      </w:pPr>
+      <w:r>
+        <w:rPr>
+          <w:lang w:val="es-CO"/>
+        </w:rPr>
+        <w:t>“green” -&gt; “red” -&gt; “blue”</w:t>
+      </w:r>
+      <w:r>
+        <w:rPr>
+          <w:lang w:val="es-CO"/>
+        </w:rPr>
+        <w:t xml:space="preserve"> -&gt; “yellow”, </w:t>
+      </w:r>
+      <w:r>
+        <w:rPr>
+          <w:lang w:val="es-CO"/>
+        </w:rPr>
+        <w:t>por tanto, cua</w:t>
+      </w:r>
+      <w:r>
+        <w:rPr>
+          <w:lang w:val="es-CO"/>
+        </w:rPr>
+        <w:t>lquier azul después de un spin, será amarillo.</w:t>
+      </w:r>
+    </w:p>
+    <w:p>
+      <w:pPr>
+        <w:rPr>
+          <w:lang w:val="es-CO"/>
+        </w:rPr>
+      </w:pPr>
+      <w:r>
+        <w:rPr>
+          <w:lang w:val="es-CO"/>
+        </w:rPr>
+        <w:drawing>
+          <wp:inline distT="0" distB="0" distL="0" distR="0" wp14:anchorId="19C88768" wp14:editId="3CFF5C0D">
+            <wp:extent cx="4391638" cy="2391109"/>
+            <wp:effectExtent l="0" t="0" r="9525" b="9525"/>
+            <wp:docPr id="319531973" name="Imagen 1"/>
+            <wp:cNvGraphicFramePr>
+              <a:graphicFrameLocks xmlns:a="http://schemas.openxmlformats.org/drawingml/2006/main" noChangeAspect="1"/>
+            </wp:cNvGraphicFramePr>
+            <a:graphic xmlns:a="http://schemas.openxmlformats.org/drawingml/2006/main">
+              <a:graphicData uri="http://schemas.openxmlformats.org/drawingml/2006/picture">
+                <pic:pic xmlns:pic="http://schemas.openxmlformats.org/drawingml/2006/picture">
+                  <pic:nvPicPr>
+                    <pic:cNvPr id="319531973" name=""/>
+                    <pic:cNvPicPr/>
+                  </pic:nvPicPr>
+                  <pic:blipFill>
+                    <a:blip r:embed="rId66"/>
+                    <a:stretch>
+                      <a:fillRect/>
+                    </a:stretch>
+                  </pic:blipFill>
+                  <pic:spPr>
+                    <a:xfrm>
+                      <a:off x="0" y="0"/>
+                      <a:ext cx="4391638" cy="2391109"/>
+                    </a:xfrm>
+                    <a:prstGeom prst="rect">
+                      <a:avLst/>
+                    </a:prstGeom>
+                  </pic:spPr>
+                </pic:pic>
+              </a:graphicData>
+            </a:graphic>
+          </wp:inline>
+        </w:drawing>
+      </w:r>
+    </w:p>
+    <w:p>
+      <w:pPr>
+        <w:rPr>
+          <w:lang w:val="es-CO"/>
+        </w:rPr>
+      </w:pPr>
+      <w:r>
+        <w:rPr>
+          <w:lang w:val="es-CO"/>
+        </w:rPr>
+        <w:t>Si añado:</w:t>
+      </w:r>
+    </w:p>
+    <w:p>
+      <w:pPr>
+        <w:rPr>
+          <w:lang w:val="es-CO"/>
+        </w:rPr>
+      </w:pPr>
+      <w:r>
+        <w:rPr>
+          <w:lang w:val="es-CO"/>
+        </w:rPr>
+        <w:lastRenderedPageBreak/>
+        <w:drawing>
+          <wp:inline distT="0" distB="0" distL="0" distR="0" wp14:anchorId="5EA9AE54" wp14:editId="2E91B5F1">
+            <wp:extent cx="4067743" cy="2372056"/>
+            <wp:effectExtent l="0" t="0" r="9525" b="9525"/>
+            <wp:docPr id="446253110" name="Imagen 1"/>
+            <wp:cNvGraphicFramePr>
+              <a:graphicFrameLocks xmlns:a="http://schemas.openxmlformats.org/drawingml/2006/main" noChangeAspect="1"/>
+            </wp:cNvGraphicFramePr>
+            <a:graphic xmlns:a="http://schemas.openxmlformats.org/drawingml/2006/main">
+              <a:graphicData uri="http://schemas.openxmlformats.org/drawingml/2006/picture">
+                <pic:pic xmlns:pic="http://schemas.openxmlformats.org/drawingml/2006/picture">
+                  <pic:nvPicPr>
+                    <pic:cNvPr id="446253110" name=""/>
+                    <pic:cNvPicPr/>
+                  </pic:nvPicPr>
+                  <pic:blipFill>
+                    <a:blip r:embed="rId67"/>
+                    <a:stretch>
+                      <a:fillRect/>
+                    </a:stretch>
+                  </pic:blipFill>
+                  <pic:spPr>
+                    <a:xfrm>
+                      <a:off x="0" y="0"/>
+                      <a:ext cx="4067743" cy="2372056"/>
+                    </a:xfrm>
+                    <a:prstGeom prst="rect">
+                      <a:avLst/>
+                    </a:prstGeom>
+                  </pic:spPr>
+                </pic:pic>
+              </a:graphicData>
+            </a:graphic>
+          </wp:inline>
+        </w:drawing>
+      </w:r>
+    </w:p>
+    <w:p>
+      <w:pPr>
+        <w:rPr>
+          <w:lang w:val="es-CO"/>
+        </w:rPr>
+      </w:pPr>
+      <w:r>
+        <w:rPr>
+          <w:lang w:val="es-CO"/>
+        </w:rPr>
+        <w:t>Al ser menor a 1, se contará como que ahora este será el primer color de esa lista de símbolos, o sea será:</w:t>
+      </w:r>
+    </w:p>
+    <w:p>
+      <w:pPr>
+        <w:rPr>
+          <w:lang w:val="es-CO"/>
+        </w:rPr>
+      </w:pPr>
+      <w:r>
+        <w:t>“black”-&gt;</w:t>
+      </w:r>
+      <w:r>
+        <w:t>“green” -&gt; “red” -&gt; “blue” -&gt; “yellow”</w:t>
+      </w:r>
+      <w:r>
+        <w:t xml:space="preserve">. </w:t>
+      </w:r>
+      <w:r>
+        <w:rPr>
+          <w:lang w:val="es-CO"/>
+        </w:rPr>
+        <w:t>O sea en la si</w:t>
+      </w:r>
+      <w:r>
+        <w:rPr>
+          <w:lang w:val="es-CO"/>
+        </w:rPr>
+        <w:t>guiente iteración, los amarillos se volverán negros</w:t>
+      </w:r>
+    </w:p>
+    <w:p>
+      <w:pPr>
+        <w:rPr>
+          <w:lang w:val="es-CO"/>
+        </w:rPr>
+      </w:pPr>
+      <w:r>
+        <w:rPr>
+          <w:lang w:val="es-CO"/>
+        </w:rPr>
+        <w:drawing>
+          <wp:inline distT="0" distB="0" distL="0" distR="0" wp14:anchorId="59D14201" wp14:editId="4BDDFE79">
+            <wp:extent cx="4096322" cy="2181529"/>
+            <wp:effectExtent l="0" t="0" r="0" b="0"/>
+            <wp:docPr id="1019705925" name="Imagen 1"/>
+            <wp:cNvGraphicFramePr>
+              <a:graphicFrameLocks xmlns:a="http://schemas.openxmlformats.org/drawingml/2006/main" noChangeAspect="1"/>
+            </wp:cNvGraphicFramePr>
+            <a:graphic xmlns:a="http://schemas.openxmlformats.org/drawingml/2006/main">
+              <a:graphicData uri="http://schemas.openxmlformats.org/drawingml/2006/picture">
+                <pic:pic xmlns:pic="http://schemas.openxmlformats.org/drawingml/2006/picture">
+                  <pic:nvPicPr>
+                    <pic:cNvPr id="1019705925" name=""/>
+                    <pic:cNvPicPr/>
+                  </pic:nvPicPr>
+                  <pic:blipFill>
+                    <a:blip r:embed="rId68"/>
+                    <a:stretch>
+                      <a:fillRect/>
+                    </a:stretch>
+                  </pic:blipFill>
+                  <pic:spPr>
+                    <a:xfrm>
+                      <a:off x="0" y="0"/>
+                      <a:ext cx="4096322" cy="2181529"/>
+                    </a:xfrm>
+                    <a:prstGeom prst="rect">
+                      <a:avLst/>
+                    </a:prstGeom>
+                  </pic:spPr>
+                </pic:pic>
+              </a:graphicData>
+            </a:graphic>
+          </wp:inline>
+        </w:drawing>
+      </w:r>
+    </w:p>
+    <w:p>
+      <w:pPr>
+        <w:rPr>
+          <w:lang w:val="es-CO"/>
+        </w:rPr>
+      </w:pPr>
+      <w:r>
+        <w:rPr>
+          <w:lang w:val="es-CO"/>
+        </w:rPr>
+        <w:t>Si ahora quiero añadir un color entre “black” y “green”, un color como “</w:t>
+      </w:r>
+      <w:r>
+        <w:rPr>
+          <w:lang w:val="es-CO"/>
+        </w:rPr>
+        <w:t>o</w:t>
+      </w:r>
+      <w:r>
+        <w:rPr>
+          <w:lang w:val="es-CO"/>
+        </w:rPr>
+        <w:t xml:space="preserve">range” (el cuál se tuvo que implementar como un color extra </w:t>
+      </w:r>
+      <w:r>
+        <w:rPr>
+          <w:lang w:val="es-CO"/>
+        </w:rPr>
+        <w:t>en Canvas):</w:t>
+      </w:r>
+    </w:p>
+    <w:p>
+      <w:pPr>
+        <w:rPr>
+          <w:lang w:val="es-CO"/>
+        </w:rPr>
+      </w:pPr>
+      <w:r>
+        <w:rPr>
+          <w:lang w:val="es-CO"/>
+        </w:rPr>
+        <w:lastRenderedPageBreak/>
+        <w:drawing>
+          <wp:inline distT="0" distB="0" distL="0" distR="0" wp14:anchorId="00DD1CCE" wp14:editId="3DA6BB77">
+            <wp:extent cx="3991532" cy="2314898"/>
+            <wp:effectExtent l="0" t="0" r="9525" b="9525"/>
+            <wp:docPr id="645523531" name="Imagen 1"/>
+            <wp:cNvGraphicFramePr>
+              <a:graphicFrameLocks xmlns:a="http://schemas.openxmlformats.org/drawingml/2006/main" noChangeAspect="1"/>
+            </wp:cNvGraphicFramePr>
+            <a:graphic xmlns:a="http://schemas.openxmlformats.org/drawingml/2006/main">
+              <a:graphicData uri="http://schemas.openxmlformats.org/drawingml/2006/picture">
+                <pic:pic xmlns:pic="http://schemas.openxmlformats.org/drawingml/2006/picture">
+                  <pic:nvPicPr>
+                    <pic:cNvPr id="645523531" name=""/>
+                    <pic:cNvPicPr/>
+                  </pic:nvPicPr>
+                  <pic:blipFill>
+                    <a:blip r:embed="rId69"/>
+                    <a:stretch>
+                      <a:fillRect/>
+                    </a:stretch>
+                  </pic:blipFill>
+                  <pic:spPr>
+                    <a:xfrm>
+                      <a:off x="0" y="0"/>
+                      <a:ext cx="3991532" cy="2314898"/>
+                    </a:xfrm>
+                    <a:prstGeom prst="rect">
+                      <a:avLst/>
+                    </a:prstGeom>
+                  </pic:spPr>
+                </pic:pic>
+              </a:graphicData>
+            </a:graphic>
+          </wp:inline>
+        </w:drawing>
+      </w:r>
+    </w:p>
+    <w:p>
+      <w:pPr>
+        <w:rPr>
+          <w:lang w:val="es-CO"/>
+        </w:rPr>
+      </w:pPr>
+      <w:r>
+        <w:rPr>
+          <w:lang w:val="es-CO"/>
+        </w:rPr>
+        <w:t>Debería quedar como:</w:t>
+      </w:r>
+    </w:p>
+    <w:p>
+      <w:r>
+        <w:t>“black”-&gt;</w:t>
+      </w:r>
+      <w:r>
+        <w:t>”orange” -&gt;</w:t>
+      </w:r>
+      <w:r>
+        <w:t>“green” -&gt; “red” -&gt; “blue” -&gt; “yellow”</w:t>
+      </w:r>
+      <w:r>
+        <w:t>:</w:t>
+      </w:r>
+    </w:p>
+    <w:p>
+      <w:r>
+        <w:drawing>
+          <wp:inline distT="0" distB="0" distL="0" distR="0" wp14:anchorId="468C20BA" wp14:editId="08D067B9">
+            <wp:extent cx="4067743" cy="2172003"/>
+            <wp:effectExtent l="0" t="0" r="9525" b="0"/>
+            <wp:docPr id="1467454597" name="Imagen 1"/>
+            <wp:cNvGraphicFramePr>
+              <a:graphicFrameLocks xmlns:a="http://schemas.openxmlformats.org/drawingml/2006/main" noChangeAspect="1"/>
+            </wp:cNvGraphicFramePr>
+            <a:graphic xmlns:a="http://schemas.openxmlformats.org/drawingml/2006/main">
+              <a:graphicData uri="http://schemas.openxmlformats.org/drawingml/2006/picture">
+                <pic:pic xmlns:pic="http://schemas.openxmlformats.org/drawingml/2006/picture">
+                  <pic:nvPicPr>
+                    <pic:cNvPr id="1467454597" name=""/>
+                    <pic:cNvPicPr/>
+                  </pic:nvPicPr>
+                  <pic:blipFill>
+                    <a:blip r:embed="rId70"/>
+                    <a:stretch>
+                      <a:fillRect/>
+                    </a:stretch>
+                  </pic:blipFill>
+                  <pic:spPr>
+                    <a:xfrm>
+                      <a:off x="0" y="0"/>
+                      <a:ext cx="4067743" cy="2172003"/>
+                    </a:xfrm>
+                    <a:prstGeom prst="rect">
+                      <a:avLst/>
+                    </a:prstGeom>
+                  </pic:spPr>
+                </pic:pic>
+              </a:graphicData>
+            </a:graphic>
+          </wp:inline>
+        </w:drawing>
+      </w:r>
+    </w:p>
+    <w:p>
+      <w:pPr>
+        <w:rPr>
+          <w:lang w:val="es-CO"/>
+        </w:rPr>
+      </w:pPr>
+      <w:r>
+        <w:rPr>
+          <w:lang w:val="es-CO"/>
+        </w:rPr>
+        <w:t>Y para comprobar que el o</w:t>
+      </w:r>
+      <w:r>
+        <w:rPr>
+          <w:lang w:val="es-CO"/>
+        </w:rPr>
+        <w:t>rden actualmente está como:</w:t>
+      </w:r>
+    </w:p>
+    <w:p>
+      <w:r>
+        <w:t>“black”-&gt;</w:t>
+      </w:r>
+      <w:r>
+        <w:t>”orange” -&gt;</w:t>
+      </w:r>
+      <w:r>
+        <w:t>“green” -&gt; “red” -&gt; “blue” -&gt; “yellow”</w:t>
+      </w:r>
+      <w:r>
+        <w:t>:</w:t>
+      </w:r>
+    </w:p>
+    <w:p>
+      <w:pPr>
+        <w:rPr>
+          <w:lang w:val="es-CO"/>
+        </w:rPr>
+      </w:pPr>
+      <w:r>
+        <w:rPr>
+          <w:lang w:val="es-CO"/>
+        </w:rPr>
+        <w:t>Si usamos el método S</w:t>
+      </w:r>
+      <w:r>
+        <w:rPr>
+          <w:lang w:val="es-CO"/>
+        </w:rPr>
+        <w:t>tring[] symbols:</w:t>
+      </w:r>
+    </w:p>
+    <w:p>
+      <w:pPr>
+        <w:rPr>
+          <w:lang w:val="es-CO"/>
+        </w:rPr>
+      </w:pPr>
+      <w:r>
+        <w:rPr>
+          <w:lang w:val="es-CO"/>
+        </w:rPr>
+        <w:drawing>
+          <wp:inline distT="0" distB="0" distL="0" distR="0" wp14:anchorId="44A83E18" wp14:editId="0562F364">
+            <wp:extent cx="2172003" cy="362001"/>
+            <wp:effectExtent l="0" t="0" r="0" b="0"/>
+            <wp:docPr id="1416048774" name="Imagen 1"/>
+            <wp:cNvGraphicFramePr>
+              <a:graphicFrameLocks xmlns:a="http://schemas.openxmlformats.org/drawingml/2006/main" noChangeAspect="1"/>
+            </wp:cNvGraphicFramePr>
+            <a:graphic xmlns:a="http://schemas.openxmlformats.org/drawingml/2006/main">
+              <a:graphicData uri="http://schemas.openxmlformats.org/drawingml/2006/picture">
+                <pic:pic xmlns:pic="http://schemas.openxmlformats.org/drawingml/2006/picture">
+                  <pic:nvPicPr>
+                    <pic:cNvPr id="1416048774" name=""/>
+                    <pic:cNvPicPr/>
+                  </pic:nvPicPr>
+                  <pic:blipFill>
+                    <a:blip r:embed="rId71"/>
+                    <a:stretch>
+                      <a:fillRect/>
+                    </a:stretch>
+                  </pic:blipFill>
+                  <pic:spPr>
+                    <a:xfrm>
+                      <a:off x="0" y="0"/>
+                      <a:ext cx="2172003" cy="362001"/>
+                    </a:xfrm>
+                    <a:prstGeom prst="rect">
+                      <a:avLst/>
+                    </a:prstGeom>
+                  </pic:spPr>
+                </pic:pic>
+              </a:graphicData>
+            </a:graphic>
+          </wp:inline>
+        </w:drawing>
+      </w:r>
+    </w:p>
+    <w:p>
+      <w:pPr>
+        <w:rPr>
+          <w:lang w:val="es-CO"/>
+        </w:rPr>
+      </w:pPr>
+      <w:r>
+        <w:rPr>
+          <w:lang w:val="es-CO"/>
+        </w:rPr>
+        <w:lastRenderedPageBreak/>
+        <w:drawing>
+          <wp:inline distT="0" distB="0" distL="0" distR="0" wp14:anchorId="2B91D971" wp14:editId="154F8684">
+            <wp:extent cx="3534268" cy="2905530"/>
+            <wp:effectExtent l="0" t="0" r="9525" b="9525"/>
+            <wp:docPr id="469829708" name="Imagen 1"/>
+            <wp:cNvGraphicFramePr>
+              <a:graphicFrameLocks xmlns:a="http://schemas.openxmlformats.org/drawingml/2006/main" noChangeAspect="1"/>
+            </wp:cNvGraphicFramePr>
+            <a:graphic xmlns:a="http://schemas.openxmlformats.org/drawingml/2006/main">
+              <a:graphicData uri="http://schemas.openxmlformats.org/drawingml/2006/picture">
+                <pic:pic xmlns:pic="http://schemas.openxmlformats.org/drawingml/2006/picture">
+                  <pic:nvPicPr>
+                    <pic:cNvPr id="469829708" name=""/>
+                    <pic:cNvPicPr/>
+                  </pic:nvPicPr>
+                  <pic:blipFill>
+                    <a:blip r:embed="rId72"/>
+                    <a:stretch>
+                      <a:fillRect/>
+                    </a:stretch>
+                  </pic:blipFill>
+                  <pic:spPr>
+                    <a:xfrm>
+                      <a:off x="0" y="0"/>
+                      <a:ext cx="3534268" cy="2905530"/>
+                    </a:xfrm>
+                    <a:prstGeom prst="rect">
+                      <a:avLst/>
+                    </a:prstGeom>
+                  </pic:spPr>
+                </pic:pic>
+              </a:graphicData>
+            </a:graphic>
+          </wp:inline>
+        </w:drawing>
+      </w:r>
+    </w:p>
+    <w:p>
+      <w:pPr>
+        <w:rPr>
+          <w:lang w:val="es-CO"/>
+        </w:rPr>
+      </w:pPr>
+      <w:r>
+        <w:rPr>
+          <w:lang w:val="es-CO"/>
+        </w:rPr>
+        <w:t>Adicionalmente se le añaden los siguiente colores a los colores que permite Canvas:</w:t>
+      </w:r>
+    </w:p>
+    <w:p>
+      <w:pPr>
+        <w:rPr>
+          <w:lang w:val="es-CO"/>
+        </w:rPr>
+      </w:pPr>
+      <w:r>
+        <w:rPr>
+          <w:lang w:val="es-CO"/>
+        </w:rPr>
+        <w:drawing>
+          <wp:inline distT="0" distB="0" distL="0" distR="0" wp14:anchorId="58F80DF8" wp14:editId="3F3CC4BA">
+            <wp:extent cx="4534533" cy="1876687"/>
+            <wp:effectExtent l="0" t="0" r="0" b="9525"/>
+            <wp:docPr id="1016451937" name="Imagen 1"/>
+            <wp:cNvGraphicFramePr>
+              <a:graphicFrameLocks xmlns:a="http://schemas.openxmlformats.org/drawingml/2006/main" noChangeAspect="1"/>
+            </wp:cNvGraphicFramePr>
+            <a:graphic xmlns:a="http://schemas.openxmlformats.org/drawingml/2006/main">
+              <a:graphicData uri="http://schemas.openxmlformats.org/drawingml/2006/picture">
+                <pic:pic xmlns:pic="http://schemas.openxmlformats.org/drawingml/2006/picture">
+                  <pic:nvPicPr>
+                    <pic:cNvPr id="1016451937" name=""/>
+                    <pic:cNvPicPr/>
+                  </pic:nvPicPr>
+                  <pic:blipFill>
+                    <a:blip r:embed="rId73"/>
+                    <a:stretch>
+                      <a:fillRect/>
+                    </a:stretch>
+                  </pic:blipFill>
+                  <pic:spPr>
+                    <a:xfrm>
+                      <a:off x="0" y="0"/>
+                      <a:ext cx="4534533" cy="1876687"/>
+                    </a:xfrm>
+                    <a:prstGeom prst="rect">
+                      <a:avLst/>
+                    </a:prstGeom>
+                  </pic:spPr>
+                </pic:pic>
+              </a:graphicData>
+            </a:graphic>
+          </wp:inline>
+        </w:drawing>
+      </w:r>
+    </w:p>
+    <w:p>
+      <w:pPr>
+        <w:rPr>
+          <w:lang w:val="es-CO"/>
+        </w:rPr>
+      </w:pPr>
+    </w:p>
+    <w:p>
+      <w:pPr>
+        <w:rPr>
+          <w:lang w:val="es-CO"/>
+        </w:rPr>
+      </w:pPr>
+      <w:r>
+        <w:rPr>
+          <w:lang w:val="es-CO"/>
+        </w:rPr>
+        <w:t xml:space="preserve">Para continuar con el ciclo se debe </w:t>
+      </w:r>
+      <w:r>
+        <w:rPr>
+          <w:lang w:val="es-CO"/>
+        </w:rPr>
+        <w:t>crear delSymbol() en Wheel:</w:t>
+      </w:r>
+    </w:p>
+    <w:p>
+      <w:pPr>
+        <w:rPr>
+          <w:lang w:val="es-CO"/>
+        </w:rPr>
+      </w:pPr>
+      <w:r>
+        <w:rPr>
+          <w:lang w:val="es-CO"/>
+        </w:rPr>
+        <w:lastRenderedPageBreak/>
+        <w:drawing>
+          <wp:inline distT="0" distB="0" distL="0" distR="0" wp14:anchorId="278D0D82" wp14:editId="22E25F49">
+            <wp:extent cx="5943600" cy="3308350"/>
+            <wp:effectExtent l="0" t="0" r="0" b="6350"/>
+            <wp:docPr id="418976955" name="Imagen 1"/>
+            <wp:cNvGraphicFramePr>
+              <a:graphicFrameLocks xmlns:a="http://schemas.openxmlformats.org/drawingml/2006/main" noChangeAspect="1"/>
+            </wp:cNvGraphicFramePr>
+            <a:graphic xmlns:a="http://schemas.openxmlformats.org/drawingml/2006/main">
+              <a:graphicData uri="http://schemas.openxmlformats.org/drawingml/2006/picture">
+                <pic:pic xmlns:pic="http://schemas.openxmlformats.org/drawingml/2006/picture">
+                  <pic:nvPicPr>
+                    <pic:cNvPr id="418976955" name=""/>
+                    <pic:cNvPicPr/>
+                  </pic:nvPicPr>
+                  <pic:blipFill>
+                    <a:blip r:embed="rId74"/>
+                    <a:stretch>
+                      <a:fillRect/>
+                    </a:stretch>
+                  </pic:blipFill>
+                  <pic:spPr>
+                    <a:xfrm>
+                      <a:off x="0" y="0"/>
+                      <a:ext cx="5943600" cy="3308350"/>
+                    </a:xfrm>
+                    <a:prstGeom prst="rect">
+                      <a:avLst/>
+                    </a:prstGeom>
+                  </pic:spPr>
+                </pic:pic>
+              </a:graphicData>
+            </a:graphic>
+          </wp:inline>
+        </w:drawing>
+      </w:r>
+    </w:p>
+    <w:p>
+      <w:pPr>
+        <w:rPr>
+          <w:lang w:val="es-CO"/>
+        </w:rPr>
+      </w:pPr>
+      <w:r>
+        <w:rPr>
+          <w:lang w:val="es-CO"/>
+        </w:rPr>
+        <w:t>Además de implementar delSymbol() en SlotMachine():</w:t>
+      </w:r>
+    </w:p>
+    <w:p>
+      <w:pPr>
+        <w:rPr>
+          <w:lang w:val="es-CO"/>
+        </w:rPr>
+      </w:pPr>
+      <w:r>
+        <w:rPr>
+          <w:lang w:val="es-CO"/>
+        </w:rPr>
+        <w:drawing>
+          <wp:inline distT="0" distB="0" distL="0" distR="0" wp14:anchorId="5DFFC776" wp14:editId="3893D043">
+            <wp:extent cx="3677163" cy="1486107"/>
+            <wp:effectExtent l="0" t="0" r="0" b="0"/>
+            <wp:docPr id="1002945058" name="Imagen 1"/>
+            <wp:cNvGraphicFramePr>
+              <a:graphicFrameLocks xmlns:a="http://schemas.openxmlformats.org/drawingml/2006/main" noChangeAspect="1"/>
+            </wp:cNvGraphicFramePr>
+            <a:graphic xmlns:a="http://schemas.openxmlformats.org/drawingml/2006/main">
+              <a:graphicData uri="http://schemas.openxmlformats.org/drawingml/2006/picture">
+                <pic:pic xmlns:pic="http://schemas.openxmlformats.org/drawingml/2006/picture">
+                  <pic:nvPicPr>
+                    <pic:cNvPr id="1002945058" name=""/>
+                    <pic:cNvPicPr/>
+                  </pic:nvPicPr>
+                  <pic:blipFill>
+                    <a:blip r:embed="rId75"/>
+                    <a:stretch>
+                      <a:fillRect/>
+                    </a:stretch>
+                  </pic:blipFill>
+                  <pic:spPr>
+                    <a:xfrm>
+                      <a:off x="0" y="0"/>
+                      <a:ext cx="3677163" cy="1486107"/>
+                    </a:xfrm>
+                    <a:prstGeom prst="rect">
+                      <a:avLst/>
+                    </a:prstGeom>
+                  </pic:spPr>
+                </pic:pic>
+              </a:graphicData>
+            </a:graphic>
+          </wp:inline>
+        </w:drawing>
+      </w:r>
+    </w:p>
+    <w:p>
+      <w:pPr>
+        <w:rPr>
+          <w:lang w:val="es-CO"/>
+        </w:rPr>
+      </w:pPr>
+    </w:p>
+    <w:p>
+      <w:pPr>
+        <w:rPr>
+          <w:lang w:val="es-CO"/>
+        </w:rPr>
+      </w:pPr>
+      <w:r>
+        <w:rPr>
+          <w:lang w:val="es-CO"/>
+        </w:rPr>
+        <w:t>Para probarlo, si tenemos inicialmente:</w:t>
+      </w:r>
+    </w:p>
+    <w:p>
+      <w:pPr>
+        <w:rPr>
+          <w:lang w:val="es-CO"/>
+        </w:rPr>
+      </w:pPr>
+      <w:r>
+        <w:rPr>
+          <w:lang w:val="es-CO"/>
+        </w:rPr>
+        <w:lastRenderedPageBreak/>
+        <w:drawing>
+          <wp:inline distT="0" distB="0" distL="0" distR="0" wp14:anchorId="0DA76DDE" wp14:editId="6B2E9385">
+            <wp:extent cx="3896269" cy="2162477"/>
+            <wp:effectExtent l="0" t="0" r="9525" b="9525"/>
+            <wp:docPr id="698753870" name="Imagen 1"/>
+            <wp:cNvGraphicFramePr>
+              <a:graphicFrameLocks xmlns:a="http://schemas.openxmlformats.org/drawingml/2006/main" noChangeAspect="1"/>
+            </wp:cNvGraphicFramePr>
+            <a:graphic xmlns:a="http://schemas.openxmlformats.org/drawingml/2006/main">
+              <a:graphicData uri="http://schemas.openxmlformats.org/drawingml/2006/picture">
+                <pic:pic xmlns:pic="http://schemas.openxmlformats.org/drawingml/2006/picture">
+                  <pic:nvPicPr>
+                    <pic:cNvPr id="698753870" name=""/>
+                    <pic:cNvPicPr/>
+                  </pic:nvPicPr>
+                  <pic:blipFill>
+                    <a:blip r:embed="rId76"/>
+                    <a:stretch>
+                      <a:fillRect/>
+                    </a:stretch>
+                  </pic:blipFill>
+                  <pic:spPr>
+                    <a:xfrm>
+                      <a:off x="0" y="0"/>
+                      <a:ext cx="3896269" cy="2162477"/>
+                    </a:xfrm>
+                    <a:prstGeom prst="rect">
+                      <a:avLst/>
+                    </a:prstGeom>
+                  </pic:spPr>
+                </pic:pic>
+              </a:graphicData>
+            </a:graphic>
+          </wp:inline>
+        </w:drawing>
+      </w:r>
+    </w:p>
+    <w:p>
+      <w:pPr>
+        <w:rPr>
+          <w:lang w:val="es-CO"/>
+        </w:rPr>
+      </w:pPr>
+      <w:r>
+        <w:rPr>
+          <w:lang w:val="es-CO"/>
+        </w:rPr>
+        <w:t>Y sabemos que el ciclo es:</w:t>
+      </w:r>
+    </w:p>
+    <w:p>
+      <w:pPr>
+        <w:rPr>
+          <w:lang w:val="es-CO"/>
+        </w:rPr>
+      </w:pPr>
+      <w:r>
+        <w:rPr>
+          <w:lang w:val="es-CO"/>
+        </w:rPr>
+        <w:t>“green” -&gt; “red” –&gt; “blue”:</w:t>
+      </w:r>
+    </w:p>
+    <w:p>
+      <w:pPr>
+        <w:rPr>
+          <w:lang w:val="es-CO"/>
+        </w:rPr>
+      </w:pPr>
+      <w:r>
+        <w:rPr>
+          <w:lang w:val="es-CO"/>
+        </w:rPr>
+        <w:t>Si elimino “green”, ambos colores no deberían cambiar:</w:t>
+      </w:r>
+    </w:p>
+    <w:p>
+      <w:pPr>
+        <w:rPr>
+          <w:lang w:val="es-CO"/>
+        </w:rPr>
+      </w:pPr>
+      <w:r>
+        <w:rPr>
+          <w:lang w:val="es-CO"/>
+        </w:rPr>
+        <w:drawing>
+          <wp:inline distT="0" distB="0" distL="0" distR="0" wp14:anchorId="2E510B07" wp14:editId="7620E2C2">
+            <wp:extent cx="4020111" cy="2143424"/>
+            <wp:effectExtent l="0" t="0" r="0" b="9525"/>
+            <wp:docPr id="703214019" name="Imagen 1"/>
+            <wp:cNvGraphicFramePr>
+              <a:graphicFrameLocks xmlns:a="http://schemas.openxmlformats.org/drawingml/2006/main" noChangeAspect="1"/>
+            </wp:cNvGraphicFramePr>
+            <a:graphic xmlns:a="http://schemas.openxmlformats.org/drawingml/2006/main">
+              <a:graphicData uri="http://schemas.openxmlformats.org/drawingml/2006/picture">
+                <pic:pic xmlns:pic="http://schemas.openxmlformats.org/drawingml/2006/picture">
+                  <pic:nvPicPr>
+                    <pic:cNvPr id="703214019" name=""/>
+                    <pic:cNvPicPr/>
+                  </pic:nvPicPr>
+                  <pic:blipFill>
+                    <a:blip r:embed="rId77"/>
+                    <a:stretch>
+                      <a:fillRect/>
+                    </a:stretch>
+                  </pic:blipFill>
+                  <pic:spPr>
+                    <a:xfrm>
+                      <a:off x="0" y="0"/>
+                      <a:ext cx="4020111" cy="2143424"/>
+                    </a:xfrm>
+                    <a:prstGeom prst="rect">
+                      <a:avLst/>
+                    </a:prstGeom>
+                  </pic:spPr>
+                </pic:pic>
+              </a:graphicData>
+            </a:graphic>
+          </wp:inline>
+        </w:drawing>
+      </w:r>
+    </w:p>
+    <w:p>
+      <w:pPr>
+        <w:rPr>
+          <w:lang w:val="es-CO"/>
+        </w:rPr>
+      </w:pPr>
+      <w:r>
+        <w:rPr>
+          <w:lang w:val="es-CO"/>
+        </w:rPr>
+        <w:t>Sin embargo, al hacer spin(), deberían cambiar de colores al color del otro:</w:t>
+      </w:r>
+    </w:p>
+    <w:p>
+      <w:pPr>
+        <w:rPr>
+          <w:lang w:val="es-CO"/>
+        </w:rPr>
+      </w:pPr>
+      <w:r>
+        <w:rPr>
+          <w:lang w:val="es-CO"/>
+        </w:rPr>
+        <w:lastRenderedPageBreak/>
+        <w:drawing>
+          <wp:inline distT="0" distB="0" distL="0" distR="0" wp14:anchorId="42E4C3B0" wp14:editId="5D3409E2">
+            <wp:extent cx="4153480" cy="2191056"/>
+            <wp:effectExtent l="0" t="0" r="0" b="0"/>
+            <wp:docPr id="1115493255" name="Imagen 1"/>
+            <wp:cNvGraphicFramePr>
+              <a:graphicFrameLocks xmlns:a="http://schemas.openxmlformats.org/drawingml/2006/main" noChangeAspect="1"/>
+            </wp:cNvGraphicFramePr>
+            <a:graphic xmlns:a="http://schemas.openxmlformats.org/drawingml/2006/main">
+              <a:graphicData uri="http://schemas.openxmlformats.org/drawingml/2006/picture">
+                <pic:pic xmlns:pic="http://schemas.openxmlformats.org/drawingml/2006/picture">
+                  <pic:nvPicPr>
+                    <pic:cNvPr id="1115493255" name=""/>
+                    <pic:cNvPicPr/>
+                  </pic:nvPicPr>
+                  <pic:blipFill>
+                    <a:blip r:embed="rId78"/>
+                    <a:stretch>
+                      <a:fillRect/>
+                    </a:stretch>
+                  </pic:blipFill>
+                  <pic:spPr>
+                    <a:xfrm>
+                      <a:off x="0" y="0"/>
+                      <a:ext cx="4153480" cy="2191056"/>
+                    </a:xfrm>
+                    <a:prstGeom prst="rect">
+                      <a:avLst/>
+                    </a:prstGeom>
+                  </pic:spPr>
+                </pic:pic>
+              </a:graphicData>
+            </a:graphic>
+          </wp:inline>
+        </w:drawing>
+      </w:r>
+    </w:p>
+    <w:p>
+      <w:pPr>
+        <w:rPr>
+          <w:lang w:val="es-CO"/>
+        </w:rPr>
+      </w:pPr>
+      <w:r>
+        <w:rPr>
+          <w:lang w:val="es-CO"/>
+        </w:rPr>
+        <w:t>Ahora voy a añadir dos colores al final de la lista de colores; “orange” y “cian”</w:t>
+      </w:r>
+      <w:r>
+        <w:rPr>
+          <w:lang w:val="es-CO"/>
+        </w:rPr>
+        <w:t>. Si borramos el color rojo, debería pasar al color azul, puesto que:</w:t>
+      </w:r>
+    </w:p>
+    <w:p>
+      <w:pPr>
+        <w:rPr>
+          <w:lang w:val="es-CO"/>
+        </w:rPr>
+      </w:pPr>
+      <w:r>
+        <w:rPr>
+          <w:lang w:val="es-CO"/>
+        </w:rPr>
+        <w:t>“red” -&gt; “blue” -&gt; “orange” -&gt; “cian”</w:t>
+      </w:r>
+    </w:p>
+    <w:p>
+      <w:pPr>
+        <w:rPr>
+          <w:lang w:val="es-CO"/>
+        </w:rPr>
+      </w:pPr>
+      <w:r>
+        <w:rPr>
+          <w:lang w:val="es-CO"/>
+        </w:rPr>
+        <w:drawing>
+          <wp:inline distT="0" distB="0" distL="0" distR="0" wp14:anchorId="0AC69FFA" wp14:editId="00F3F6BE">
+            <wp:extent cx="4829849" cy="2438740"/>
+            <wp:effectExtent l="0" t="0" r="8890" b="0"/>
+            <wp:docPr id="1792968514" name="Imagen 1"/>
+            <wp:cNvGraphicFramePr>
+              <a:graphicFrameLocks xmlns:a="http://schemas.openxmlformats.org/drawingml/2006/main" noChangeAspect="1"/>
+            </wp:cNvGraphicFramePr>
+            <a:graphic xmlns:a="http://schemas.openxmlformats.org/drawingml/2006/main">
+              <a:graphicData uri="http://schemas.openxmlformats.org/drawingml/2006/picture">
+                <pic:pic xmlns:pic="http://schemas.openxmlformats.org/drawingml/2006/picture">
+                  <pic:nvPicPr>
+                    <pic:cNvPr id="1792968514" name=""/>
+                    <pic:cNvPicPr/>
+                  </pic:nvPicPr>
+                  <pic:blipFill>
+                    <a:blip r:embed="rId79"/>
+                    <a:stretch>
+                      <a:fillRect/>
+                    </a:stretch>
+                  </pic:blipFill>
+                  <pic:spPr>
+                    <a:xfrm>
+                      <a:off x="0" y="0"/>
+                      <a:ext cx="4829849" cy="2438740"/>
+                    </a:xfrm>
+                    <a:prstGeom prst="rect">
+                      <a:avLst/>
+                    </a:prstGeom>
+                  </pic:spPr>
+                </pic:pic>
+              </a:graphicData>
+            </a:graphic>
+          </wp:inline>
+        </w:drawing>
+      </w:r>
+    </w:p>
+    <w:p>
+      <w:pPr>
+        <w:rPr>
+          <w:lang w:val="es-CO"/>
+        </w:rPr>
+      </w:pPr>
+      <w:r>
+        <w:rPr>
+          <w:lang w:val="es-CO"/>
+        </w:rPr>
+        <w:t>Además, si borramos el color azul, deberían volverse de color naranja:</w:t>
+      </w:r>
+    </w:p>
+    <w:p>
+      <w:pPr>
+        <w:rPr>
+          <w:lang w:val="es-CO"/>
+        </w:rPr>
+      </w:pPr>
+      <w:r>
+        <w:rPr>
+          <w:lang w:val="es-CO"/>
+        </w:rPr>
+        <w:lastRenderedPageBreak/>
+        <w:drawing>
+          <wp:inline distT="0" distB="0" distL="0" distR="0" wp14:anchorId="42F2D42F" wp14:editId="78C2FA5E">
+            <wp:extent cx="4267796" cy="2257740"/>
+            <wp:effectExtent l="0" t="0" r="0" b="9525"/>
+            <wp:docPr id="1680125180" name="Imagen 1"/>
+            <wp:cNvGraphicFramePr>
+              <a:graphicFrameLocks xmlns:a="http://schemas.openxmlformats.org/drawingml/2006/main" noChangeAspect="1"/>
+            </wp:cNvGraphicFramePr>
+            <a:graphic xmlns:a="http://schemas.openxmlformats.org/drawingml/2006/main">
+              <a:graphicData uri="http://schemas.openxmlformats.org/drawingml/2006/picture">
+                <pic:pic xmlns:pic="http://schemas.openxmlformats.org/drawingml/2006/picture">
+                  <pic:nvPicPr>
+                    <pic:cNvPr id="1680125180" name=""/>
+                    <pic:cNvPicPr/>
+                  </pic:nvPicPr>
+                  <pic:blipFill>
+                    <a:blip r:embed="rId80"/>
+                    <a:stretch>
+                      <a:fillRect/>
+                    </a:stretch>
+                  </pic:blipFill>
+                  <pic:spPr>
+                    <a:xfrm>
+                      <a:off x="0" y="0"/>
+                      <a:ext cx="4267796" cy="2257740"/>
+                    </a:xfrm>
+                    <a:prstGeom prst="rect">
+                      <a:avLst/>
+                    </a:prstGeom>
+                  </pic:spPr>
+                </pic:pic>
+              </a:graphicData>
+            </a:graphic>
+          </wp:inline>
+        </w:drawing>
+      </w:r>
+    </w:p>
+    <w:p>
+      <w:pPr>
+        <w:rPr>
+          <w:lang w:val="es-CO"/>
+        </w:rPr>
+      </w:pPr>
+    </w:p>
     <w:sectPr>
-      <w:headerReference w:type="default" r:id="rId62"/>
+      <w:headerReference w:type="default" r:id="rId81"/>
       <w:pgSz w:w="12240" w:h="15840"/>
       <w:pgMar w:top="1440" w:right="1440" w:bottom="1440" w:left="1440" w:header="720" w:footer="720" w:gutter="0"/>
       <w:cols w:space="720"/>

</xml_diff>

<commit_message>
Guardar estado local del documento Word
</commit_message>
<xml_diff>
--- a/Primer Ciclo/Primer Ciclo.docx
+++ b/Primer Ciclo/Primer Ciclo.docx
@@ -190,18 +190,18 @@
           <w:color w:val="000000" w:themeColor="text1"/>
           <w:lang w:val="es-CO"/>
         </w:rPr>
-        <w:t>David Santiago Garzon Rodriguez</w:t>
-      </w:r>
-    </w:p>
-    <w:p>
-      <w:pPr>
-        <w:jc w:val="center"/>
+        <w:t xml:space="preserve">David Santiago Garzon </w:t>
+      </w:r>
+      <w:proofErr w:type="spellStart"/>
+      <w:r>
         <w:rPr>
           <w:rFonts w:ascii="Times New Roman" w:eastAsia="Times New Roman" w:hAnsi="Times New Roman" w:cs="Times New Roman"/>
           <w:color w:val="000000" w:themeColor="text1"/>
           <w:lang w:val="es-CO"/>
         </w:rPr>
-      </w:pPr>
+        <w:t>Rodriguez</w:t>
+      </w:r>
+      <w:proofErr w:type="spellEnd"/>
     </w:p>
     <w:p>
       <w:pPr>
@@ -222,41 +222,51 @@
           <w:lang w:val="es-CO"/>
         </w:rPr>
       </w:pPr>
-      <w:r>
+    </w:p>
+    <w:p>
+      <w:pPr>
+        <w:jc w:val="center"/>
         <w:rPr>
           <w:rFonts w:ascii="Times New Roman" w:eastAsia="Times New Roman" w:hAnsi="Times New Roman" w:cs="Times New Roman"/>
           <w:color w:val="000000" w:themeColor="text1"/>
           <w:lang w:val="es-CO"/>
         </w:rPr>
-        <w:t>Docente:</w:t>
-      </w:r>
-    </w:p>
-    <w:p>
-      <w:pPr>
-        <w:jc w:val="center"/>
+      </w:pPr>
+      <w:r>
         <w:rPr>
           <w:rFonts w:ascii="Times New Roman" w:eastAsia="Times New Roman" w:hAnsi="Times New Roman" w:cs="Times New Roman"/>
           <w:color w:val="000000" w:themeColor="text1"/>
           <w:lang w:val="es-CO"/>
         </w:rPr>
-      </w:pPr>
-      <w:r>
+        <w:t>Docente:</w:t>
+      </w:r>
+    </w:p>
+    <w:p>
+      <w:pPr>
+        <w:jc w:val="center"/>
         <w:rPr>
           <w:rFonts w:ascii="Times New Roman" w:eastAsia="Times New Roman" w:hAnsi="Times New Roman" w:cs="Times New Roman"/>
           <w:color w:val="000000" w:themeColor="text1"/>
           <w:lang w:val="es-CO"/>
         </w:rPr>
-        <w:t>María Irma Diaz Rozo</w:t>
-      </w:r>
-    </w:p>
-    <w:p>
-      <w:pPr>
-        <w:jc w:val="center"/>
+      </w:pPr>
+      <w:r>
         <w:rPr>
           <w:rFonts w:ascii="Times New Roman" w:eastAsia="Times New Roman" w:hAnsi="Times New Roman" w:cs="Times New Roman"/>
           <w:color w:val="000000" w:themeColor="text1"/>
           <w:lang w:val="es-CO"/>
         </w:rPr>
+        <w:t>María Irma Diaz Rozo</w:t>
+      </w:r>
+    </w:p>
+    <w:p>
+      <w:pPr>
+        <w:jc w:val="center"/>
+        <w:rPr>
+          <w:rFonts w:ascii="Times New Roman" w:eastAsia="Times New Roman" w:hAnsi="Times New Roman" w:cs="Times New Roman"/>
+          <w:color w:val="000000" w:themeColor="text1"/>
+          <w:lang w:val="es-CO"/>
+        </w:rPr>
       </w:pPr>
     </w:p>
     <w:p>
@@ -316,6 +326,7 @@
           <w:lang w:val="es-CO"/>
         </w:rPr>
       </w:pPr>
+      <w:proofErr w:type="spellStart"/>
       <w:r>
         <w:rPr>
           <w:b/>
@@ -323,15 +334,16 @@
           <w:lang w:val="es-CO"/>
         </w:rPr>
         <w:lastRenderedPageBreak/>
-        <w:t>MiniCiclo 1:</w:t>
-      </w:r>
+        <w:t>MiniCiclo</w:t>
+      </w:r>
+      <w:proofErr w:type="spellEnd"/>
       <w:r>
         <w:rPr>
           <w:b/>
           <w:bCs/>
           <w:lang w:val="es-CO"/>
         </w:rPr>
-        <w:t xml:space="preserve"> Creación e implementación</w:t>
+        <w:t xml:space="preserve"> 1:</w:t>
       </w:r>
       <w:r>
         <w:rPr>
@@ -339,7 +351,7 @@
           <w:bCs/>
           <w:lang w:val="es-CO"/>
         </w:rPr>
-        <w:t xml:space="preserve"> de </w:t>
+        <w:t xml:space="preserve"> Creación e implementación</w:t>
       </w:r>
       <w:r>
         <w:rPr>
@@ -347,6 +359,14 @@
           <w:bCs/>
           <w:lang w:val="es-CO"/>
         </w:rPr>
+        <w:t xml:space="preserve"> de </w:t>
+      </w:r>
+      <w:r>
+        <w:rPr>
+          <w:b/>
+          <w:bCs/>
+          <w:lang w:val="es-CO"/>
+        </w:rPr>
         <w:t>Symbol:</w:t>
       </w:r>
     </w:p>
@@ -381,7 +401,21 @@
         <w:rPr>
           <w:lang w:val="es-CO"/>
         </w:rPr>
-        <w:t xml:space="preserve">Inicialmente se modela en astah: </w:t>
+        <w:t xml:space="preserve">Inicialmente se modela en </w:t>
+      </w:r>
+      <w:proofErr w:type="spellStart"/>
+      <w:r>
+        <w:rPr>
+          <w:lang w:val="es-CO"/>
+        </w:rPr>
+        <w:t>astah</w:t>
+      </w:r>
+      <w:proofErr w:type="spellEnd"/>
+      <w:r>
+        <w:rPr>
+          <w:lang w:val="es-CO"/>
+        </w:rPr>
+        <w:t xml:space="preserve">: </w:t>
       </w:r>
     </w:p>
     <w:p>
@@ -446,11 +480,19 @@
           <w:lang w:val="es-CO"/>
         </w:rPr>
       </w:pPr>
-      <w:r>
-        <w:rPr>
-          <w:lang w:val="es-CO"/>
-        </w:rPr>
-        <w:t>Además sus atributos son:</w:t>
+      <w:proofErr w:type="gramStart"/>
+      <w:r>
+        <w:rPr>
+          <w:lang w:val="es-CO"/>
+        </w:rPr>
+        <w:t>Además</w:t>
+      </w:r>
+      <w:proofErr w:type="gramEnd"/>
+      <w:r>
+        <w:rPr>
+          <w:lang w:val="es-CO"/>
+        </w:rPr>
+        <w:t xml:space="preserve"> sus atributos son:</w:t>
       </w:r>
     </w:p>
     <w:p>
@@ -519,29 +561,85 @@
         <w:rPr>
           <w:lang w:val="es-CO"/>
         </w:rPr>
-        <w:t>La cual representa su interfaz grafica como Rectangle de shapes.</w:t>
-      </w:r>
-    </w:p>
-    <w:p>
-      <w:pPr>
-        <w:rPr>
-          <w:rFonts w:hint="eastAsia"/>
-          <w:lang w:val="es-CO"/>
-        </w:rPr>
-      </w:pPr>
-    </w:p>
-    <w:p>
-      <w:pPr>
-        <w:rPr>
-          <w:rFonts w:hint="eastAsia"/>
-          <w:lang w:val="es-CO"/>
-        </w:rPr>
-      </w:pPr>
-      <w:r>
-        <w:rPr>
-          <w:lang w:val="es-CO"/>
-        </w:rPr>
-        <w:t>A la clase Rectangle fue necesario agregarle ciertos métodos para encontrar su ubicación en la pantalla, su tamaño</w:t>
+        <w:t xml:space="preserve">La cual representa su interfaz </w:t>
+      </w:r>
+      <w:proofErr w:type="spellStart"/>
+      <w:r>
+        <w:rPr>
+          <w:lang w:val="es-CO"/>
+        </w:rPr>
+        <w:t>grafica</w:t>
+      </w:r>
+      <w:proofErr w:type="spellEnd"/>
+      <w:r>
+        <w:rPr>
+          <w:lang w:val="es-CO"/>
+        </w:rPr>
+        <w:t xml:space="preserve"> como </w:t>
+      </w:r>
+      <w:proofErr w:type="spellStart"/>
+      <w:r>
+        <w:rPr>
+          <w:lang w:val="es-CO"/>
+        </w:rPr>
+        <w:t>Rectangle</w:t>
+      </w:r>
+      <w:proofErr w:type="spellEnd"/>
+      <w:r>
+        <w:rPr>
+          <w:lang w:val="es-CO"/>
+        </w:rPr>
+        <w:t xml:space="preserve"> de </w:t>
+      </w:r>
+      <w:proofErr w:type="spellStart"/>
+      <w:r>
+        <w:rPr>
+          <w:lang w:val="es-CO"/>
+        </w:rPr>
+        <w:t>shapes</w:t>
+      </w:r>
+      <w:proofErr w:type="spellEnd"/>
+      <w:r>
+        <w:rPr>
+          <w:lang w:val="es-CO"/>
+        </w:rPr>
+        <w:t>.</w:t>
+      </w:r>
+    </w:p>
+    <w:p>
+      <w:pPr>
+        <w:rPr>
+          <w:rFonts w:hint="eastAsia"/>
+          <w:lang w:val="es-CO"/>
+        </w:rPr>
+      </w:pPr>
+    </w:p>
+    <w:p>
+      <w:pPr>
+        <w:rPr>
+          <w:rFonts w:hint="eastAsia"/>
+          <w:lang w:val="es-CO"/>
+        </w:rPr>
+      </w:pPr>
+      <w:r>
+        <w:rPr>
+          <w:lang w:val="es-CO"/>
+        </w:rPr>
+        <w:t xml:space="preserve">A la clase </w:t>
+      </w:r>
+      <w:proofErr w:type="spellStart"/>
+      <w:r>
+        <w:rPr>
+          <w:lang w:val="es-CO"/>
+        </w:rPr>
+        <w:t>Rectangle</w:t>
+      </w:r>
+      <w:proofErr w:type="spellEnd"/>
+      <w:r>
+        <w:rPr>
+          <w:lang w:val="es-CO"/>
+        </w:rPr>
+        <w:t xml:space="preserve"> fue necesario agregarle ciertos métodos para encontrar su ubicación en la pantalla, su tamaño</w:t>
       </w:r>
       <w:r>
         <w:rPr>
@@ -624,7 +722,21 @@
         <w:rPr>
           <w:lang w:val="es-CO"/>
         </w:rPr>
-        <w:t xml:space="preserve">Por tanto cada método debe cumplir determinada función. </w:t>
+        <w:t xml:space="preserve">Por </w:t>
+      </w:r>
+      <w:proofErr w:type="gramStart"/>
+      <w:r>
+        <w:rPr>
+          <w:lang w:val="es-CO"/>
+        </w:rPr>
+        <w:t>tanto</w:t>
+      </w:r>
+      <w:proofErr w:type="gramEnd"/>
+      <w:r>
+        <w:rPr>
+          <w:lang w:val="es-CO"/>
+        </w:rPr>
+        <w:t xml:space="preserve"> cada método debe cumplir determinada función. </w:t>
       </w:r>
     </w:p>
     <w:p>
@@ -710,11 +822,27 @@
           <w:lang w:val="es-CO"/>
         </w:rPr>
       </w:pPr>
-      <w:r>
-        <w:rPr>
-          <w:lang w:val="es-CO"/>
-        </w:rPr>
-        <w:t>makeVisible(): Debe volver visible el símbolo.</w:t>
+      <w:proofErr w:type="spellStart"/>
+      <w:proofErr w:type="gramStart"/>
+      <w:r>
+        <w:rPr>
+          <w:lang w:val="es-CO"/>
+        </w:rPr>
+        <w:t>makeVisible</w:t>
+      </w:r>
+      <w:proofErr w:type="spellEnd"/>
+      <w:r>
+        <w:rPr>
+          <w:lang w:val="es-CO"/>
+        </w:rPr>
+        <w:t>(</w:t>
+      </w:r>
+      <w:proofErr w:type="gramEnd"/>
+      <w:r>
+        <w:rPr>
+          <w:lang w:val="es-CO"/>
+        </w:rPr>
+        <w:t>): Debe volver visible el símbolo.</w:t>
       </w:r>
     </w:p>
     <w:p>
@@ -779,11 +907,27 @@
           <w:lang w:val="es-CO"/>
         </w:rPr>
       </w:pPr>
-      <w:r>
-        <w:rPr>
-          <w:lang w:val="es-CO"/>
-        </w:rPr>
-        <w:t>makeInvisible(): Debe volver invisible el símbolo.</w:t>
+      <w:proofErr w:type="spellStart"/>
+      <w:proofErr w:type="gramStart"/>
+      <w:r>
+        <w:rPr>
+          <w:lang w:val="es-CO"/>
+        </w:rPr>
+        <w:t>makeInvisible</w:t>
+      </w:r>
+      <w:proofErr w:type="spellEnd"/>
+      <w:r>
+        <w:rPr>
+          <w:lang w:val="es-CO"/>
+        </w:rPr>
+        <w:t>(</w:t>
+      </w:r>
+      <w:proofErr w:type="gramEnd"/>
+      <w:r>
+        <w:rPr>
+          <w:lang w:val="es-CO"/>
+        </w:rPr>
+        <w:t>): Debe volver invisible el símbolo.</w:t>
       </w:r>
     </w:p>
     <w:p>
@@ -848,11 +992,19 @@
           <w:lang w:val="es-CO"/>
         </w:rPr>
       </w:pPr>
-      <w:r>
-        <w:rPr>
-          <w:lang w:val="es-CO"/>
-        </w:rPr>
-        <w:t>place()</w:t>
+      <w:proofErr w:type="gramStart"/>
+      <w:r>
+        <w:rPr>
+          <w:lang w:val="es-CO"/>
+        </w:rPr>
+        <w:t>place(</w:t>
+      </w:r>
+      <w:proofErr w:type="gramEnd"/>
+      <w:r>
+        <w:rPr>
+          <w:lang w:val="es-CO"/>
+        </w:rPr>
+        <w:t>)</w:t>
       </w:r>
       <w:r>
         <w:rPr>
@@ -923,11 +1075,27 @@
           <w:lang w:val="es-CO"/>
         </w:rPr>
       </w:pPr>
-      <w:r>
-        <w:rPr>
-          <w:lang w:val="es-CO"/>
-        </w:rPr>
-        <w:t>getColor(): Para obtener el nombre del color que tiene symbol.</w:t>
+      <w:proofErr w:type="spellStart"/>
+      <w:proofErr w:type="gramStart"/>
+      <w:r>
+        <w:rPr>
+          <w:lang w:val="es-CO"/>
+        </w:rPr>
+        <w:t>getColor</w:t>
+      </w:r>
+      <w:proofErr w:type="spellEnd"/>
+      <w:r>
+        <w:rPr>
+          <w:lang w:val="es-CO"/>
+        </w:rPr>
+        <w:t>(</w:t>
+      </w:r>
+      <w:proofErr w:type="gramEnd"/>
+      <w:r>
+        <w:rPr>
+          <w:lang w:val="es-CO"/>
+        </w:rPr>
+        <w:t>): Para obtener el nombre del color que tiene symbol.</w:t>
       </w:r>
     </w:p>
     <w:p>
@@ -1072,20 +1240,30 @@
           <w:lang w:val="es-CO"/>
         </w:rPr>
       </w:pPr>
+      <w:proofErr w:type="spellStart"/>
       <w:r>
         <w:rPr>
           <w:b/>
           <w:bCs/>
           <w:lang w:val="es-CO"/>
         </w:rPr>
-        <w:t xml:space="preserve">MiniCiclo 2: Creación e implementación </w:t>
-      </w:r>
+        <w:t>MiniCiclo</w:t>
+      </w:r>
+      <w:proofErr w:type="spellEnd"/>
       <w:r>
         <w:rPr>
           <w:b/>
           <w:bCs/>
           <w:lang w:val="es-CO"/>
         </w:rPr>
+        <w:t xml:space="preserve"> 2: Creación e implementación </w:t>
+      </w:r>
+      <w:r>
+        <w:rPr>
+          <w:b/>
+          <w:bCs/>
+          <w:lang w:val="es-CO"/>
+        </w:rPr>
         <w:t>de Wheel.</w:t>
       </w:r>
     </w:p>
@@ -1106,21 +1284,43 @@
         <w:rPr>
           <w:lang w:val="es-CO"/>
         </w:rPr>
-        <w:t>Wheel que representará cada una de esas ruedas que tiene el slotMachine, este contendrá varios símbolos.</w:t>
-      </w:r>
-    </w:p>
-    <w:p>
-      <w:pPr>
-        <w:rPr>
-          <w:rFonts w:hint="eastAsia"/>
-          <w:lang w:val="es-CO"/>
-        </w:rPr>
-      </w:pPr>
-      <w:r>
-        <w:rPr>
-          <w:lang w:val="es-CO"/>
-        </w:rPr>
-        <w:t>Además sus atributos son:</w:t>
+        <w:t xml:space="preserve">Wheel que representará cada una de esas ruedas que tiene el </w:t>
+      </w:r>
+      <w:proofErr w:type="spellStart"/>
+      <w:r>
+        <w:rPr>
+          <w:lang w:val="es-CO"/>
+        </w:rPr>
+        <w:t>slotMachine</w:t>
+      </w:r>
+      <w:proofErr w:type="spellEnd"/>
+      <w:r>
+        <w:rPr>
+          <w:lang w:val="es-CO"/>
+        </w:rPr>
+        <w:t>, este contendrá varios símbolos.</w:t>
+      </w:r>
+    </w:p>
+    <w:p>
+      <w:pPr>
+        <w:rPr>
+          <w:rFonts w:hint="eastAsia"/>
+          <w:lang w:val="es-CO"/>
+        </w:rPr>
+      </w:pPr>
+      <w:proofErr w:type="gramStart"/>
+      <w:r>
+        <w:rPr>
+          <w:lang w:val="es-CO"/>
+        </w:rPr>
+        <w:t>Además</w:t>
+      </w:r>
+      <w:proofErr w:type="gramEnd"/>
+      <w:r>
+        <w:rPr>
+          <w:lang w:val="es-CO"/>
+        </w:rPr>
+        <w:t xml:space="preserve"> sus atributos son:</w:t>
       </w:r>
     </w:p>
     <w:p>
@@ -1189,7 +1389,49 @@
         <w:rPr>
           <w:lang w:val="es-CO"/>
         </w:rPr>
-        <w:t>La cual representa su interfaz grafica como Rectangle de shapes.</w:t>
+        <w:t xml:space="preserve">La cual representa su interfaz </w:t>
+      </w:r>
+      <w:proofErr w:type="spellStart"/>
+      <w:r>
+        <w:rPr>
+          <w:lang w:val="es-CO"/>
+        </w:rPr>
+        <w:t>grafica</w:t>
+      </w:r>
+      <w:proofErr w:type="spellEnd"/>
+      <w:r>
+        <w:rPr>
+          <w:lang w:val="es-CO"/>
+        </w:rPr>
+        <w:t xml:space="preserve"> como </w:t>
+      </w:r>
+      <w:proofErr w:type="spellStart"/>
+      <w:r>
+        <w:rPr>
+          <w:lang w:val="es-CO"/>
+        </w:rPr>
+        <w:t>Rectangle</w:t>
+      </w:r>
+      <w:proofErr w:type="spellEnd"/>
+      <w:r>
+        <w:rPr>
+          <w:lang w:val="es-CO"/>
+        </w:rPr>
+        <w:t xml:space="preserve"> de </w:t>
+      </w:r>
+      <w:proofErr w:type="spellStart"/>
+      <w:r>
+        <w:rPr>
+          <w:lang w:val="es-CO"/>
+        </w:rPr>
+        <w:t>shapes</w:t>
+      </w:r>
+      <w:proofErr w:type="spellEnd"/>
+      <w:r>
+        <w:rPr>
+          <w:lang w:val="es-CO"/>
+        </w:rPr>
+        <w:t>.</w:t>
       </w:r>
     </w:p>
     <w:p>
@@ -1288,50 +1530,110 @@
         <w:rPr>
           <w:lang w:val="es-CO"/>
         </w:rPr>
-        <w:t>, por eso es static</w:t>
-      </w:r>
-    </w:p>
-    <w:p>
-      <w:pPr>
-        <w:rPr>
-          <w:rFonts w:hint="eastAsia"/>
-          <w:lang w:val="es-CO"/>
-        </w:rPr>
-      </w:pPr>
-      <w:r>
-        <w:rPr>
-          <w:lang w:val="es-CO"/>
-        </w:rPr>
-        <w:t>rectangleBodyPart es su interfaz gráfica como Rectangle de shapes.</w:t>
-      </w:r>
-    </w:p>
-    <w:p>
-      <w:pPr>
-        <w:rPr>
-          <w:rFonts w:hint="eastAsia"/>
-          <w:lang w:val="es-CO"/>
-        </w:rPr>
-      </w:pPr>
-      <w:r>
-        <w:rPr>
-          <w:lang w:val="es-CO"/>
-        </w:rPr>
-        <w:t>currentSymbol es el símbolo actual que tiene.</w:t>
-      </w:r>
-    </w:p>
-    <w:p>
-      <w:pPr>
-        <w:rPr>
-          <w:rFonts w:hint="eastAsia"/>
-          <w:lang w:val="es-CO"/>
-        </w:rPr>
-      </w:pPr>
+        <w:t xml:space="preserve">, por eso es </w:t>
+      </w:r>
+      <w:proofErr w:type="spellStart"/>
+      <w:r>
+        <w:rPr>
+          <w:lang w:val="es-CO"/>
+        </w:rPr>
+        <w:t>static</w:t>
+      </w:r>
+      <w:proofErr w:type="spellEnd"/>
+    </w:p>
+    <w:p>
+      <w:pPr>
+        <w:rPr>
+          <w:rFonts w:hint="eastAsia"/>
+          <w:lang w:val="es-CO"/>
+        </w:rPr>
+      </w:pPr>
+      <w:proofErr w:type="spellStart"/>
+      <w:r>
+        <w:rPr>
+          <w:lang w:val="es-CO"/>
+        </w:rPr>
+        <w:t>rectangleBodyPart</w:t>
+      </w:r>
+      <w:proofErr w:type="spellEnd"/>
+      <w:r>
+        <w:rPr>
+          <w:lang w:val="es-CO"/>
+        </w:rPr>
+        <w:t xml:space="preserve"> es su interfaz gráfica como </w:t>
+      </w:r>
+      <w:proofErr w:type="spellStart"/>
+      <w:r>
+        <w:rPr>
+          <w:lang w:val="es-CO"/>
+        </w:rPr>
+        <w:t>Rectangle</w:t>
+      </w:r>
+      <w:proofErr w:type="spellEnd"/>
+      <w:r>
+        <w:rPr>
+          <w:lang w:val="es-CO"/>
+        </w:rPr>
+        <w:t xml:space="preserve"> de </w:t>
+      </w:r>
+      <w:proofErr w:type="spellStart"/>
+      <w:r>
+        <w:rPr>
+          <w:lang w:val="es-CO"/>
+        </w:rPr>
+        <w:t>shapes</w:t>
+      </w:r>
+      <w:proofErr w:type="spellEnd"/>
+      <w:r>
+        <w:rPr>
+          <w:lang w:val="es-CO"/>
+        </w:rPr>
+        <w:t>.</w:t>
+      </w:r>
+    </w:p>
+    <w:p>
+      <w:pPr>
+        <w:rPr>
+          <w:rFonts w:hint="eastAsia"/>
+          <w:lang w:val="es-CO"/>
+        </w:rPr>
+      </w:pPr>
+      <w:proofErr w:type="spellStart"/>
+      <w:r>
+        <w:rPr>
+          <w:lang w:val="es-CO"/>
+        </w:rPr>
+        <w:t>currentSymbol</w:t>
+      </w:r>
+      <w:proofErr w:type="spellEnd"/>
+      <w:r>
+        <w:rPr>
+          <w:lang w:val="es-CO"/>
+        </w:rPr>
+        <w:t xml:space="preserve"> es el símbolo actual que tiene.</w:t>
+      </w:r>
+    </w:p>
+    <w:p>
+      <w:pPr>
+        <w:rPr>
+          <w:rFonts w:hint="eastAsia"/>
+          <w:lang w:val="es-CO"/>
+        </w:rPr>
+      </w:pPr>
+      <w:proofErr w:type="spellStart"/>
       <w:r>
         <w:rPr>
           <w:lang w:val="es-CO"/>
         </w:rPr>
         <w:lastRenderedPageBreak/>
-        <w:t>isVisible permite saber si está visible o no</w:t>
+        <w:t>isVisible</w:t>
+      </w:r>
+      <w:proofErr w:type="spellEnd"/>
+      <w:r>
+        <w:rPr>
+          <w:lang w:val="es-CO"/>
+        </w:rPr>
+        <w:t xml:space="preserve"> permite saber si está visible o no</w:t>
       </w:r>
       <w:r>
         <w:rPr>
@@ -1351,7 +1653,21 @@
         <w:rPr>
           <w:lang w:val="es-CO"/>
         </w:rPr>
-        <w:t>Inicialmente se modela así en astah:</w:t>
+        <w:t xml:space="preserve">Inicialmente se modela así en </w:t>
+      </w:r>
+      <w:proofErr w:type="spellStart"/>
+      <w:r>
+        <w:rPr>
+          <w:lang w:val="es-CO"/>
+        </w:rPr>
+        <w:t>astah</w:t>
+      </w:r>
+      <w:proofErr w:type="spellEnd"/>
+      <w:r>
+        <w:rPr>
+          <w:lang w:val="es-CO"/>
+        </w:rPr>
+        <w:t>:</w:t>
       </w:r>
     </w:p>
     <w:p>
@@ -1429,7 +1745,21 @@
         <w:rPr>
           <w:lang w:val="es-CO"/>
         </w:rPr>
-        <w:t>Por tanto cada método debe cumplir una determinada función:</w:t>
+        <w:t xml:space="preserve">Por </w:t>
+      </w:r>
+      <w:proofErr w:type="gramStart"/>
+      <w:r>
+        <w:rPr>
+          <w:lang w:val="es-CO"/>
+        </w:rPr>
+        <w:t>tanto</w:t>
+      </w:r>
+      <w:proofErr w:type="gramEnd"/>
+      <w:r>
+        <w:rPr>
+          <w:lang w:val="es-CO"/>
+        </w:rPr>
+        <w:t xml:space="preserve"> cada método debe cumplir una determinada función:</w:t>
       </w:r>
     </w:p>
     <w:p>
@@ -1508,11 +1838,27 @@
           <w:lang w:val="es-CO"/>
         </w:rPr>
       </w:pPr>
-      <w:r>
-        <w:rPr>
-          <w:lang w:val="es-CO"/>
-        </w:rPr>
-        <w:t>makeVisible(): Se encarga de volver visible a</w:t>
+      <w:proofErr w:type="spellStart"/>
+      <w:proofErr w:type="gramStart"/>
+      <w:r>
+        <w:rPr>
+          <w:lang w:val="es-CO"/>
+        </w:rPr>
+        <w:t>makeVisible</w:t>
+      </w:r>
+      <w:proofErr w:type="spellEnd"/>
+      <w:r>
+        <w:rPr>
+          <w:lang w:val="es-CO"/>
+        </w:rPr>
+        <w:t>(</w:t>
+      </w:r>
+      <w:proofErr w:type="gramEnd"/>
+      <w:r>
+        <w:rPr>
+          <w:lang w:val="es-CO"/>
+        </w:rPr>
+        <w:t>): Se encarga de volver visible a</w:t>
       </w:r>
       <w:r>
         <w:rPr>
@@ -1583,11 +1929,27 @@
           <w:lang w:val="es-CO"/>
         </w:rPr>
       </w:pPr>
-      <w:r>
-        <w:rPr>
-          <w:lang w:val="es-CO"/>
-        </w:rPr>
-        <w:t>makeInvisible(): Se encarga de volver invisible a Wheel y al símbolo que tenga actualmente.</w:t>
+      <w:proofErr w:type="spellStart"/>
+      <w:proofErr w:type="gramStart"/>
+      <w:r>
+        <w:rPr>
+          <w:lang w:val="es-CO"/>
+        </w:rPr>
+        <w:t>makeInvisible</w:t>
+      </w:r>
+      <w:proofErr w:type="spellEnd"/>
+      <w:r>
+        <w:rPr>
+          <w:lang w:val="es-CO"/>
+        </w:rPr>
+        <w:t>(</w:t>
+      </w:r>
+      <w:proofErr w:type="gramEnd"/>
+      <w:r>
+        <w:rPr>
+          <w:lang w:val="es-CO"/>
+        </w:rPr>
+        <w:t>): Se encarga de volver invisible a Wheel y al símbolo que tenga actualmente.</w:t>
       </w:r>
     </w:p>
     <w:p>
@@ -1653,11 +2015,19 @@
           <w:lang w:val="es-CO"/>
         </w:rPr>
       </w:pPr>
-      <w:r>
-        <w:rPr>
-          <w:lang w:val="es-CO"/>
-        </w:rPr>
-        <w:t>Place(): Se encarga de poner a la rueda en una posición específica.</w:t>
+      <w:proofErr w:type="gramStart"/>
+      <w:r>
+        <w:rPr>
+          <w:lang w:val="es-CO"/>
+        </w:rPr>
+        <w:t>Place(</w:t>
+      </w:r>
+      <w:proofErr w:type="gramEnd"/>
+      <w:r>
+        <w:rPr>
+          <w:lang w:val="es-CO"/>
+        </w:rPr>
+        <w:t>): Se encarga de poner a la rueda en una posición específica.</w:t>
       </w:r>
     </w:p>
     <w:p>
@@ -1722,17 +2092,27 @@
           <w:lang w:val="es-CO"/>
         </w:rPr>
       </w:pPr>
+      <w:proofErr w:type="spellStart"/>
+      <w:proofErr w:type="gramStart"/>
       <w:r>
         <w:rPr>
           <w:lang w:val="es-CO"/>
         </w:rPr>
         <w:t>addSymbol</w:t>
       </w:r>
-      <w:r>
-        <w:rPr>
-          <w:lang w:val="es-CO"/>
-        </w:rPr>
-        <w:t>()</w:t>
+      <w:proofErr w:type="spellEnd"/>
+      <w:r>
+        <w:rPr>
+          <w:lang w:val="es-CO"/>
+        </w:rPr>
+        <w:t>(</w:t>
+      </w:r>
+      <w:proofErr w:type="gramEnd"/>
+      <w:r>
+        <w:rPr>
+          <w:lang w:val="es-CO"/>
+        </w:rPr>
+        <w:t>)</w:t>
       </w:r>
       <w:r>
         <w:rPr>
@@ -1821,7 +2201,21 @@
         <w:rPr>
           <w:lang w:val="es-CO"/>
         </w:rPr>
-        <w:t>Adicionalmente en Canvas fue necesario añadir otro color nuevo, el color gris (“gray”):</w:t>
+        <w:t xml:space="preserve">Adicionalmente en </w:t>
+      </w:r>
+      <w:proofErr w:type="spellStart"/>
+      <w:r>
+        <w:rPr>
+          <w:lang w:val="es-CO"/>
+        </w:rPr>
+        <w:t>Canvas</w:t>
+      </w:r>
+      <w:proofErr w:type="spellEnd"/>
+      <w:r>
+        <w:rPr>
+          <w:lang w:val="es-CO"/>
+        </w:rPr>
+        <w:t xml:space="preserve"> fue necesario añadir otro color nuevo, el color gris (“gray”):</w:t>
       </w:r>
     </w:p>
     <w:p>
@@ -1913,7 +2307,21 @@
           <w:lang w:val="es-CO"/>
         </w:rPr>
         <w:lastRenderedPageBreak/>
-        <w:t>Inicialmente Wheel vacio se ve como:</w:t>
+        <w:t xml:space="preserve">Inicialmente Wheel </w:t>
+      </w:r>
+      <w:proofErr w:type="spellStart"/>
+      <w:r>
+        <w:rPr>
+          <w:lang w:val="es-CO"/>
+        </w:rPr>
+        <w:t>vacio</w:t>
+      </w:r>
+      <w:proofErr w:type="spellEnd"/>
+      <w:r>
+        <w:rPr>
+          <w:lang w:val="es-CO"/>
+        </w:rPr>
+        <w:t xml:space="preserve"> se ve como:</w:t>
       </w:r>
     </w:p>
     <w:p>
@@ -2051,7 +2459,21 @@
         <w:rPr>
           <w:lang w:val="es-CO"/>
         </w:rPr>
-        <w:t>(La parte gris es para mostrar como se ve ubicado</w:t>
+        <w:t xml:space="preserve">(La parte gris es para mostrar </w:t>
+      </w:r>
+      <w:proofErr w:type="spellStart"/>
+      <w:r>
+        <w:rPr>
+          <w:lang w:val="es-CO"/>
+        </w:rPr>
+        <w:t>como</w:t>
+      </w:r>
+      <w:proofErr w:type="spellEnd"/>
+      <w:r>
+        <w:rPr>
+          <w:lang w:val="es-CO"/>
+        </w:rPr>
+        <w:t xml:space="preserve"> se ve ubicado</w:t>
       </w:r>
       <w:r>
         <w:rPr>
@@ -2067,11 +2489,19 @@
           <w:lang w:val="es-CO"/>
         </w:rPr>
       </w:pPr>
-      <w:r>
-        <w:rPr>
-          <w:lang w:val="es-CO"/>
-        </w:rPr>
-        <w:t>Además sus atributos son:</w:t>
+      <w:proofErr w:type="gramStart"/>
+      <w:r>
+        <w:rPr>
+          <w:lang w:val="es-CO"/>
+        </w:rPr>
+        <w:t>Además</w:t>
+      </w:r>
+      <w:proofErr w:type="gramEnd"/>
+      <w:r>
+        <w:rPr>
+          <w:lang w:val="es-CO"/>
+        </w:rPr>
+        <w:t xml:space="preserve"> sus atributos son:</w:t>
       </w:r>
     </w:p>
     <w:p>
@@ -2160,21 +2590,53 @@
           <w:bCs/>
           <w:lang w:val="es-CO"/>
         </w:rPr>
-        <w:t>de la slotMachine:</w:t>
-      </w:r>
-    </w:p>
-    <w:p>
-      <w:pPr>
-        <w:rPr>
-          <w:rFonts w:hint="eastAsia"/>
-          <w:lang w:val="es-CO"/>
-        </w:rPr>
-      </w:pPr>
-      <w:r>
-        <w:rPr>
-          <w:lang w:val="es-CO"/>
-        </w:rPr>
-        <w:t>Se busca que la slotMachine inicié con un estado inicial</w:t>
+        <w:t xml:space="preserve">de la </w:t>
+      </w:r>
+      <w:proofErr w:type="spellStart"/>
+      <w:r>
+        <w:rPr>
+          <w:b/>
+          <w:bCs/>
+          <w:lang w:val="es-CO"/>
+        </w:rPr>
+        <w:t>slotMachine</w:t>
+      </w:r>
+      <w:proofErr w:type="spellEnd"/>
+      <w:r>
+        <w:rPr>
+          <w:b/>
+          <w:bCs/>
+          <w:lang w:val="es-CO"/>
+        </w:rPr>
+        <w:t>:</w:t>
+      </w:r>
+    </w:p>
+    <w:p>
+      <w:pPr>
+        <w:rPr>
+          <w:rFonts w:hint="eastAsia"/>
+          <w:lang w:val="es-CO"/>
+        </w:rPr>
+      </w:pPr>
+      <w:r>
+        <w:rPr>
+          <w:lang w:val="es-CO"/>
+        </w:rPr>
+        <w:t xml:space="preserve">Se busca que la </w:t>
+      </w:r>
+      <w:proofErr w:type="spellStart"/>
+      <w:r>
+        <w:rPr>
+          <w:lang w:val="es-CO"/>
+        </w:rPr>
+        <w:t>slotMachine</w:t>
+      </w:r>
+      <w:proofErr w:type="spellEnd"/>
+      <w:r>
+        <w:rPr>
+          <w:lang w:val="es-CO"/>
+        </w:rPr>
+        <w:t xml:space="preserve"> inicié con un estado inicial</w:t>
       </w:r>
       <w:r>
         <w:rPr>
@@ -2263,7 +2725,21 @@
         <w:rPr>
           <w:lang w:val="es-CO"/>
         </w:rPr>
-        <w:t>Por tanto es necesario hacer los siguientes métodos:</w:t>
+        <w:t xml:space="preserve">Por </w:t>
+      </w:r>
+      <w:proofErr w:type="gramStart"/>
+      <w:r>
+        <w:rPr>
+          <w:lang w:val="es-CO"/>
+        </w:rPr>
+        <w:t>tanto</w:t>
+      </w:r>
+      <w:proofErr w:type="gramEnd"/>
+      <w:r>
+        <w:rPr>
+          <w:lang w:val="es-CO"/>
+        </w:rPr>
+        <w:t xml:space="preserve"> es necesario hacer los siguientes métodos:</w:t>
       </w:r>
     </w:p>
     <w:p>
@@ -2289,7 +2765,21 @@
         <w:rPr>
           <w:lang w:val="es-CO"/>
         </w:rPr>
-        <w:t>la interfaz de la maquina, se preparen los símbolos y las ruedas iniciales.</w:t>
+        <w:t xml:space="preserve">la interfaz de la </w:t>
+      </w:r>
+      <w:proofErr w:type="spellStart"/>
+      <w:r>
+        <w:rPr>
+          <w:lang w:val="es-CO"/>
+        </w:rPr>
+        <w:t>maquina</w:t>
+      </w:r>
+      <w:proofErr w:type="spellEnd"/>
+      <w:r>
+        <w:rPr>
+          <w:lang w:val="es-CO"/>
+        </w:rPr>
+        <w:t>, se preparen los símbolos y las ruedas iniciales.</w:t>
       </w:r>
     </w:p>
     <w:p>
@@ -2355,11 +2845,27 @@
           <w:lang w:val="es-CO"/>
         </w:rPr>
       </w:pPr>
-      <w:r>
-        <w:rPr>
-          <w:lang w:val="es-CO"/>
-        </w:rPr>
-        <w:t>prepareMachine(): Se encarga de poner en un estado inicial al tablero</w:t>
+      <w:proofErr w:type="spellStart"/>
+      <w:proofErr w:type="gramStart"/>
+      <w:r>
+        <w:rPr>
+          <w:lang w:val="es-CO"/>
+        </w:rPr>
+        <w:t>prepareMachine</w:t>
+      </w:r>
+      <w:proofErr w:type="spellEnd"/>
+      <w:r>
+        <w:rPr>
+          <w:lang w:val="es-CO"/>
+        </w:rPr>
+        <w:t>(</w:t>
+      </w:r>
+      <w:proofErr w:type="gramEnd"/>
+      <w:r>
+        <w:rPr>
+          <w:lang w:val="es-CO"/>
+        </w:rPr>
+        <w:t>): Se encarga de poner en un estado inicial al tablero</w:t>
       </w:r>
       <w:r>
         <w:rPr>
@@ -2430,11 +2936,27 @@
           <w:lang w:val="es-CO"/>
         </w:rPr>
       </w:pPr>
-      <w:r>
-        <w:rPr>
-          <w:lang w:val="es-CO"/>
-        </w:rPr>
-        <w:t xml:space="preserve">prepareSymbols(): Se encarga de crear unos símbolos predeterminados con el color </w:t>
+      <w:proofErr w:type="spellStart"/>
+      <w:proofErr w:type="gramStart"/>
+      <w:r>
+        <w:rPr>
+          <w:lang w:val="es-CO"/>
+        </w:rPr>
+        <w:t>prepareSymbols</w:t>
+      </w:r>
+      <w:proofErr w:type="spellEnd"/>
+      <w:r>
+        <w:rPr>
+          <w:lang w:val="es-CO"/>
+        </w:rPr>
+        <w:t>(</w:t>
+      </w:r>
+      <w:proofErr w:type="gramEnd"/>
+      <w:r>
+        <w:rPr>
+          <w:lang w:val="es-CO"/>
+        </w:rPr>
+        <w:t xml:space="preserve">): Se encarga de crear unos símbolos predeterminados con el color </w:t>
       </w:r>
       <w:r>
         <w:rPr>
@@ -2530,11 +3052,27 @@
           <w:lang w:val="es-CO"/>
         </w:rPr>
       </w:pPr>
-      <w:r>
-        <w:rPr>
-          <w:lang w:val="es-CO"/>
-        </w:rPr>
-        <w:t xml:space="preserve">prepareWheels(): Se encarga de crear las ruedas, además de situar sus símbolos </w:t>
+      <w:proofErr w:type="spellStart"/>
+      <w:proofErr w:type="gramStart"/>
+      <w:r>
+        <w:rPr>
+          <w:lang w:val="es-CO"/>
+        </w:rPr>
+        <w:t>prepareWheels</w:t>
+      </w:r>
+      <w:proofErr w:type="spellEnd"/>
+      <w:r>
+        <w:rPr>
+          <w:lang w:val="es-CO"/>
+        </w:rPr>
+        <w:t>(</w:t>
+      </w:r>
+      <w:proofErr w:type="gramEnd"/>
+      <w:r>
+        <w:rPr>
+          <w:lang w:val="es-CO"/>
+        </w:rPr>
+        <w:t xml:space="preserve">): Se encarga de crear las ruedas, además de situar sus símbolos </w:t>
       </w:r>
       <w:r>
         <w:rPr>
@@ -2546,7 +3084,29 @@
         <w:rPr>
           <w:lang w:val="es-CO"/>
         </w:rPr>
-        <w:t xml:space="preserve"> Esto hizo necesario crear un método en Wheel llamado randomizeSymbol().</w:t>
+        <w:t xml:space="preserve"> Esto hizo necesario crear un método en Wheel llamado </w:t>
+      </w:r>
+      <w:proofErr w:type="spellStart"/>
+      <w:proofErr w:type="gramStart"/>
+      <w:r>
+        <w:rPr>
+          <w:lang w:val="es-CO"/>
+        </w:rPr>
+        <w:t>randomizeSymbol</w:t>
+      </w:r>
+      <w:proofErr w:type="spellEnd"/>
+      <w:r>
+        <w:rPr>
+          <w:lang w:val="es-CO"/>
+        </w:rPr>
+        <w:t>(</w:t>
+      </w:r>
+      <w:proofErr w:type="gramEnd"/>
+      <w:r>
+        <w:rPr>
+          <w:lang w:val="es-CO"/>
+        </w:rPr>
+        <w:t>).</w:t>
       </w:r>
     </w:p>
     <w:p>
@@ -2611,17 +3171,47 @@
           <w:lang w:val="es-CO"/>
         </w:rPr>
       </w:pPr>
-      <w:r>
-        <w:rPr>
-          <w:lang w:val="es-CO"/>
-        </w:rPr>
-        <w:t xml:space="preserve">randomNumGenerator(): </w:t>
-      </w:r>
-      <w:r>
-        <w:rPr>
-          <w:lang w:val="es-CO"/>
-        </w:rPr>
-        <w:t>Es un método estático, que se busca usar, para cualquier cálculo que dependa de generar números aleatorios, por tanto puede ser usado por cualquiera en cualquier momento.</w:t>
+      <w:proofErr w:type="spellStart"/>
+      <w:proofErr w:type="gramStart"/>
+      <w:r>
+        <w:rPr>
+          <w:lang w:val="es-CO"/>
+        </w:rPr>
+        <w:t>randomNumGenerator</w:t>
+      </w:r>
+      <w:proofErr w:type="spellEnd"/>
+      <w:r>
+        <w:rPr>
+          <w:lang w:val="es-CO"/>
+        </w:rPr>
+        <w:t>(</w:t>
+      </w:r>
+      <w:proofErr w:type="gramEnd"/>
+      <w:r>
+        <w:rPr>
+          <w:lang w:val="es-CO"/>
+        </w:rPr>
+        <w:t xml:space="preserve">): </w:t>
+      </w:r>
+      <w:r>
+        <w:rPr>
+          <w:lang w:val="es-CO"/>
+        </w:rPr>
+        <w:t xml:space="preserve">Es un método estático, que se busca usar, para cualquier cálculo que dependa de generar números aleatorios, por </w:t>
+      </w:r>
+      <w:proofErr w:type="gramStart"/>
+      <w:r>
+        <w:rPr>
+          <w:lang w:val="es-CO"/>
+        </w:rPr>
+        <w:t>tanto</w:t>
+      </w:r>
+      <w:proofErr w:type="gramEnd"/>
+      <w:r>
+        <w:rPr>
+          <w:lang w:val="es-CO"/>
+        </w:rPr>
+        <w:t xml:space="preserve"> puede ser usado por cualquiera en cualquier momento.</w:t>
       </w:r>
     </w:p>
     <w:p>
@@ -2687,11 +3277,27 @@
           <w:lang w:val="es-CO"/>
         </w:rPr>
       </w:pPr>
-      <w:r>
-        <w:rPr>
-          <w:lang w:val="es-CO"/>
-        </w:rPr>
-        <w:t xml:space="preserve">makeVisible(): Se encarga de mostrar el tablero y reposicionar </w:t>
+      <w:proofErr w:type="spellStart"/>
+      <w:proofErr w:type="gramStart"/>
+      <w:r>
+        <w:rPr>
+          <w:lang w:val="es-CO"/>
+        </w:rPr>
+        <w:t>makeVisible</w:t>
+      </w:r>
+      <w:proofErr w:type="spellEnd"/>
+      <w:r>
+        <w:rPr>
+          <w:lang w:val="es-CO"/>
+        </w:rPr>
+        <w:t>(</w:t>
+      </w:r>
+      <w:proofErr w:type="gramEnd"/>
+      <w:r>
+        <w:rPr>
+          <w:lang w:val="es-CO"/>
+        </w:rPr>
+        <w:t xml:space="preserve">): Se encarga de mostrar el tablero y reposicionar </w:t>
       </w:r>
       <w:r>
         <w:rPr>
@@ -2896,12 +3502,14 @@
         </w:rPr>
         <w:t xml:space="preserve"> N </w:t>
       </w:r>
+      <w:proofErr w:type="spellStart"/>
       <w:r>
         <w:rPr>
           <w:lang w:val="es-CO"/>
         </w:rPr>
         <w:t>Wheels</w:t>
       </w:r>
+      <w:proofErr w:type="spellEnd"/>
       <w:r>
         <w:rPr>
           <w:lang w:val="es-CO"/>
@@ -2970,7 +3578,14 @@
         <w:rPr>
           <w:lang w:val="es-CO"/>
         </w:rPr>
-        <w:t>(n + 1)</w:t>
+        <w:t xml:space="preserve">(n + </w:t>
+      </w:r>
+      <w:proofErr w:type="gramStart"/>
+      <w:r>
+        <w:rPr>
+          <w:lang w:val="es-CO"/>
+        </w:rPr>
+        <w:t>1)</w:t>
       </w:r>
       <w:r>
         <w:rPr>
@@ -2978,6 +3593,7 @@
         </w:rPr>
         <w:t>+</w:t>
       </w:r>
+      <w:proofErr w:type="gramEnd"/>
       <w:r>
         <w:rPr>
           <w:lang w:val="es-CO"/>
@@ -2996,7 +3612,21 @@
         <w:rPr>
           <w:lang w:val="es-CO"/>
         </w:rPr>
-        <w:t>Si se sabe que n será un valor fijo y X también será un valor fijo, que irá aumentando de acuerdo a las ruedas que se vayan poniendo</w:t>
+        <w:t xml:space="preserve">Si se sabe que n será un valor fijo y X también será un valor fijo, que irá aumentando </w:t>
+      </w:r>
+      <w:proofErr w:type="gramStart"/>
+      <w:r>
+        <w:rPr>
+          <w:lang w:val="es-CO"/>
+        </w:rPr>
+        <w:t>de acuerdo a</w:t>
+      </w:r>
+      <w:proofErr w:type="gramEnd"/>
+      <w:r>
+        <w:rPr>
+          <w:lang w:val="es-CO"/>
+        </w:rPr>
+        <w:t xml:space="preserve"> las ruedas que se vayan poniendo</w:t>
       </w:r>
       <w:r>
         <w:rPr>
@@ -3034,8 +3664,16 @@
         <w:rPr>
           <w:lang w:val="es-CO"/>
         </w:rPr>
-        <w:t xml:space="preserve"> – 50*n)/</w:t>
-      </w:r>
+        <w:t xml:space="preserve"> – 50*</w:t>
+      </w:r>
+      <w:proofErr w:type="gramStart"/>
+      <w:r>
+        <w:rPr>
+          <w:lang w:val="es-CO"/>
+        </w:rPr>
+        <w:t>n)/</w:t>
+      </w:r>
+      <w:proofErr w:type="gramEnd"/>
       <w:r>
         <w:rPr>
           <w:lang w:val="es-CO"/>
@@ -3110,7 +3748,21 @@
         <w:rPr>
           <w:lang w:val="es-CO"/>
         </w:rPr>
-        <w:t>Este es un boceto actual de como se ve la maquina</w:t>
+        <w:t xml:space="preserve">Este es un boceto actual de </w:t>
+      </w:r>
+      <w:proofErr w:type="spellStart"/>
+      <w:r>
+        <w:rPr>
+          <w:lang w:val="es-CO"/>
+        </w:rPr>
+        <w:t>como</w:t>
+      </w:r>
+      <w:proofErr w:type="spellEnd"/>
+      <w:r>
+        <w:rPr>
+          <w:lang w:val="es-CO"/>
+        </w:rPr>
+        <w:t xml:space="preserve"> se ve la maquina</w:t>
       </w:r>
       <w:r>
         <w:rPr>
@@ -3140,11 +3792,27 @@
           <w:lang w:val="es-CO"/>
         </w:rPr>
       </w:pPr>
-      <w:r>
-        <w:rPr>
-          <w:lang w:val="es-CO"/>
-        </w:rPr>
-        <w:t xml:space="preserve">makeInvisible(): </w:t>
+      <w:proofErr w:type="spellStart"/>
+      <w:proofErr w:type="gramStart"/>
+      <w:r>
+        <w:rPr>
+          <w:lang w:val="es-CO"/>
+        </w:rPr>
+        <w:t>makeInvisible</w:t>
+      </w:r>
+      <w:proofErr w:type="spellEnd"/>
+      <w:r>
+        <w:rPr>
+          <w:lang w:val="es-CO"/>
+        </w:rPr>
+        <w:t>(</w:t>
+      </w:r>
+      <w:proofErr w:type="gramEnd"/>
+      <w:r>
+        <w:rPr>
+          <w:lang w:val="es-CO"/>
+        </w:rPr>
+        <w:t xml:space="preserve">): </w:t>
       </w:r>
       <w:r>
         <w:rPr>
@@ -3305,11 +3973,27 @@
           <w:lang w:val="es-CO"/>
         </w:rPr>
       </w:pPr>
-      <w:r>
-        <w:rPr>
-          <w:lang w:val="es-CO"/>
-        </w:rPr>
-        <w:t xml:space="preserve">randomizeSymbol(): Se encarga de poner un símbolo aleatorio </w:t>
+      <w:proofErr w:type="spellStart"/>
+      <w:proofErr w:type="gramStart"/>
+      <w:r>
+        <w:rPr>
+          <w:lang w:val="es-CO"/>
+        </w:rPr>
+        <w:t>randomizeSymbol</w:t>
+      </w:r>
+      <w:proofErr w:type="spellEnd"/>
+      <w:r>
+        <w:rPr>
+          <w:lang w:val="es-CO"/>
+        </w:rPr>
+        <w:t>(</w:t>
+      </w:r>
+      <w:proofErr w:type="gramEnd"/>
+      <w:r>
+        <w:rPr>
+          <w:lang w:val="es-CO"/>
+        </w:rPr>
+        <w:t xml:space="preserve">): Se encarga de poner un símbolo aleatorio </w:t>
       </w:r>
       <w:r>
         <w:rPr>
@@ -3382,21 +4066,23 @@
           <w:lang w:val="es-CO"/>
         </w:rPr>
       </w:pPr>
+      <w:proofErr w:type="spellStart"/>
       <w:r>
         <w:rPr>
           <w:b/>
           <w:bCs/>
           <w:lang w:val="es-CO"/>
         </w:rPr>
-        <w:t>MiniCiclo 4:</w:t>
-      </w:r>
+        <w:t>MiniCiclo</w:t>
+      </w:r>
+      <w:proofErr w:type="spellEnd"/>
       <w:r>
         <w:rPr>
           <w:b/>
           <w:bCs/>
           <w:lang w:val="es-CO"/>
         </w:rPr>
-        <w:t xml:space="preserve"> </w:t>
+        <w:t xml:space="preserve"> 4:</w:t>
       </w:r>
       <w:r>
         <w:rPr>
@@ -3404,7 +4090,7 @@
           <w:bCs/>
           <w:lang w:val="es-CO"/>
         </w:rPr>
-        <w:t>Add</w:t>
+        <w:t xml:space="preserve"> </w:t>
       </w:r>
       <w:r>
         <w:rPr>
@@ -3412,7 +4098,7 @@
           <w:bCs/>
           <w:lang w:val="es-CO"/>
         </w:rPr>
-        <w:t>/Del</w:t>
+        <w:t>Add</w:t>
       </w:r>
       <w:r>
         <w:rPr>
@@ -3420,7 +4106,7 @@
           <w:bCs/>
           <w:lang w:val="es-CO"/>
         </w:rPr>
-        <w:t xml:space="preserve"> </w:t>
+        <w:t>/Del</w:t>
       </w:r>
       <w:r>
         <w:rPr>
@@ -3428,6 +4114,14 @@
           <w:bCs/>
           <w:lang w:val="es-CO"/>
         </w:rPr>
+        <w:t xml:space="preserve"> </w:t>
+      </w:r>
+      <w:r>
+        <w:rPr>
+          <w:b/>
+          <w:bCs/>
+          <w:lang w:val="es-CO"/>
+        </w:rPr>
         <w:t>Wheel</w:t>
       </w:r>
     </w:p>
@@ -3449,35 +4143,107 @@
         <w:rPr>
           <w:lang w:val="es-CO"/>
         </w:rPr>
-        <w:t>ncargaremos de añadir una nueva Wheel en la maquina, probando de paso que nuestro algoritmo matemático para calcular el espacio y que quedé simétrico al ejecutar makeVisible() funcione.</w:t>
-      </w:r>
-    </w:p>
-    <w:p>
-      <w:pPr>
-        <w:rPr>
-          <w:rFonts w:hint="eastAsia"/>
-          <w:lang w:val="es-CO"/>
-        </w:rPr>
-      </w:pPr>
-      <w:r>
-        <w:rPr>
-          <w:lang w:val="es-CO"/>
-        </w:rPr>
-        <w:t>Necesitaremos crear los siguiente métodos:</w:t>
-      </w:r>
-    </w:p>
-    <w:p>
-      <w:pPr>
-        <w:rPr>
-          <w:rFonts w:hint="eastAsia"/>
-          <w:lang w:val="es-CO"/>
-        </w:rPr>
-      </w:pPr>
-      <w:r>
-        <w:rPr>
-          <w:lang w:val="es-CO"/>
-        </w:rPr>
-        <w:t xml:space="preserve">Symbols(): Para obtener todos los símbolos que se tienen actualmente, además de </w:t>
+        <w:t xml:space="preserve">ncargaremos de añadir una nueva Wheel en la </w:t>
+      </w:r>
+      <w:proofErr w:type="spellStart"/>
+      <w:r>
+        <w:rPr>
+          <w:lang w:val="es-CO"/>
+        </w:rPr>
+        <w:t>maquina</w:t>
+      </w:r>
+      <w:proofErr w:type="spellEnd"/>
+      <w:r>
+        <w:rPr>
+          <w:lang w:val="es-CO"/>
+        </w:rPr>
+        <w:t xml:space="preserve">, probando de paso que nuestro algoritmo matemático para calcular el espacio y que quedé simétrico al ejecutar </w:t>
+      </w:r>
+      <w:proofErr w:type="spellStart"/>
+      <w:proofErr w:type="gramStart"/>
+      <w:r>
+        <w:rPr>
+          <w:lang w:val="es-CO"/>
+        </w:rPr>
+        <w:t>makeVisible</w:t>
+      </w:r>
+      <w:proofErr w:type="spellEnd"/>
+      <w:r>
+        <w:rPr>
+          <w:lang w:val="es-CO"/>
+        </w:rPr>
+        <w:t>(</w:t>
+      </w:r>
+      <w:proofErr w:type="gramEnd"/>
+      <w:r>
+        <w:rPr>
+          <w:lang w:val="es-CO"/>
+        </w:rPr>
+        <w:t xml:space="preserve">) </w:t>
+      </w:r>
+      <w:proofErr w:type="gramStart"/>
+      <w:r>
+        <w:rPr>
+          <w:lang w:val="es-CO"/>
+        </w:rPr>
+        <w:t>funcione</w:t>
+      </w:r>
+      <w:proofErr w:type="gramEnd"/>
+      <w:r>
+        <w:rPr>
+          <w:lang w:val="es-CO"/>
+        </w:rPr>
+        <w:t>.</w:t>
+      </w:r>
+    </w:p>
+    <w:p>
+      <w:pPr>
+        <w:rPr>
+          <w:rFonts w:hint="eastAsia"/>
+          <w:lang w:val="es-CO"/>
+        </w:rPr>
+      </w:pPr>
+      <w:r>
+        <w:rPr>
+          <w:lang w:val="es-CO"/>
+        </w:rPr>
+        <w:t xml:space="preserve">Necesitaremos crear los </w:t>
+      </w:r>
+      <w:proofErr w:type="gramStart"/>
+      <w:r>
+        <w:rPr>
+          <w:lang w:val="es-CO"/>
+        </w:rPr>
+        <w:t>siguiente métodos</w:t>
+      </w:r>
+      <w:proofErr w:type="gramEnd"/>
+      <w:r>
+        <w:rPr>
+          <w:lang w:val="es-CO"/>
+        </w:rPr>
+        <w:t>:</w:t>
+      </w:r>
+    </w:p>
+    <w:p>
+      <w:pPr>
+        <w:rPr>
+          <w:rFonts w:hint="eastAsia"/>
+          <w:lang w:val="es-CO"/>
+        </w:rPr>
+      </w:pPr>
+      <w:proofErr w:type="gramStart"/>
+      <w:r>
+        <w:rPr>
+          <w:lang w:val="es-CO"/>
+        </w:rPr>
+        <w:t>Symbols(</w:t>
+      </w:r>
+      <w:proofErr w:type="gramEnd"/>
+      <w:r>
+        <w:rPr>
+          <w:lang w:val="es-CO"/>
+        </w:rPr>
+        <w:t xml:space="preserve">): Para obtener todos los símbolos que se tienen actualmente, además de </w:t>
       </w:r>
       <w:r>
         <w:rPr>
@@ -3554,6 +4320,8 @@
           <w:lang w:val="es-CO"/>
         </w:rPr>
       </w:pPr>
+      <w:proofErr w:type="spellStart"/>
+      <w:proofErr w:type="gramStart"/>
       <w:r>
         <w:rPr>
           <w:lang w:val="es-CO"/>
@@ -3564,7 +4332,21 @@
         <w:rPr>
           <w:lang w:val="es-CO"/>
         </w:rPr>
-        <w:t>Wheel(): Tiene el objetivo de agregar una nueva rueda, en una posición específica.</w:t>
+        <w:t>Wheel</w:t>
+      </w:r>
+      <w:proofErr w:type="spellEnd"/>
+      <w:r>
+        <w:rPr>
+          <w:lang w:val="es-CO"/>
+        </w:rPr>
+        <w:t>(</w:t>
+      </w:r>
+      <w:proofErr w:type="gramEnd"/>
+      <w:r>
+        <w:rPr>
+          <w:lang w:val="es-CO"/>
+        </w:rPr>
+        <w:t>): Tiene el objetivo de agregar una nueva rueda, en una posición específica.</w:t>
       </w:r>
       <w:r>
         <w:rPr>
@@ -4281,11 +5063,27 @@
           <w:lang w:val="es-CO"/>
         </w:rPr>
       </w:pPr>
-      <w:r>
-        <w:rPr>
-          <w:lang w:val="es-CO"/>
-        </w:rPr>
-        <w:t>delWheel(): Se debe encargar de borrar una rueda en una posición específica</w:t>
+      <w:proofErr w:type="spellStart"/>
+      <w:proofErr w:type="gramStart"/>
+      <w:r>
+        <w:rPr>
+          <w:lang w:val="es-CO"/>
+        </w:rPr>
+        <w:t>delWheel</w:t>
+      </w:r>
+      <w:proofErr w:type="spellEnd"/>
+      <w:r>
+        <w:rPr>
+          <w:lang w:val="es-CO"/>
+        </w:rPr>
+        <w:t>(</w:t>
+      </w:r>
+      <w:proofErr w:type="gramEnd"/>
+      <w:r>
+        <w:rPr>
+          <w:lang w:val="es-CO"/>
+        </w:rPr>
+        <w:t>): Se debe encargar de borrar una rueda en una posición específica</w:t>
       </w:r>
       <w:r>
         <w:rPr>
@@ -4747,27 +5545,51 @@
           <w:lang w:val="es-CO"/>
         </w:rPr>
       </w:pPr>
+      <w:proofErr w:type="spellStart"/>
       <w:r>
         <w:rPr>
           <w:b/>
           <w:bCs/>
           <w:lang w:val="es-CO"/>
         </w:rPr>
-        <w:t>MiniCiclo 5: Spin</w:t>
-      </w:r>
-    </w:p>
-    <w:p>
-      <w:pPr>
-        <w:rPr>
-          <w:rFonts w:hint="eastAsia"/>
-          <w:lang w:val="es-CO"/>
-        </w:rPr>
-      </w:pPr>
-      <w:r>
-        <w:rPr>
-          <w:lang w:val="es-CO"/>
-        </w:rPr>
-        <w:t xml:space="preserve">Para este miniCiclo nos encargaremos de ser capaces de cambiar los símbolos de </w:t>
+        <w:t>MiniCiclo</w:t>
+      </w:r>
+      <w:proofErr w:type="spellEnd"/>
+      <w:r>
+        <w:rPr>
+          <w:b/>
+          <w:bCs/>
+          <w:lang w:val="es-CO"/>
+        </w:rPr>
+        <w:t xml:space="preserve"> 5: Spin</w:t>
+      </w:r>
+    </w:p>
+    <w:p>
+      <w:pPr>
+        <w:rPr>
+          <w:rFonts w:hint="eastAsia"/>
+          <w:lang w:val="es-CO"/>
+        </w:rPr>
+      </w:pPr>
+      <w:r>
+        <w:rPr>
+          <w:lang w:val="es-CO"/>
+        </w:rPr>
+        <w:t xml:space="preserve">Para este </w:t>
+      </w:r>
+      <w:proofErr w:type="spellStart"/>
+      <w:r>
+        <w:rPr>
+          <w:lang w:val="es-CO"/>
+        </w:rPr>
+        <w:t>miniCiclo</w:t>
+      </w:r>
+      <w:proofErr w:type="spellEnd"/>
+      <w:r>
+        <w:rPr>
+          <w:lang w:val="es-CO"/>
+        </w:rPr>
+        <w:t xml:space="preserve"> nos encargaremos de ser capaces de cambiar los símbolos de </w:t>
       </w:r>
       <w:r>
         <w:rPr>
@@ -4803,11 +5625,19 @@
           <w:lang w:val="es-CO"/>
         </w:rPr>
       </w:pPr>
-      <w:r>
-        <w:rPr>
-          <w:lang w:val="es-CO"/>
-        </w:rPr>
-        <w:t>Spin(): En este método vamos a cambiar el símbolo actual</w:t>
+      <w:proofErr w:type="gramStart"/>
+      <w:r>
+        <w:rPr>
+          <w:lang w:val="es-CO"/>
+        </w:rPr>
+        <w:t>Spin(</w:t>
+      </w:r>
+      <w:proofErr w:type="gramEnd"/>
+      <w:r>
+        <w:rPr>
+          <w:lang w:val="es-CO"/>
+        </w:rPr>
+        <w:t>): En este método vamos a cambiar el símbolo actual</w:t>
       </w:r>
       <w:r>
         <w:rPr>
@@ -4901,7 +5731,35 @@
           <w:lang w:val="es-CO"/>
         </w:rPr>
         <w:lastRenderedPageBreak/>
-        <w:t>Por otro lado, volviendo a slotMachine, si se quiere mover todos las ruedas al siguiente símbolo:</w:t>
+        <w:t xml:space="preserve">Por otro lado, volviendo a </w:t>
+      </w:r>
+      <w:proofErr w:type="spellStart"/>
+      <w:r>
+        <w:rPr>
+          <w:lang w:val="es-CO"/>
+        </w:rPr>
+        <w:t>slotMachine</w:t>
+      </w:r>
+      <w:proofErr w:type="spellEnd"/>
+      <w:r>
+        <w:rPr>
+          <w:lang w:val="es-CO"/>
+        </w:rPr>
+        <w:t xml:space="preserve">, si se quiere mover </w:t>
+      </w:r>
+      <w:proofErr w:type="gramStart"/>
+      <w:r>
+        <w:rPr>
+          <w:lang w:val="es-CO"/>
+        </w:rPr>
+        <w:t>todos las ruedas</w:t>
+      </w:r>
+      <w:proofErr w:type="gramEnd"/>
+      <w:r>
+        <w:rPr>
+          <w:lang w:val="es-CO"/>
+        </w:rPr>
+        <w:t xml:space="preserve"> al siguiente símbolo:</w:t>
       </w:r>
     </w:p>
     <w:p>
@@ -5051,7 +5909,21 @@
         <w:rPr>
           <w:lang w:val="es-CO"/>
         </w:rPr>
-        <w:t>“green”</w:t>
+        <w:t>“</w:t>
+      </w:r>
+      <w:proofErr w:type="spellStart"/>
+      <w:r>
+        <w:rPr>
+          <w:lang w:val="es-CO"/>
+        </w:rPr>
+        <w:t>green</w:t>
+      </w:r>
+      <w:proofErr w:type="spellEnd"/>
+      <w:r>
+        <w:rPr>
+          <w:lang w:val="es-CO"/>
+        </w:rPr>
+        <w:t>”</w:t>
       </w:r>
       <w:r>
         <w:rPr>
@@ -5083,12 +5955,14 @@
         </w:rPr>
         <w:t>, al usar spin, los colores van a ser: “</w:t>
       </w:r>
+      <w:proofErr w:type="spellStart"/>
       <w:r>
         <w:rPr>
           <w:lang w:val="es-CO"/>
         </w:rPr>
         <w:t>green</w:t>
       </w:r>
+      <w:proofErr w:type="spellEnd"/>
       <w:r>
         <w:rPr>
           <w:lang w:val="es-CO"/>
@@ -5187,11 +6061,41 @@
           <w:lang w:val="es-CO"/>
         </w:rPr>
       </w:pPr>
-      <w:r>
-        <w:rPr>
-          <w:lang w:val="es-CO"/>
-        </w:rPr>
-        <w:t>Spin(int wheel): El cual al escoger una rueda en específico cambiará al siguiente símbolo.</w:t>
+      <w:proofErr w:type="gramStart"/>
+      <w:r>
+        <w:rPr>
+          <w:lang w:val="es-CO"/>
+        </w:rPr>
+        <w:t>Spin(</w:t>
+      </w:r>
+      <w:proofErr w:type="spellStart"/>
+      <w:proofErr w:type="gramEnd"/>
+      <w:r>
+        <w:rPr>
+          <w:lang w:val="es-CO"/>
+        </w:rPr>
+        <w:t>int</w:t>
+      </w:r>
+      <w:proofErr w:type="spellEnd"/>
+      <w:r>
+        <w:rPr>
+          <w:lang w:val="es-CO"/>
+        </w:rPr>
+        <w:t xml:space="preserve"> </w:t>
+      </w:r>
+      <w:proofErr w:type="spellStart"/>
+      <w:r>
+        <w:rPr>
+          <w:lang w:val="es-CO"/>
+        </w:rPr>
+        <w:t>wheel</w:t>
+      </w:r>
+      <w:proofErr w:type="spellEnd"/>
+      <w:r>
+        <w:rPr>
+          <w:lang w:val="es-CO"/>
+        </w:rPr>
+        <w:t>): El cual al escoger una rueda en específico cambiará al siguiente símbolo.</w:t>
       </w:r>
     </w:p>
     <w:p>
@@ -5413,21 +6317,23 @@
           <w:lang w:val="es-CO"/>
         </w:rPr>
       </w:pPr>
+      <w:proofErr w:type="spellStart"/>
       <w:r>
         <w:rPr>
           <w:b/>
           <w:bCs/>
           <w:lang w:val="es-CO"/>
         </w:rPr>
-        <w:t xml:space="preserve">MiniCiclo </w:t>
-      </w:r>
+        <w:t>MiniCiclo</w:t>
+      </w:r>
+      <w:proofErr w:type="spellEnd"/>
       <w:r>
         <w:rPr>
           <w:b/>
           <w:bCs/>
           <w:lang w:val="es-CO"/>
         </w:rPr>
-        <w:t>6</w:t>
+        <w:t xml:space="preserve"> </w:t>
       </w:r>
       <w:r>
         <w:rPr>
@@ -5435,7 +6341,7 @@
           <w:bCs/>
           <w:lang w:val="es-CO"/>
         </w:rPr>
-        <w:t>: Add/Del symbols</w:t>
+        <w:t>6</w:t>
       </w:r>
       <w:r>
         <w:rPr>
@@ -5443,6 +6349,24 @@
           <w:bCs/>
           <w:lang w:val="es-CO"/>
         </w:rPr>
+        <w:t>: Add/</w:t>
+      </w:r>
+      <w:proofErr w:type="gramStart"/>
+      <w:r>
+        <w:rPr>
+          <w:b/>
+          <w:bCs/>
+          <w:lang w:val="es-CO"/>
+        </w:rPr>
+        <w:t>Del symbols</w:t>
+      </w:r>
+      <w:proofErr w:type="gramEnd"/>
+      <w:r>
+        <w:rPr>
+          <w:b/>
+          <w:bCs/>
+          <w:lang w:val="es-CO"/>
+        </w:rPr>
         <w:t>:</w:t>
       </w:r>
     </w:p>
@@ -5457,7 +6381,21 @@
         <w:rPr>
           <w:lang w:val="es-CO"/>
         </w:rPr>
-        <w:t>Para este miniCiclo nos encargaremos de ser capaces de añadir y quitar símbolos de las maquinas</w:t>
+        <w:t xml:space="preserve">Para este </w:t>
+      </w:r>
+      <w:proofErr w:type="spellStart"/>
+      <w:r>
+        <w:rPr>
+          <w:lang w:val="es-CO"/>
+        </w:rPr>
+        <w:t>miniCiclo</w:t>
+      </w:r>
+      <w:proofErr w:type="spellEnd"/>
+      <w:r>
+        <w:rPr>
+          <w:lang w:val="es-CO"/>
+        </w:rPr>
+        <w:t xml:space="preserve"> nos encargaremos de ser capaces de añadir y quitar símbolos de las maquinas</w:t>
       </w:r>
       <w:r>
         <w:rPr>
@@ -5477,7 +6415,21 @@
         <w:rPr>
           <w:lang w:val="es-CO"/>
         </w:rPr>
-        <w:t xml:space="preserve">Por tanto </w:t>
+        <w:t xml:space="preserve">Por </w:t>
+      </w:r>
+      <w:proofErr w:type="gramStart"/>
+      <w:r>
+        <w:rPr>
+          <w:lang w:val="es-CO"/>
+        </w:rPr>
+        <w:t>tanto</w:t>
+      </w:r>
+      <w:proofErr w:type="gramEnd"/>
+      <w:r>
+        <w:rPr>
+          <w:lang w:val="es-CO"/>
+        </w:rPr>
+        <w:t xml:space="preserve"> </w:t>
       </w:r>
       <w:r>
         <w:rPr>
@@ -5495,8 +6447,16 @@
         <w:rPr>
           <w:lang w:val="es-CO"/>
         </w:rPr>
-        <w:t xml:space="preserve"> método addSymbol</w:t>
-      </w:r>
+        <w:t xml:space="preserve"> método </w:t>
+      </w:r>
+      <w:proofErr w:type="spellStart"/>
+      <w:r>
+        <w:rPr>
+          <w:lang w:val="es-CO"/>
+        </w:rPr>
+        <w:t>addSymbol</w:t>
+      </w:r>
+      <w:proofErr w:type="spellEnd"/>
       <w:r>
         <w:rPr>
           <w:lang w:val="es-CO"/>
@@ -5511,11 +6471,27 @@
           <w:lang w:val="es-CO"/>
         </w:rPr>
       </w:pPr>
-      <w:r>
-        <w:rPr>
-          <w:lang w:val="es-CO"/>
-        </w:rPr>
-        <w:t>addSymbol(): Este nuevo método para añadir el símbolo, ahora hará que se cree desde adentro el símbolo y se podrá poner en una posición específica</w:t>
+      <w:proofErr w:type="spellStart"/>
+      <w:proofErr w:type="gramStart"/>
+      <w:r>
+        <w:rPr>
+          <w:lang w:val="es-CO"/>
+        </w:rPr>
+        <w:t>addSymbol</w:t>
+      </w:r>
+      <w:proofErr w:type="spellEnd"/>
+      <w:r>
+        <w:rPr>
+          <w:lang w:val="es-CO"/>
+        </w:rPr>
+        <w:t>(</w:t>
+      </w:r>
+      <w:proofErr w:type="gramEnd"/>
+      <w:r>
+        <w:rPr>
+          <w:lang w:val="es-CO"/>
+        </w:rPr>
+        <w:t>): Este nuevo método para añadir el símbolo, ahora hará que se cree desde adentro el símbolo y se podrá poner en una posición específica</w:t>
       </w:r>
       <w:r>
         <w:rPr>
@@ -5601,12 +6577,36 @@
         </w:rPr>
         <w:t xml:space="preserve">Se crea </w:t>
       </w:r>
-      <w:r>
-        <w:rPr>
-          <w:lang w:val="es-CO"/>
-        </w:rPr>
-        <w:t>addSymbol() en SlotMachine</w:t>
-      </w:r>
+      <w:proofErr w:type="spellStart"/>
+      <w:proofErr w:type="gramStart"/>
+      <w:r>
+        <w:rPr>
+          <w:lang w:val="es-CO"/>
+        </w:rPr>
+        <w:t>addSymbol</w:t>
+      </w:r>
+      <w:proofErr w:type="spellEnd"/>
+      <w:r>
+        <w:rPr>
+          <w:lang w:val="es-CO"/>
+        </w:rPr>
+        <w:t>(</w:t>
+      </w:r>
+      <w:proofErr w:type="gramEnd"/>
+      <w:r>
+        <w:rPr>
+          <w:lang w:val="es-CO"/>
+        </w:rPr>
+        <w:t xml:space="preserve">) en </w:t>
+      </w:r>
+      <w:proofErr w:type="spellStart"/>
+      <w:r>
+        <w:rPr>
+          <w:lang w:val="es-CO"/>
+        </w:rPr>
+        <w:t>SlotMachine</w:t>
+      </w:r>
+      <w:proofErr w:type="spellEnd"/>
       <w:r>
         <w:rPr>
           <w:lang w:val="es-CO"/>
@@ -5750,7 +6750,49 @@
         <w:rPr>
           <w:lang w:val="es-CO"/>
         </w:rPr>
-        <w:t>Si ponemos un número muy grande aunque no hayan tantos símbolos se pondrá al final:</w:t>
+        <w:t xml:space="preserve">Si ponemos un número muy </w:t>
+      </w:r>
+      <w:proofErr w:type="gramStart"/>
+      <w:r>
+        <w:rPr>
+          <w:lang w:val="es-CO"/>
+        </w:rPr>
+        <w:t>grande</w:t>
+      </w:r>
+      <w:proofErr w:type="gramEnd"/>
+      <w:r>
+        <w:rPr>
+          <w:lang w:val="es-CO"/>
+        </w:rPr>
+        <w:t xml:space="preserve"> aunque no </w:t>
+      </w:r>
+      <w:proofErr w:type="gramStart"/>
+      <w:r>
+        <w:rPr>
+          <w:lang w:val="es-CO"/>
+        </w:rPr>
+        <w:t>hayan</w:t>
+      </w:r>
+      <w:proofErr w:type="gramEnd"/>
+      <w:r>
+        <w:rPr>
+          <w:lang w:val="es-CO"/>
+        </w:rPr>
+        <w:t xml:space="preserve"> </w:t>
+      </w:r>
+      <w:proofErr w:type="gramStart"/>
+      <w:r>
+        <w:rPr>
+          <w:lang w:val="es-CO"/>
+        </w:rPr>
+        <w:t>tantos símbolos se pondrá al final</w:t>
+      </w:r>
+      <w:proofErr w:type="gramEnd"/>
+      <w:r>
+        <w:rPr>
+          <w:lang w:val="es-CO"/>
+        </w:rPr>
+        <w:t>:</w:t>
       </w:r>
     </w:p>
     <w:p>
@@ -5839,7 +6881,35 @@
         <w:rPr>
           <w:lang w:val="es-CO"/>
         </w:rPr>
-        <w:t xml:space="preserve">“green” -&gt; “red” -&gt; “blue” -&gt; “yellow”, </w:t>
+        <w:t>“</w:t>
+      </w:r>
+      <w:proofErr w:type="spellStart"/>
+      <w:r>
+        <w:rPr>
+          <w:lang w:val="es-CO"/>
+        </w:rPr>
+        <w:t>green</w:t>
+      </w:r>
+      <w:proofErr w:type="spellEnd"/>
+      <w:r>
+        <w:rPr>
+          <w:lang w:val="es-CO"/>
+        </w:rPr>
+        <w:t>” -&gt; “red” -&gt; “blue” -&gt; “</w:t>
+      </w:r>
+      <w:proofErr w:type="spellStart"/>
+      <w:r>
+        <w:rPr>
+          <w:lang w:val="es-CO"/>
+        </w:rPr>
+        <w:t>yellow</w:t>
+      </w:r>
+      <w:proofErr w:type="spellEnd"/>
+      <w:r>
+        <w:rPr>
+          <w:lang w:val="es-CO"/>
+        </w:rPr>
+        <w:t xml:space="preserve">”, </w:t>
       </w:r>
       <w:r>
         <w:rPr>
@@ -6001,7 +7071,15 @@
         </w:rPr>
       </w:pPr>
       <w:r>
-        <w:t>“black”-&gt;“green” -&gt; “red” -&gt; “blue” -&gt; “yellow”</w:t>
+        <w:t>“black”-</w:t>
+      </w:r>
+      <w:proofErr w:type="gramStart"/>
+      <w:r>
+        <w:t>&gt;“</w:t>
+      </w:r>
+      <w:proofErr w:type="gramEnd"/>
+      <w:r>
+        <w:t>green” -&gt; “red” -&gt; “blue” -&gt; “yellow”</w:t>
       </w:r>
       <w:r>
         <w:t xml:space="preserve">. </w:t>
@@ -6010,7 +7088,21 @@
         <w:rPr>
           <w:lang w:val="es-CO"/>
         </w:rPr>
-        <w:t>O sea en la si</w:t>
+        <w:t xml:space="preserve">O </w:t>
+      </w:r>
+      <w:proofErr w:type="gramStart"/>
+      <w:r>
+        <w:rPr>
+          <w:lang w:val="es-CO"/>
+        </w:rPr>
+        <w:t>sea</w:t>
+      </w:r>
+      <w:proofErr w:type="gramEnd"/>
+      <w:r>
+        <w:rPr>
+          <w:lang w:val="es-CO"/>
+        </w:rPr>
+        <w:t xml:space="preserve"> en la si</w:t>
       </w:r>
       <w:r>
         <w:rPr>
@@ -6086,8 +7178,37 @@
         <w:rPr>
           <w:lang w:val="es-CO"/>
         </w:rPr>
-        <w:t>Si ahora quiero añadir un color entre “black” y “green”, un color como “</w:t>
-      </w:r>
+        <w:t>Si ahora quiero añadir un color entre “</w:t>
+      </w:r>
+      <w:proofErr w:type="spellStart"/>
+      <w:r>
+        <w:rPr>
+          <w:lang w:val="es-CO"/>
+        </w:rPr>
+        <w:t>black</w:t>
+      </w:r>
+      <w:proofErr w:type="spellEnd"/>
+      <w:r>
+        <w:rPr>
+          <w:lang w:val="es-CO"/>
+        </w:rPr>
+        <w:t>” y “</w:t>
+      </w:r>
+      <w:proofErr w:type="spellStart"/>
+      <w:r>
+        <w:rPr>
+          <w:lang w:val="es-CO"/>
+        </w:rPr>
+        <w:t>green</w:t>
+      </w:r>
+      <w:proofErr w:type="spellEnd"/>
+      <w:r>
+        <w:rPr>
+          <w:lang w:val="es-CO"/>
+        </w:rPr>
+        <w:t>”, un color como “</w:t>
+      </w:r>
+      <w:proofErr w:type="spellStart"/>
       <w:r>
         <w:rPr>
           <w:lang w:val="es-CO"/>
@@ -6098,13 +7219,34 @@
         <w:rPr>
           <w:lang w:val="es-CO"/>
         </w:rPr>
-        <w:t xml:space="preserve">range” (el cuál se tuvo que implementar como un color extra </w:t>
-      </w:r>
-      <w:r>
-        <w:rPr>
-          <w:lang w:val="es-CO"/>
-        </w:rPr>
-        <w:t>en Canvas):</w:t>
+        <w:t>range</w:t>
+      </w:r>
+      <w:proofErr w:type="spellEnd"/>
+      <w:r>
+        <w:rPr>
+          <w:lang w:val="es-CO"/>
+        </w:rPr>
+        <w:t xml:space="preserve">” (el cuál se tuvo que implementar como un color extra </w:t>
+      </w:r>
+      <w:r>
+        <w:rPr>
+          <w:lang w:val="es-CO"/>
+        </w:rPr>
+        <w:t xml:space="preserve">en </w:t>
+      </w:r>
+      <w:proofErr w:type="spellStart"/>
+      <w:r>
+        <w:rPr>
+          <w:lang w:val="es-CO"/>
+        </w:rPr>
+        <w:t>Canvas</w:t>
+      </w:r>
+      <w:proofErr w:type="spellEnd"/>
+      <w:r>
+        <w:rPr>
+          <w:lang w:val="es-CO"/>
+        </w:rPr>
+        <w:t>):</w:t>
       </w:r>
     </w:p>
     <w:p>
@@ -6183,13 +7325,29 @@
         </w:rPr>
       </w:pPr>
       <w:r>
-        <w:t>“black”-&gt;</w:t>
-      </w:r>
-      <w:r>
-        <w:t>”orange” -&gt;</w:t>
-      </w:r>
-      <w:r>
-        <w:t>“green” -&gt; “red” -&gt; “blue” -&gt; “yellow”</w:t>
+        <w:t>“black”-</w:t>
+      </w:r>
+      <w:proofErr w:type="gramStart"/>
+      <w:r>
+        <w:t>&gt;</w:t>
+      </w:r>
+      <w:r>
+        <w:t>”orange</w:t>
+      </w:r>
+      <w:proofErr w:type="gramEnd"/>
+      <w:r>
+        <w:t>” -</w:t>
+      </w:r>
+      <w:proofErr w:type="gramStart"/>
+      <w:r>
+        <w:t>&gt;</w:t>
+      </w:r>
+      <w:r>
+        <w:t>“</w:t>
+      </w:r>
+      <w:proofErr w:type="gramEnd"/>
+      <w:r>
+        <w:t>green” -&gt; “red” -&gt; “blue” -&gt; “yellow”</w:t>
       </w:r>
       <w:r>
         <w:t>:</w:t>
@@ -6276,13 +7434,29 @@
         </w:rPr>
       </w:pPr>
       <w:r>
-        <w:t>“black”-&gt;</w:t>
-      </w:r>
-      <w:r>
-        <w:t>”orange” -&gt;</w:t>
-      </w:r>
-      <w:r>
-        <w:t>“green” -&gt; “red” -&gt; “blue” -&gt; “yellow”</w:t>
+        <w:t>“black”-</w:t>
+      </w:r>
+      <w:proofErr w:type="gramStart"/>
+      <w:r>
+        <w:t>&gt;</w:t>
+      </w:r>
+      <w:r>
+        <w:t>”orange</w:t>
+      </w:r>
+      <w:proofErr w:type="gramEnd"/>
+      <w:r>
+        <w:t>” -</w:t>
+      </w:r>
+      <w:proofErr w:type="gramStart"/>
+      <w:r>
+        <w:t>&gt;</w:t>
+      </w:r>
+      <w:r>
+        <w:t>“</w:t>
+      </w:r>
+      <w:proofErr w:type="gramEnd"/>
+      <w:r>
+        <w:t>green” -&gt; “red” -&gt; “blue” -&gt; “yellow”</w:t>
       </w:r>
       <w:r>
         <w:t>:</w:t>
@@ -6299,13 +7473,27 @@
         <w:rPr>
           <w:lang w:val="es-CO"/>
         </w:rPr>
-        <w:t>Si usamos el método S</w:t>
-      </w:r>
-      <w:r>
-        <w:rPr>
-          <w:lang w:val="es-CO"/>
-        </w:rPr>
-        <w:t>tring[] symbols:</w:t>
+        <w:t xml:space="preserve">Si usamos el método </w:t>
+      </w:r>
+      <w:proofErr w:type="gramStart"/>
+      <w:r>
+        <w:rPr>
+          <w:lang w:val="es-CO"/>
+        </w:rPr>
+        <w:t>S</w:t>
+      </w:r>
+      <w:r>
+        <w:rPr>
+          <w:lang w:val="es-CO"/>
+        </w:rPr>
+        <w:t>tring[</w:t>
+      </w:r>
+      <w:proofErr w:type="gramEnd"/>
+      <w:r>
+        <w:rPr>
+          <w:lang w:val="es-CO"/>
+        </w:rPr>
+        <w:t>] symbols:</w:t>
       </w:r>
     </w:p>
     <w:p>
@@ -6429,7 +7617,35 @@
         <w:rPr>
           <w:lang w:val="es-CO"/>
         </w:rPr>
-        <w:t>Adicionalmente se le añaden los siguiente colores a los colores que permite Canvas:</w:t>
+        <w:t xml:space="preserve">Adicionalmente se le añaden los </w:t>
+      </w:r>
+      <w:proofErr w:type="gramStart"/>
+      <w:r>
+        <w:rPr>
+          <w:lang w:val="es-CO"/>
+        </w:rPr>
+        <w:t>siguiente colores</w:t>
+      </w:r>
+      <w:proofErr w:type="gramEnd"/>
+      <w:r>
+        <w:rPr>
+          <w:lang w:val="es-CO"/>
+        </w:rPr>
+        <w:t xml:space="preserve"> a los colores que permite </w:t>
+      </w:r>
+      <w:proofErr w:type="spellStart"/>
+      <w:r>
+        <w:rPr>
+          <w:lang w:val="es-CO"/>
+        </w:rPr>
+        <w:t>Canvas</w:t>
+      </w:r>
+      <w:proofErr w:type="spellEnd"/>
+      <w:r>
+        <w:rPr>
+          <w:lang w:val="es-CO"/>
+        </w:rPr>
+        <w:t>:</w:t>
       </w:r>
     </w:p>
     <w:p>
@@ -6513,7 +7729,29 @@
         <w:rPr>
           <w:lang w:val="es-CO"/>
         </w:rPr>
-        <w:t>crear delSymbol() en Wheel:</w:t>
+        <w:t xml:space="preserve">crear </w:t>
+      </w:r>
+      <w:proofErr w:type="spellStart"/>
+      <w:proofErr w:type="gramStart"/>
+      <w:r>
+        <w:rPr>
+          <w:lang w:val="es-CO"/>
+        </w:rPr>
+        <w:t>delSymbol</w:t>
+      </w:r>
+      <w:proofErr w:type="spellEnd"/>
+      <w:r>
+        <w:rPr>
+          <w:lang w:val="es-CO"/>
+        </w:rPr>
+        <w:t>(</w:t>
+      </w:r>
+      <w:proofErr w:type="gramEnd"/>
+      <w:r>
+        <w:rPr>
+          <w:lang w:val="es-CO"/>
+        </w:rPr>
+        <w:t>) en Wheel:</w:t>
       </w:r>
     </w:p>
     <w:p>
@@ -6582,7 +7820,51 @@
         <w:rPr>
           <w:lang w:val="es-CO"/>
         </w:rPr>
-        <w:t>Además de implementar delSymbol() en SlotMachine():</w:t>
+        <w:t xml:space="preserve">Además de implementar </w:t>
+      </w:r>
+      <w:proofErr w:type="spellStart"/>
+      <w:proofErr w:type="gramStart"/>
+      <w:r>
+        <w:rPr>
+          <w:lang w:val="es-CO"/>
+        </w:rPr>
+        <w:t>delSymbol</w:t>
+      </w:r>
+      <w:proofErr w:type="spellEnd"/>
+      <w:r>
+        <w:rPr>
+          <w:lang w:val="es-CO"/>
+        </w:rPr>
+        <w:t>(</w:t>
+      </w:r>
+      <w:proofErr w:type="gramEnd"/>
+      <w:r>
+        <w:rPr>
+          <w:lang w:val="es-CO"/>
+        </w:rPr>
+        <w:t xml:space="preserve">) en </w:t>
+      </w:r>
+      <w:proofErr w:type="spellStart"/>
+      <w:proofErr w:type="gramStart"/>
+      <w:r>
+        <w:rPr>
+          <w:lang w:val="es-CO"/>
+        </w:rPr>
+        <w:t>SlotMachine</w:t>
+      </w:r>
+      <w:proofErr w:type="spellEnd"/>
+      <w:r>
+        <w:rPr>
+          <w:lang w:val="es-CO"/>
+        </w:rPr>
+        <w:t>(</w:t>
+      </w:r>
+      <w:proofErr w:type="gramEnd"/>
+      <w:r>
+        <w:rPr>
+          <w:lang w:val="es-CO"/>
+        </w:rPr>
+        <w:t>):</w:t>
       </w:r>
     </w:p>
     <w:p>
@@ -6743,21 +8025,49 @@
         <w:rPr>
           <w:lang w:val="es-CO"/>
         </w:rPr>
-        <w:t>“green” -&gt; “red” –&gt; “blue”:</w:t>
-      </w:r>
-    </w:p>
-    <w:p>
-      <w:pPr>
-        <w:rPr>
-          <w:rFonts w:hint="eastAsia"/>
-          <w:lang w:val="es-CO"/>
-        </w:rPr>
-      </w:pPr>
-      <w:r>
-        <w:rPr>
-          <w:lang w:val="es-CO"/>
-        </w:rPr>
-        <w:t>Si elimino “green”, ambos colores no deberían cambiar:</w:t>
+        <w:t>“</w:t>
+      </w:r>
+      <w:proofErr w:type="spellStart"/>
+      <w:r>
+        <w:rPr>
+          <w:lang w:val="es-CO"/>
+        </w:rPr>
+        <w:t>green</w:t>
+      </w:r>
+      <w:proofErr w:type="spellEnd"/>
+      <w:r>
+        <w:rPr>
+          <w:lang w:val="es-CO"/>
+        </w:rPr>
+        <w:t>” -&gt; “red” –&gt; “blue”:</w:t>
+      </w:r>
+    </w:p>
+    <w:p>
+      <w:pPr>
+        <w:rPr>
+          <w:rFonts w:hint="eastAsia"/>
+          <w:lang w:val="es-CO"/>
+        </w:rPr>
+      </w:pPr>
+      <w:r>
+        <w:rPr>
+          <w:lang w:val="es-CO"/>
+        </w:rPr>
+        <w:t>Si elimino “</w:t>
+      </w:r>
+      <w:proofErr w:type="spellStart"/>
+      <w:r>
+        <w:rPr>
+          <w:lang w:val="es-CO"/>
+        </w:rPr>
+        <w:t>green</w:t>
+      </w:r>
+      <w:proofErr w:type="spellEnd"/>
+      <w:r>
+        <w:rPr>
+          <w:lang w:val="es-CO"/>
+        </w:rPr>
+        <w:t>”, ambos colores no deberían cambiar:</w:t>
       </w:r>
     </w:p>
     <w:p>
@@ -6827,7 +8137,21 @@
           <w:lang w:val="es-CO"/>
         </w:rPr>
         <w:lastRenderedPageBreak/>
-        <w:t>Sin embargo, al hacer spin(), deberían cambiar de colores al color del otro:</w:t>
+        <w:t xml:space="preserve">Sin embargo, al hacer </w:t>
+      </w:r>
+      <w:proofErr w:type="gramStart"/>
+      <w:r>
+        <w:rPr>
+          <w:lang w:val="es-CO"/>
+        </w:rPr>
+        <w:t>spin(</w:t>
+      </w:r>
+      <w:proofErr w:type="gramEnd"/>
+      <w:r>
+        <w:rPr>
+          <w:lang w:val="es-CO"/>
+        </w:rPr>
+        <w:t>), deberían cambiar de colores al color del otro:</w:t>
       </w:r>
     </w:p>
     <w:p>
@@ -6896,7 +8220,21 @@
         <w:rPr>
           <w:lang w:val="es-CO"/>
         </w:rPr>
-        <w:t>Ahora voy a añadir dos colores al final de la lista de colores; “orange” y “cian”</w:t>
+        <w:t>Ahora voy a añadir dos colores al final de la lista de colores; “</w:t>
+      </w:r>
+      <w:proofErr w:type="spellStart"/>
+      <w:r>
+        <w:rPr>
+          <w:lang w:val="es-CO"/>
+        </w:rPr>
+        <w:t>orange</w:t>
+      </w:r>
+      <w:proofErr w:type="spellEnd"/>
+      <w:r>
+        <w:rPr>
+          <w:lang w:val="es-CO"/>
+        </w:rPr>
+        <w:t>” y “cian”</w:t>
       </w:r>
       <w:r>
         <w:rPr>
@@ -6916,7 +8254,21 @@
         <w:rPr>
           <w:lang w:val="es-CO"/>
         </w:rPr>
-        <w:t>“red” -&gt; “blue” -&gt; “orange” -&gt; “cian”</w:t>
+        <w:t>“red” -&gt; “blue” -&gt; “</w:t>
+      </w:r>
+      <w:proofErr w:type="spellStart"/>
+      <w:r>
+        <w:rPr>
+          <w:lang w:val="es-CO"/>
+        </w:rPr>
+        <w:t>orange</w:t>
+      </w:r>
+      <w:proofErr w:type="spellEnd"/>
+      <w:r>
+        <w:rPr>
+          <w:lang w:val="es-CO"/>
+        </w:rPr>
+        <w:t>” -&gt; “cian”</w:t>
       </w:r>
     </w:p>
     <w:p>
@@ -7067,12 +8419,14 @@
           <w:lang w:val="es-CO"/>
         </w:rPr>
       </w:pPr>
+      <w:proofErr w:type="spellStart"/>
       <w:r>
         <w:rPr>
           <w:lang w:val="es-CO"/>
         </w:rPr>
         <w:t>MiniCiclo</w:t>
       </w:r>
+      <w:proofErr w:type="spellEnd"/>
       <w:r>
         <w:rPr>
           <w:lang w:val="es-CO"/>
@@ -7085,24 +8439,28 @@
         </w:rPr>
         <w:t xml:space="preserve"> </w:t>
       </w:r>
+      <w:proofErr w:type="spellStart"/>
       <w:r>
         <w:rPr>
           <w:lang w:val="es-CO"/>
         </w:rPr>
         <w:t>configuration</w:t>
       </w:r>
+      <w:proofErr w:type="spellEnd"/>
       <w:r>
         <w:rPr>
           <w:lang w:val="es-CO"/>
         </w:rPr>
         <w:t>/</w:t>
       </w:r>
+      <w:proofErr w:type="spellStart"/>
       <w:r>
         <w:rPr>
           <w:lang w:val="es-CO"/>
         </w:rPr>
         <w:t>distincSymbols</w:t>
       </w:r>
+      <w:proofErr w:type="spellEnd"/>
       <w:r>
         <w:rPr>
           <w:lang w:val="es-CO"/>
@@ -7139,19 +8497,35 @@
         <w:rPr>
           <w:lang w:val="es-CO"/>
         </w:rPr>
-        <w:t>creando el metodo</w:t>
-      </w:r>
+        <w:t xml:space="preserve">creando el </w:t>
+      </w:r>
+      <w:proofErr w:type="spellStart"/>
+      <w:r>
+        <w:rPr>
+          <w:lang w:val="es-CO"/>
+        </w:rPr>
+        <w:t>metodo</w:t>
+      </w:r>
+      <w:proofErr w:type="spellEnd"/>
       <w:r>
         <w:rPr>
           <w:lang w:val="es-CO"/>
         </w:rPr>
         <w:t xml:space="preserve"> </w:t>
       </w:r>
-      <w:r>
-        <w:rPr>
-          <w:lang w:val="es-CO"/>
-        </w:rPr>
-        <w:t xml:space="preserve">configuration y </w:t>
+      <w:proofErr w:type="spellStart"/>
+      <w:r>
+        <w:rPr>
+          <w:lang w:val="es-CO"/>
+        </w:rPr>
+        <w:t>configuration</w:t>
+      </w:r>
+      <w:proofErr w:type="spellEnd"/>
+      <w:r>
+        <w:rPr>
+          <w:lang w:val="es-CO"/>
+        </w:rPr>
+        <w:t xml:space="preserve"> y </w:t>
       </w:r>
       <w:r>
         <w:rPr>
@@ -7159,11 +8533,19 @@
         </w:rPr>
         <w:t xml:space="preserve">agregando un </w:t>
       </w:r>
-      <w:r>
-        <w:rPr>
-          <w:lang w:val="es-CO"/>
-        </w:rPr>
-        <w:t xml:space="preserve">metodo a </w:t>
+      <w:proofErr w:type="spellStart"/>
+      <w:r>
+        <w:rPr>
+          <w:lang w:val="es-CO"/>
+        </w:rPr>
+        <w:t>metodo</w:t>
+      </w:r>
+      <w:proofErr w:type="spellEnd"/>
+      <w:r>
+        <w:rPr>
+          <w:lang w:val="es-CO"/>
+        </w:rPr>
+        <w:t xml:space="preserve"> a </w:t>
       </w:r>
       <w:r>
         <w:rPr>
@@ -7207,12 +8589,14 @@
         </w:rPr>
         <w:t xml:space="preserve"> </w:t>
       </w:r>
+      <w:proofErr w:type="spellStart"/>
       <w:r>
         <w:rPr>
           <w:lang w:val="es-CO"/>
         </w:rPr>
         <w:t>colorCurrentSymbol</w:t>
       </w:r>
+      <w:proofErr w:type="spellEnd"/>
       <w:r>
         <w:rPr>
           <w:lang w:val="es-CO"/>
@@ -7327,12 +8711,14 @@
         </w:rPr>
         <w:t xml:space="preserve"> en este </w:t>
       </w:r>
+      <w:proofErr w:type="spellStart"/>
       <w:r>
         <w:rPr>
           <w:lang w:val="es-ES"/>
         </w:rPr>
         <w:t>miniciclo</w:t>
       </w:r>
+      <w:proofErr w:type="spellEnd"/>
     </w:p>
     <w:p>
       <w:pPr>
@@ -7377,11 +8763,19 @@
         </w:rPr>
         <w:t xml:space="preserve"> </w:t>
       </w:r>
-      <w:r>
-        <w:rPr>
-          <w:lang w:val="es-ES"/>
-        </w:rPr>
-        <w:t xml:space="preserve">configuration </w:t>
+      <w:proofErr w:type="spellStart"/>
+      <w:r>
+        <w:rPr>
+          <w:lang w:val="es-ES"/>
+        </w:rPr>
+        <w:t>configuration</w:t>
+      </w:r>
+      <w:proofErr w:type="spellEnd"/>
+      <w:r>
+        <w:rPr>
+          <w:lang w:val="es-ES"/>
+        </w:rPr>
+        <w:t xml:space="preserve"> </w:t>
       </w:r>
       <w:r>
         <w:rPr>
@@ -7399,7 +8793,21 @@
         <w:rPr>
           <w:lang w:val="es-ES"/>
         </w:rPr>
-        <w:t xml:space="preserve">los simbolos </w:t>
+        <w:t xml:space="preserve">los </w:t>
+      </w:r>
+      <w:proofErr w:type="spellStart"/>
+      <w:r>
+        <w:rPr>
+          <w:lang w:val="es-ES"/>
+        </w:rPr>
+        <w:t>simbolos</w:t>
+      </w:r>
+      <w:proofErr w:type="spellEnd"/>
+      <w:r>
+        <w:rPr>
+          <w:lang w:val="es-ES"/>
+        </w:rPr>
+        <w:t xml:space="preserve"> </w:t>
       </w:r>
       <w:r>
         <w:rPr>
@@ -7407,11 +8815,19 @@
         </w:rPr>
         <w:t xml:space="preserve">actuales de la </w:t>
       </w:r>
-      <w:r>
-        <w:rPr>
-          <w:lang w:val="es-ES"/>
-        </w:rPr>
-        <w:t xml:space="preserve">Slotmachine </w:t>
+      <w:proofErr w:type="spellStart"/>
+      <w:r>
+        <w:rPr>
+          <w:lang w:val="es-ES"/>
+        </w:rPr>
+        <w:t>Slotmachine</w:t>
+      </w:r>
+      <w:proofErr w:type="spellEnd"/>
+      <w:r>
+        <w:rPr>
+          <w:lang w:val="es-ES"/>
+        </w:rPr>
+        <w:t xml:space="preserve"> </w:t>
       </w:r>
       <w:r>
         <w:rPr>
@@ -7419,11 +8835,19 @@
         </w:rPr>
         <w:t xml:space="preserve">ordenados de </w:t>
       </w:r>
-      <w:r>
-        <w:rPr>
-          <w:lang w:val="es-ES"/>
-        </w:rPr>
-        <w:t>izquiera a derecha</w:t>
+      <w:proofErr w:type="spellStart"/>
+      <w:r>
+        <w:rPr>
+          <w:lang w:val="es-ES"/>
+        </w:rPr>
+        <w:t>izquiera</w:t>
+      </w:r>
+      <w:proofErr w:type="spellEnd"/>
+      <w:r>
+        <w:rPr>
+          <w:lang w:val="es-ES"/>
+        </w:rPr>
+        <w:t xml:space="preserve"> a derecha</w:t>
       </w:r>
     </w:p>
     <w:p>
@@ -7833,12 +9257,14 @@
         </w:rPr>
         <w:t xml:space="preserve"> el cual es </w:t>
       </w:r>
+      <w:proofErr w:type="spellStart"/>
       <w:r>
         <w:rPr>
           <w:lang w:val="es-ES"/>
         </w:rPr>
         <w:t>distinctSymbols</w:t>
       </w:r>
+      <w:proofErr w:type="spellEnd"/>
       <w:r>
         <w:rPr>
           <w:lang w:val="es-ES"/>
@@ -7875,11 +9301,19 @@
         </w:rPr>
         <w:t xml:space="preserve">original es </w:t>
       </w:r>
-      <w:r>
-        <w:rPr>
-          <w:lang w:val="es-ES"/>
-        </w:rPr>
-        <w:t>es K</w:t>
+      <w:proofErr w:type="spellStart"/>
+      <w:r>
+        <w:rPr>
+          <w:lang w:val="es-ES"/>
+        </w:rPr>
+        <w:t>es</w:t>
+      </w:r>
+      <w:proofErr w:type="spellEnd"/>
+      <w:r>
+        <w:rPr>
+          <w:lang w:val="es-ES"/>
+        </w:rPr>
+        <w:t xml:space="preserve"> K</w:t>
       </w:r>
       <w:r>
         <w:rPr>
@@ -7897,7 +9331,21 @@
         <w:rPr>
           <w:lang w:val="es-ES"/>
         </w:rPr>
-        <w:t xml:space="preserve"> de simbolos </w:t>
+        <w:t xml:space="preserve"> de </w:t>
+      </w:r>
+      <w:proofErr w:type="spellStart"/>
+      <w:r>
+        <w:rPr>
+          <w:lang w:val="es-ES"/>
+        </w:rPr>
+        <w:t>simbolos</w:t>
+      </w:r>
+      <w:proofErr w:type="spellEnd"/>
+      <w:r>
+        <w:rPr>
+          <w:lang w:val="es-ES"/>
+        </w:rPr>
+        <w:t xml:space="preserve"> </w:t>
       </w:r>
       <w:r>
         <w:rPr>
@@ -8133,7 +9581,25 @@
           <w:bCs/>
           <w:lang w:val="es-ES"/>
         </w:rPr>
-        <w:t xml:space="preserve"> 8: isJackPot/ Estado Ganador (diseño gráfico)</w:t>
+        <w:t xml:space="preserve"> 8: </w:t>
+      </w:r>
+      <w:proofErr w:type="spellStart"/>
+      <w:r>
+        <w:rPr>
+          <w:b/>
+          <w:bCs/>
+          <w:lang w:val="es-ES"/>
+        </w:rPr>
+        <w:t>isJackPot</w:t>
+      </w:r>
+      <w:proofErr w:type="spellEnd"/>
+      <w:r>
+        <w:rPr>
+          <w:b/>
+          <w:bCs/>
+          <w:lang w:val="es-ES"/>
+        </w:rPr>
+        <w:t>/ Estado Ganador (diseño gráfico)</w:t>
       </w:r>
     </w:p>
     <w:p>
@@ -8159,7 +9625,21 @@
         <w:rPr>
           <w:lang w:val="es-ES"/>
         </w:rPr>
-        <w:t xml:space="preserve"> isJackPot </w:t>
+        <w:t xml:space="preserve"> </w:t>
+      </w:r>
+      <w:proofErr w:type="spellStart"/>
+      <w:r>
+        <w:rPr>
+          <w:lang w:val="es-ES"/>
+        </w:rPr>
+        <w:t>isJackPot</w:t>
+      </w:r>
+      <w:proofErr w:type="spellEnd"/>
+      <w:r>
+        <w:rPr>
+          <w:lang w:val="es-ES"/>
+        </w:rPr>
+        <w:t xml:space="preserve"> </w:t>
       </w:r>
       <w:r>
         <w:rPr>
@@ -8221,12 +9701,14 @@
         </w:rPr>
         <w:t xml:space="preserve"> en </w:t>
       </w:r>
+      <w:proofErr w:type="spellStart"/>
       <w:r>
         <w:rPr>
           <w:lang w:val="es-ES"/>
         </w:rPr>
         <w:t>slotMachine</w:t>
       </w:r>
+      <w:proofErr w:type="spellEnd"/>
       <w:r>
         <w:rPr>
           <w:lang w:val="es-ES"/>
@@ -8370,7 +9852,21 @@
         <w:rPr>
           <w:lang w:val="es-ES"/>
         </w:rPr>
-        <w:t xml:space="preserve">Ahora, cuando pasa eso, slotMachine debe de tener un aspecto </w:t>
+        <w:t xml:space="preserve">Ahora, cuando pasa eso, </w:t>
+      </w:r>
+      <w:proofErr w:type="spellStart"/>
+      <w:r>
+        <w:rPr>
+          <w:lang w:val="es-ES"/>
+        </w:rPr>
+        <w:t>slotMachine</w:t>
+      </w:r>
+      <w:proofErr w:type="spellEnd"/>
+      <w:r>
+        <w:rPr>
+          <w:lang w:val="es-ES"/>
+        </w:rPr>
+        <w:t xml:space="preserve"> debe de tener un aspecto </w:t>
       </w:r>
       <w:r>
         <w:rPr>
@@ -8486,7 +9982,43 @@
         <w:rPr>
           <w:lang w:val="es-ES"/>
         </w:rPr>
-        <w:t xml:space="preserve"> spin(int wheel), </w:t>
+        <w:t xml:space="preserve"> </w:t>
+      </w:r>
+      <w:proofErr w:type="gramStart"/>
+      <w:r>
+        <w:rPr>
+          <w:lang w:val="es-ES"/>
+        </w:rPr>
+        <w:t>spin(</w:t>
+      </w:r>
+      <w:proofErr w:type="spellStart"/>
+      <w:proofErr w:type="gramEnd"/>
+      <w:r>
+        <w:rPr>
+          <w:lang w:val="es-ES"/>
+        </w:rPr>
+        <w:t>int</w:t>
+      </w:r>
+      <w:proofErr w:type="spellEnd"/>
+      <w:r>
+        <w:rPr>
+          <w:lang w:val="es-ES"/>
+        </w:rPr>
+        <w:t xml:space="preserve"> </w:t>
+      </w:r>
+      <w:proofErr w:type="spellStart"/>
+      <w:r>
+        <w:rPr>
+          <w:lang w:val="es-ES"/>
+        </w:rPr>
+        <w:t>wheel</w:t>
+      </w:r>
+      <w:proofErr w:type="spellEnd"/>
+      <w:r>
+        <w:rPr>
+          <w:lang w:val="es-ES"/>
+        </w:rPr>
+        <w:t xml:space="preserve">), </w:t>
       </w:r>
       <w:r>
         <w:rPr>
@@ -8518,11 +10050,19 @@
         </w:rPr>
         <w:t xml:space="preserve">muestre el </w:t>
       </w:r>
-      <w:r>
-        <w:rPr>
-          <w:lang w:val="es-ES"/>
-        </w:rPr>
-        <w:t xml:space="preserve">slotMachine cuando </w:t>
+      <w:proofErr w:type="spellStart"/>
+      <w:r>
+        <w:rPr>
+          <w:lang w:val="es-ES"/>
+        </w:rPr>
+        <w:t>slotMachine</w:t>
+      </w:r>
+      <w:proofErr w:type="spellEnd"/>
+      <w:r>
+        <w:rPr>
+          <w:lang w:val="es-ES"/>
+        </w:rPr>
+        <w:t xml:space="preserve"> cuando </w:t>
       </w:r>
       <w:r>
         <w:rPr>
@@ -8747,7 +10287,64 @@
         <w:rPr>
           <w:lang w:val="es-CO"/>
         </w:rPr>
-        <w:t>Para ello se modifico el metodo spin(int whe</w:t>
+        <w:t xml:space="preserve">Para ello se </w:t>
+      </w:r>
+      <w:proofErr w:type="spellStart"/>
+      <w:r>
+        <w:rPr>
+          <w:lang w:val="es-CO"/>
+        </w:rPr>
+        <w:t>modifico</w:t>
+      </w:r>
+      <w:proofErr w:type="spellEnd"/>
+      <w:r>
+        <w:rPr>
+          <w:lang w:val="es-CO"/>
+        </w:rPr>
+        <w:t xml:space="preserve"> el </w:t>
+      </w:r>
+      <w:proofErr w:type="spellStart"/>
+      <w:r>
+        <w:rPr>
+          <w:lang w:val="es-CO"/>
+        </w:rPr>
+        <w:t>metodo</w:t>
+      </w:r>
+      <w:proofErr w:type="spellEnd"/>
+      <w:r>
+        <w:rPr>
+          <w:lang w:val="es-CO"/>
+        </w:rPr>
+        <w:t xml:space="preserve"> </w:t>
+      </w:r>
+      <w:proofErr w:type="gramStart"/>
+      <w:r>
+        <w:rPr>
+          <w:lang w:val="es-CO"/>
+        </w:rPr>
+        <w:t>spin(</w:t>
+      </w:r>
+      <w:proofErr w:type="spellStart"/>
+      <w:proofErr w:type="gramEnd"/>
+      <w:r>
+        <w:rPr>
+          <w:lang w:val="es-CO"/>
+        </w:rPr>
+        <w:t>int</w:t>
+      </w:r>
+      <w:proofErr w:type="spellEnd"/>
+      <w:r>
+        <w:rPr>
+          <w:lang w:val="es-CO"/>
+        </w:rPr>
+        <w:t xml:space="preserve"> </w:t>
+      </w:r>
+      <w:proofErr w:type="spellStart"/>
+      <w:r>
+        <w:rPr>
+          <w:lang w:val="es-CO"/>
+        </w:rPr>
+        <w:t>whe</w:t>
       </w:r>
       <w:r>
         <w:rPr>
@@ -8759,7 +10356,14 @@
         <w:rPr>
           <w:lang w:val="es-CO"/>
         </w:rPr>
-        <w:t>l):</w:t>
+        <w:t>l</w:t>
+      </w:r>
+      <w:proofErr w:type="spellEnd"/>
+      <w:r>
+        <w:rPr>
+          <w:lang w:val="es-CO"/>
+        </w:rPr>
+        <w:t>):</w:t>
       </w:r>
     </w:p>
     <w:p>
@@ -8773,13 +10377,13 @@
           <w:noProof/>
         </w:rPr>
         <w:drawing>
-          <wp:inline distT="0" distB="0" distL="0" distR="0" wp14:anchorId="7DEB934D" wp14:editId="305373BD">
-            <wp:extent cx="5943600" cy="3048000"/>
+          <wp:inline distT="0" distB="0" distL="0" distR="0" wp14:anchorId="5782EA5D" wp14:editId="00C99A6E">
+            <wp:extent cx="5943600" cy="2324100"/>
             <wp:effectExtent l="0" t="0" r="0" b="0"/>
-            <wp:docPr id="670589384" name="drawing">
+            <wp:docPr id="470132564" name="drawing">
               <a:extLst xmlns:a="http://schemas.openxmlformats.org/drawingml/2006/main">
                 <a:ext uri="{FF2B5EF4-FFF2-40B4-BE49-F238E27FC236}">
-                  <a16:creationId xmlns:a16="http://schemas.microsoft.com/office/drawing/2014/main" id="{C6FD9CA2-F2C8-40C6-8CB3-23F655255B2E}"/>
+                  <a16:creationId xmlns:a16="http://schemas.microsoft.com/office/drawing/2014/main" id="{22C0C7F9-9530-4CE0-ADF4-CD038DC103F3}"/>
                 </a:ext>
               </a:extLst>
             </wp:docPr>
@@ -8790,7 +10394,7 @@
               <a:graphicData uri="http://schemas.openxmlformats.org/drawingml/2006/picture">
                 <pic:pic xmlns:pic="http://schemas.openxmlformats.org/drawingml/2006/picture">
                   <pic:nvPicPr>
-                    <pic:cNvPr id="670589384" name="Picture 670589384"/>
+                    <pic:cNvPr id="470132564" name="Picture 470132564"/>
                     <pic:cNvPicPr/>
                   </pic:nvPicPr>
                   <pic:blipFill>
@@ -8808,7 +10412,7 @@
                   <pic:spPr>
                     <a:xfrm>
                       <a:off x="0" y="0"/>
-                      <a:ext cx="5943600" cy="3048000"/>
+                      <a:ext cx="5943600" cy="2324100"/>
                     </a:xfrm>
                     <a:prstGeom prst="rect">
                       <a:avLst/>
@@ -8844,7 +10448,21 @@
         <w:rPr>
           <w:lang w:val="es-ES"/>
         </w:rPr>
-        <w:t xml:space="preserve"> slotMachine con los mismos </w:t>
+        <w:t xml:space="preserve"> </w:t>
+      </w:r>
+      <w:proofErr w:type="spellStart"/>
+      <w:r>
+        <w:rPr>
+          <w:lang w:val="es-ES"/>
+        </w:rPr>
+        <w:t>slotMachine</w:t>
+      </w:r>
+      <w:proofErr w:type="spellEnd"/>
+      <w:r>
+        <w:rPr>
+          <w:lang w:val="es-ES"/>
+        </w:rPr>
+        <w:t xml:space="preserve"> con los mismos </w:t>
       </w:r>
       <w:r>
         <w:rPr>
@@ -9025,11 +10643,19 @@
         </w:rPr>
         <w:t xml:space="preserve"> </w:t>
       </w:r>
-      <w:r>
-        <w:rPr>
-          <w:lang w:val="es-ES"/>
-        </w:rPr>
-        <w:t xml:space="preserve">if es donde se </w:t>
+      <w:proofErr w:type="spellStart"/>
+      <w:r>
+        <w:rPr>
+          <w:lang w:val="es-ES"/>
+        </w:rPr>
+        <w:t>if</w:t>
+      </w:r>
+      <w:proofErr w:type="spellEnd"/>
+      <w:r>
+        <w:rPr>
+          <w:lang w:val="es-ES"/>
+        </w:rPr>
+        <w:t xml:space="preserve"> es donde se </w:t>
       </w:r>
       <w:r>
         <w:rPr>
@@ -9053,35 +10679,796 @@
       </w:pPr>
     </w:p>
     <w:p>
-      <w:r>
-        <w:rPr>
-          <w:lang w:val="es-ES"/>
-        </w:rPr>
-        <w:t>Mini Ciclo</w:t>
-      </w:r>
-      <w:r>
-        <w:rPr>
-          <w:lang w:val="es-ES"/>
+      <w:pPr>
+        <w:rPr>
+          <w:b/>
+          <w:bCs/>
+          <w:lang w:val="es-ES"/>
+        </w:rPr>
+      </w:pPr>
+      <w:r>
+        <w:rPr>
+          <w:b/>
+          <w:bCs/>
+          <w:lang w:val="es-ES"/>
+        </w:rPr>
+        <w:t>Mini Ciclo 9: ok/</w:t>
+      </w:r>
+      <w:proofErr w:type="spellStart"/>
+      <w:r>
+        <w:rPr>
+          <w:b/>
+          <w:bCs/>
+          <w:lang w:val="es-ES"/>
+        </w:rPr>
+        <w:t>exit</w:t>
+      </w:r>
+      <w:proofErr w:type="spellEnd"/>
+      <w:r>
+        <w:rPr>
+          <w:b/>
+          <w:bCs/>
+          <w:lang w:val="es-ES"/>
+        </w:rPr>
+        <w:t>:</w:t>
+      </w:r>
+    </w:p>
+    <w:p>
+      <w:pPr>
+        <w:rPr>
+          <w:lang w:val="es-ES"/>
+        </w:rPr>
+      </w:pPr>
+    </w:p>
+    <w:p>
+      <w:pPr>
+        <w:rPr>
+          <w:lang w:val="es-CO"/>
+        </w:rPr>
+      </w:pPr>
+      <w:r>
+        <w:rPr>
+          <w:lang w:val="es-CO"/>
+        </w:rPr>
+        <w:t xml:space="preserve">Se crea el </w:t>
+      </w:r>
+      <w:r>
+        <w:rPr>
+          <w:lang w:val="es-CO"/>
+        </w:rPr>
+        <w:t>método</w:t>
+      </w:r>
+      <w:r>
+        <w:rPr>
+          <w:lang w:val="es-CO"/>
         </w:rPr>
         <w:t xml:space="preserve"> </w:t>
       </w:r>
-      <w:r>
-        <w:rPr>
-          <w:lang w:val="es-ES"/>
-        </w:rPr>
-        <w:t>9:</w:t>
-      </w:r>
-    </w:p>
-    <w:p>
-      <w:pPr>
-        <w:rPr>
-          <w:rFonts w:hint="eastAsia"/>
-          <w:lang w:val="es-CO"/>
-        </w:rPr>
-      </w:pPr>
+      <w:proofErr w:type="spellStart"/>
+      <w:r>
+        <w:rPr>
+          <w:lang w:val="es-CO"/>
+        </w:rPr>
+        <w:t>exit</w:t>
+      </w:r>
+      <w:proofErr w:type="spellEnd"/>
+      <w:r>
+        <w:rPr>
+          <w:lang w:val="es-CO"/>
+        </w:rPr>
+        <w:t>,</w:t>
+      </w:r>
+      <w:r>
+        <w:rPr>
+          <w:lang w:val="es-CO"/>
+        </w:rPr>
+        <w:t xml:space="preserve"> es </w:t>
+      </w:r>
+      <w:r>
+        <w:rPr>
+          <w:lang w:val="es-CO"/>
+        </w:rPr>
+        <w:t xml:space="preserve">cuando el </w:t>
+      </w:r>
+      <w:r>
+        <w:rPr>
+          <w:lang w:val="es-CO"/>
+        </w:rPr>
+        <w:t xml:space="preserve">usuario </w:t>
+      </w:r>
+      <w:r>
+        <w:rPr>
+          <w:lang w:val="es-CO"/>
+        </w:rPr>
+        <w:t>desee salir</w:t>
+      </w:r>
+      <w:r>
+        <w:rPr>
+          <w:lang w:val="es-CO"/>
+        </w:rPr>
+        <w:t>:</w:t>
+      </w:r>
+    </w:p>
+    <w:p>
+      <w:r>
+        <w:rPr>
+          <w:noProof/>
+        </w:rPr>
+        <w:drawing>
+          <wp:inline distT="0" distB="0" distL="0" distR="0" wp14:anchorId="2C8AD30B" wp14:editId="2120D4E3">
+            <wp:extent cx="5943600" cy="1152525"/>
+            <wp:effectExtent l="0" t="0" r="0" b="0"/>
+            <wp:docPr id="141245598" name="drawing">
+              <a:extLst xmlns:a="http://schemas.openxmlformats.org/drawingml/2006/main">
+                <a:ext uri="{FF2B5EF4-FFF2-40B4-BE49-F238E27FC236}">
+                  <a16:creationId xmlns:a16="http://schemas.microsoft.com/office/drawing/2014/main" id="{FD5E0F85-F4FD-438C-A786-AB00D139914E}"/>
+                </a:ext>
+              </a:extLst>
+            </wp:docPr>
+            <wp:cNvGraphicFramePr>
+              <a:graphicFrameLocks xmlns:a="http://schemas.openxmlformats.org/drawingml/2006/main" noChangeAspect="1"/>
+            </wp:cNvGraphicFramePr>
+            <a:graphic xmlns:a="http://schemas.openxmlformats.org/drawingml/2006/main">
+              <a:graphicData uri="http://schemas.openxmlformats.org/drawingml/2006/picture">
+                <pic:pic xmlns:pic="http://schemas.openxmlformats.org/drawingml/2006/picture">
+                  <pic:nvPicPr>
+                    <pic:cNvPr id="141245598" name="Picture 141245598"/>
+                    <pic:cNvPicPr/>
+                  </pic:nvPicPr>
+                  <pic:blipFill>
+                    <a:blip r:embed="rId98">
+                      <a:extLst>
+                        <a:ext uri="{28A0092B-C50C-407E-A947-70E740481C1C}">
+                          <a14:useLocalDpi xmlns:a14="http://schemas.microsoft.com/office/drawing/2010/main"/>
+                        </a:ext>
+                      </a:extLst>
+                    </a:blip>
+                    <a:stretch>
+                      <a:fillRect/>
+                    </a:stretch>
+                  </pic:blipFill>
+                  <pic:spPr>
+                    <a:xfrm>
+                      <a:off x="0" y="0"/>
+                      <a:ext cx="5943600" cy="1152525"/>
+                    </a:xfrm>
+                    <a:prstGeom prst="rect">
+                      <a:avLst/>
+                    </a:prstGeom>
+                  </pic:spPr>
+                </pic:pic>
+              </a:graphicData>
+            </a:graphic>
+          </wp:inline>
+        </w:drawing>
+      </w:r>
+      <w:r>
+        <w:rPr>
+          <w:noProof/>
+        </w:rPr>
+        <w:drawing>
+          <wp:inline distT="0" distB="0" distL="0" distR="0" wp14:anchorId="1264C5AE" wp14:editId="48A71F1D">
+            <wp:extent cx="4563112" cy="2314898"/>
+            <wp:effectExtent l="0" t="0" r="0" b="0"/>
+            <wp:docPr id="1694604127" name="drawing">
+              <a:extLst xmlns:a="http://schemas.openxmlformats.org/drawingml/2006/main">
+                <a:ext uri="{FF2B5EF4-FFF2-40B4-BE49-F238E27FC236}">
+                  <a16:creationId xmlns:a16="http://schemas.microsoft.com/office/drawing/2014/main" id="{180DA362-8CC3-4D4D-9F9C-9FD6962EE7C1}"/>
+                </a:ext>
+              </a:extLst>
+            </wp:docPr>
+            <wp:cNvGraphicFramePr>
+              <a:graphicFrameLocks xmlns:a="http://schemas.openxmlformats.org/drawingml/2006/main" noChangeAspect="1"/>
+            </wp:cNvGraphicFramePr>
+            <a:graphic xmlns:a="http://schemas.openxmlformats.org/drawingml/2006/main">
+              <a:graphicData uri="http://schemas.openxmlformats.org/drawingml/2006/picture">
+                <pic:pic xmlns:pic="http://schemas.openxmlformats.org/drawingml/2006/picture">
+                  <pic:nvPicPr>
+                    <pic:cNvPr id="1694604127" name="Picture 1694604127"/>
+                    <pic:cNvPicPr/>
+                  </pic:nvPicPr>
+                  <pic:blipFill>
+                    <a:blip r:embed="rId99">
+                      <a:extLst>
+                        <a:ext uri="{28A0092B-C50C-407E-A947-70E740481C1C}">
+                          <a14:useLocalDpi xmlns:a14="http://schemas.microsoft.com/office/drawing/2010/main"/>
+                        </a:ext>
+                      </a:extLst>
+                    </a:blip>
+                    <a:stretch>
+                      <a:fillRect/>
+                    </a:stretch>
+                  </pic:blipFill>
+                  <pic:spPr>
+                    <a:xfrm>
+                      <a:off x="0" y="0"/>
+                      <a:ext cx="4563112" cy="2314898"/>
+                    </a:xfrm>
+                    <a:prstGeom prst="rect">
+                      <a:avLst/>
+                    </a:prstGeom>
+                  </pic:spPr>
+                </pic:pic>
+              </a:graphicData>
+            </a:graphic>
+          </wp:inline>
+        </w:drawing>
+      </w:r>
+    </w:p>
+    <w:p>
+      <w:r>
+        <w:rPr>
+          <w:noProof/>
+        </w:rPr>
+        <w:lastRenderedPageBreak/>
+        <w:drawing>
+          <wp:inline distT="0" distB="0" distL="0" distR="0" wp14:anchorId="065314C5" wp14:editId="06CA1187">
+            <wp:extent cx="2600688" cy="3753374"/>
+            <wp:effectExtent l="0" t="0" r="0" b="0"/>
+            <wp:docPr id="594188376" name="drawing">
+              <a:extLst xmlns:a="http://schemas.openxmlformats.org/drawingml/2006/main">
+                <a:ext uri="{FF2B5EF4-FFF2-40B4-BE49-F238E27FC236}">
+                  <a16:creationId xmlns:a16="http://schemas.microsoft.com/office/drawing/2014/main" id="{ABC0A61D-DEFC-4869-91AB-4ACFEA257D6D}"/>
+                </a:ext>
+              </a:extLst>
+            </wp:docPr>
+            <wp:cNvGraphicFramePr>
+              <a:graphicFrameLocks xmlns:a="http://schemas.openxmlformats.org/drawingml/2006/main" noChangeAspect="1"/>
+            </wp:cNvGraphicFramePr>
+            <a:graphic xmlns:a="http://schemas.openxmlformats.org/drawingml/2006/main">
+              <a:graphicData uri="http://schemas.openxmlformats.org/drawingml/2006/picture">
+                <pic:pic xmlns:pic="http://schemas.openxmlformats.org/drawingml/2006/picture">
+                  <pic:nvPicPr>
+                    <pic:cNvPr id="594188376" name="Picture 594188376"/>
+                    <pic:cNvPicPr/>
+                  </pic:nvPicPr>
+                  <pic:blipFill>
+                    <a:blip r:embed="rId100">
+                      <a:extLst>
+                        <a:ext uri="{28A0092B-C50C-407E-A947-70E740481C1C}">
+                          <a14:useLocalDpi xmlns:a14="http://schemas.microsoft.com/office/drawing/2010/main"/>
+                        </a:ext>
+                      </a:extLst>
+                    </a:blip>
+                    <a:stretch>
+                      <a:fillRect/>
+                    </a:stretch>
+                  </pic:blipFill>
+                  <pic:spPr>
+                    <a:xfrm>
+                      <a:off x="0" y="0"/>
+                      <a:ext cx="2600688" cy="3753374"/>
+                    </a:xfrm>
+                    <a:prstGeom prst="rect">
+                      <a:avLst/>
+                    </a:prstGeom>
+                  </pic:spPr>
+                </pic:pic>
+              </a:graphicData>
+            </a:graphic>
+          </wp:inline>
+        </w:drawing>
+      </w:r>
+    </w:p>
+    <w:p>
+      <w:r>
+        <w:rPr>
+          <w:noProof/>
+        </w:rPr>
+        <w:drawing>
+          <wp:inline distT="0" distB="0" distL="0" distR="0" wp14:anchorId="79315498" wp14:editId="16C72B11">
+            <wp:extent cx="2629267" cy="1228896"/>
+            <wp:effectExtent l="0" t="0" r="0" b="0"/>
+            <wp:docPr id="1033831509" name="drawing">
+              <a:extLst xmlns:a="http://schemas.openxmlformats.org/drawingml/2006/main">
+                <a:ext uri="{FF2B5EF4-FFF2-40B4-BE49-F238E27FC236}">
+                  <a16:creationId xmlns:a16="http://schemas.microsoft.com/office/drawing/2014/main" id="{08638604-F95F-4BAF-AE35-95EEB364061F}"/>
+                </a:ext>
+              </a:extLst>
+            </wp:docPr>
+            <wp:cNvGraphicFramePr>
+              <a:graphicFrameLocks xmlns:a="http://schemas.openxmlformats.org/drawingml/2006/main" noChangeAspect="1"/>
+            </wp:cNvGraphicFramePr>
+            <a:graphic xmlns:a="http://schemas.openxmlformats.org/drawingml/2006/main">
+              <a:graphicData uri="http://schemas.openxmlformats.org/drawingml/2006/picture">
+                <pic:pic xmlns:pic="http://schemas.openxmlformats.org/drawingml/2006/picture">
+                  <pic:nvPicPr>
+                    <pic:cNvPr id="1033831509" name="Picture 1033831509"/>
+                    <pic:cNvPicPr/>
+                  </pic:nvPicPr>
+                  <pic:blipFill>
+                    <a:blip r:embed="rId101">
+                      <a:extLst>
+                        <a:ext uri="{28A0092B-C50C-407E-A947-70E740481C1C}">
+                          <a14:useLocalDpi xmlns:a14="http://schemas.microsoft.com/office/drawing/2010/main"/>
+                        </a:ext>
+                      </a:extLst>
+                    </a:blip>
+                    <a:stretch>
+                      <a:fillRect/>
+                    </a:stretch>
+                  </pic:blipFill>
+                  <pic:spPr>
+                    <a:xfrm>
+                      <a:off x="0" y="0"/>
+                      <a:ext cx="2629267" cy="1228896"/>
+                    </a:xfrm>
+                    <a:prstGeom prst="rect">
+                      <a:avLst/>
+                    </a:prstGeom>
+                  </pic:spPr>
+                </pic:pic>
+              </a:graphicData>
+            </a:graphic>
+          </wp:inline>
+        </w:drawing>
+      </w:r>
+    </w:p>
+    <w:p>
+      <w:r>
+        <w:rPr>
+          <w:noProof/>
+        </w:rPr>
+        <w:lastRenderedPageBreak/>
+        <w:drawing>
+          <wp:inline distT="0" distB="0" distL="0" distR="0" wp14:anchorId="161D0A6A" wp14:editId="62ED4944">
+            <wp:extent cx="5943600" cy="3505200"/>
+            <wp:effectExtent l="0" t="0" r="0" b="0"/>
+            <wp:docPr id="1023070029" name="drawing">
+              <a:extLst xmlns:a="http://schemas.openxmlformats.org/drawingml/2006/main">
+                <a:ext uri="{FF2B5EF4-FFF2-40B4-BE49-F238E27FC236}">
+                  <a16:creationId xmlns:a16="http://schemas.microsoft.com/office/drawing/2014/main" id="{CE8C4BFB-7496-4DCC-B3FE-33899B379883}"/>
+                </a:ext>
+              </a:extLst>
+            </wp:docPr>
+            <wp:cNvGraphicFramePr>
+              <a:graphicFrameLocks xmlns:a="http://schemas.openxmlformats.org/drawingml/2006/main" noChangeAspect="1"/>
+            </wp:cNvGraphicFramePr>
+            <a:graphic xmlns:a="http://schemas.openxmlformats.org/drawingml/2006/main">
+              <a:graphicData uri="http://schemas.openxmlformats.org/drawingml/2006/picture">
+                <pic:pic xmlns:pic="http://schemas.openxmlformats.org/drawingml/2006/picture">
+                  <pic:nvPicPr>
+                    <pic:cNvPr id="1023070029" name="Picture 1023070029"/>
+                    <pic:cNvPicPr/>
+                  </pic:nvPicPr>
+                  <pic:blipFill>
+                    <a:blip r:embed="rId102">
+                      <a:extLst>
+                        <a:ext uri="{28A0092B-C50C-407E-A947-70E740481C1C}">
+                          <a14:useLocalDpi xmlns:a14="http://schemas.microsoft.com/office/drawing/2010/main"/>
+                        </a:ext>
+                      </a:extLst>
+                    </a:blip>
+                    <a:stretch>
+                      <a:fillRect/>
+                    </a:stretch>
+                  </pic:blipFill>
+                  <pic:spPr>
+                    <a:xfrm>
+                      <a:off x="0" y="0"/>
+                      <a:ext cx="5943600" cy="3505200"/>
+                    </a:xfrm>
+                    <a:prstGeom prst="rect">
+                      <a:avLst/>
+                    </a:prstGeom>
+                  </pic:spPr>
+                </pic:pic>
+              </a:graphicData>
+            </a:graphic>
+          </wp:inline>
+        </w:drawing>
+      </w:r>
+    </w:p>
+    <w:p/>
+    <w:p/>
+    <w:p>
+      <w:pPr>
+        <w:rPr>
+          <w:lang w:val="es-CO"/>
+        </w:rPr>
+      </w:pPr>
+      <w:r>
+        <w:rPr>
+          <w:lang w:val="es-ES"/>
+        </w:rPr>
+        <w:t>Luego, s</w:t>
+      </w:r>
+      <w:r>
+        <w:rPr>
+          <w:lang w:val="es-ES"/>
+        </w:rPr>
+        <w:t xml:space="preserve">e crea el </w:t>
+      </w:r>
+      <w:r>
+        <w:rPr>
+          <w:lang w:val="es-ES"/>
+        </w:rPr>
+        <w:t>método</w:t>
+      </w:r>
+      <w:r>
+        <w:rPr>
+          <w:lang w:val="es-ES"/>
+        </w:rPr>
+        <w:t xml:space="preserve"> </w:t>
+      </w:r>
+      <w:proofErr w:type="gramStart"/>
+      <w:r>
+        <w:rPr>
+          <w:lang w:val="es-ES"/>
+        </w:rPr>
+        <w:t>ok(</w:t>
+      </w:r>
+      <w:proofErr w:type="gramEnd"/>
+      <w:r>
+        <w:rPr>
+          <w:lang w:val="es-ES"/>
+        </w:rPr>
+        <w:t xml:space="preserve">), el cual se encarga de verificar ciertas acciones </w:t>
+      </w:r>
+      <w:proofErr w:type="spellStart"/>
+      <w:r>
+        <w:rPr>
+          <w:lang w:val="es-ES"/>
+        </w:rPr>
+        <w:t>especificas</w:t>
+      </w:r>
+      <w:proofErr w:type="spellEnd"/>
+      <w:r>
+        <w:rPr>
+          <w:lang w:val="es-ES"/>
+        </w:rPr>
+        <w:t xml:space="preserve"> se </w:t>
+      </w:r>
+      <w:r>
+        <w:rPr>
+          <w:lang w:val="es-ES"/>
+        </w:rPr>
+        <w:t xml:space="preserve">pueden </w:t>
+      </w:r>
+      <w:r>
+        <w:rPr>
+          <w:lang w:val="es-ES"/>
+        </w:rPr>
+        <w:t>realizar</w:t>
+      </w:r>
+      <w:r>
+        <w:rPr>
+          <w:lang w:val="es-ES"/>
+        </w:rPr>
+        <w:t>,</w:t>
+      </w:r>
+      <w:r>
+        <w:rPr>
+          <w:lang w:val="es-ES"/>
+        </w:rPr>
+        <w:t xml:space="preserve"> las que encontramos son, que el </w:t>
+      </w:r>
+      <w:r>
+        <w:rPr>
+          <w:lang w:val="es-ES"/>
+        </w:rPr>
+        <w:t xml:space="preserve">usuario no puede </w:t>
+      </w:r>
+      <w:r>
+        <w:rPr>
+          <w:lang w:val="es-ES"/>
+        </w:rPr>
+        <w:t>eliminar</w:t>
+      </w:r>
+      <w:r>
+        <w:rPr>
+          <w:lang w:val="es-ES"/>
+        </w:rPr>
+        <w:t xml:space="preserve"> </w:t>
+      </w:r>
+      <w:r>
+        <w:rPr>
+          <w:lang w:val="es-ES"/>
+        </w:rPr>
+        <w:t xml:space="preserve">un </w:t>
+      </w:r>
+      <w:r>
+        <w:rPr>
+          <w:lang w:val="es-ES"/>
+        </w:rPr>
+        <w:t>símbolo</w:t>
+      </w:r>
+      <w:r>
+        <w:rPr>
+          <w:lang w:val="es-ES"/>
+        </w:rPr>
+        <w:t xml:space="preserve"> </w:t>
+      </w:r>
+      <w:r>
+        <w:rPr>
+          <w:lang w:val="es-ES"/>
+        </w:rPr>
+        <w:t xml:space="preserve">o una rueda </w:t>
+      </w:r>
+      <w:r>
+        <w:rPr>
+          <w:lang w:val="es-ES"/>
+        </w:rPr>
+        <w:t xml:space="preserve">si solamente hay </w:t>
+      </w:r>
+      <w:r>
+        <w:rPr>
+          <w:lang w:val="es-ES"/>
+        </w:rPr>
+        <w:t xml:space="preserve">2 </w:t>
+      </w:r>
+      <w:r>
+        <w:rPr>
+          <w:lang w:val="es-ES"/>
+        </w:rPr>
+        <w:t xml:space="preserve">ruedas o 2 </w:t>
+      </w:r>
+      <w:proofErr w:type="spellStart"/>
+      <w:r>
+        <w:rPr>
+          <w:lang w:val="es-ES"/>
+        </w:rPr>
+        <w:t>simbolos</w:t>
+      </w:r>
+      <w:proofErr w:type="spellEnd"/>
+      <w:r>
+        <w:rPr>
+          <w:lang w:val="es-ES"/>
+        </w:rPr>
+        <w:t xml:space="preserve">, y tampoco puede </w:t>
+      </w:r>
+      <w:r>
+        <w:rPr>
+          <w:lang w:val="es-ES"/>
+        </w:rPr>
+        <w:t xml:space="preserve">agregarse </w:t>
+      </w:r>
+      <w:proofErr w:type="spellStart"/>
+      <w:r>
+        <w:rPr>
+          <w:lang w:val="es-ES"/>
+        </w:rPr>
+        <w:t>mas</w:t>
+      </w:r>
+      <w:proofErr w:type="spellEnd"/>
+      <w:r>
+        <w:rPr>
+          <w:lang w:val="es-ES"/>
+        </w:rPr>
+        <w:t xml:space="preserve"> de 50 </w:t>
+      </w:r>
+      <w:r>
+        <w:rPr>
+          <w:lang w:val="es-ES"/>
+        </w:rPr>
+        <w:t>ruedas</w:t>
+      </w:r>
+      <w:r>
+        <w:rPr>
+          <w:lang w:val="es-ES"/>
+        </w:rPr>
+        <w:t xml:space="preserve">, entonces: </w:t>
+      </w:r>
+    </w:p>
+    <w:p>
+      <w:r>
+        <w:rPr>
+          <w:noProof/>
+        </w:rPr>
+        <w:lastRenderedPageBreak/>
+        <w:drawing>
+          <wp:inline distT="0" distB="0" distL="0" distR="0" wp14:anchorId="7F2517FE" wp14:editId="29FC2488">
+            <wp:extent cx="5943600" cy="2085975"/>
+            <wp:effectExtent l="0" t="0" r="0" b="0"/>
+            <wp:docPr id="713306353" name="drawing">
+              <a:extLst xmlns:a="http://schemas.openxmlformats.org/drawingml/2006/main">
+                <a:ext uri="{FF2B5EF4-FFF2-40B4-BE49-F238E27FC236}">
+                  <a16:creationId xmlns:a16="http://schemas.microsoft.com/office/drawing/2014/main" id="{D8E4551E-4B25-4CBB-A54F-328242A2F1AD}"/>
+                </a:ext>
+              </a:extLst>
+            </wp:docPr>
+            <wp:cNvGraphicFramePr>
+              <a:graphicFrameLocks xmlns:a="http://schemas.openxmlformats.org/drawingml/2006/main" noChangeAspect="1"/>
+            </wp:cNvGraphicFramePr>
+            <a:graphic xmlns:a="http://schemas.openxmlformats.org/drawingml/2006/main">
+              <a:graphicData uri="http://schemas.openxmlformats.org/drawingml/2006/picture">
+                <pic:pic xmlns:pic="http://schemas.openxmlformats.org/drawingml/2006/picture">
+                  <pic:nvPicPr>
+                    <pic:cNvPr id="713306353" name="Picture 713306353"/>
+                    <pic:cNvPicPr/>
+                  </pic:nvPicPr>
+                  <pic:blipFill>
+                    <a:blip r:embed="rId103">
+                      <a:extLst>
+                        <a:ext uri="{28A0092B-C50C-407E-A947-70E740481C1C}">
+                          <a14:useLocalDpi xmlns:a14="http://schemas.microsoft.com/office/drawing/2010/main"/>
+                        </a:ext>
+                      </a:extLst>
+                    </a:blip>
+                    <a:stretch>
+                      <a:fillRect/>
+                    </a:stretch>
+                  </pic:blipFill>
+                  <pic:spPr>
+                    <a:xfrm>
+                      <a:off x="0" y="0"/>
+                      <a:ext cx="5943600" cy="2085975"/>
+                    </a:xfrm>
+                    <a:prstGeom prst="rect">
+                      <a:avLst/>
+                    </a:prstGeom>
+                  </pic:spPr>
+                </pic:pic>
+              </a:graphicData>
+            </a:graphic>
+          </wp:inline>
+        </w:drawing>
+      </w:r>
+      <w:r>
+        <w:rPr>
+          <w:noProof/>
+        </w:rPr>
+        <w:drawing>
+          <wp:inline distT="0" distB="0" distL="0" distR="0" wp14:anchorId="2EE6EC1D" wp14:editId="7FE30E8C">
+            <wp:extent cx="5943600" cy="2114550"/>
+            <wp:effectExtent l="0" t="0" r="0" b="0"/>
+            <wp:docPr id="1897685842" name="drawing">
+              <a:extLst xmlns:a="http://schemas.openxmlformats.org/drawingml/2006/main">
+                <a:ext uri="{FF2B5EF4-FFF2-40B4-BE49-F238E27FC236}">
+                  <a16:creationId xmlns:a16="http://schemas.microsoft.com/office/drawing/2014/main" id="{0C30189F-90C2-48B0-A1E0-9D1FC1BDFBC8}"/>
+                </a:ext>
+              </a:extLst>
+            </wp:docPr>
+            <wp:cNvGraphicFramePr>
+              <a:graphicFrameLocks xmlns:a="http://schemas.openxmlformats.org/drawingml/2006/main" noChangeAspect="1"/>
+            </wp:cNvGraphicFramePr>
+            <a:graphic xmlns:a="http://schemas.openxmlformats.org/drawingml/2006/main">
+              <a:graphicData uri="http://schemas.openxmlformats.org/drawingml/2006/picture">
+                <pic:pic xmlns:pic="http://schemas.openxmlformats.org/drawingml/2006/picture">
+                  <pic:nvPicPr>
+                    <pic:cNvPr id="1897685842" name="Picture 1897685842"/>
+                    <pic:cNvPicPr/>
+                  </pic:nvPicPr>
+                  <pic:blipFill>
+                    <a:blip r:embed="rId104">
+                      <a:extLst>
+                        <a:ext uri="{28A0092B-C50C-407E-A947-70E740481C1C}">
+                          <a14:useLocalDpi xmlns:a14="http://schemas.microsoft.com/office/drawing/2010/main"/>
+                        </a:ext>
+                      </a:extLst>
+                    </a:blip>
+                    <a:stretch>
+                      <a:fillRect/>
+                    </a:stretch>
+                  </pic:blipFill>
+                  <pic:spPr>
+                    <a:xfrm>
+                      <a:off x="0" y="0"/>
+                      <a:ext cx="5943600" cy="2114550"/>
+                    </a:xfrm>
+                    <a:prstGeom prst="rect">
+                      <a:avLst/>
+                    </a:prstGeom>
+                  </pic:spPr>
+                </pic:pic>
+              </a:graphicData>
+            </a:graphic>
+          </wp:inline>
+        </w:drawing>
+      </w:r>
+      <w:r>
+        <w:rPr>
+          <w:noProof/>
+        </w:rPr>
+        <w:lastRenderedPageBreak/>
+        <w:drawing>
+          <wp:inline distT="0" distB="0" distL="0" distR="0" wp14:anchorId="0F63920C" wp14:editId="2D257EDA">
+            <wp:extent cx="5943600" cy="3571875"/>
+            <wp:effectExtent l="0" t="0" r="0" b="0"/>
+            <wp:docPr id="708715109" name="drawing">
+              <a:extLst xmlns:a="http://schemas.openxmlformats.org/drawingml/2006/main">
+                <a:ext uri="{FF2B5EF4-FFF2-40B4-BE49-F238E27FC236}">
+                  <a16:creationId xmlns:a16="http://schemas.microsoft.com/office/drawing/2014/main" id="{0BC4C4D9-9CA2-45B0-8DF1-E918ABDAC972}"/>
+                </a:ext>
+              </a:extLst>
+            </wp:docPr>
+            <wp:cNvGraphicFramePr>
+              <a:graphicFrameLocks xmlns:a="http://schemas.openxmlformats.org/drawingml/2006/main" noChangeAspect="1"/>
+            </wp:cNvGraphicFramePr>
+            <a:graphic xmlns:a="http://schemas.openxmlformats.org/drawingml/2006/main">
+              <a:graphicData uri="http://schemas.openxmlformats.org/drawingml/2006/picture">
+                <pic:pic xmlns:pic="http://schemas.openxmlformats.org/drawingml/2006/picture">
+                  <pic:nvPicPr>
+                    <pic:cNvPr id="708715109" name="Picture 708715109"/>
+                    <pic:cNvPicPr/>
+                  </pic:nvPicPr>
+                  <pic:blipFill>
+                    <a:blip r:embed="rId105">
+                      <a:extLst>
+                        <a:ext uri="{28A0092B-C50C-407E-A947-70E740481C1C}">
+                          <a14:useLocalDpi xmlns:a14="http://schemas.microsoft.com/office/drawing/2010/main"/>
+                        </a:ext>
+                      </a:extLst>
+                    </a:blip>
+                    <a:stretch>
+                      <a:fillRect/>
+                    </a:stretch>
+                  </pic:blipFill>
+                  <pic:spPr>
+                    <a:xfrm>
+                      <a:off x="0" y="0"/>
+                      <a:ext cx="5943600" cy="3571875"/>
+                    </a:xfrm>
+                    <a:prstGeom prst="rect">
+                      <a:avLst/>
+                    </a:prstGeom>
+                  </pic:spPr>
+                </pic:pic>
+              </a:graphicData>
+            </a:graphic>
+          </wp:inline>
+        </w:drawing>
+      </w:r>
+      <w:r>
+        <w:t xml:space="preserve"> </w:t>
+      </w:r>
+    </w:p>
+    <w:p>
+      <w:r>
+        <w:rPr>
+          <w:noProof/>
+        </w:rPr>
+        <w:drawing>
+          <wp:inline distT="0" distB="0" distL="0" distR="0" wp14:anchorId="7CBEFE48" wp14:editId="79470B6C">
+            <wp:extent cx="5943600" cy="3543300"/>
+            <wp:effectExtent l="0" t="0" r="0" b="0"/>
+            <wp:docPr id="1901986787" name="drawing">
+              <a:extLst xmlns:a="http://schemas.openxmlformats.org/drawingml/2006/main">
+                <a:ext uri="{FF2B5EF4-FFF2-40B4-BE49-F238E27FC236}">
+                  <a16:creationId xmlns:a16="http://schemas.microsoft.com/office/drawing/2014/main" id="{36683DE7-E0C1-4C34-ACFD-BC5D05AF216B}"/>
+                </a:ext>
+              </a:extLst>
+            </wp:docPr>
+            <wp:cNvGraphicFramePr>
+              <a:graphicFrameLocks xmlns:a="http://schemas.openxmlformats.org/drawingml/2006/main" noChangeAspect="1"/>
+            </wp:cNvGraphicFramePr>
+            <a:graphic xmlns:a="http://schemas.openxmlformats.org/drawingml/2006/main">
+              <a:graphicData uri="http://schemas.openxmlformats.org/drawingml/2006/picture">
+                <pic:pic xmlns:pic="http://schemas.openxmlformats.org/drawingml/2006/picture">
+                  <pic:nvPicPr>
+                    <pic:cNvPr id="1901986787" name="Picture 1901986787"/>
+                    <pic:cNvPicPr/>
+                  </pic:nvPicPr>
+                  <pic:blipFill>
+                    <a:blip r:embed="rId106">
+                      <a:extLst>
+                        <a:ext uri="{28A0092B-C50C-407E-A947-70E740481C1C}">
+                          <a14:useLocalDpi xmlns:a14="http://schemas.microsoft.com/office/drawing/2010/main"/>
+                        </a:ext>
+                      </a:extLst>
+                    </a:blip>
+                    <a:stretch>
+                      <a:fillRect/>
+                    </a:stretch>
+                  </pic:blipFill>
+                  <pic:spPr>
+                    <a:xfrm>
+                      <a:off x="0" y="0"/>
+                      <a:ext cx="5943600" cy="3543300"/>
+                    </a:xfrm>
+                    <a:prstGeom prst="rect">
+                      <a:avLst/>
+                    </a:prstGeom>
+                  </pic:spPr>
+                </pic:pic>
+              </a:graphicData>
+            </a:graphic>
+          </wp:inline>
+        </w:drawing>
+      </w:r>
     </w:p>
     <w:sectPr>
-      <w:headerReference w:type="default" r:id="rId98"/>
+      <w:headerReference w:type="default" r:id="rId107"/>
       <w:pgSz w:w="12240" w:h="15840"/>
       <w:pgMar w:top="1440" w:right="1440" w:bottom="1440" w:left="1440" w:header="720" w:footer="720" w:gutter="0"/>
       <w:cols w:space="720"/>

</xml_diff>

<commit_message>
Added last updates for animations
</commit_message>
<xml_diff>
--- a/Primer Ciclo/Primer Ciclo.docx
+++ b/Primer Ciclo/Primer Ciclo.docx
@@ -262,55 +262,48 @@
     <w:p>
       <w:pPr>
         <w:rPr>
-          <w:rFonts w:hint="eastAsia"/>
-          <w:lang w:val="es-CO"/>
-        </w:rPr>
-      </w:pPr>
-    </w:p>
-    <w:p>
-      <w:pPr>
-        <w:rPr>
-          <w:rFonts w:hint="eastAsia"/>
-          <w:lang w:val="es-CO"/>
-        </w:rPr>
-      </w:pPr>
-    </w:p>
-    <w:p>
-      <w:pPr>
-        <w:rPr>
-          <w:rFonts w:hint="eastAsia"/>
-          <w:lang w:val="es-CO"/>
-        </w:rPr>
-      </w:pPr>
-    </w:p>
-    <w:p>
-      <w:pPr>
-        <w:rPr>
-          <w:rFonts w:hint="eastAsia"/>
-          <w:lang w:val="es-CO"/>
-        </w:rPr>
-      </w:pPr>
-    </w:p>
-    <w:p>
-      <w:pPr>
-        <w:rPr>
-          <w:rFonts w:hint="eastAsia"/>
-          <w:lang w:val="es-CO"/>
-        </w:rPr>
-      </w:pPr>
-    </w:p>
-    <w:p>
-      <w:pPr>
-        <w:rPr>
-          <w:rFonts w:hint="eastAsia"/>
-          <w:lang w:val="es-CO"/>
-        </w:rPr>
-      </w:pPr>
-    </w:p>
-    <w:p>
-      <w:pPr>
-        <w:rPr>
-          <w:rFonts w:hint="eastAsia"/>
+          <w:lang w:val="es-CO"/>
+        </w:rPr>
+      </w:pPr>
+    </w:p>
+    <w:p>
+      <w:pPr>
+        <w:rPr>
+          <w:lang w:val="es-CO"/>
+        </w:rPr>
+      </w:pPr>
+    </w:p>
+    <w:p>
+      <w:pPr>
+        <w:rPr>
+          <w:lang w:val="es-CO"/>
+        </w:rPr>
+      </w:pPr>
+    </w:p>
+    <w:p>
+      <w:pPr>
+        <w:rPr>
+          <w:lang w:val="es-CO"/>
+        </w:rPr>
+      </w:pPr>
+    </w:p>
+    <w:p>
+      <w:pPr>
+        <w:rPr>
+          <w:lang w:val="es-CO"/>
+        </w:rPr>
+      </w:pPr>
+    </w:p>
+    <w:p>
+      <w:pPr>
+        <w:rPr>
+          <w:lang w:val="es-CO"/>
+        </w:rPr>
+      </w:pPr>
+    </w:p>
+    <w:p>
+      <w:pPr>
+        <w:rPr>
           <w:b/>
           <w:bCs/>
           <w:lang w:val="es-CO"/>
@@ -322,6 +315,7 @@
           <w:bCs/>
           <w:lang w:val="es-CO"/>
         </w:rPr>
+        <w:lastRenderedPageBreak/>
         <w:t>MiniCiclo 1:</w:t>
       </w:r>
       <w:r>
@@ -352,7 +346,6 @@
     <w:p>
       <w:pPr>
         <w:rPr>
-          <w:rFonts w:hint="eastAsia"/>
           <w:lang w:val="es-CO"/>
         </w:rPr>
       </w:pPr>
@@ -372,7 +365,6 @@
     <w:p>
       <w:pPr>
         <w:rPr>
-          <w:rFonts w:hint="eastAsia"/>
           <w:lang w:val="es-CO"/>
         </w:rPr>
       </w:pPr>
@@ -386,7 +378,6 @@
     <w:p>
       <w:pPr>
         <w:rPr>
-          <w:rFonts w:hint="eastAsia"/>
           <w:lang w:val="es-CO"/>
         </w:rPr>
       </w:pPr>
@@ -441,7 +432,6 @@
     <w:p>
       <w:pPr>
         <w:rPr>
-          <w:rFonts w:hint="eastAsia"/>
           <w:lang w:val="es-CO"/>
         </w:rPr>
       </w:pPr>
@@ -455,7 +445,6 @@
     <w:p>
       <w:pPr>
         <w:rPr>
-          <w:rFonts w:hint="eastAsia"/>
           <w:lang w:val="es-CO"/>
         </w:rPr>
       </w:pPr>
@@ -510,7 +499,6 @@
     <w:p>
       <w:pPr>
         <w:rPr>
-          <w:rFonts w:hint="eastAsia"/>
           <w:lang w:val="es-CO"/>
         </w:rPr>
       </w:pPr>
@@ -524,15 +512,13 @@
     <w:p>
       <w:pPr>
         <w:rPr>
-          <w:rFonts w:hint="eastAsia"/>
-          <w:lang w:val="es-CO"/>
-        </w:rPr>
-      </w:pPr>
-    </w:p>
-    <w:p>
-      <w:pPr>
-        <w:rPr>
-          <w:rFonts w:hint="eastAsia"/>
+          <w:lang w:val="es-CO"/>
+        </w:rPr>
+      </w:pPr>
+    </w:p>
+    <w:p>
+      <w:pPr>
+        <w:rPr>
           <w:lang w:val="es-CO"/>
         </w:rPr>
       </w:pPr>
@@ -552,7 +538,6 @@
     <w:p>
       <w:pPr>
         <w:rPr>
-          <w:rFonts w:hint="eastAsia"/>
           <w:lang w:val="es-CO"/>
         </w:rPr>
       </w:pPr>
@@ -607,15 +592,13 @@
     <w:p>
       <w:pPr>
         <w:rPr>
-          <w:rFonts w:hint="eastAsia"/>
-          <w:lang w:val="es-CO"/>
-        </w:rPr>
-      </w:pPr>
-    </w:p>
-    <w:p>
-      <w:pPr>
-        <w:rPr>
-          <w:rFonts w:hint="eastAsia"/>
+          <w:lang w:val="es-CO"/>
+        </w:rPr>
+      </w:pPr>
+    </w:p>
+    <w:p>
+      <w:pPr>
+        <w:rPr>
           <w:lang w:val="es-CO"/>
         </w:rPr>
       </w:pPr>
@@ -629,7 +612,6 @@
     <w:p>
       <w:pPr>
         <w:rPr>
-          <w:rFonts w:hint="eastAsia"/>
           <w:lang w:val="es-CO"/>
         </w:rPr>
       </w:pPr>
@@ -649,7 +631,6 @@
     <w:p>
       <w:pPr>
         <w:rPr>
-          <w:rFonts w:hint="eastAsia"/>
           <w:lang w:val="es-CO"/>
         </w:rPr>
       </w:pPr>
@@ -658,6 +639,7 @@
           <w:noProof/>
           <w:lang w:val="es-CO"/>
         </w:rPr>
+        <w:lastRenderedPageBreak/>
         <w:drawing>
           <wp:inline distT="0" distB="0" distL="0" distR="0" wp14:anchorId="4DFBCD0B" wp14:editId="7F05CCF8">
             <wp:extent cx="5943600" cy="1268095"/>
@@ -704,7 +686,6 @@
     <w:p>
       <w:pPr>
         <w:rPr>
-          <w:rFonts w:hint="eastAsia"/>
           <w:lang w:val="es-CO"/>
         </w:rPr>
       </w:pPr>
@@ -718,7 +699,6 @@
     <w:p>
       <w:pPr>
         <w:rPr>
-          <w:rFonts w:hint="eastAsia"/>
           <w:lang w:val="es-CO"/>
         </w:rPr>
       </w:pPr>
@@ -773,7 +753,6 @@
     <w:p>
       <w:pPr>
         <w:rPr>
-          <w:rFonts w:hint="eastAsia"/>
           <w:lang w:val="es-CO"/>
         </w:rPr>
       </w:pPr>
@@ -787,7 +766,6 @@
     <w:p>
       <w:pPr>
         <w:rPr>
-          <w:rFonts w:hint="eastAsia"/>
           <w:lang w:val="es-CO"/>
         </w:rPr>
       </w:pPr>
@@ -842,7 +820,6 @@
     <w:p>
       <w:pPr>
         <w:rPr>
-          <w:rFonts w:hint="eastAsia"/>
           <w:lang w:val="es-CO"/>
         </w:rPr>
       </w:pPr>
@@ -862,7 +839,6 @@
     <w:p>
       <w:pPr>
         <w:rPr>
-          <w:rFonts w:hint="eastAsia"/>
           <w:lang w:val="es-CO"/>
         </w:rPr>
       </w:pPr>
@@ -917,7 +893,6 @@
     <w:p>
       <w:pPr>
         <w:rPr>
-          <w:rFonts w:hint="eastAsia"/>
           <w:lang w:val="es-CO"/>
         </w:rPr>
       </w:pPr>
@@ -931,7 +906,6 @@
     <w:p>
       <w:pPr>
         <w:rPr>
-          <w:rFonts w:hint="eastAsia"/>
           <w:lang w:val="es-CO"/>
         </w:rPr>
       </w:pPr>
@@ -940,6 +914,7 @@
           <w:noProof/>
           <w:lang w:val="es-CO"/>
         </w:rPr>
+        <w:lastRenderedPageBreak/>
         <w:drawing>
           <wp:inline distT="0" distB="0" distL="0" distR="0" wp14:anchorId="139B6065" wp14:editId="4ACDC9A6">
             <wp:extent cx="3839111" cy="1505160"/>
@@ -986,7 +961,6 @@
     <w:p>
       <w:pPr>
         <w:rPr>
-          <w:rFonts w:hint="eastAsia"/>
           <w:lang w:val="es-CO"/>
         </w:rPr>
       </w:pPr>
@@ -1000,7 +974,6 @@
     <w:p>
       <w:pPr>
         <w:rPr>
-          <w:rFonts w:hint="eastAsia"/>
           <w:lang w:val="es-CO"/>
         </w:rPr>
       </w:pPr>
@@ -1055,15 +1028,13 @@
     <w:p>
       <w:pPr>
         <w:rPr>
-          <w:rFonts w:hint="eastAsia"/>
-          <w:lang w:val="es-CO"/>
-        </w:rPr>
-      </w:pPr>
-    </w:p>
-    <w:p>
-      <w:pPr>
-        <w:rPr>
-          <w:rFonts w:hint="eastAsia"/>
+          <w:lang w:val="es-CO"/>
+        </w:rPr>
+      </w:pPr>
+    </w:p>
+    <w:p>
+      <w:pPr>
+        <w:rPr>
           <w:b/>
           <w:bCs/>
           <w:lang w:val="es-CO"/>
@@ -1089,7 +1060,6 @@
     <w:p>
       <w:pPr>
         <w:rPr>
-          <w:rFonts w:hint="eastAsia"/>
           <w:lang w:val="es-CO"/>
         </w:rPr>
       </w:pPr>
@@ -1109,7 +1079,6 @@
     <w:p>
       <w:pPr>
         <w:rPr>
-          <w:rFonts w:hint="eastAsia"/>
           <w:lang w:val="es-CO"/>
         </w:rPr>
       </w:pPr>
@@ -1123,7 +1092,6 @@
     <w:p>
       <w:pPr>
         <w:rPr>
-          <w:rFonts w:hint="eastAsia"/>
           <w:lang w:val="es-CO"/>
         </w:rPr>
       </w:pPr>
@@ -1178,7 +1146,6 @@
     <w:p>
       <w:pPr>
         <w:rPr>
-          <w:rFonts w:hint="eastAsia"/>
           <w:lang w:val="es-CO"/>
         </w:rPr>
       </w:pPr>
@@ -1192,7 +1159,6 @@
     <w:p>
       <w:pPr>
         <w:rPr>
-          <w:rFonts w:hint="eastAsia"/>
           <w:lang w:val="es-CO"/>
         </w:rPr>
       </w:pPr>
@@ -1247,7 +1213,6 @@
     <w:p>
       <w:pPr>
         <w:rPr>
-          <w:rFonts w:hint="eastAsia"/>
           <w:lang w:val="es-CO"/>
         </w:rPr>
       </w:pPr>
@@ -1291,7 +1256,6 @@
     <w:p>
       <w:pPr>
         <w:rPr>
-          <w:rFonts w:hint="eastAsia"/>
           <w:lang w:val="es-CO"/>
         </w:rPr>
       </w:pPr>
@@ -1305,7 +1269,6 @@
     <w:p>
       <w:pPr>
         <w:rPr>
-          <w:rFonts w:hint="eastAsia"/>
           <w:lang w:val="es-CO"/>
         </w:rPr>
       </w:pPr>
@@ -1319,14 +1282,14 @@
     <w:p>
       <w:pPr>
         <w:rPr>
-          <w:rFonts w:hint="eastAsia"/>
-          <w:lang w:val="es-CO"/>
-        </w:rPr>
-      </w:pPr>
-      <w:r>
-        <w:rPr>
-          <w:lang w:val="es-CO"/>
-        </w:rPr>
+          <w:lang w:val="es-CO"/>
+        </w:rPr>
+      </w:pPr>
+      <w:r>
+        <w:rPr>
+          <w:lang w:val="es-CO"/>
+        </w:rPr>
+        <w:lastRenderedPageBreak/>
         <w:t>isVisible permite saber si está visible o no</w:t>
       </w:r>
       <w:r>
@@ -1339,7 +1302,6 @@
     <w:p>
       <w:pPr>
         <w:rPr>
-          <w:rFonts w:hint="eastAsia"/>
           <w:lang w:val="es-CO"/>
         </w:rPr>
       </w:pPr>
@@ -1353,7 +1315,6 @@
     <w:p>
       <w:pPr>
         <w:rPr>
-          <w:rFonts w:hint="eastAsia"/>
           <w:lang w:val="es-CO"/>
         </w:rPr>
       </w:pPr>
@@ -1417,7 +1378,6 @@
     <w:p>
       <w:pPr>
         <w:rPr>
-          <w:rFonts w:hint="eastAsia"/>
           <w:lang w:val="es-CO"/>
         </w:rPr>
       </w:pPr>
@@ -1431,7 +1391,6 @@
     <w:p>
       <w:pPr>
         <w:rPr>
-          <w:rFonts w:hint="eastAsia"/>
           <w:lang w:val="es-CO"/>
         </w:rPr>
       </w:pPr>
@@ -1445,7 +1404,6 @@
     <w:p>
       <w:pPr>
         <w:rPr>
-          <w:rFonts w:hint="eastAsia"/>
           <w:lang w:val="es-CO"/>
         </w:rPr>
       </w:pPr>
@@ -1500,7 +1458,6 @@
     <w:p>
       <w:pPr>
         <w:rPr>
-          <w:rFonts w:hint="eastAsia"/>
           <w:lang w:val="es-CO"/>
         </w:rPr>
       </w:pPr>
@@ -1520,7 +1477,6 @@
     <w:p>
       <w:pPr>
         <w:rPr>
-          <w:rFonts w:hint="eastAsia"/>
           <w:lang w:val="es-CO"/>
         </w:rPr>
       </w:pPr>
@@ -1575,7 +1531,6 @@
     <w:p>
       <w:pPr>
         <w:rPr>
-          <w:rFonts w:hint="eastAsia"/>
           <w:lang w:val="es-CO"/>
         </w:rPr>
       </w:pPr>
@@ -1589,7 +1544,6 @@
     <w:p>
       <w:pPr>
         <w:rPr>
-          <w:rFonts w:hint="eastAsia"/>
           <w:lang w:val="es-CO"/>
         </w:rPr>
       </w:pPr>
@@ -1598,6 +1552,7 @@
           <w:noProof/>
           <w:lang w:val="es-CO"/>
         </w:rPr>
+        <w:lastRenderedPageBreak/>
         <w:drawing>
           <wp:inline distT="0" distB="0" distL="0" distR="0" wp14:anchorId="5D78B5A8" wp14:editId="7ADDE2FE">
             <wp:extent cx="4648849" cy="1648055"/>
@@ -1644,7 +1599,6 @@
     <w:p>
       <w:pPr>
         <w:rPr>
-          <w:rFonts w:hint="eastAsia"/>
           <w:lang w:val="es-CO"/>
         </w:rPr>
       </w:pPr>
@@ -1658,7 +1612,6 @@
     <w:p>
       <w:pPr>
         <w:rPr>
-          <w:rFonts w:hint="eastAsia"/>
           <w:lang w:val="es-CO"/>
         </w:rPr>
       </w:pPr>
@@ -1713,7 +1666,6 @@
     <w:p>
       <w:pPr>
         <w:rPr>
-          <w:rFonts w:hint="eastAsia"/>
           <w:lang w:val="es-CO"/>
         </w:rPr>
       </w:pPr>
@@ -1745,7 +1697,6 @@
     <w:p>
       <w:pPr>
         <w:rPr>
-          <w:rFonts w:hint="eastAsia"/>
           <w:lang w:val="es-CO"/>
         </w:rPr>
       </w:pPr>
@@ -1800,15 +1751,13 @@
     <w:p>
       <w:pPr>
         <w:rPr>
-          <w:rFonts w:hint="eastAsia"/>
-          <w:lang w:val="es-CO"/>
-        </w:rPr>
-      </w:pPr>
-    </w:p>
-    <w:p>
-      <w:pPr>
-        <w:rPr>
-          <w:rFonts w:hint="eastAsia"/>
+          <w:lang w:val="es-CO"/>
+        </w:rPr>
+      </w:pPr>
+    </w:p>
+    <w:p>
+      <w:pPr>
+        <w:rPr>
           <w:lang w:val="es-CO"/>
         </w:rPr>
       </w:pPr>
@@ -1822,7 +1771,6 @@
     <w:p>
       <w:pPr>
         <w:rPr>
-          <w:rFonts w:hint="eastAsia"/>
           <w:lang w:val="es-CO"/>
         </w:rPr>
       </w:pPr>
@@ -1877,7 +1825,6 @@
     <w:p>
       <w:pPr>
         <w:rPr>
-          <w:rFonts w:hint="eastAsia"/>
           <w:lang w:val="es-CO"/>
         </w:rPr>
       </w:pPr>
@@ -1891,29 +1838,27 @@
     <w:p>
       <w:pPr>
         <w:rPr>
-          <w:rFonts w:hint="eastAsia"/>
-          <w:lang w:val="es-CO"/>
-        </w:rPr>
-      </w:pPr>
-    </w:p>
-    <w:p>
-      <w:pPr>
-        <w:rPr>
-          <w:rFonts w:hint="eastAsia"/>
-          <w:lang w:val="es-CO"/>
-        </w:rPr>
-      </w:pPr>
-      <w:r>
-        <w:rPr>
-          <w:lang w:val="es-CO"/>
-        </w:rPr>
+          <w:lang w:val="es-CO"/>
+        </w:rPr>
+      </w:pPr>
+    </w:p>
+    <w:p>
+      <w:pPr>
+        <w:rPr>
+          <w:lang w:val="es-CO"/>
+        </w:rPr>
+      </w:pPr>
+      <w:r>
+        <w:rPr>
+          <w:lang w:val="es-CO"/>
+        </w:rPr>
+        <w:lastRenderedPageBreak/>
         <w:t>Inicialmente Wheel vacio se ve como:</w:t>
       </w:r>
     </w:p>
     <w:p>
       <w:pPr>
         <w:rPr>
-          <w:rFonts w:hint="eastAsia"/>
           <w:lang w:val="es-CO"/>
         </w:rPr>
       </w:pPr>
@@ -1968,7 +1913,6 @@
     <w:p>
       <w:pPr>
         <w:rPr>
-          <w:rFonts w:hint="eastAsia"/>
           <w:lang w:val="es-CO"/>
         </w:rPr>
       </w:pPr>
@@ -1982,7 +1926,6 @@
     <w:p>
       <w:pPr>
         <w:rPr>
-          <w:rFonts w:hint="eastAsia"/>
           <w:lang w:val="es-CO"/>
         </w:rPr>
       </w:pPr>
@@ -2037,7 +1980,6 @@
     <w:p>
       <w:pPr>
         <w:rPr>
-          <w:rFonts w:hint="eastAsia"/>
           <w:lang w:val="es-CO"/>
         </w:rPr>
       </w:pPr>
@@ -2057,7 +1999,6 @@
     <w:p>
       <w:pPr>
         <w:rPr>
-          <w:rFonts w:hint="eastAsia"/>
           <w:lang w:val="es-CO"/>
         </w:rPr>
       </w:pPr>
@@ -2071,7 +2012,6 @@
     <w:p>
       <w:pPr>
         <w:rPr>
-          <w:rFonts w:hint="eastAsia"/>
           <w:lang w:val="es-CO"/>
         </w:rPr>
       </w:pPr>
@@ -2126,7 +2066,6 @@
     <w:p>
       <w:pPr>
         <w:rPr>
-          <w:rFonts w:hint="eastAsia"/>
           <w:b/>
           <w:bCs/>
           <w:lang w:val="es-CO"/>
@@ -2160,7 +2099,6 @@
     <w:p>
       <w:pPr>
         <w:rPr>
-          <w:rFonts w:hint="eastAsia"/>
           <w:lang w:val="es-CO"/>
         </w:rPr>
       </w:pPr>
@@ -2180,7 +2118,6 @@
     <w:p>
       <w:pPr>
         <w:rPr>
-          <w:rFonts w:hint="eastAsia"/>
           <w:lang w:val="es-CO"/>
         </w:rPr>
       </w:pPr>
@@ -2194,7 +2131,6 @@
     <w:p>
       <w:pPr>
         <w:rPr>
-          <w:rFonts w:hint="eastAsia"/>
           <w:lang w:val="es-CO"/>
         </w:rPr>
       </w:pPr>
@@ -2249,7 +2185,6 @@
     <w:p>
       <w:pPr>
         <w:rPr>
-          <w:rFonts w:hint="eastAsia"/>
           <w:lang w:val="es-CO"/>
         </w:rPr>
       </w:pPr>
@@ -2263,7 +2198,6 @@
     <w:p>
       <w:pPr>
         <w:rPr>
-          <w:rFonts w:hint="eastAsia"/>
           <w:lang w:val="es-CO"/>
         </w:rPr>
       </w:pPr>
@@ -2289,7 +2223,6 @@
     <w:p>
       <w:pPr>
         <w:rPr>
-          <w:rFonts w:hint="eastAsia"/>
           <w:lang w:val="es-CO"/>
         </w:rPr>
       </w:pPr>
@@ -2298,6 +2231,7 @@
           <w:noProof/>
           <w:lang w:val="es-CO"/>
         </w:rPr>
+        <w:lastRenderedPageBreak/>
         <w:drawing>
           <wp:inline distT="0" distB="0" distL="0" distR="0" wp14:anchorId="7EEF9A8F" wp14:editId="49095D9B">
             <wp:extent cx="5430008" cy="3620005"/>
@@ -2344,7 +2278,6 @@
     <w:p>
       <w:pPr>
         <w:rPr>
-          <w:rFonts w:hint="eastAsia"/>
           <w:lang w:val="es-CO"/>
         </w:rPr>
       </w:pPr>
@@ -2364,7 +2297,6 @@
     <w:p>
       <w:pPr>
         <w:rPr>
-          <w:rFonts w:hint="eastAsia"/>
           <w:lang w:val="es-CO"/>
         </w:rPr>
       </w:pPr>
@@ -2419,7 +2351,6 @@
     <w:p>
       <w:pPr>
         <w:rPr>
-          <w:rFonts w:hint="eastAsia"/>
           <w:lang w:val="es-CO"/>
         </w:rPr>
       </w:pPr>
@@ -2463,7 +2394,6 @@
     <w:p>
       <w:pPr>
         <w:rPr>
-          <w:rFonts w:hint="eastAsia"/>
           <w:lang w:val="es-CO"/>
         </w:rPr>
       </w:pPr>
@@ -2472,6 +2402,7 @@
           <w:noProof/>
           <w:lang w:val="es-CO"/>
         </w:rPr>
+        <w:lastRenderedPageBreak/>
         <w:drawing>
           <wp:inline distT="0" distB="0" distL="0" distR="0" wp14:anchorId="147E854A" wp14:editId="54CC2134">
             <wp:extent cx="5725324" cy="1886213"/>
@@ -2518,7 +2449,6 @@
     <w:p>
       <w:pPr>
         <w:rPr>
-          <w:rFonts w:hint="eastAsia"/>
           <w:lang w:val="es-CO"/>
         </w:rPr>
       </w:pPr>
@@ -2544,7 +2474,6 @@
     <w:p>
       <w:pPr>
         <w:rPr>
-          <w:rFonts w:hint="eastAsia"/>
           <w:lang w:val="es-CO"/>
         </w:rPr>
       </w:pPr>
@@ -2599,7 +2528,6 @@
     <w:p>
       <w:pPr>
         <w:rPr>
-          <w:rFonts w:hint="eastAsia"/>
           <w:lang w:val="es-CO"/>
         </w:rPr>
       </w:pPr>
@@ -2619,7 +2547,6 @@
     <w:p>
       <w:pPr>
         <w:rPr>
-          <w:rFonts w:hint="eastAsia"/>
           <w:lang w:val="es-CO"/>
         </w:rPr>
       </w:pPr>
@@ -2628,6 +2555,7 @@
           <w:noProof/>
           <w:lang w:val="es-CO"/>
         </w:rPr>
+        <w:lastRenderedPageBreak/>
         <w:drawing>
           <wp:inline distT="0" distB="0" distL="0" distR="0" wp14:anchorId="6EE6C572" wp14:editId="327D09F8">
             <wp:extent cx="5943600" cy="1965960"/>
@@ -2674,7 +2602,6 @@
     <w:p>
       <w:pPr>
         <w:rPr>
-          <w:rFonts w:hint="eastAsia"/>
           <w:lang w:val="es-CO"/>
         </w:rPr>
       </w:pPr>
@@ -2748,7 +2675,6 @@
     <w:p>
       <w:pPr>
         <w:rPr>
-          <w:rFonts w:hint="eastAsia"/>
           <w:lang w:val="es-CO"/>
         </w:rPr>
       </w:pPr>
@@ -2803,7 +2729,6 @@
     <w:p>
       <w:pPr>
         <w:rPr>
-          <w:rFonts w:hint="eastAsia"/>
           <w:lang w:val="es-CO"/>
         </w:rPr>
       </w:pPr>
@@ -2812,6 +2737,7 @@
           <w:noProof/>
           <w:lang w:val="es-CO"/>
         </w:rPr>
+        <w:lastRenderedPageBreak/>
         <w:drawing>
           <wp:inline distT="0" distB="0" distL="0" distR="0" wp14:anchorId="16BC14C5" wp14:editId="6A17137A">
             <wp:extent cx="5943600" cy="3581400"/>
@@ -2858,7 +2784,6 @@
     <w:p>
       <w:pPr>
         <w:rPr>
-          <w:rFonts w:hint="eastAsia"/>
           <w:lang w:val="es-CO"/>
         </w:rPr>
       </w:pPr>
@@ -2914,7 +2839,6 @@
     <w:p>
       <w:pPr>
         <w:rPr>
-          <w:rFonts w:hint="eastAsia"/>
           <w:lang w:val="es-CO"/>
         </w:rPr>
       </w:pPr>
@@ -2934,7 +2858,6 @@
     <w:p>
       <w:pPr>
         <w:rPr>
-          <w:rFonts w:hint="eastAsia"/>
           <w:lang w:val="es-CO"/>
         </w:rPr>
       </w:pPr>
@@ -2978,7 +2901,6 @@
     <w:p>
       <w:pPr>
         <w:rPr>
-          <w:rFonts w:hint="eastAsia"/>
           <w:lang w:val="es-CO"/>
         </w:rPr>
       </w:pPr>
@@ -2998,7 +2920,6 @@
     <w:p>
       <w:pPr>
         <w:rPr>
-          <w:rFonts w:hint="eastAsia"/>
           <w:lang w:val="es-CO"/>
         </w:rPr>
       </w:pPr>
@@ -3036,7 +2957,6 @@
     <w:p>
       <w:pPr>
         <w:rPr>
-          <w:rFonts w:hint="eastAsia"/>
           <w:lang w:val="es-CO"/>
         </w:rPr>
       </w:pPr>
@@ -3045,6 +2965,7 @@
           <w:noProof/>
           <w:lang w:val="es-CO"/>
         </w:rPr>
+        <w:lastRenderedPageBreak/>
         <w:drawing>
           <wp:inline distT="0" distB="0" distL="0" distR="0" wp14:anchorId="40E59D09" wp14:editId="43C637FD">
             <wp:extent cx="4001058" cy="2257740"/>
@@ -3091,7 +3012,6 @@
     <w:p>
       <w:pPr>
         <w:rPr>
-          <w:rFonts w:hint="eastAsia"/>
           <w:lang w:val="es-CO"/>
         </w:rPr>
       </w:pPr>
@@ -3117,15 +3037,13 @@
     <w:p>
       <w:pPr>
         <w:rPr>
-          <w:rFonts w:hint="eastAsia"/>
-          <w:lang w:val="es-CO"/>
-        </w:rPr>
-      </w:pPr>
-    </w:p>
-    <w:p>
-      <w:pPr>
-        <w:rPr>
-          <w:rFonts w:hint="eastAsia"/>
+          <w:lang w:val="es-CO"/>
+        </w:rPr>
+      </w:pPr>
+    </w:p>
+    <w:p>
+      <w:pPr>
+        <w:rPr>
           <w:lang w:val="es-CO"/>
         </w:rPr>
       </w:pPr>
@@ -3145,7 +3063,6 @@
     <w:p>
       <w:pPr>
         <w:rPr>
-          <w:rFonts w:hint="eastAsia"/>
           <w:lang w:val="es-CO"/>
         </w:rPr>
       </w:pPr>
@@ -3200,7 +3117,6 @@
     <w:p>
       <w:pPr>
         <w:rPr>
-          <w:rFonts w:hint="eastAsia"/>
           <w:lang w:val="es-CO"/>
         </w:rPr>
       </w:pPr>
@@ -3209,6 +3125,7 @@
           <w:noProof/>
           <w:lang w:val="es-CO"/>
         </w:rPr>
+        <w:lastRenderedPageBreak/>
         <w:drawing>
           <wp:inline distT="0" distB="0" distL="0" distR="0" wp14:anchorId="37821223" wp14:editId="4CB96237">
             <wp:extent cx="5943600" cy="4065905"/>
@@ -3255,7 +3172,6 @@
     <w:p>
       <w:pPr>
         <w:rPr>
-          <w:rFonts w:hint="eastAsia"/>
           <w:lang w:val="es-CO"/>
         </w:rPr>
       </w:pPr>
@@ -3269,7 +3185,6 @@
     <w:p>
       <w:pPr>
         <w:rPr>
-          <w:rFonts w:hint="eastAsia"/>
           <w:lang w:val="es-CO"/>
         </w:rPr>
       </w:pPr>
@@ -3289,7 +3204,6 @@
     <w:p>
       <w:pPr>
         <w:rPr>
-          <w:rFonts w:hint="eastAsia"/>
           <w:lang w:val="es-CO"/>
         </w:rPr>
       </w:pPr>
@@ -3309,7 +3223,6 @@
     <w:p>
       <w:pPr>
         <w:rPr>
-          <w:rFonts w:hint="eastAsia"/>
           <w:lang w:val="es-CO"/>
         </w:rPr>
       </w:pPr>
@@ -3364,7 +3277,6 @@
     <w:p>
       <w:pPr>
         <w:rPr>
-          <w:rFonts w:hint="eastAsia"/>
           <w:b/>
           <w:bCs/>
           <w:lang w:val="es-CO"/>
@@ -3422,14 +3334,14 @@
     <w:p>
       <w:pPr>
         <w:rPr>
-          <w:rFonts w:hint="eastAsia"/>
-          <w:lang w:val="es-CO"/>
-        </w:rPr>
-      </w:pPr>
-      <w:r>
-        <w:rPr>
-          <w:lang w:val="es-CO"/>
-        </w:rPr>
+          <w:lang w:val="es-CO"/>
+        </w:rPr>
+      </w:pPr>
+      <w:r>
+        <w:rPr>
+          <w:lang w:val="es-CO"/>
+        </w:rPr>
+        <w:lastRenderedPageBreak/>
         <w:t>En este ciclo nos e</w:t>
       </w:r>
       <w:r>
@@ -3442,7 +3354,6 @@
     <w:p>
       <w:pPr>
         <w:rPr>
-          <w:rFonts w:hint="eastAsia"/>
           <w:lang w:val="es-CO"/>
         </w:rPr>
       </w:pPr>
@@ -3456,7 +3367,6 @@
     <w:p>
       <w:pPr>
         <w:rPr>
-          <w:rFonts w:hint="eastAsia"/>
           <w:lang w:val="es-CO"/>
         </w:rPr>
       </w:pPr>
@@ -3482,7 +3392,6 @@
     <w:p>
       <w:pPr>
         <w:rPr>
-          <w:rFonts w:hint="eastAsia"/>
           <w:lang w:val="es-CO"/>
         </w:rPr>
       </w:pPr>
@@ -3537,7 +3446,6 @@
     <w:p>
       <w:pPr>
         <w:rPr>
-          <w:rFonts w:hint="eastAsia"/>
           <w:lang w:val="es-CO"/>
         </w:rPr>
       </w:pPr>
@@ -3569,7 +3477,6 @@
     <w:p>
       <w:pPr>
         <w:rPr>
-          <w:rFonts w:hint="eastAsia"/>
           <w:lang w:val="es-CO"/>
         </w:rPr>
       </w:pPr>
@@ -3578,6 +3485,7 @@
           <w:noProof/>
           <w:lang w:val="es-CO"/>
         </w:rPr>
+        <w:lastRenderedPageBreak/>
         <w:drawing>
           <wp:inline distT="0" distB="0" distL="0" distR="0" wp14:anchorId="4A1DB036" wp14:editId="6ADFA02C">
             <wp:extent cx="5943600" cy="3410585"/>
@@ -3624,7 +3532,6 @@
     <w:p>
       <w:pPr>
         <w:rPr>
-          <w:rFonts w:hint="eastAsia"/>
           <w:lang w:val="es-CO"/>
         </w:rPr>
       </w:pPr>
@@ -3638,7 +3545,6 @@
     <w:p>
       <w:pPr>
         <w:rPr>
-          <w:rFonts w:hint="eastAsia"/>
           <w:lang w:val="es-CO"/>
         </w:rPr>
       </w:pPr>
@@ -3693,7 +3599,6 @@
     <w:p>
       <w:pPr>
         <w:rPr>
-          <w:rFonts w:hint="eastAsia"/>
           <w:lang w:val="es-CO"/>
         </w:rPr>
       </w:pPr>
@@ -3707,7 +3612,6 @@
     <w:p>
       <w:pPr>
         <w:rPr>
-          <w:rFonts w:hint="eastAsia"/>
           <w:lang w:val="es-CO"/>
         </w:rPr>
       </w:pPr>
@@ -3716,6 +3620,7 @@
           <w:noProof/>
           <w:lang w:val="es-CO"/>
         </w:rPr>
+        <w:lastRenderedPageBreak/>
         <w:drawing>
           <wp:inline distT="0" distB="0" distL="0" distR="0" wp14:anchorId="5008C24A" wp14:editId="7B12731C">
             <wp:extent cx="3458058" cy="2076740"/>
@@ -3762,7 +3667,6 @@
     <w:p>
       <w:pPr>
         <w:rPr>
-          <w:rFonts w:hint="eastAsia"/>
           <w:lang w:val="es-CO"/>
         </w:rPr>
       </w:pPr>
@@ -3776,7 +3680,6 @@
     <w:p>
       <w:pPr>
         <w:rPr>
-          <w:rFonts w:hint="eastAsia"/>
           <w:lang w:val="es-CO"/>
         </w:rPr>
       </w:pPr>
@@ -3831,7 +3734,6 @@
     <w:p>
       <w:pPr>
         <w:rPr>
-          <w:rFonts w:hint="eastAsia"/>
           <w:lang w:val="es-CO"/>
         </w:rPr>
       </w:pPr>
@@ -3845,7 +3747,6 @@
     <w:p>
       <w:pPr>
         <w:rPr>
-          <w:rFonts w:hint="eastAsia"/>
           <w:lang w:val="es-CO"/>
         </w:rPr>
       </w:pPr>
@@ -3900,7 +3801,6 @@
     <w:p>
       <w:pPr>
         <w:rPr>
-          <w:rFonts w:hint="eastAsia"/>
           <w:lang w:val="es-CO"/>
         </w:rPr>
       </w:pPr>
@@ -3914,15 +3814,13 @@
     <w:p>
       <w:pPr>
         <w:rPr>
-          <w:rFonts w:hint="eastAsia"/>
-          <w:lang w:val="es-CO"/>
-        </w:rPr>
-      </w:pPr>
-    </w:p>
-    <w:p>
-      <w:pPr>
-        <w:rPr>
-          <w:rFonts w:hint="eastAsia"/>
+          <w:lang w:val="es-CO"/>
+        </w:rPr>
+      </w:pPr>
+    </w:p>
+    <w:p>
+      <w:pPr>
+        <w:rPr>
           <w:lang w:val="es-CO"/>
         </w:rPr>
       </w:pPr>
@@ -3977,7 +3875,6 @@
     <w:p>
       <w:pPr>
         <w:rPr>
-          <w:rFonts w:hint="eastAsia"/>
           <w:lang w:val="es-CO"/>
         </w:rPr>
       </w:pPr>
@@ -3991,7 +3888,6 @@
     <w:p>
       <w:pPr>
         <w:rPr>
-          <w:rFonts w:hint="eastAsia"/>
           <w:lang w:val="es-CO"/>
         </w:rPr>
       </w:pPr>
@@ -4005,7 +3901,6 @@
     <w:p>
       <w:pPr>
         <w:rPr>
-          <w:rFonts w:hint="eastAsia"/>
           <w:lang w:val="es-CO"/>
         </w:rPr>
       </w:pPr>
@@ -4060,7 +3955,6 @@
     <w:p>
       <w:pPr>
         <w:rPr>
-          <w:rFonts w:hint="eastAsia"/>
           <w:lang w:val="es-CO"/>
         </w:rPr>
       </w:pPr>
@@ -4074,7 +3968,6 @@
     <w:p>
       <w:pPr>
         <w:rPr>
-          <w:rFonts w:hint="eastAsia"/>
           <w:lang w:val="es-CO"/>
         </w:rPr>
       </w:pPr>
@@ -4129,21 +4022,20 @@
     <w:p>
       <w:pPr>
         <w:rPr>
-          <w:rFonts w:hint="eastAsia"/>
-          <w:lang w:val="es-CO"/>
-        </w:rPr>
-      </w:pPr>
-      <w:r>
-        <w:rPr>
-          <w:lang w:val="es-CO"/>
-        </w:rPr>
+          <w:lang w:val="es-CO"/>
+        </w:rPr>
+      </w:pPr>
+      <w:r>
+        <w:rPr>
+          <w:lang w:val="es-CO"/>
+        </w:rPr>
+        <w:lastRenderedPageBreak/>
         <w:t>Si intento poner una en la posición 4:</w:t>
       </w:r>
     </w:p>
     <w:p>
       <w:pPr>
         <w:rPr>
-          <w:rFonts w:hint="eastAsia"/>
           <w:lang w:val="es-CO"/>
         </w:rPr>
       </w:pPr>
@@ -4198,7 +4090,6 @@
     <w:p>
       <w:pPr>
         <w:rPr>
-          <w:rFonts w:hint="eastAsia"/>
           <w:lang w:val="es-CO"/>
         </w:rPr>
       </w:pPr>
@@ -4253,15 +4144,13 @@
     <w:p>
       <w:pPr>
         <w:rPr>
-          <w:rFonts w:hint="eastAsia"/>
-          <w:lang w:val="es-CO"/>
-        </w:rPr>
-      </w:pPr>
-    </w:p>
-    <w:p>
-      <w:pPr>
-        <w:rPr>
-          <w:rFonts w:hint="eastAsia"/>
+          <w:lang w:val="es-CO"/>
+        </w:rPr>
+      </w:pPr>
+    </w:p>
+    <w:p>
+      <w:pPr>
+        <w:rPr>
           <w:lang w:val="es-CO"/>
         </w:rPr>
       </w:pPr>
@@ -4281,7 +4170,6 @@
     <w:p>
       <w:pPr>
         <w:rPr>
-          <w:rFonts w:hint="eastAsia"/>
           <w:lang w:val="es-CO"/>
         </w:rPr>
       </w:pPr>
@@ -4290,6 +4178,7 @@
           <w:noProof/>
           <w:lang w:val="es-CO"/>
         </w:rPr>
+        <w:lastRenderedPageBreak/>
         <w:drawing>
           <wp:inline distT="0" distB="0" distL="0" distR="0" wp14:anchorId="021075C3" wp14:editId="23E9972B">
             <wp:extent cx="5943600" cy="3582670"/>
@@ -4336,7 +4225,6 @@
     <w:p>
       <w:pPr>
         <w:rPr>
-          <w:rFonts w:hint="eastAsia"/>
           <w:lang w:val="es-CO"/>
         </w:rPr>
       </w:pPr>
@@ -4350,7 +4238,6 @@
     <w:p>
       <w:pPr>
         <w:rPr>
-          <w:rFonts w:hint="eastAsia"/>
           <w:lang w:val="es-CO"/>
         </w:rPr>
       </w:pPr>
@@ -4405,7 +4292,6 @@
     <w:p>
       <w:pPr>
         <w:rPr>
-          <w:rFonts w:hint="eastAsia"/>
           <w:lang w:val="es-CO"/>
         </w:rPr>
       </w:pPr>
@@ -4419,7 +4305,6 @@
     <w:p>
       <w:pPr>
         <w:rPr>
-          <w:rFonts w:hint="eastAsia"/>
           <w:lang w:val="es-CO"/>
         </w:rPr>
       </w:pPr>
@@ -4428,6 +4313,7 @@
           <w:noProof/>
           <w:lang w:val="es-CO"/>
         </w:rPr>
+        <w:lastRenderedPageBreak/>
         <w:drawing>
           <wp:inline distT="0" distB="0" distL="0" distR="0" wp14:anchorId="1113ABBB" wp14:editId="3AAFD6FD">
             <wp:extent cx="3515216" cy="2172003"/>
@@ -4474,7 +4360,6 @@
     <w:p>
       <w:pPr>
         <w:rPr>
-          <w:rFonts w:hint="eastAsia"/>
           <w:lang w:val="es-CO"/>
         </w:rPr>
       </w:pPr>
@@ -4529,7 +4414,6 @@
     <w:p>
       <w:pPr>
         <w:rPr>
-          <w:rFonts w:hint="eastAsia"/>
           <w:lang w:val="es-CO"/>
         </w:rPr>
       </w:pPr>
@@ -4543,7 +4427,6 @@
     <w:p>
       <w:pPr>
         <w:rPr>
-          <w:rFonts w:hint="eastAsia"/>
           <w:lang w:val="es-CO"/>
         </w:rPr>
       </w:pPr>
@@ -4598,7 +4481,6 @@
     <w:p>
       <w:pPr>
         <w:rPr>
-          <w:rFonts w:hint="eastAsia"/>
           <w:lang w:val="es-CO"/>
         </w:rPr>
       </w:pPr>
@@ -4612,7 +4494,6 @@
     <w:p>
       <w:pPr>
         <w:rPr>
-          <w:rFonts w:hint="eastAsia"/>
           <w:lang w:val="es-CO"/>
         </w:rPr>
       </w:pPr>
@@ -4621,6 +4502,7 @@
           <w:noProof/>
           <w:lang w:val="es-CO"/>
         </w:rPr>
+        <w:lastRenderedPageBreak/>
         <w:drawing>
           <wp:inline distT="0" distB="0" distL="0" distR="0" wp14:anchorId="11419C3C" wp14:editId="1D13552F">
             <wp:extent cx="3305636" cy="2191056"/>
@@ -4667,7 +4549,6 @@
     <w:p>
       <w:pPr>
         <w:rPr>
-          <w:rFonts w:hint="eastAsia"/>
           <w:lang w:val="es-CO"/>
         </w:rPr>
       </w:pPr>
@@ -4722,7 +4603,6 @@
     <w:p>
       <w:pPr>
         <w:rPr>
-          <w:rFonts w:hint="eastAsia"/>
           <w:b/>
           <w:bCs/>
           <w:lang w:val="es-CO"/>
@@ -4740,7 +4620,6 @@
     <w:p>
       <w:pPr>
         <w:rPr>
-          <w:rFonts w:hint="eastAsia"/>
           <w:lang w:val="es-CO"/>
         </w:rPr>
       </w:pPr>
@@ -4760,7 +4639,6 @@
     <w:p>
       <w:pPr>
         <w:rPr>
-          <w:rFonts w:hint="eastAsia"/>
           <w:lang w:val="es-CO"/>
         </w:rPr>
       </w:pPr>
@@ -4780,7 +4658,6 @@
     <w:p>
       <w:pPr>
         <w:rPr>
-          <w:rFonts w:hint="eastAsia"/>
           <w:lang w:val="es-CO"/>
         </w:rPr>
       </w:pPr>
@@ -4818,7 +4695,6 @@
     <w:p>
       <w:pPr>
         <w:rPr>
-          <w:rFonts w:hint="eastAsia"/>
           <w:lang w:val="es-CO"/>
         </w:rPr>
       </w:pPr>
@@ -4873,21 +4749,20 @@
     <w:p>
       <w:pPr>
         <w:rPr>
-          <w:rFonts w:hint="eastAsia"/>
-          <w:lang w:val="es-CO"/>
-        </w:rPr>
-      </w:pPr>
-      <w:r>
-        <w:rPr>
-          <w:lang w:val="es-CO"/>
-        </w:rPr>
+          <w:lang w:val="es-CO"/>
+        </w:rPr>
+      </w:pPr>
+      <w:r>
+        <w:rPr>
+          <w:lang w:val="es-CO"/>
+        </w:rPr>
+        <w:lastRenderedPageBreak/>
         <w:t>Por otro lado, volviendo a slotMachine, si se quiere mover todos las ruedas al siguiente símbolo:</w:t>
       </w:r>
     </w:p>
     <w:p>
       <w:pPr>
         <w:rPr>
-          <w:rFonts w:hint="eastAsia"/>
           <w:lang w:val="es-CO"/>
         </w:rPr>
       </w:pPr>
@@ -4942,7 +4817,6 @@
     <w:p>
       <w:pPr>
         <w:rPr>
-          <w:rFonts w:hint="eastAsia"/>
           <w:lang w:val="es-CO"/>
         </w:rPr>
       </w:pPr>
@@ -4997,7 +4871,6 @@
     <w:p>
       <w:pPr>
         <w:rPr>
-          <w:rFonts w:hint="eastAsia"/>
           <w:lang w:val="es-CO"/>
         </w:rPr>
       </w:pPr>
@@ -5023,7 +4896,6 @@
     <w:p>
       <w:pPr>
         <w:rPr>
-          <w:rFonts w:hint="eastAsia"/>
           <w:lang w:val="es-CO"/>
         </w:rPr>
       </w:pPr>
@@ -5085,7 +4957,6 @@
     <w:p>
       <w:pPr>
         <w:rPr>
-          <w:rFonts w:hint="eastAsia"/>
           <w:lang w:val="es-CO"/>
         </w:rPr>
       </w:pPr>
@@ -5094,6 +4965,7 @@
           <w:noProof/>
           <w:lang w:val="es-CO"/>
         </w:rPr>
+        <w:lastRenderedPageBreak/>
         <w:drawing>
           <wp:inline distT="0" distB="0" distL="0" distR="0" wp14:anchorId="21B4B812" wp14:editId="2D064DFA">
             <wp:extent cx="3982006" cy="2133898"/>
@@ -5140,15 +5012,13 @@
     <w:p>
       <w:pPr>
         <w:rPr>
-          <w:rFonts w:hint="eastAsia"/>
-          <w:lang w:val="es-CO"/>
-        </w:rPr>
-      </w:pPr>
-    </w:p>
-    <w:p>
-      <w:pPr>
-        <w:rPr>
-          <w:rFonts w:hint="eastAsia"/>
+          <w:lang w:val="es-CO"/>
+        </w:rPr>
+      </w:pPr>
+    </w:p>
+    <w:p>
+      <w:pPr>
+        <w:rPr>
           <w:lang w:val="es-CO"/>
         </w:rPr>
       </w:pPr>
@@ -5162,7 +5032,6 @@
     <w:p>
       <w:pPr>
         <w:rPr>
-          <w:rFonts w:hint="eastAsia"/>
           <w:lang w:val="es-CO"/>
         </w:rPr>
       </w:pPr>
@@ -5176,7 +5045,6 @@
     <w:p>
       <w:pPr>
         <w:rPr>
-          <w:rFonts w:hint="eastAsia"/>
           <w:lang w:val="es-CO"/>
         </w:rPr>
       </w:pPr>
@@ -5231,7 +5099,6 @@
     <w:p>
       <w:pPr>
         <w:rPr>
-          <w:rFonts w:hint="eastAsia"/>
           <w:lang w:val="es-CO"/>
         </w:rPr>
       </w:pPr>
@@ -5245,7 +5112,6 @@
     <w:p>
       <w:pPr>
         <w:rPr>
-          <w:rFonts w:hint="eastAsia"/>
           <w:lang w:val="es-CO"/>
         </w:rPr>
       </w:pPr>
@@ -5254,6 +5120,7 @@
           <w:noProof/>
           <w:lang w:val="es-CO"/>
         </w:rPr>
+        <w:lastRenderedPageBreak/>
         <w:drawing>
           <wp:inline distT="0" distB="0" distL="0" distR="0" wp14:anchorId="01FBB918" wp14:editId="30F88338">
             <wp:extent cx="3915321" cy="2133898"/>
@@ -5300,7 +5167,6 @@
     <w:p>
       <w:pPr>
         <w:rPr>
-          <w:rFonts w:hint="eastAsia"/>
           <w:lang w:val="es-CO"/>
         </w:rPr>
       </w:pPr>
@@ -5314,7 +5180,6 @@
     <w:p>
       <w:pPr>
         <w:rPr>
-          <w:rFonts w:hint="eastAsia"/>
           <w:lang w:val="es-CO"/>
         </w:rPr>
       </w:pPr>
@@ -5369,23 +5234,20 @@
     <w:p>
       <w:pPr>
         <w:rPr>
-          <w:rFonts w:hint="eastAsia"/>
-          <w:lang w:val="es-CO"/>
-        </w:rPr>
-      </w:pPr>
-    </w:p>
-    <w:p>
-      <w:pPr>
-        <w:rPr>
-          <w:rFonts w:hint="eastAsia"/>
-          <w:lang w:val="es-CO"/>
-        </w:rPr>
-      </w:pPr>
-    </w:p>
-    <w:p>
-      <w:pPr>
-        <w:rPr>
-          <w:rFonts w:hint="eastAsia"/>
+          <w:lang w:val="es-CO"/>
+        </w:rPr>
+      </w:pPr>
+    </w:p>
+    <w:p>
+      <w:pPr>
+        <w:rPr>
+          <w:lang w:val="es-CO"/>
+        </w:rPr>
+      </w:pPr>
+    </w:p>
+    <w:p>
+      <w:pPr>
+        <w:rPr>
           <w:b/>
           <w:bCs/>
           <w:lang w:val="es-CO"/>
@@ -5427,7 +5289,6 @@
     <w:p>
       <w:pPr>
         <w:rPr>
-          <w:rFonts w:hint="eastAsia"/>
           <w:lang w:val="es-CO"/>
         </w:rPr>
       </w:pPr>
@@ -5447,7 +5308,6 @@
     <w:p>
       <w:pPr>
         <w:rPr>
-          <w:rFonts w:hint="eastAsia"/>
           <w:lang w:val="es-CO"/>
         </w:rPr>
       </w:pPr>
@@ -5485,7 +5345,6 @@
     <w:p>
       <w:pPr>
         <w:rPr>
-          <w:rFonts w:hint="eastAsia"/>
           <w:lang w:val="es-CO"/>
         </w:rPr>
       </w:pPr>
@@ -5505,7 +5364,6 @@
     <w:p>
       <w:pPr>
         <w:rPr>
-          <w:rFonts w:hint="eastAsia"/>
           <w:lang w:val="es-CO"/>
         </w:rPr>
       </w:pPr>
@@ -5514,6 +5372,7 @@
           <w:noProof/>
           <w:lang w:val="es-CO"/>
         </w:rPr>
+        <w:lastRenderedPageBreak/>
         <w:drawing>
           <wp:inline distT="0" distB="0" distL="0" distR="0" wp14:anchorId="3B12C239" wp14:editId="59B1E5D0">
             <wp:extent cx="5553850" cy="2657846"/>
@@ -5560,15 +5419,13 @@
     <w:p>
       <w:pPr>
         <w:rPr>
-          <w:rFonts w:hint="eastAsia"/>
-          <w:lang w:val="es-CO"/>
-        </w:rPr>
-      </w:pPr>
-    </w:p>
-    <w:p>
-      <w:pPr>
-        <w:rPr>
-          <w:rFonts w:hint="eastAsia"/>
+          <w:lang w:val="es-CO"/>
+        </w:rPr>
+      </w:pPr>
+    </w:p>
+    <w:p>
+      <w:pPr>
+        <w:rPr>
           <w:lang w:val="es-CO"/>
         </w:rPr>
       </w:pPr>
@@ -5594,7 +5451,6 @@
     <w:p>
       <w:pPr>
         <w:rPr>
-          <w:rFonts w:hint="eastAsia"/>
           <w:lang w:val="es-CO"/>
         </w:rPr>
       </w:pPr>
@@ -5649,7 +5505,6 @@
     <w:p>
       <w:pPr>
         <w:rPr>
-          <w:rFonts w:hint="eastAsia"/>
           <w:lang w:val="es-CO"/>
         </w:rPr>
       </w:pPr>
@@ -5663,7 +5518,6 @@
     <w:p>
       <w:pPr>
         <w:rPr>
-          <w:rFonts w:hint="eastAsia"/>
           <w:lang w:val="es-CO"/>
         </w:rPr>
       </w:pPr>
@@ -5672,6 +5526,7 @@
           <w:noProof/>
           <w:lang w:val="es-CO"/>
         </w:rPr>
+        <w:lastRenderedPageBreak/>
         <w:drawing>
           <wp:inline distT="0" distB="0" distL="0" distR="0" wp14:anchorId="507FCAB5" wp14:editId="5190585F">
             <wp:extent cx="4048690" cy="2114845"/>
@@ -5718,7 +5573,6 @@
     <w:p>
       <w:pPr>
         <w:rPr>
-          <w:rFonts w:hint="eastAsia"/>
           <w:lang w:val="es-CO"/>
         </w:rPr>
       </w:pPr>
@@ -5732,7 +5586,6 @@
     <w:p>
       <w:pPr>
         <w:rPr>
-          <w:rFonts w:hint="eastAsia"/>
           <w:lang w:val="es-CO"/>
         </w:rPr>
       </w:pPr>
@@ -5787,7 +5640,6 @@
     <w:p>
       <w:pPr>
         <w:rPr>
-          <w:rFonts w:hint="eastAsia"/>
           <w:lang w:val="es-CO"/>
         </w:rPr>
       </w:pPr>
@@ -5807,7 +5659,6 @@
     <w:p>
       <w:pPr>
         <w:rPr>
-          <w:rFonts w:hint="eastAsia"/>
           <w:lang w:val="es-CO"/>
         </w:rPr>
       </w:pPr>
@@ -5833,7 +5684,6 @@
     <w:p>
       <w:pPr>
         <w:rPr>
-          <w:rFonts w:hint="eastAsia"/>
           <w:lang w:val="es-CO"/>
         </w:rPr>
       </w:pPr>
@@ -5842,6 +5692,7 @@
           <w:noProof/>
           <w:lang w:val="es-CO"/>
         </w:rPr>
+        <w:lastRenderedPageBreak/>
         <w:drawing>
           <wp:inline distT="0" distB="0" distL="0" distR="0" wp14:anchorId="19C88768" wp14:editId="3CFF5C0D">
             <wp:extent cx="4391638" cy="2391109"/>
@@ -5888,7 +5739,6 @@
     <w:p>
       <w:pPr>
         <w:rPr>
-          <w:rFonts w:hint="eastAsia"/>
           <w:lang w:val="es-CO"/>
         </w:rPr>
       </w:pPr>
@@ -5902,7 +5752,6 @@
     <w:p>
       <w:pPr>
         <w:rPr>
-          <w:rFonts w:hint="eastAsia"/>
           <w:lang w:val="es-CO"/>
         </w:rPr>
       </w:pPr>
@@ -5957,7 +5806,6 @@
     <w:p>
       <w:pPr>
         <w:rPr>
-          <w:rFonts w:hint="eastAsia"/>
           <w:lang w:val="es-CO"/>
         </w:rPr>
       </w:pPr>
@@ -5971,7 +5819,6 @@
     <w:p>
       <w:pPr>
         <w:rPr>
-          <w:rFonts w:hint="eastAsia"/>
           <w:lang w:val="es-CO"/>
         </w:rPr>
       </w:pPr>
@@ -5997,7 +5844,6 @@
     <w:p>
       <w:pPr>
         <w:rPr>
-          <w:rFonts w:hint="eastAsia"/>
           <w:lang w:val="es-CO"/>
         </w:rPr>
       </w:pPr>
@@ -6006,6 +5852,7 @@
           <w:noProof/>
           <w:lang w:val="es-CO"/>
         </w:rPr>
+        <w:lastRenderedPageBreak/>
         <w:drawing>
           <wp:inline distT="0" distB="0" distL="0" distR="0" wp14:anchorId="59D14201" wp14:editId="4BDDFE79">
             <wp:extent cx="4096322" cy="2181529"/>
@@ -6052,7 +5899,6 @@
     <w:p>
       <w:pPr>
         <w:rPr>
-          <w:rFonts w:hint="eastAsia"/>
           <w:lang w:val="es-CO"/>
         </w:rPr>
       </w:pPr>
@@ -6084,7 +5930,6 @@
     <w:p>
       <w:pPr>
         <w:rPr>
-          <w:rFonts w:hint="eastAsia"/>
           <w:lang w:val="es-CO"/>
         </w:rPr>
       </w:pPr>
@@ -6139,7 +5984,6 @@
     <w:p>
       <w:pPr>
         <w:rPr>
-          <w:rFonts w:hint="eastAsia"/>
           <w:lang w:val="es-CO"/>
         </w:rPr>
       </w:pPr>
@@ -6151,11 +5995,6 @@
       </w:r>
     </w:p>
     <w:p>
-      <w:pPr>
-        <w:rPr>
-          <w:rFonts w:hint="eastAsia"/>
-        </w:rPr>
-      </w:pPr>
       <w:r>
         <w:t>“black”-&gt;</w:t>
       </w:r>
@@ -6170,15 +6009,11 @@
       </w:r>
     </w:p>
     <w:p>
-      <w:pPr>
-        <w:rPr>
-          <w:rFonts w:hint="eastAsia"/>
-        </w:rPr>
-      </w:pPr>
       <w:r>
         <w:rPr>
           <w:noProof/>
         </w:rPr>
+        <w:lastRenderedPageBreak/>
         <w:drawing>
           <wp:inline distT="0" distB="0" distL="0" distR="0" wp14:anchorId="468C20BA" wp14:editId="08D067B9">
             <wp:extent cx="4067743" cy="2172003"/>
@@ -6225,7 +6060,6 @@
     <w:p>
       <w:pPr>
         <w:rPr>
-          <w:rFonts w:hint="eastAsia"/>
           <w:lang w:val="es-CO"/>
         </w:rPr>
       </w:pPr>
@@ -6243,11 +6077,6 @@
       </w:r>
     </w:p>
     <w:p>
-      <w:pPr>
-        <w:rPr>
-          <w:rFonts w:hint="eastAsia"/>
-        </w:rPr>
-      </w:pPr>
       <w:r>
         <w:t>“black”-&gt;</w:t>
       </w:r>
@@ -6264,7 +6093,6 @@
     <w:p>
       <w:pPr>
         <w:rPr>
-          <w:rFonts w:hint="eastAsia"/>
           <w:lang w:val="es-CO"/>
         </w:rPr>
       </w:pPr>
@@ -6284,7 +6112,6 @@
     <w:p>
       <w:pPr>
         <w:rPr>
-          <w:rFonts w:hint="eastAsia"/>
           <w:lang w:val="es-CO"/>
         </w:rPr>
       </w:pPr>
@@ -6339,7 +6166,6 @@
     <w:p>
       <w:pPr>
         <w:rPr>
-          <w:rFonts w:hint="eastAsia"/>
           <w:lang w:val="es-CO"/>
         </w:rPr>
       </w:pPr>
@@ -6394,7 +6220,6 @@
     <w:p>
       <w:pPr>
         <w:rPr>
-          <w:rFonts w:hint="eastAsia"/>
           <w:lang w:val="es-CO"/>
         </w:rPr>
       </w:pPr>
@@ -6408,7 +6233,6 @@
     <w:p>
       <w:pPr>
         <w:rPr>
-          <w:rFonts w:hint="eastAsia"/>
           <w:lang w:val="es-CO"/>
         </w:rPr>
       </w:pPr>
@@ -6417,6 +6241,7 @@
           <w:noProof/>
           <w:lang w:val="es-CO"/>
         </w:rPr>
+        <w:lastRenderedPageBreak/>
         <w:drawing>
           <wp:inline distT="0" distB="0" distL="0" distR="0" wp14:anchorId="58F80DF8" wp14:editId="3F3CC4BA">
             <wp:extent cx="4534533" cy="1876687"/>
@@ -6463,15 +6288,13 @@
     <w:p>
       <w:pPr>
         <w:rPr>
-          <w:rFonts w:hint="eastAsia"/>
-          <w:lang w:val="es-CO"/>
-        </w:rPr>
-      </w:pPr>
-    </w:p>
-    <w:p>
-      <w:pPr>
-        <w:rPr>
-          <w:rFonts w:hint="eastAsia"/>
+          <w:lang w:val="es-CO"/>
+        </w:rPr>
+      </w:pPr>
+    </w:p>
+    <w:p>
+      <w:pPr>
+        <w:rPr>
           <w:lang w:val="es-CO"/>
         </w:rPr>
       </w:pPr>
@@ -6491,7 +6314,6 @@
     <w:p>
       <w:pPr>
         <w:rPr>
-          <w:rFonts w:hint="eastAsia"/>
           <w:lang w:val="es-CO"/>
         </w:rPr>
       </w:pPr>
@@ -6546,7 +6368,6 @@
     <w:p>
       <w:pPr>
         <w:rPr>
-          <w:rFonts w:hint="eastAsia"/>
           <w:lang w:val="es-CO"/>
         </w:rPr>
       </w:pPr>
@@ -6560,7 +6381,6 @@
     <w:p>
       <w:pPr>
         <w:rPr>
-          <w:rFonts w:hint="eastAsia"/>
           <w:lang w:val="es-CO"/>
         </w:rPr>
       </w:pPr>
@@ -6569,6 +6389,7 @@
           <w:noProof/>
           <w:lang w:val="es-CO"/>
         </w:rPr>
+        <w:lastRenderedPageBreak/>
         <w:drawing>
           <wp:inline distT="0" distB="0" distL="0" distR="0" wp14:anchorId="5DFFC776" wp14:editId="3893D043">
             <wp:extent cx="3677163" cy="1486107"/>
@@ -6615,15 +6436,13 @@
     <w:p>
       <w:pPr>
         <w:rPr>
-          <w:rFonts w:hint="eastAsia"/>
-          <w:lang w:val="es-CO"/>
-        </w:rPr>
-      </w:pPr>
-    </w:p>
-    <w:p>
-      <w:pPr>
-        <w:rPr>
-          <w:rFonts w:hint="eastAsia"/>
+          <w:lang w:val="es-CO"/>
+        </w:rPr>
+      </w:pPr>
+    </w:p>
+    <w:p>
+      <w:pPr>
+        <w:rPr>
           <w:lang w:val="es-CO"/>
         </w:rPr>
       </w:pPr>
@@ -6637,7 +6456,6 @@
     <w:p>
       <w:pPr>
         <w:rPr>
-          <w:rFonts w:hint="eastAsia"/>
           <w:lang w:val="es-CO"/>
         </w:rPr>
       </w:pPr>
@@ -6692,7 +6510,6 @@
     <w:p>
       <w:pPr>
         <w:rPr>
-          <w:rFonts w:hint="eastAsia"/>
           <w:lang w:val="es-CO"/>
         </w:rPr>
       </w:pPr>
@@ -6706,7 +6523,6 @@
     <w:p>
       <w:pPr>
         <w:rPr>
-          <w:rFonts w:hint="eastAsia"/>
           <w:lang w:val="es-CO"/>
         </w:rPr>
       </w:pPr>
@@ -6720,7 +6536,6 @@
     <w:p>
       <w:pPr>
         <w:rPr>
-          <w:rFonts w:hint="eastAsia"/>
           <w:lang w:val="es-CO"/>
         </w:rPr>
       </w:pPr>
@@ -6734,7 +6549,6 @@
     <w:p>
       <w:pPr>
         <w:rPr>
-          <w:rFonts w:hint="eastAsia"/>
           <w:lang w:val="es-CO"/>
         </w:rPr>
       </w:pPr>
@@ -6789,21 +6603,20 @@
     <w:p>
       <w:pPr>
         <w:rPr>
-          <w:rFonts w:hint="eastAsia"/>
-          <w:lang w:val="es-CO"/>
-        </w:rPr>
-      </w:pPr>
-      <w:r>
-        <w:rPr>
-          <w:lang w:val="es-CO"/>
-        </w:rPr>
+          <w:lang w:val="es-CO"/>
+        </w:rPr>
+      </w:pPr>
+      <w:r>
+        <w:rPr>
+          <w:lang w:val="es-CO"/>
+        </w:rPr>
+        <w:lastRenderedPageBreak/>
         <w:t>Sin embargo, al hacer spin(), deberían cambiar de colores al color del otro:</w:t>
       </w:r>
     </w:p>
     <w:p>
       <w:pPr>
         <w:rPr>
-          <w:rFonts w:hint="eastAsia"/>
           <w:lang w:val="es-CO"/>
         </w:rPr>
       </w:pPr>
@@ -6858,7 +6671,6 @@
     <w:p>
       <w:pPr>
         <w:rPr>
-          <w:rFonts w:hint="eastAsia"/>
           <w:lang w:val="es-CO"/>
         </w:rPr>
       </w:pPr>
@@ -6878,7 +6690,6 @@
     <w:p>
       <w:pPr>
         <w:rPr>
-          <w:rFonts w:hint="eastAsia"/>
           <w:lang w:val="es-CO"/>
         </w:rPr>
       </w:pPr>
@@ -6892,7 +6703,6 @@
     <w:p>
       <w:pPr>
         <w:rPr>
-          <w:rFonts w:hint="eastAsia"/>
           <w:lang w:val="es-CO"/>
         </w:rPr>
       </w:pPr>
@@ -6947,7 +6757,6 @@
     <w:p>
       <w:pPr>
         <w:rPr>
-          <w:rFonts w:hint="eastAsia"/>
           <w:lang w:val="es-CO"/>
         </w:rPr>
       </w:pPr>
@@ -6961,7 +6770,6 @@
     <w:p>
       <w:pPr>
         <w:rPr>
-          <w:rFonts w:hint="eastAsia"/>
           <w:lang w:val="es-CO"/>
         </w:rPr>
       </w:pPr>
@@ -6970,6 +6778,7 @@
           <w:noProof/>
           <w:lang w:val="es-CO"/>
         </w:rPr>
+        <w:lastRenderedPageBreak/>
         <w:drawing>
           <wp:inline distT="0" distB="0" distL="0" distR="0" wp14:anchorId="42F2D42F" wp14:editId="78C2FA5E">
             <wp:extent cx="4267796" cy="2257740"/>
@@ -7016,23 +6825,20 @@
     <w:p>
       <w:pPr>
         <w:rPr>
-          <w:rFonts w:hint="eastAsia"/>
-          <w:lang w:val="es-CO"/>
-        </w:rPr>
-      </w:pPr>
-    </w:p>
-    <w:p>
-      <w:pPr>
-        <w:rPr>
-          <w:rFonts w:hint="eastAsia"/>
-          <w:lang w:val="es-CO"/>
-        </w:rPr>
-      </w:pPr>
-    </w:p>
-    <w:p>
-      <w:pPr>
-        <w:rPr>
-          <w:rFonts w:hint="eastAsia"/>
+          <w:lang w:val="es-CO"/>
+        </w:rPr>
+      </w:pPr>
+    </w:p>
+    <w:p>
+      <w:pPr>
+        <w:rPr>
+          <w:lang w:val="es-CO"/>
+        </w:rPr>
+      </w:pPr>
+    </w:p>
+    <w:p>
+      <w:pPr>
+        <w:rPr>
           <w:lang w:val="es-CO"/>
         </w:rPr>
       </w:pPr>
@@ -7082,7 +6888,6 @@
     <w:p>
       <w:pPr>
         <w:rPr>
-          <w:rFonts w:hint="eastAsia"/>
           <w:lang w:val="es-CO"/>
         </w:rPr>
       </w:pPr>
@@ -7192,7 +6997,6 @@
     <w:p>
       <w:pPr>
         <w:rPr>
-          <w:rFonts w:hint="eastAsia"/>
           <w:lang w:val="es-CO"/>
         </w:rPr>
       </w:pPr>
@@ -7306,7 +7110,6 @@
     <w:p>
       <w:pPr>
         <w:rPr>
-          <w:rFonts w:hint="eastAsia"/>
           <w:lang w:val="es-CO"/>
         </w:rPr>
       </w:pPr>
@@ -7396,15 +7199,11 @@
       </w:r>
     </w:p>
     <w:p>
-      <w:pPr>
-        <w:rPr>
-          <w:rFonts w:hint="eastAsia"/>
-        </w:rPr>
-      </w:pPr>
       <w:r>
         <w:rPr>
           <w:noProof/>
         </w:rPr>
+        <w:lastRenderedPageBreak/>
         <w:drawing>
           <wp:inline distT="0" distB="0" distL="0" distR="0" wp14:anchorId="21A73C95" wp14:editId="7B898E96">
             <wp:extent cx="5943600" cy="1581150"/>
@@ -7458,11 +7257,6 @@
       </w:r>
     </w:p>
     <w:p>
-      <w:pPr>
-        <w:rPr>
-          <w:rFonts w:hint="eastAsia"/>
-        </w:rPr>
-      </w:pPr>
       <w:r>
         <w:rPr>
           <w:noProof/>
@@ -7517,15 +7311,11 @@
       </w:r>
     </w:p>
     <w:p>
-      <w:pPr>
-        <w:rPr>
-          <w:rFonts w:hint="eastAsia"/>
-        </w:rPr>
-      </w:pPr>
       <w:r>
         <w:rPr>
           <w:noProof/>
         </w:rPr>
+        <w:lastRenderedPageBreak/>
         <w:drawing>
           <wp:inline distT="0" distB="0" distL="0" distR="0" wp14:anchorId="76DD3246" wp14:editId="47CD8325">
             <wp:extent cx="5153744" cy="4477375"/>
@@ -7575,30 +7365,14 @@
         </w:drawing>
       </w:r>
     </w:p>
-    <w:p>
-      <w:pPr>
-        <w:rPr>
-          <w:rFonts w:hint="eastAsia"/>
-        </w:rPr>
-      </w:pPr>
-    </w:p>
-    <w:p>
-      <w:pPr>
-        <w:rPr>
-          <w:rFonts w:hint="eastAsia"/>
-        </w:rPr>
-      </w:pPr>
-    </w:p>
-    <w:p>
-      <w:pPr>
-        <w:rPr>
-          <w:rFonts w:hint="eastAsia"/>
-        </w:rPr>
-      </w:pPr>
+    <w:p/>
+    <w:p/>
+    <w:p>
       <w:r>
         <w:rPr>
           <w:noProof/>
         </w:rPr>
+        <w:lastRenderedPageBreak/>
         <w:drawing>
           <wp:inline distT="0" distB="0" distL="0" distR="0" wp14:anchorId="6D343524" wp14:editId="54C9D827">
             <wp:extent cx="5029902" cy="2629267"/>
@@ -7649,11 +7423,6 @@
       </w:r>
     </w:p>
     <w:p>
-      <w:pPr>
-        <w:rPr>
-          <w:rFonts w:hint="eastAsia"/>
-        </w:rPr>
-      </w:pPr>
       <w:r>
         <w:rPr>
           <w:noProof/>
@@ -7710,14 +7479,14 @@
     <w:p>
       <w:pPr>
         <w:rPr>
-          <w:rFonts w:hint="eastAsia"/>
-          <w:lang w:val="es-CO"/>
-        </w:rPr>
-      </w:pPr>
-      <w:r>
-        <w:rPr>
-          <w:lang w:val="es-ES"/>
-        </w:rPr>
+          <w:lang w:val="es-CO"/>
+        </w:rPr>
+      </w:pPr>
+      <w:r>
+        <w:rPr>
+          <w:lang w:val="es-ES"/>
+        </w:rPr>
+        <w:lastRenderedPageBreak/>
         <w:t xml:space="preserve">Con este </w:t>
       </w:r>
       <w:r>
@@ -7936,15 +7705,11 @@
       </w:r>
     </w:p>
     <w:p>
-      <w:pPr>
-        <w:rPr>
-          <w:rFonts w:hint="eastAsia"/>
-        </w:rPr>
-      </w:pPr>
       <w:r>
         <w:rPr>
           <w:noProof/>
         </w:rPr>
+        <w:lastRenderedPageBreak/>
         <w:drawing>
           <wp:inline distT="0" distB="0" distL="0" distR="0" wp14:anchorId="2FE733C6" wp14:editId="728B1F03">
             <wp:extent cx="5943600" cy="4210050"/>
@@ -7995,11 +7760,6 @@
       </w:r>
     </w:p>
     <w:p>
-      <w:pPr>
-        <w:rPr>
-          <w:rFonts w:hint="eastAsia"/>
-        </w:rPr>
-      </w:pPr>
       <w:r>
         <w:rPr>
           <w:noProof/>
@@ -8053,17 +7813,10 @@
         </w:drawing>
       </w:r>
     </w:p>
-    <w:p>
-      <w:pPr>
-        <w:rPr>
-          <w:rFonts w:hint="eastAsia"/>
-        </w:rPr>
-      </w:pPr>
-    </w:p>
-    <w:p>
-      <w:pPr>
-        <w:rPr>
-          <w:rFonts w:hint="eastAsia"/>
+    <w:p/>
+    <w:p>
+      <w:pPr>
+        <w:rPr>
           <w:lang w:val="es-CO"/>
         </w:rPr>
       </w:pPr>
@@ -8103,7 +7856,6 @@
     <w:p>
       <w:pPr>
         <w:rPr>
-          <w:rFonts w:hint="eastAsia"/>
           <w:lang w:val="es-CO"/>
         </w:rPr>
       </w:pPr>
@@ -8265,11 +8017,6 @@
       </w:r>
     </w:p>
     <w:p>
-      <w:pPr>
-        <w:rPr>
-          <w:rFonts w:hint="eastAsia"/>
-        </w:rPr>
-      </w:pPr>
       <w:r>
         <w:rPr>
           <w:noProof/>
@@ -8326,7 +8073,6 @@
     <w:p>
       <w:pPr>
         <w:rPr>
-          <w:rFonts w:hint="eastAsia"/>
           <w:lang w:val="es-CO"/>
         </w:rPr>
       </w:pPr>
@@ -8356,11 +8102,6 @@
       </w:r>
     </w:p>
     <w:p>
-      <w:pPr>
-        <w:rPr>
-          <w:rFonts w:hint="eastAsia"/>
-        </w:rPr>
-      </w:pPr>
       <w:r>
         <w:rPr>
           <w:noProof/>
@@ -8417,14 +8158,14 @@
     <w:p>
       <w:pPr>
         <w:rPr>
-          <w:rFonts w:hint="eastAsia"/>
-          <w:lang w:val="es-CO"/>
-        </w:rPr>
-      </w:pPr>
-      <w:r>
-        <w:rPr>
-          <w:lang w:val="es-ES"/>
-        </w:rPr>
+          <w:lang w:val="es-CO"/>
+        </w:rPr>
+      </w:pPr>
+      <w:r>
+        <w:rPr>
+          <w:lang w:val="es-ES"/>
+        </w:rPr>
+        <w:lastRenderedPageBreak/>
         <w:t>Por ende</w:t>
       </w:r>
       <w:r>
@@ -8501,11 +8242,6 @@
       </w:r>
     </w:p>
     <w:p>
-      <w:pPr>
-        <w:rPr>
-          <w:rFonts w:hint="eastAsia"/>
-        </w:rPr>
-      </w:pPr>
       <w:r>
         <w:rPr>
           <w:noProof/>
@@ -8559,19 +8295,8 @@
         </w:drawing>
       </w:r>
     </w:p>
-    <w:p>
-      <w:pPr>
-        <w:rPr>
-          <w:rFonts w:hint="eastAsia"/>
-        </w:rPr>
-      </w:pPr>
-    </w:p>
-    <w:p>
-      <w:pPr>
-        <w:rPr>
-          <w:rFonts w:hint="eastAsia"/>
-        </w:rPr>
-      </w:pPr>
+    <w:p/>
+    <w:p>
       <w:r>
         <w:rPr>
           <w:noProof/>
@@ -8626,15 +8351,11 @@
       </w:r>
     </w:p>
     <w:p>
-      <w:pPr>
-        <w:rPr>
-          <w:rFonts w:hint="eastAsia"/>
-        </w:rPr>
-      </w:pPr>
       <w:r>
         <w:rPr>
           <w:noProof/>
         </w:rPr>
+        <w:lastRenderedPageBreak/>
         <w:drawing>
           <wp:inline distT="0" distB="0" distL="0" distR="0" wp14:anchorId="0FA53594" wp14:editId="3558BB7A">
             <wp:extent cx="5096586" cy="2743583"/>
@@ -8684,24 +8405,11 @@
         </w:drawing>
       </w:r>
     </w:p>
-    <w:p>
-      <w:pPr>
-        <w:rPr>
-          <w:rFonts w:hint="eastAsia"/>
-        </w:rPr>
-      </w:pPr>
-    </w:p>
-    <w:p>
-      <w:pPr>
-        <w:rPr>
-          <w:rFonts w:hint="eastAsia"/>
-        </w:rPr>
-      </w:pPr>
-    </w:p>
-    <w:p>
-      <w:pPr>
-        <w:rPr>
-          <w:rFonts w:hint="eastAsia"/>
+    <w:p/>
+    <w:p/>
+    <w:p>
+      <w:pPr>
+        <w:rPr>
           <w:lang w:val="es-CO"/>
         </w:rPr>
       </w:pPr>
@@ -8725,11 +8433,6 @@
       </w:r>
     </w:p>
     <w:p>
-      <w:pPr>
-        <w:rPr>
-          <w:rFonts w:hint="eastAsia"/>
-        </w:rPr>
-      </w:pPr>
       <w:r>
         <w:rPr>
           <w:noProof/>
@@ -8786,7 +8489,6 @@
     <w:p>
       <w:pPr>
         <w:rPr>
-          <w:rFonts w:hint="eastAsia"/>
           <w:lang w:val="es-CO"/>
         </w:rPr>
       </w:pPr>
@@ -8920,6 +8622,7 @@
         <w:rPr>
           <w:noProof/>
         </w:rPr>
+        <w:lastRenderedPageBreak/>
         <w:drawing>
           <wp:inline distT="0" distB="0" distL="0" distR="0" wp14:anchorId="4A94AE62" wp14:editId="4D2C58AA">
             <wp:extent cx="5943600" cy="2247900"/>
@@ -9008,7 +8711,6 @@
     <w:p>
       <w:pPr>
         <w:rPr>
-          <w:rFonts w:hint="eastAsia"/>
           <w:lang w:val="es-ES"/>
         </w:rPr>
       </w:pPr>
@@ -9203,6 +8905,7 @@
         <w:rPr>
           <w:noProof/>
         </w:rPr>
+        <w:lastRenderedPageBreak/>
         <w:drawing>
           <wp:inline distT="0" distB="0" distL="0" distR="0" wp14:anchorId="065314C5" wp14:editId="06CA1187">
             <wp:extent cx="2600688" cy="3753374"/>
@@ -9311,6 +9014,7 @@
         <w:rPr>
           <w:noProof/>
         </w:rPr>
+        <w:lastRenderedPageBreak/>
         <w:drawing>
           <wp:inline distT="0" distB="0" distL="0" distR="0" wp14:anchorId="161D0A6A" wp14:editId="62ED4944">
             <wp:extent cx="5943600" cy="3505200"/>
@@ -9518,6 +9222,7 @@
         <w:rPr>
           <w:noProof/>
         </w:rPr>
+        <w:lastRenderedPageBreak/>
         <w:drawing>
           <wp:inline distT="0" distB="0" distL="0" distR="0" wp14:anchorId="7F2517FE" wp14:editId="29FC2488">
             <wp:extent cx="5943600" cy="2085975"/>
@@ -9622,6 +9327,7 @@
         <w:rPr>
           <w:noProof/>
         </w:rPr>
+        <w:lastRenderedPageBreak/>
         <w:drawing>
           <wp:inline distT="0" distB="0" distL="0" distR="0" wp14:anchorId="0F63920C" wp14:editId="2D257EDA">
             <wp:extent cx="5943600" cy="3571875"/>
@@ -9728,8 +9434,512 @@
         </w:drawing>
       </w:r>
     </w:p>
+    <w:p/>
+    <w:p>
+      <w:r>
+        <w:lastRenderedPageBreak/>
+        <w:t>miniCiclo 10: Ciclo animado</w:t>
+      </w:r>
+    </w:p>
+    <w:p>
+      <w:pPr>
+        <w:rPr>
+          <w:lang w:val="es-CO"/>
+        </w:rPr>
+      </w:pPr>
+      <w:r>
+        <w:rPr>
+          <w:lang w:val="es-CO"/>
+        </w:rPr>
+        <w:t>Para este ciclo nos enfocaremos e</w:t>
+      </w:r>
+      <w:r>
+        <w:rPr>
+          <w:lang w:val="es-CO"/>
+        </w:rPr>
+        <w:t>n animar un poco la maquina, puesto que el único cambio visual medio interesante es cuando cambia el color del símbolo, sin embargo, nos encargaremos de animar la palanca de la maquina</w:t>
+      </w:r>
+      <w:r>
+        <w:rPr>
+          <w:lang w:val="es-CO"/>
+        </w:rPr>
+        <w:t>:</w:t>
+      </w:r>
+    </w:p>
+    <w:p>
+      <w:pPr>
+        <w:rPr>
+          <w:lang w:val="es-CO"/>
+        </w:rPr>
+      </w:pPr>
+      <w:r>
+        <w:rPr>
+          <w:lang w:val="es-CO"/>
+        </w:rPr>
+        <w:drawing>
+          <wp:inline distT="0" distB="0" distL="0" distR="0" wp14:anchorId="6495FB2C" wp14:editId="68D1A17F">
+            <wp:extent cx="5010849" cy="3105583"/>
+            <wp:effectExtent l="0" t="0" r="0" b="0"/>
+            <wp:docPr id="1449858186" name="Imagen 1"/>
+            <wp:cNvGraphicFramePr>
+              <a:graphicFrameLocks xmlns:a="http://schemas.openxmlformats.org/drawingml/2006/main" noChangeAspect="1"/>
+            </wp:cNvGraphicFramePr>
+            <a:graphic xmlns:a="http://schemas.openxmlformats.org/drawingml/2006/main">
+              <a:graphicData uri="http://schemas.openxmlformats.org/drawingml/2006/picture">
+                <pic:pic xmlns:pic="http://schemas.openxmlformats.org/drawingml/2006/picture">
+                  <pic:nvPicPr>
+                    <pic:cNvPr id="1449858186" name=""/>
+                    <pic:cNvPicPr/>
+                  </pic:nvPicPr>
+                  <pic:blipFill>
+                    <a:blip r:embed="rId107"/>
+                    <a:stretch>
+                      <a:fillRect/>
+                    </a:stretch>
+                  </pic:blipFill>
+                  <pic:spPr>
+                    <a:xfrm>
+                      <a:off x="0" y="0"/>
+                      <a:ext cx="5010849" cy="3105583"/>
+                    </a:xfrm>
+                    <a:prstGeom prst="rect">
+                      <a:avLst/>
+                    </a:prstGeom>
+                  </pic:spPr>
+                </pic:pic>
+              </a:graphicData>
+            </a:graphic>
+          </wp:inline>
+        </w:drawing>
+      </w:r>
+    </w:p>
+    <w:p>
+      <w:pPr>
+        <w:rPr>
+          <w:lang w:val="es-CO"/>
+        </w:rPr>
+      </w:pPr>
+      <w:r>
+        <w:rPr>
+          <w:lang w:val="es-CO"/>
+        </w:rPr>
+        <w:t>Si se le añaden más ruedas:</w:t>
+      </w:r>
+    </w:p>
+    <w:p>
+      <w:pPr>
+        <w:rPr>
+          <w:lang w:val="es-CO"/>
+        </w:rPr>
+      </w:pPr>
+      <w:r>
+        <w:rPr>
+          <w:lang w:val="es-CO"/>
+        </w:rPr>
+        <w:drawing>
+          <wp:inline distT="0" distB="0" distL="0" distR="0" wp14:anchorId="0BA30967" wp14:editId="08AC6AF8">
+            <wp:extent cx="5525271" cy="2972215"/>
+            <wp:effectExtent l="0" t="0" r="0" b="0"/>
+            <wp:docPr id="1179229043" name="Imagen 1"/>
+            <wp:cNvGraphicFramePr>
+              <a:graphicFrameLocks xmlns:a="http://schemas.openxmlformats.org/drawingml/2006/main" noChangeAspect="1"/>
+            </wp:cNvGraphicFramePr>
+            <a:graphic xmlns:a="http://schemas.openxmlformats.org/drawingml/2006/main">
+              <a:graphicData uri="http://schemas.openxmlformats.org/drawingml/2006/picture">
+                <pic:pic xmlns:pic="http://schemas.openxmlformats.org/drawingml/2006/picture">
+                  <pic:nvPicPr>
+                    <pic:cNvPr id="1179229043" name=""/>
+                    <pic:cNvPicPr/>
+                  </pic:nvPicPr>
+                  <pic:blipFill>
+                    <a:blip r:embed="rId108"/>
+                    <a:stretch>
+                      <a:fillRect/>
+                    </a:stretch>
+                  </pic:blipFill>
+                  <pic:spPr>
+                    <a:xfrm>
+                      <a:off x="0" y="0"/>
+                      <a:ext cx="5525271" cy="2972215"/>
+                    </a:xfrm>
+                    <a:prstGeom prst="rect">
+                      <a:avLst/>
+                    </a:prstGeom>
+                  </pic:spPr>
+                </pic:pic>
+              </a:graphicData>
+            </a:graphic>
+          </wp:inline>
+        </w:drawing>
+      </w:r>
+    </w:p>
+    <w:p>
+      <w:pPr>
+        <w:rPr>
+          <w:lang w:val="es-CO"/>
+        </w:rPr>
+      </w:pPr>
+      <w:r>
+        <w:rPr>
+          <w:lang w:val="es-CO"/>
+        </w:rPr>
+        <w:lastRenderedPageBreak/>
+        <w:t>Si se le quitan ruedas:</w:t>
+      </w:r>
+    </w:p>
+    <w:p>
+      <w:pPr>
+        <w:rPr>
+          <w:lang w:val="es-CO"/>
+        </w:rPr>
+      </w:pPr>
+      <w:r>
+        <w:rPr>
+          <w:lang w:val="es-CO"/>
+        </w:rPr>
+        <w:drawing>
+          <wp:inline distT="0" distB="0" distL="0" distR="0" wp14:anchorId="38DB5C13" wp14:editId="52681380">
+            <wp:extent cx="5458587" cy="2295845"/>
+            <wp:effectExtent l="0" t="0" r="8890" b="9525"/>
+            <wp:docPr id="978113683" name="Imagen 1"/>
+            <wp:cNvGraphicFramePr>
+              <a:graphicFrameLocks xmlns:a="http://schemas.openxmlformats.org/drawingml/2006/main" noChangeAspect="1"/>
+            </wp:cNvGraphicFramePr>
+            <a:graphic xmlns:a="http://schemas.openxmlformats.org/drawingml/2006/main">
+              <a:graphicData uri="http://schemas.openxmlformats.org/drawingml/2006/picture">
+                <pic:pic xmlns:pic="http://schemas.openxmlformats.org/drawingml/2006/picture">
+                  <pic:nvPicPr>
+                    <pic:cNvPr id="978113683" name=""/>
+                    <pic:cNvPicPr/>
+                  </pic:nvPicPr>
+                  <pic:blipFill>
+                    <a:blip r:embed="rId109"/>
+                    <a:stretch>
+                      <a:fillRect/>
+                    </a:stretch>
+                  </pic:blipFill>
+                  <pic:spPr>
+                    <a:xfrm>
+                      <a:off x="0" y="0"/>
+                      <a:ext cx="5458587" cy="2295845"/>
+                    </a:xfrm>
+                    <a:prstGeom prst="rect">
+                      <a:avLst/>
+                    </a:prstGeom>
+                  </pic:spPr>
+                </pic:pic>
+              </a:graphicData>
+            </a:graphic>
+          </wp:inline>
+        </w:drawing>
+      </w:r>
+    </w:p>
+    <w:p>
+      <w:pPr>
+        <w:rPr>
+          <w:lang w:val="es-CO"/>
+        </w:rPr>
+      </w:pPr>
+      <w:r>
+        <w:rPr>
+          <w:lang w:val="es-CO"/>
+        </w:rPr>
+        <w:t>Cuando gira:</w:t>
+      </w:r>
+    </w:p>
+    <w:p>
+      <w:pPr>
+        <w:rPr>
+          <w:lang w:val="es-CO"/>
+        </w:rPr>
+      </w:pPr>
+      <w:r>
+        <w:rPr>
+          <w:lang w:val="es-CO"/>
+        </w:rPr>
+        <w:drawing>
+          <wp:inline distT="0" distB="0" distL="0" distR="0" wp14:anchorId="3ECA0A0B" wp14:editId="11765495">
+            <wp:extent cx="5943600" cy="2615565"/>
+            <wp:effectExtent l="0" t="0" r="0" b="0"/>
+            <wp:docPr id="290097898" name="Imagen 1"/>
+            <wp:cNvGraphicFramePr>
+              <a:graphicFrameLocks xmlns:a="http://schemas.openxmlformats.org/drawingml/2006/main" noChangeAspect="1"/>
+            </wp:cNvGraphicFramePr>
+            <a:graphic xmlns:a="http://schemas.openxmlformats.org/drawingml/2006/main">
+              <a:graphicData uri="http://schemas.openxmlformats.org/drawingml/2006/picture">
+                <pic:pic xmlns:pic="http://schemas.openxmlformats.org/drawingml/2006/picture">
+                  <pic:nvPicPr>
+                    <pic:cNvPr id="290097898" name=""/>
+                    <pic:cNvPicPr/>
+                  </pic:nvPicPr>
+                  <pic:blipFill>
+                    <a:blip r:embed="rId110"/>
+                    <a:stretch>
+                      <a:fillRect/>
+                    </a:stretch>
+                  </pic:blipFill>
+                  <pic:spPr>
+                    <a:xfrm>
+                      <a:off x="0" y="0"/>
+                      <a:ext cx="5943600" cy="2615565"/>
+                    </a:xfrm>
+                    <a:prstGeom prst="rect">
+                      <a:avLst/>
+                    </a:prstGeom>
+                  </pic:spPr>
+                </pic:pic>
+              </a:graphicData>
+            </a:graphic>
+          </wp:inline>
+        </w:drawing>
+      </w:r>
+    </w:p>
+    <w:p>
+      <w:pPr>
+        <w:rPr>
+          <w:lang w:val="es-CO"/>
+        </w:rPr>
+      </w:pPr>
+      <w:r>
+        <w:rPr>
+          <w:lang w:val="es-CO"/>
+        </w:rPr>
+        <w:t>Lo que hace es animar todo el movimiento del circulo para que baje</w:t>
+      </w:r>
+      <w:r>
+        <w:rPr>
+          <w:lang w:val="es-CO"/>
+        </w:rPr>
+        <w:t>.</w:t>
+      </w:r>
+    </w:p>
+    <w:p>
+      <w:pPr>
+        <w:rPr>
+          <w:lang w:val="es-CO"/>
+        </w:rPr>
+      </w:pPr>
+      <w:r>
+        <w:rPr>
+          <w:lang w:val="es-CO"/>
+        </w:rPr>
+        <w:t>Para lograr esta animación fue necesario refactorizar varios bloques de código para adaptar el cambio de ruedas, sin embargo, el cambio más importante fue añadir la animación:</w:t>
+      </w:r>
+    </w:p>
+    <w:p>
+      <w:pPr>
+        <w:rPr>
+          <w:lang w:val="es-CO"/>
+        </w:rPr>
+      </w:pPr>
+      <w:r>
+        <w:rPr>
+          <w:lang w:val="es-CO"/>
+        </w:rPr>
+        <w:lastRenderedPageBreak/>
+        <w:drawing>
+          <wp:inline distT="0" distB="0" distL="0" distR="0" wp14:anchorId="7890BB96" wp14:editId="63796D97">
+            <wp:extent cx="5772956" cy="6220693"/>
+            <wp:effectExtent l="0" t="0" r="0" b="8890"/>
+            <wp:docPr id="725647213" name="Imagen 1"/>
+            <wp:cNvGraphicFramePr>
+              <a:graphicFrameLocks xmlns:a="http://schemas.openxmlformats.org/drawingml/2006/main" noChangeAspect="1"/>
+            </wp:cNvGraphicFramePr>
+            <a:graphic xmlns:a="http://schemas.openxmlformats.org/drawingml/2006/main">
+              <a:graphicData uri="http://schemas.openxmlformats.org/drawingml/2006/picture">
+                <pic:pic xmlns:pic="http://schemas.openxmlformats.org/drawingml/2006/picture">
+                  <pic:nvPicPr>
+                    <pic:cNvPr id="725647213" name=""/>
+                    <pic:cNvPicPr/>
+                  </pic:nvPicPr>
+                  <pic:blipFill>
+                    <a:blip r:embed="rId111"/>
+                    <a:stretch>
+                      <a:fillRect/>
+                    </a:stretch>
+                  </pic:blipFill>
+                  <pic:spPr>
+                    <a:xfrm>
+                      <a:off x="0" y="0"/>
+                      <a:ext cx="5772956" cy="6220693"/>
+                    </a:xfrm>
+                    <a:prstGeom prst="rect">
+                      <a:avLst/>
+                    </a:prstGeom>
+                  </pic:spPr>
+                </pic:pic>
+              </a:graphicData>
+            </a:graphic>
+          </wp:inline>
+        </w:drawing>
+      </w:r>
+    </w:p>
+    <w:p>
+      <w:pPr>
+        <w:rPr>
+          <w:lang w:val="es-CO"/>
+        </w:rPr>
+      </w:pPr>
+      <w:r>
+        <w:rPr>
+          <w:lang w:val="es-CO"/>
+        </w:rPr>
+        <w:t>En resumidas cuentas, la animación se reduce en 4 bloques de movimiento, el primero que mueve un bloque invisible blanco que se encarga de dar la ilusión de que se baja la palanca, este bloque llega hasta la mitad</w:t>
+      </w:r>
+      <w:r>
+        <w:rPr>
+          <w:lang w:val="es-CO"/>
+        </w:rPr>
+        <w:t>. En el segundo bloque de movimiento la bola roja sigue bajando y debajo de él está otro bloque invisible blanco que da la ilusión de que aparece la palanca detrás del circulo rojo, el bloque 3 y 4 de movimiento se resumen, en hacer lo mismo, pero a la inversa, para que de la ilusión de que se sube la palanca...</w:t>
+      </w:r>
+    </w:p>
+    <w:p>
+      <w:pPr>
+        <w:rPr>
+          <w:lang w:val="es-CO"/>
+        </w:rPr>
+      </w:pPr>
+      <w:r>
+        <w:rPr>
+          <w:lang w:val="es-CO"/>
+        </w:rPr>
+        <w:lastRenderedPageBreak/>
+        <w:t xml:space="preserve">Como se ve, a la hora de mover las partes fue necesario añadir tanto en Rectangle como en </w:t>
+      </w:r>
+      <w:r>
+        <w:rPr>
+          <w:lang w:val="es-CO"/>
+        </w:rPr>
+        <w:t>Circle un nuevo tipo de movimiento, esto porque, con el movimiento normal, recorrer grandes distancia se vuelve lento:</w:t>
+      </w:r>
+    </w:p>
+    <w:p>
+      <w:pPr>
+        <w:rPr>
+          <w:lang w:val="es-CO"/>
+        </w:rPr>
+      </w:pPr>
+      <w:r>
+        <w:rPr>
+          <w:lang w:val="es-CO"/>
+        </w:rPr>
+        <w:drawing>
+          <wp:inline distT="0" distB="0" distL="0" distR="0" wp14:anchorId="3AC1C04B" wp14:editId="35FAC69A">
+            <wp:extent cx="5487166" cy="3877216"/>
+            <wp:effectExtent l="0" t="0" r="0" b="9525"/>
+            <wp:docPr id="376039351" name="Imagen 1"/>
+            <wp:cNvGraphicFramePr>
+              <a:graphicFrameLocks xmlns:a="http://schemas.openxmlformats.org/drawingml/2006/main" noChangeAspect="1"/>
+            </wp:cNvGraphicFramePr>
+            <a:graphic xmlns:a="http://schemas.openxmlformats.org/drawingml/2006/main">
+              <a:graphicData uri="http://schemas.openxmlformats.org/drawingml/2006/picture">
+                <pic:pic xmlns:pic="http://schemas.openxmlformats.org/drawingml/2006/picture">
+                  <pic:nvPicPr>
+                    <pic:cNvPr id="376039351" name=""/>
+                    <pic:cNvPicPr/>
+                  </pic:nvPicPr>
+                  <pic:blipFill>
+                    <a:blip r:embed="rId112"/>
+                    <a:stretch>
+                      <a:fillRect/>
+                    </a:stretch>
+                  </pic:blipFill>
+                  <pic:spPr>
+                    <a:xfrm>
+                      <a:off x="0" y="0"/>
+                      <a:ext cx="5487166" cy="3877216"/>
+                    </a:xfrm>
+                    <a:prstGeom prst="rect">
+                      <a:avLst/>
+                    </a:prstGeom>
+                  </pic:spPr>
+                </pic:pic>
+              </a:graphicData>
+            </a:graphic>
+          </wp:inline>
+        </w:drawing>
+      </w:r>
+    </w:p>
+    <w:p>
+      <w:pPr>
+        <w:rPr>
+          <w:lang w:val="es-CO"/>
+        </w:rPr>
+      </w:pPr>
+      <w:r>
+        <w:rPr>
+          <w:lang w:val="es-CO"/>
+        </w:rPr>
+        <w:t>Ade</w:t>
+      </w:r>
+      <w:r>
+        <w:rPr>
+          <w:lang w:val="es-CO"/>
+        </w:rPr>
+        <w:t>más de crear un fastDraw() que evite grandes tiempos de esper</w:t>
+      </w:r>
+      <w:r>
+        <w:rPr>
+          <w:lang w:val="es-CO"/>
+        </w:rPr>
+        <w:t>a</w:t>
+      </w:r>
+      <w:r>
+        <w:rPr>
+          <w:lang w:val="es-CO"/>
+        </w:rPr>
+        <w:t xml:space="preserve"> entre cada dibujo:</w:t>
+      </w:r>
+    </w:p>
+    <w:p>
+      <w:pPr>
+        <w:rPr>
+          <w:lang w:val="es-CO"/>
+        </w:rPr>
+      </w:pPr>
+      <w:r>
+        <w:rPr>
+          <w:lang w:val="es-CO"/>
+        </w:rPr>
+        <w:drawing>
+          <wp:inline distT="0" distB="0" distL="0" distR="0" wp14:anchorId="31DB93CB" wp14:editId="3201F79E">
+            <wp:extent cx="5943600" cy="2192020"/>
+            <wp:effectExtent l="0" t="0" r="0" b="0"/>
+            <wp:docPr id="2088043028" name="Imagen 1"/>
+            <wp:cNvGraphicFramePr>
+              <a:graphicFrameLocks xmlns:a="http://schemas.openxmlformats.org/drawingml/2006/main" noChangeAspect="1"/>
+            </wp:cNvGraphicFramePr>
+            <a:graphic xmlns:a="http://schemas.openxmlformats.org/drawingml/2006/main">
+              <a:graphicData uri="http://schemas.openxmlformats.org/drawingml/2006/picture">
+                <pic:pic xmlns:pic="http://schemas.openxmlformats.org/drawingml/2006/picture">
+                  <pic:nvPicPr>
+                    <pic:cNvPr id="2088043028" name=""/>
+                    <pic:cNvPicPr/>
+                  </pic:nvPicPr>
+                  <pic:blipFill>
+                    <a:blip r:embed="rId113"/>
+                    <a:stretch>
+                      <a:fillRect/>
+                    </a:stretch>
+                  </pic:blipFill>
+                  <pic:spPr>
+                    <a:xfrm>
+                      <a:off x="0" y="0"/>
+                      <a:ext cx="5943600" cy="2192020"/>
+                    </a:xfrm>
+                    <a:prstGeom prst="rect">
+                      <a:avLst/>
+                    </a:prstGeom>
+                  </pic:spPr>
+                </pic:pic>
+              </a:graphicData>
+            </a:graphic>
+          </wp:inline>
+        </w:drawing>
+      </w:r>
+    </w:p>
     <w:sectPr>
-      <w:headerReference w:type="default" r:id="rId107"/>
+      <w:headerReference w:type="default" r:id="rId114"/>
       <w:pgSz w:w="12240" w:h="15840"/>
       <w:pgMar w:top="1440" w:right="1440" w:bottom="1440" w:left="1440" w:header="720" w:footer="720" w:gutter="0"/>
       <w:cols w:space="720"/>
@@ -9745,9 +9955,6 @@
     <w:p>
       <w:pPr>
         <w:spacing w:after="0" w:line="240" w:lineRule="auto"/>
-        <w:rPr>
-          <w:rFonts w:hint="eastAsia"/>
-        </w:rPr>
       </w:pPr>
       <w:r>
         <w:separator/>
@@ -9758,9 +9965,6 @@
     <w:p>
       <w:pPr>
         <w:spacing w:after="0" w:line="240" w:lineRule="auto"/>
-        <w:rPr>
-          <w:rFonts w:hint="eastAsia"/>
-        </w:rPr>
       </w:pPr>
       <w:r>
         <w:continuationSeparator/>
@@ -9776,9 +9980,6 @@
     <w:p>
       <w:pPr>
         <w:spacing w:after="0" w:line="240" w:lineRule="auto"/>
-        <w:rPr>
-          <w:rFonts w:hint="eastAsia"/>
-        </w:rPr>
       </w:pPr>
       <w:r>
         <w:separator/>
@@ -9789,9 +9990,6 @@
     <w:p>
       <w:pPr>
         <w:spacing w:after="0" w:line="240" w:lineRule="auto"/>
-        <w:rPr>
-          <w:rFonts w:hint="eastAsia"/>
-        </w:rPr>
       </w:pPr>
       <w:r>
         <w:continuationSeparator/>
@@ -9805,10 +10003,7 @@
 <w:hdr xmlns:wpc="http://schemas.microsoft.com/office/word/2010/wordprocessingCanvas" xmlns:cx="http://schemas.microsoft.com/office/drawing/2014/chartex" xmlns:cx1="http://schemas.microsoft.com/office/drawing/2015/9/8/chartex" xmlns:cx2="http://schemas.microsoft.com/office/drawing/2015/10/21/chartex" xmlns:cx3="http://schemas.microsoft.com/office/drawing/2016/5/9/chartex" xmlns:cx4="http://schemas.microsoft.com/office/drawing/2016/5/10/chartex" xmlns:cx5="http://schemas.microsoft.com/office/drawing/2016/5/11/chartex" xmlns:cx6="http://schemas.microsoft.com/office/drawing/2016/5/12/chartex" xmlns:cx7="http://schemas.microsoft.com/office/drawing/2016/5/13/chartex" xmlns:cx8="http://schemas.microsoft.com/office/drawing/2016/5/14/chartex" xmlns:mc="http://schemas.openxmlformats.org/markup-compatibility/2006" xmlns:aink="http://schemas.microsoft.com/office/drawing/2016/ink" xmlns:am3d="http://schemas.microsoft.com/office/drawing/2017/model3d" xmlns:o="urn:schemas-microsoft-com:office:office" xmlns:oel="http://schemas.microsoft.com/office/2019/extlst" xmlns:r="http://schemas.openxmlformats.org/officeDocument/2006/relationships" xmlns:m="http://schemas.openxmlformats.org/officeDocument/2006/math" xmlns:v="urn:schemas-microsoft-com:vml" xmlns:wp14="http://schemas.microsoft.com/office/word/2010/wordprocessingDrawing" xmlns:wp="http://schemas.openxmlformats.org/drawingml/2006/wordprocessingDrawing" xmlns:w10="urn:schemas-microsoft-com:office:word" xmlns:w="http://schemas.openxmlformats.org/wordprocessingml/2006/main" xmlns:w14="http://schemas.microsoft.com/office/word/2010/wordml" xmlns:w15="http://schemas.microsoft.com/office/word/2012/wordml" xmlns:w16cex="http://schemas.microsoft.com/office/word/2018/wordml/cex" xmlns:w16cid="http://schemas.microsoft.com/office/word/2016/wordml/cid" xmlns:w16="http://schemas.microsoft.com/office/word/2018/wordml" xmlns:w16du="http://schemas.microsoft.com/office/word/2023/wordml/word16du" xmlns:w16sdtdh="http://schemas.microsoft.com/office/word/2020/wordml/sdtdatahash" xmlns:w16sdtfl="http://schemas.microsoft.com/office/word/2024/wordml/sdtformatlock" xmlns:w16se="http://schemas.microsoft.com/office/word/2015/wordml/symex" xmlns:wpg="http://schemas.microsoft.com/office/word/2010/wordprocessingGroup" xmlns:wpi="http://schemas.microsoft.com/office/word/2010/wordprocessingInk" xmlns:wne="http://schemas.microsoft.com/office/word/2006/wordml" xmlns:wps="http://schemas.microsoft.com/office/word/2010/wordprocessingShape" mc:Ignorable="w14 w15 w16se w16cid w16 w16cex w16sdtdh w16sdtfl w16du wp14">
   <w:p>
     <w:pPr>
-      <w:pStyle w:val="Header"/>
-      <w:rPr>
-        <w:rFonts w:hint="eastAsia"/>
-      </w:rPr>
+      <w:pStyle w:val="Encabezado"/>
     </w:pPr>
     <w:r>
       <w:rPr>
@@ -10265,13 +10460,13 @@
     <w:name w:val="Normal"/>
     <w:qFormat/>
   </w:style>
-  <w:style w:type="character" w:default="1" w:styleId="DefaultParagraphFont">
+  <w:style w:type="character" w:default="1" w:styleId="Fuentedeprrafopredeter">
     <w:name w:val="Default Paragraph Font"/>
     <w:uiPriority w:val="1"/>
     <w:semiHidden/>
     <w:unhideWhenUsed/>
   </w:style>
-  <w:style w:type="table" w:default="1" w:styleId="TableNormal">
+  <w:style w:type="table" w:default="1" w:styleId="Tablanormal">
     <w:name w:val="Normal Table"/>
     <w:uiPriority w:val="99"/>
     <w:semiHidden/>
@@ -10286,16 +10481,16 @@
       </w:tblCellMar>
     </w:tblPr>
   </w:style>
-  <w:style w:type="numbering" w:default="1" w:styleId="NoList">
+  <w:style w:type="numbering" w:default="1" w:styleId="Sinlista">
     <w:name w:val="No List"/>
     <w:uiPriority w:val="99"/>
     <w:semiHidden/>
     <w:unhideWhenUsed/>
   </w:style>
-  <w:style w:type="paragraph" w:styleId="Header">
+  <w:style w:type="paragraph" w:styleId="Encabezado">
     <w:name w:val="header"/>
     <w:basedOn w:val="Normal"/>
-    <w:link w:val="HeaderChar"/>
+    <w:link w:val="EncabezadoCar"/>
     <w:uiPriority w:val="99"/>
     <w:unhideWhenUsed/>
     <w:rsid w:val="008E3A33"/>
@@ -10307,17 +10502,17 @@
       <w:spacing w:after="0" w:line="240" w:lineRule="auto"/>
     </w:pPr>
   </w:style>
-  <w:style w:type="character" w:customStyle="1" w:styleId="HeaderChar">
-    <w:name w:val="Header Char"/>
-    <w:basedOn w:val="DefaultParagraphFont"/>
-    <w:link w:val="Header"/>
+  <w:style w:type="character" w:customStyle="1" w:styleId="EncabezadoCar">
+    <w:name w:val="Encabezado Car"/>
+    <w:basedOn w:val="Fuentedeprrafopredeter"/>
+    <w:link w:val="Encabezado"/>
     <w:uiPriority w:val="99"/>
     <w:rsid w:val="008E3A33"/>
   </w:style>
-  <w:style w:type="paragraph" w:styleId="Footer">
+  <w:style w:type="paragraph" w:styleId="Piedepgina">
     <w:name w:val="footer"/>
     <w:basedOn w:val="Normal"/>
-    <w:link w:val="FooterChar"/>
+    <w:link w:val="PiedepginaCar"/>
     <w:uiPriority w:val="99"/>
     <w:unhideWhenUsed/>
     <w:rsid w:val="008E3A33"/>
@@ -10329,10 +10524,10 @@
       <w:spacing w:after="0" w:line="240" w:lineRule="auto"/>
     </w:pPr>
   </w:style>
-  <w:style w:type="character" w:customStyle="1" w:styleId="FooterChar">
-    <w:name w:val="Footer Char"/>
-    <w:basedOn w:val="DefaultParagraphFont"/>
-    <w:link w:val="Footer"/>
+  <w:style w:type="character" w:customStyle="1" w:styleId="PiedepginaCar">
+    <w:name w:val="Pie de página Car"/>
+    <w:basedOn w:val="Fuentedeprrafopredeter"/>
+    <w:link w:val="Piedepgina"/>
     <w:uiPriority w:val="99"/>
     <w:rsid w:val="008E3A33"/>
   </w:style>

</xml_diff>